<commit_message>
Update Document Production Process to v1.4
- Entity PRD Structure: replaced 6-section structure with 9-section
  structure matching Entity Definition guide v1.1 (Entity Overview,
  Native Fields, Custom Fields, Relationships, Dynamic Logic Rules,
  Layout Guidance, Implementation Notes, Open Issues, Decisions Made)
- Added reference to Entity PRD generator template
- Updated Completeness Standard to match 9-section structure
- Version 1.4 replacing v1.3
</commit_message>
<xml_diff>
--- a/PRDs/process/CRM-Builder-Document-Production-Process.docx
+++ b/PRDs/process/CRM-Builder-Document-Production-Process.docx
@@ -107,7 +107,7 @@
                 <w:sz w:val="22"/>
                 <w:szCs w:val="22"/>
               </w:rPr>
-              <w:t xml:space="preserve">1.3</w:t>
+              <w:t xml:space="preserve">1.4</w:t>
             </w:r>
           </w:p>
         </w:tc>
@@ -225,7 +225,7 @@
                 <w:sz w:val="22"/>
                 <w:szCs w:val="22"/>
               </w:rPr>
-              <w:t xml:space="preserve">03-31-26 00:15</w:t>
+              <w:t xml:space="preserve">04-02-26 14:00</w:t>
             </w:r>
           </w:p>
         </w:tc>
@@ -285,7 +285,7 @@
                 <w:sz w:val="22"/>
                 <w:szCs w:val="22"/>
               </w:rPr>
-              <w:t xml:space="preserve">v1.2</w:t>
+              <w:t xml:space="preserve">v1.3</w:t>
             </w:r>
           </w:p>
         </w:tc>
@@ -2484,7 +2484,7 @@
           <w:sz w:val="22"/>
           <w:szCs w:val="22"/>
         </w:rPr>
-        <w:t xml:space="preserve">Every Entity PRD must contain all of the following sections:</w:t>
+        <w:t xml:space="preserve">Every Entity PRD must contain all nine of the following sections. The Entity Definition guide (guide-entity-definition.md) provides detailed descriptions of each section. A generator template (generate-entity-prd-template.js) is available to produce Entity PRDs with consistent formatting.</w:t>
       </w:r>
     </w:p>
     <w:p>
@@ -2512,7 +2512,7 @@
           <w:sz w:val="22"/>
           <w:szCs w:val="22"/>
         </w:rPr>
-        <w:t xml:space="preserve"> — what the entity represents, its purpose in the system, and which personas interact with it</w:t>
+        <w:t xml:space="preserve"> — entity metadata, native/custom status, entity type, contributing domains, and discriminator details for shared entities</w:t>
       </w:r>
     </w:p>
     <w:p>
@@ -2532,15 +2532,15 @@
           <w:sz w:val="22"/>
           <w:szCs w:val="22"/>
         </w:rPr>
-        <w:t xml:space="preserve">Domain Participation</w:t>
-      </w:r>
-      <w:r>
-        <w:rPr>
-          <w:rFonts w:ascii="Arial" w:cs="Arial" w:eastAsia="Arial" w:hAnsi="Arial"/>
-          <w:sz w:val="22"/>
-          <w:szCs w:val="22"/>
-        </w:rPr>
-        <w:t xml:space="preserve"> — which domains and processes create, read, or update this entity, with a brief description of the entity’s role in each</w:t>
+        <w:t xml:space="preserve">Native Fields</w:t>
+      </w:r>
+      <w:r>
+        <w:rPr>
+          <w:rFonts w:ascii="Arial" w:cs="Arial" w:eastAsia="Arial" w:hAnsi="Arial"/>
+          <w:sz w:val="22"/>
+          <w:szCs w:val="22"/>
+        </w:rPr>
+        <w:t xml:space="preserve"> — fields that already exist on the entity because of its platform entity type, documented to prevent duplicate creation during YAML generation</w:t>
       </w:r>
     </w:p>
     <w:p>
@@ -2560,15 +2560,15 @@
           <w:sz w:val="22"/>
           <w:szCs w:val="22"/>
         </w:rPr>
-        <w:t xml:space="preserve">Fields</w:t>
-      </w:r>
-      <w:r>
-        <w:rPr>
-          <w:rFonts w:ascii="Arial" w:cs="Arial" w:eastAsia="Arial" w:hAnsi="Arial"/>
-          <w:sz w:val="22"/>
-          <w:szCs w:val="22"/>
-        </w:rPr>
-        <w:t xml:space="preserve"> — complete field inventory at field-level detail (see Field-Level Detail Standard in Section 3.3). Fields are organized into logical groups (e.g., identity, contact information, status, dates)</w:t>
+        <w:t xml:space="preserve">Custom Fields</w:t>
+      </w:r>
+      <w:r>
+        <w:rPr>
+          <w:rFonts w:ascii="Arial" w:cs="Arial" w:eastAsia="Arial" w:hAnsi="Arial"/>
+          <w:sz w:val="22"/>
+          <w:szCs w:val="22"/>
+        </w:rPr>
+        <w:t xml:space="preserve"> — fields created via YAML, organized by scope (shared vs. type-specific) with full field-level detail including domain attribution, visibility rules, and implementation notes</w:t>
       </w:r>
     </w:p>
     <w:p>
@@ -2596,7 +2596,7 @@
           <w:sz w:val="22"/>
           <w:szCs w:val="22"/>
         </w:rPr>
-        <w:t xml:space="preserve"> — connections to other entities, including cardinality (one-to-many, many-to-many), which side owns the relationship, and a description of what the relationship represents</w:t>
+        <w:t xml:space="preserve"> — all relationships involving this entity, compiled from all domains, with link types, PRD references, and domain attribution</w:t>
       </w:r>
     </w:p>
     <w:p>
@@ -2616,15 +2616,15 @@
           <w:sz w:val="22"/>
           <w:szCs w:val="22"/>
         </w:rPr>
-        <w:t xml:space="preserve">Business Rules</w:t>
-      </w:r>
-      <w:r>
-        <w:rPr>
-          <w:rFonts w:ascii="Arial" w:cs="Arial" w:eastAsia="Arial" w:hAnsi="Arial"/>
-          <w:sz w:val="22"/>
-          <w:szCs w:val="22"/>
-        </w:rPr>
-        <w:t xml:space="preserve"> — constraints, validations, calculated fields, default values, and any conditional logic that applies to this entity regardless of which process is interacting with it</w:t>
+        <w:t xml:space="preserve">Dynamic Logic Rules</w:t>
+      </w:r>
+      <w:r>
+        <w:rPr>
+          <w:rFonts w:ascii="Arial" w:cs="Arial" w:eastAsia="Arial" w:hAnsi="Arial"/>
+          <w:sz w:val="22"/>
+          <w:szCs w:val="22"/>
+        </w:rPr>
+        <w:t xml:space="preserve"> — consolidated visibility rules for type-specific fields and panels, grouped by discriminator value</w:t>
       </w:r>
     </w:p>
     <w:p>
@@ -2644,15 +2644,99 @@
           <w:sz w:val="22"/>
           <w:szCs w:val="22"/>
         </w:rPr>
-        <w:t xml:space="preserve">Lifecycle</w:t>
-      </w:r>
-      <w:r>
-        <w:rPr>
-          <w:rFonts w:ascii="Arial" w:cs="Arial" w:eastAsia="Arial" w:hAnsi="Arial"/>
-          <w:sz w:val="22"/>
-          <w:szCs w:val="22"/>
-        </w:rPr>
-        <w:t xml:space="preserve"> — if the entity has status transitions, the complete set of statuses and the allowed transitions between them, including what triggers each transition</w:t>
+        <w:t xml:space="preserve">Layout Guidance</w:t>
+      </w:r>
+      <w:r>
+        <w:rPr>
+          <w:rFonts w:ascii="Arial" w:cs="Arial" w:eastAsia="Arial" w:hAnsi="Arial"/>
+          <w:sz w:val="22"/>
+          <w:szCs w:val="22"/>
+        </w:rPr>
+        <w:t xml:space="preserve"> — suggested panel and tab grouping for the detail view, with notes on which panels are controlled by dynamic logic</w:t>
+      </w:r>
+    </w:p>
+    <w:p>
+      <w:pPr>
+        <w:pStyle w:val="ListParagraph"/>
+        <w:numPr>
+          <w:ilvl w:val="0"/>
+          <w:numId w:val="6"/>
+        </w:numPr>
+        <w:spacing w:after="80"/>
+      </w:pPr>
+      <w:r>
+        <w:rPr>
+          <w:rFonts w:ascii="Arial" w:cs="Arial" w:eastAsia="Arial" w:hAnsi="Arial"/>
+          <w:b/>
+          <w:bCs/>
+          <w:sz w:val="22"/>
+          <w:szCs w:val="22"/>
+        </w:rPr>
+        <w:t xml:space="preserve">Implementation Notes</w:t>
+      </w:r>
+      <w:r>
+        <w:rPr>
+          <w:rFonts w:ascii="Arial" w:cs="Arial" w:eastAsia="Arial" w:hAnsi="Arial"/>
+          <w:sz w:val="22"/>
+          <w:szCs w:val="22"/>
+        </w:rPr>
+        <w:t xml:space="preserve"> — calculated field formulas, access control restrictions, audited fields, system-populated fields, and other implementation details</w:t>
+      </w:r>
+    </w:p>
+    <w:p>
+      <w:pPr>
+        <w:pStyle w:val="ListParagraph"/>
+        <w:numPr>
+          <w:ilvl w:val="0"/>
+          <w:numId w:val="6"/>
+        </w:numPr>
+        <w:spacing w:after="80"/>
+      </w:pPr>
+      <w:r>
+        <w:rPr>
+          <w:rFonts w:ascii="Arial" w:cs="Arial" w:eastAsia="Arial" w:hAnsi="Arial"/>
+          <w:b/>
+          <w:bCs/>
+          <w:sz w:val="22"/>
+          <w:szCs w:val="22"/>
+        </w:rPr>
+        <w:t xml:space="preserve">Open Issues</w:t>
+      </w:r>
+      <w:r>
+        <w:rPr>
+          <w:rFonts w:ascii="Arial" w:cs="Arial" w:eastAsia="Arial" w:hAnsi="Arial"/>
+          <w:sz w:val="22"/>
+          <w:szCs w:val="22"/>
+        </w:rPr>
+        <w:t xml:space="preserve"> — unresolved questions specific to this entity’s implementation, including issues carried forward from the Entity Inventory</w:t>
+      </w:r>
+    </w:p>
+    <w:p>
+      <w:pPr>
+        <w:pStyle w:val="ListParagraph"/>
+        <w:numPr>
+          <w:ilvl w:val="0"/>
+          <w:numId w:val="6"/>
+        </w:numPr>
+        <w:spacing w:after="80"/>
+      </w:pPr>
+      <w:r>
+        <w:rPr>
+          <w:rFonts w:ascii="Arial" w:cs="Arial" w:eastAsia="Arial" w:hAnsi="Arial"/>
+          <w:b/>
+          <w:bCs/>
+          <w:sz w:val="22"/>
+          <w:szCs w:val="22"/>
+        </w:rPr>
+        <w:t xml:space="preserve">Decisions Made</w:t>
+      </w:r>
+      <w:r>
+        <w:rPr>
+          <w:rFonts w:ascii="Arial" w:cs="Arial" w:eastAsia="Arial" w:hAnsi="Arial"/>
+          <w:sz w:val="22"/>
+          <w:szCs w:val="22"/>
+        </w:rPr>
+        <w:t xml:space="preserve"> — decisions made during the entity definition session, with identifiers and rationale, including decisions that affect other Entity PRDs</w:t>
       </w:r>
     </w:p>
     <w:p>
@@ -2682,7 +2766,7 @@
           <w:sz w:val="22"/>
           <w:szCs w:val="22"/>
         </w:rPr>
-        <w:t xml:space="preserve">An Entity PRD is not complete until:</w:t>
+        <w:t xml:space="preserve">An Entity PRD is not complete until all nine sections are present and:</w:t>
       </w:r>
     </w:p>
     <w:p>
@@ -2736,7 +2820,7 @@
           <w:sz w:val="22"/>
           <w:szCs w:val="22"/>
         </w:rPr>
-        <w:t xml:space="preserve">All business rules are stated explicitly, not implied</w:t>
+        <w:t xml:space="preserve">All dynamic logic visibility rules are documented for type-specific fields</w:t>
       </w:r>
     </w:p>
     <w:p>
@@ -2754,7 +2838,7 @@
           <w:sz w:val="22"/>
           <w:szCs w:val="22"/>
         </w:rPr>
-        <w:t xml:space="preserve">The lifecycle section accounts for all status values referenced by the participating processes listed in the Entity Inventory</w:t>
+        <w:t xml:space="preserve">Native fields are clearly distinguished from custom fields so that YAML generation does not attempt to create fields that already exist on the platform</w:t>
       </w:r>
     </w:p>
     <w:p>
@@ -10541,7 +10625,7 @@
           <w:sz w:val="22"/>
           <w:szCs w:val="22"/>
         </w:rPr>
-        <w:t xml:space="preserve">This document defines the governing process for all CRM Builder document production. It replaces v1.2.</w:t>
+        <w:t xml:space="preserve">This document defines the governing process for all CRM Builder document production. It replaces v1.3.</w:t>
       </w:r>
     </w:p>
     <w:sectPr>

</xml_diff>

<commit_message>
Document Production Process v1.6: Add Cross-Domain Services
- New concept: Cross-Domain Services (Notes, Email, Calendar, Surveys)
  structurally parallel to domains but providing shared capabilities
- New Phase 4: Cross-Domain Service Definition (12 phases total)
- Services identified by full name, stored under PRDs/services/{SERVICE_NAME}/
- Master PRD Structure: new Cross-Domain Services section
- Identifier scheme: service names as prefix (e.g., NOTES-MANAGE-REQ-001)
- Document Language, Context Requirements, Key Design Decisions tables updated
- Document Hierarchy levels 5 and 6 broadened
- Scope Changes: new Section 10.6 for service discovery
- All phase numbers renumbered consistently throughout
</commit_message>
<xml_diff>
--- a/PRDs/process/CRM-Builder-Document-Production-Process.docx
+++ b/PRDs/process/CRM-Builder-Document-Production-Process.docx
@@ -121,7 +121,7 @@
                 <w:sz w:val="20"/>
                 <w:szCs w:val="20"/>
               </w:rPr>
-              <w:t xml:space="preserve">1.5</w:t>
+              <w:t xml:space="preserve">1.6</w:t>
             </w:r>
           </w:p>
         </w:tc>
@@ -251,7 +251,7 @@
                 <w:sz w:val="20"/>
                 <w:szCs w:val="20"/>
               </w:rPr>
-              <w:t xml:space="preserve">04-02-26 23:33</w:t>
+              <w:t xml:space="preserve">04-03-26 16:00</w:t>
             </w:r>
           </w:p>
         </w:tc>
@@ -316,7 +316,7 @@
                 <w:sz w:val="20"/>
                 <w:szCs w:val="20"/>
               </w:rPr>
-              <w:t xml:space="preserve">v1.4</w:t>
+              <w:t xml:space="preserve">v1.5</w:t>
             </w:r>
           </w:p>
         </w:tc>
@@ -425,24 +425,24 @@
           <w:sz w:val="22"/>
           <w:szCs w:val="22"/>
         </w:rPr>
-        <w:t xml:space="preserve">The process has eleven phases, executed in strict sequence. Each phase consists of one or more focused conversations with Claude, each producing a single deliverable.</w:t>
-      </w:r>
-    </w:p>
-    <w:p>
-      <w:pPr>
-        <w:spacing w:after="120"/>
-      </w:pPr>
-      <w:r>
-        <w:rPr>
-          <w:rFonts w:ascii="Arial" w:cs="Arial" w:eastAsia="Arial" w:hAnsi="Arial"/>
-          <w:b w:val="false"/>
-          <w:bCs w:val="false"/>
-          <w:i w:val="false"/>
-          <w:iCs w:val="false"/>
-          <w:sz w:val="22"/>
-          <w:szCs w:val="22"/>
-        </w:rPr>
-        <w:t xml:space="preserve">Phase 2 is performed once for the entire implementation. Phases 3, 4, and 5 repeat for each domain. The domain order is established in Phase 1.</w:t>
+        <w:t xml:space="preserve">The process has twelve phases, executed in strict sequence. Each phase consists of one or more focused conversations with Claude, each producing a single deliverable.</w:t>
+      </w:r>
+    </w:p>
+    <w:p>
+      <w:pPr>
+        <w:spacing w:after="120"/>
+      </w:pPr>
+      <w:r>
+        <w:rPr>
+          <w:rFonts w:ascii="Arial" w:cs="Arial" w:eastAsia="Arial" w:hAnsi="Arial"/>
+          <w:b w:val="false"/>
+          <w:bCs w:val="false"/>
+          <w:i w:val="false"/>
+          <w:iCs w:val="false"/>
+          <w:sz w:val="22"/>
+          <w:szCs w:val="22"/>
+        </w:rPr>
+        <w:t xml:space="preserve">Phase 2 is performed once for the entire implementation. Phases 3 and 4 repeat for each Cross-Domain Service. Phases 3, 5, and 6 repeat for each domain. Services should be processed before the domains that reference them when practical, but domain process documents may reference services generically based on the Master PRD descriptions without requiring the service’s full definition to be complete. The domain order is established in Phase 1.</w:t>
       </w:r>
     </w:p>
     <w:tbl>
@@ -989,7 +989,6 @@
               <w:bottom w:val="single" w:color="AAAAAA" w:sz="1"/>
               <w:right w:val="single" w:color="AAAAAA" w:sz="1"/>
             </w:tcBorders>
-            <w:shd w:fill="F2F7FB" w:val="clear"/>
             <w:tcMar>
               <w:top w:type="dxa" w:w="60"/>
               <w:left w:type="dxa" w:w="100"/>
@@ -1021,26 +1020,25 @@
               <w:bottom w:val="single" w:color="AAAAAA" w:sz="1"/>
               <w:right w:val="single" w:color="AAAAAA" w:sz="1"/>
             </w:tcBorders>
-            <w:shd w:fill="F2F7FB" w:val="clear"/>
-            <w:tcMar>
-              <w:top w:type="dxa" w:w="60"/>
-              <w:left w:type="dxa" w:w="100"/>
-              <w:bottom w:type="dxa" w:w="60"/>
-              <w:right w:type="dxa" w:w="100"/>
-            </w:tcMar>
-          </w:tcPr>
-          <w:p>
-            <w:r>
-              <w:rPr>
-                <w:rFonts w:ascii="Arial" w:cs="Arial" w:eastAsia="Arial" w:hAnsi="Arial"/>
-                <w:b w:val="false"/>
-                <w:bCs w:val="false"/>
-                <w:i w:val="false"/>
-                <w:iCs w:val="false"/>
-                <w:sz w:val="20"/>
-                <w:szCs w:val="20"/>
-              </w:rPr>
-              <w:t xml:space="preserve">Process Definition</w:t>
+            <w:tcMar>
+              <w:top w:type="dxa" w:w="60"/>
+              <w:left w:type="dxa" w:w="100"/>
+              <w:bottom w:type="dxa" w:w="60"/>
+              <w:right w:type="dxa" w:w="100"/>
+            </w:tcMar>
+          </w:tcPr>
+          <w:p>
+            <w:r>
+              <w:rPr>
+                <w:rFonts w:ascii="Arial" w:cs="Arial" w:eastAsia="Arial" w:hAnsi="Arial"/>
+                <w:b w:val="false"/>
+                <w:bCs w:val="false"/>
+                <w:i w:val="false"/>
+                <w:iCs w:val="false"/>
+                <w:sz w:val="20"/>
+                <w:szCs w:val="20"/>
+              </w:rPr>
+              <w:t xml:space="preserve">Cross-Domain Service Definition</w:t>
             </w:r>
           </w:p>
         </w:tc>
@@ -1053,26 +1051,25 @@
               <w:bottom w:val="single" w:color="AAAAAA" w:sz="1"/>
               <w:right w:val="single" w:color="AAAAAA" w:sz="1"/>
             </w:tcBorders>
-            <w:shd w:fill="F2F7FB" w:val="clear"/>
-            <w:tcMar>
-              <w:top w:type="dxa" w:w="60"/>
-              <w:left w:type="dxa" w:w="100"/>
-              <w:bottom w:type="dxa" w:w="60"/>
-              <w:right w:type="dxa" w:w="100"/>
-            </w:tcMar>
-          </w:tcPr>
-          <w:p>
-            <w:r>
-              <w:rPr>
-                <w:rFonts w:ascii="Arial" w:cs="Arial" w:eastAsia="Arial" w:hAnsi="Arial"/>
-                <w:b w:val="false"/>
-                <w:bCs w:val="false"/>
-                <w:i w:val="false"/>
-                <w:iCs w:val="false"/>
-                <w:sz w:val="20"/>
-                <w:szCs w:val="20"/>
-              </w:rPr>
-              <w:t xml:space="preserve">Process documents (Word)</w:t>
+            <w:tcMar>
+              <w:top w:type="dxa" w:w="60"/>
+              <w:left w:type="dxa" w:w="100"/>
+              <w:bottom w:type="dxa" w:w="60"/>
+              <w:right w:type="dxa" w:w="100"/>
+            </w:tcMar>
+          </w:tcPr>
+          <w:p>
+            <w:r>
+              <w:rPr>
+                <w:rFonts w:ascii="Arial" w:cs="Arial" w:eastAsia="Arial" w:hAnsi="Arial"/>
+                <w:b w:val="false"/>
+                <w:bCs w:val="false"/>
+                <w:i w:val="false"/>
+                <w:iCs w:val="false"/>
+                <w:sz w:val="20"/>
+                <w:szCs w:val="20"/>
+              </w:rPr>
+              <w:t xml:space="preserve">Service process documents + Service PRDs (Word)</w:t>
             </w:r>
           </w:p>
         </w:tc>
@@ -1085,26 +1082,25 @@
               <w:bottom w:val="single" w:color="AAAAAA" w:sz="1"/>
               <w:right w:val="single" w:color="AAAAAA" w:sz="1"/>
             </w:tcBorders>
-            <w:shd w:fill="F2F7FB" w:val="clear"/>
-            <w:tcMar>
-              <w:top w:type="dxa" w:w="60"/>
-              <w:left w:type="dxa" w:w="100"/>
-              <w:bottom w:type="dxa" w:w="60"/>
-              <w:right w:type="dxa" w:w="100"/>
-            </w:tcMar>
-          </w:tcPr>
-          <w:p>
-            <w:r>
-              <w:rPr>
-                <w:rFonts w:ascii="Arial" w:cs="Arial" w:eastAsia="Arial" w:hAnsi="Arial"/>
-                <w:b w:val="false"/>
-                <w:bCs w:val="false"/>
-                <w:i w:val="false"/>
-                <w:iCs w:val="false"/>
-                <w:sz w:val="20"/>
-                <w:szCs w:val="20"/>
-              </w:rPr>
-              <w:t xml:space="preserve">1 per business process</w:t>
+            <w:tcMar>
+              <w:top w:type="dxa" w:w="60"/>
+              <w:left w:type="dxa" w:w="100"/>
+              <w:bottom w:type="dxa" w:w="60"/>
+              <w:right w:type="dxa" w:w="100"/>
+            </w:tcMar>
+          </w:tcPr>
+          <w:p>
+            <w:r>
+              <w:rPr>
+                <w:rFonts w:ascii="Arial" w:cs="Arial" w:eastAsia="Arial" w:hAnsi="Arial"/>
+                <w:b w:val="false"/>
+                <w:bCs w:val="false"/>
+                <w:i w:val="false"/>
+                <w:iCs w:val="false"/>
+                <w:sz w:val="20"/>
+                <w:szCs w:val="20"/>
+              </w:rPr>
+              <w:t xml:space="preserve">1 per service process + 1 per service</w:t>
             </w:r>
           </w:p>
         </w:tc>
@@ -1119,6 +1115,7 @@
               <w:bottom w:val="single" w:color="AAAAAA" w:sz="1"/>
               <w:right w:val="single" w:color="AAAAAA" w:sz="1"/>
             </w:tcBorders>
+            <w:shd w:fill="F2F7FB" w:val="clear"/>
             <w:tcMar>
               <w:top w:type="dxa" w:w="60"/>
               <w:left w:type="dxa" w:w="100"/>
@@ -1150,25 +1147,26 @@
               <w:bottom w:val="single" w:color="AAAAAA" w:sz="1"/>
               <w:right w:val="single" w:color="AAAAAA" w:sz="1"/>
             </w:tcBorders>
-            <w:tcMar>
-              <w:top w:type="dxa" w:w="60"/>
-              <w:left w:type="dxa" w:w="100"/>
-              <w:bottom w:type="dxa" w:w="60"/>
-              <w:right w:type="dxa" w:w="100"/>
-            </w:tcMar>
-          </w:tcPr>
-          <w:p>
-            <w:r>
-              <w:rPr>
-                <w:rFonts w:ascii="Arial" w:cs="Arial" w:eastAsia="Arial" w:hAnsi="Arial"/>
-                <w:b w:val="false"/>
-                <w:bCs w:val="false"/>
-                <w:i w:val="false"/>
-                <w:iCs w:val="false"/>
-                <w:sz w:val="20"/>
-                <w:szCs w:val="20"/>
-              </w:rPr>
-              <w:t xml:space="preserve">Domain Reconciliation</w:t>
+            <w:shd w:fill="F2F7FB" w:val="clear"/>
+            <w:tcMar>
+              <w:top w:type="dxa" w:w="60"/>
+              <w:left w:type="dxa" w:w="100"/>
+              <w:bottom w:type="dxa" w:w="60"/>
+              <w:right w:type="dxa" w:w="100"/>
+            </w:tcMar>
+          </w:tcPr>
+          <w:p>
+            <w:r>
+              <w:rPr>
+                <w:rFonts w:ascii="Arial" w:cs="Arial" w:eastAsia="Arial" w:hAnsi="Arial"/>
+                <w:b w:val="false"/>
+                <w:bCs w:val="false"/>
+                <w:i w:val="false"/>
+                <w:iCs w:val="false"/>
+                <w:sz w:val="20"/>
+                <w:szCs w:val="20"/>
+              </w:rPr>
+              <w:t xml:space="preserve">Process Definition</w:t>
             </w:r>
           </w:p>
         </w:tc>
@@ -1181,25 +1179,26 @@
               <w:bottom w:val="single" w:color="AAAAAA" w:sz="1"/>
               <w:right w:val="single" w:color="AAAAAA" w:sz="1"/>
             </w:tcBorders>
-            <w:tcMar>
-              <w:top w:type="dxa" w:w="60"/>
-              <w:left w:type="dxa" w:w="100"/>
-              <w:bottom w:type="dxa" w:w="60"/>
-              <w:right w:type="dxa" w:w="100"/>
-            </w:tcMar>
-          </w:tcPr>
-          <w:p>
-            <w:r>
-              <w:rPr>
-                <w:rFonts w:ascii="Arial" w:cs="Arial" w:eastAsia="Arial" w:hAnsi="Arial"/>
-                <w:b w:val="false"/>
-                <w:bCs w:val="false"/>
-                <w:i w:val="false"/>
-                <w:iCs w:val="false"/>
-                <w:sz w:val="20"/>
-                <w:szCs w:val="20"/>
-              </w:rPr>
-              <w:t xml:space="preserve">Domain PRDs (Word)</w:t>
+            <w:shd w:fill="F2F7FB" w:val="clear"/>
+            <w:tcMar>
+              <w:top w:type="dxa" w:w="60"/>
+              <w:left w:type="dxa" w:w="100"/>
+              <w:bottom w:type="dxa" w:w="60"/>
+              <w:right w:type="dxa" w:w="100"/>
+            </w:tcMar>
+          </w:tcPr>
+          <w:p>
+            <w:r>
+              <w:rPr>
+                <w:rFonts w:ascii="Arial" w:cs="Arial" w:eastAsia="Arial" w:hAnsi="Arial"/>
+                <w:b w:val="false"/>
+                <w:bCs w:val="false"/>
+                <w:i w:val="false"/>
+                <w:iCs w:val="false"/>
+                <w:sz w:val="20"/>
+                <w:szCs w:val="20"/>
+              </w:rPr>
+              <w:t xml:space="preserve">Process documents (Word)</w:t>
             </w:r>
           </w:p>
         </w:tc>
@@ -1212,25 +1211,26 @@
               <w:bottom w:val="single" w:color="AAAAAA" w:sz="1"/>
               <w:right w:val="single" w:color="AAAAAA" w:sz="1"/>
             </w:tcBorders>
-            <w:tcMar>
-              <w:top w:type="dxa" w:w="60"/>
-              <w:left w:type="dxa" w:w="100"/>
-              <w:bottom w:type="dxa" w:w="60"/>
-              <w:right w:type="dxa" w:w="100"/>
-            </w:tcMar>
-          </w:tcPr>
-          <w:p>
-            <w:r>
-              <w:rPr>
-                <w:rFonts w:ascii="Arial" w:cs="Arial" w:eastAsia="Arial" w:hAnsi="Arial"/>
-                <w:b w:val="false"/>
-                <w:bCs w:val="false"/>
-                <w:i w:val="false"/>
-                <w:iCs w:val="false"/>
-                <w:sz w:val="20"/>
-                <w:szCs w:val="20"/>
-              </w:rPr>
-              <w:t xml:space="preserve">1 per domain</w:t>
+            <w:shd w:fill="F2F7FB" w:val="clear"/>
+            <w:tcMar>
+              <w:top w:type="dxa" w:w="60"/>
+              <w:left w:type="dxa" w:w="100"/>
+              <w:bottom w:type="dxa" w:w="60"/>
+              <w:right w:type="dxa" w:w="100"/>
+            </w:tcMar>
+          </w:tcPr>
+          <w:p>
+            <w:r>
+              <w:rPr>
+                <w:rFonts w:ascii="Arial" w:cs="Arial" w:eastAsia="Arial" w:hAnsi="Arial"/>
+                <w:b w:val="false"/>
+                <w:bCs w:val="false"/>
+                <w:i w:val="false"/>
+                <w:iCs w:val="false"/>
+                <w:sz w:val="20"/>
+                <w:szCs w:val="20"/>
+              </w:rPr>
+              <w:t xml:space="preserve">1 per business process</w:t>
             </w:r>
           </w:p>
         </w:tc>
@@ -1245,7 +1245,6 @@
               <w:bottom w:val="single" w:color="AAAAAA" w:sz="1"/>
               <w:right w:val="single" w:color="AAAAAA" w:sz="1"/>
             </w:tcBorders>
-            <w:shd w:fill="F2F7FB" w:val="clear"/>
             <w:tcMar>
               <w:top w:type="dxa" w:w="60"/>
               <w:left w:type="dxa" w:w="100"/>
@@ -1277,26 +1276,25 @@
               <w:bottom w:val="single" w:color="AAAAAA" w:sz="1"/>
               <w:right w:val="single" w:color="AAAAAA" w:sz="1"/>
             </w:tcBorders>
-            <w:shd w:fill="F2F7FB" w:val="clear"/>
-            <w:tcMar>
-              <w:top w:type="dxa" w:w="60"/>
-              <w:left w:type="dxa" w:w="100"/>
-              <w:bottom w:type="dxa" w:w="60"/>
-              <w:right w:type="dxa" w:w="100"/>
-            </w:tcMar>
-          </w:tcPr>
-          <w:p>
-            <w:r>
-              <w:rPr>
-                <w:rFonts w:ascii="Arial" w:cs="Arial" w:eastAsia="Arial" w:hAnsi="Arial"/>
-                <w:b w:val="false"/>
-                <w:bCs w:val="false"/>
-                <w:i w:val="false"/>
-                <w:iCs w:val="false"/>
-                <w:sz w:val="20"/>
-                <w:szCs w:val="20"/>
-              </w:rPr>
-              <w:t xml:space="preserve">Stakeholder Review</w:t>
+            <w:tcMar>
+              <w:top w:type="dxa" w:w="60"/>
+              <w:left w:type="dxa" w:w="100"/>
+              <w:bottom w:type="dxa" w:w="60"/>
+              <w:right w:type="dxa" w:w="100"/>
+            </w:tcMar>
+          </w:tcPr>
+          <w:p>
+            <w:r>
+              <w:rPr>
+                <w:rFonts w:ascii="Arial" w:cs="Arial" w:eastAsia="Arial" w:hAnsi="Arial"/>
+                <w:b w:val="false"/>
+                <w:bCs w:val="false"/>
+                <w:i w:val="false"/>
+                <w:iCs w:val="false"/>
+                <w:sz w:val="20"/>
+                <w:szCs w:val="20"/>
+              </w:rPr>
+              <w:t xml:space="preserve">Domain Reconciliation</w:t>
             </w:r>
           </w:p>
         </w:tc>
@@ -1309,26 +1307,25 @@
               <w:bottom w:val="single" w:color="AAAAAA" w:sz="1"/>
               <w:right w:val="single" w:color="AAAAAA" w:sz="1"/>
             </w:tcBorders>
-            <w:shd w:fill="F2F7FB" w:val="clear"/>
-            <w:tcMar>
-              <w:top w:type="dxa" w:w="60"/>
-              <w:left w:type="dxa" w:w="100"/>
-              <w:bottom w:type="dxa" w:w="60"/>
-              <w:right w:type="dxa" w:w="100"/>
-            </w:tcMar>
-          </w:tcPr>
-          <w:p>
-            <w:r>
-              <w:rPr>
-                <w:rFonts w:ascii="Arial" w:cs="Arial" w:eastAsia="Arial" w:hAnsi="Arial"/>
-                <w:b w:val="false"/>
-                <w:bCs w:val="false"/>
-                <w:i w:val="false"/>
-                <w:iCs w:val="false"/>
-                <w:sz w:val="20"/>
-                <w:szCs w:val="20"/>
-              </w:rPr>
-              <w:t xml:space="preserve">Approved Domain PRDs</w:t>
+            <w:tcMar>
+              <w:top w:type="dxa" w:w="60"/>
+              <w:left w:type="dxa" w:w="100"/>
+              <w:bottom w:type="dxa" w:w="60"/>
+              <w:right w:type="dxa" w:w="100"/>
+            </w:tcMar>
+          </w:tcPr>
+          <w:p>
+            <w:r>
+              <w:rPr>
+                <w:rFonts w:ascii="Arial" w:cs="Arial" w:eastAsia="Arial" w:hAnsi="Arial"/>
+                <w:b w:val="false"/>
+                <w:bCs w:val="false"/>
+                <w:i w:val="false"/>
+                <w:iCs w:val="false"/>
+                <w:sz w:val="20"/>
+                <w:szCs w:val="20"/>
+              </w:rPr>
+              <w:t xml:space="preserve">Domain PRDs (Word)</w:t>
             </w:r>
           </w:p>
         </w:tc>
@@ -1341,26 +1338,25 @@
               <w:bottom w:val="single" w:color="AAAAAA" w:sz="1"/>
               <w:right w:val="single" w:color="AAAAAA" w:sz="1"/>
             </w:tcBorders>
-            <w:shd w:fill="F2F7FB" w:val="clear"/>
-            <w:tcMar>
-              <w:top w:type="dxa" w:w="60"/>
-              <w:left w:type="dxa" w:w="100"/>
-              <w:bottom w:type="dxa" w:w="60"/>
-              <w:right w:type="dxa" w:w="100"/>
-            </w:tcMar>
-          </w:tcPr>
-          <w:p>
-            <w:r>
-              <w:rPr>
-                <w:rFonts w:ascii="Arial" w:cs="Arial" w:eastAsia="Arial" w:hAnsi="Arial"/>
-                <w:b w:val="false"/>
-                <w:bCs w:val="false"/>
-                <w:i w:val="false"/>
-                <w:iCs w:val="false"/>
-                <w:sz w:val="20"/>
-                <w:szCs w:val="20"/>
-              </w:rPr>
-              <w:t xml:space="preserve">Outside Claude</w:t>
+            <w:tcMar>
+              <w:top w:type="dxa" w:w="60"/>
+              <w:left w:type="dxa" w:w="100"/>
+              <w:bottom w:type="dxa" w:w="60"/>
+              <w:right w:type="dxa" w:w="100"/>
+            </w:tcMar>
+          </w:tcPr>
+          <w:p>
+            <w:r>
+              <w:rPr>
+                <w:rFonts w:ascii="Arial" w:cs="Arial" w:eastAsia="Arial" w:hAnsi="Arial"/>
+                <w:b w:val="false"/>
+                <w:bCs w:val="false"/>
+                <w:i w:val="false"/>
+                <w:iCs w:val="false"/>
+                <w:sz w:val="20"/>
+                <w:szCs w:val="20"/>
+              </w:rPr>
+              <w:t xml:space="preserve">1 per domain</w:t>
             </w:r>
           </w:p>
         </w:tc>
@@ -1375,6 +1371,7 @@
               <w:bottom w:val="single" w:color="AAAAAA" w:sz="1"/>
               <w:right w:val="single" w:color="AAAAAA" w:sz="1"/>
             </w:tcBorders>
+            <w:shd w:fill="F2F7FB" w:val="clear"/>
             <w:tcMar>
               <w:top w:type="dxa" w:w="60"/>
               <w:left w:type="dxa" w:w="100"/>
@@ -1406,25 +1403,26 @@
               <w:bottom w:val="single" w:color="AAAAAA" w:sz="1"/>
               <w:right w:val="single" w:color="AAAAAA" w:sz="1"/>
             </w:tcBorders>
-            <w:tcMar>
-              <w:top w:type="dxa" w:w="60"/>
-              <w:left w:type="dxa" w:w="100"/>
-              <w:bottom w:type="dxa" w:w="60"/>
-              <w:right w:type="dxa" w:w="100"/>
-            </w:tcMar>
-          </w:tcPr>
-          <w:p>
-            <w:r>
-              <w:rPr>
-                <w:rFonts w:ascii="Arial" w:cs="Arial" w:eastAsia="Arial" w:hAnsi="Arial"/>
-                <w:b w:val="false"/>
-                <w:bCs w:val="false"/>
-                <w:i w:val="false"/>
-                <w:iCs w:val="false"/>
-                <w:sz w:val="20"/>
-                <w:szCs w:val="20"/>
-              </w:rPr>
-              <w:t xml:space="preserve">YAML Generation</w:t>
+            <w:shd w:fill="F2F7FB" w:val="clear"/>
+            <w:tcMar>
+              <w:top w:type="dxa" w:w="60"/>
+              <w:left w:type="dxa" w:w="100"/>
+              <w:bottom w:type="dxa" w:w="60"/>
+              <w:right w:type="dxa" w:w="100"/>
+            </w:tcMar>
+          </w:tcPr>
+          <w:p>
+            <w:r>
+              <w:rPr>
+                <w:rFonts w:ascii="Arial" w:cs="Arial" w:eastAsia="Arial" w:hAnsi="Arial"/>
+                <w:b w:val="false"/>
+                <w:bCs w:val="false"/>
+                <w:i w:val="false"/>
+                <w:iCs w:val="false"/>
+                <w:sz w:val="20"/>
+                <w:szCs w:val="20"/>
+              </w:rPr>
+              <w:t xml:space="preserve">Stakeholder Review</w:t>
             </w:r>
           </w:p>
         </w:tc>
@@ -1437,25 +1435,26 @@
               <w:bottom w:val="single" w:color="AAAAAA" w:sz="1"/>
               <w:right w:val="single" w:color="AAAAAA" w:sz="1"/>
             </w:tcBorders>
-            <w:tcMar>
-              <w:top w:type="dxa" w:w="60"/>
-              <w:left w:type="dxa" w:w="100"/>
-              <w:bottom w:type="dxa" w:w="60"/>
-              <w:right w:type="dxa" w:w="100"/>
-            </w:tcMar>
-          </w:tcPr>
-          <w:p>
-            <w:r>
-              <w:rPr>
-                <w:rFonts w:ascii="Arial" w:cs="Arial" w:eastAsia="Arial" w:hAnsi="Arial"/>
-                <w:b w:val="false"/>
-                <w:bCs w:val="false"/>
-                <w:i w:val="false"/>
-                <w:iCs w:val="false"/>
-                <w:sz w:val="20"/>
-                <w:szCs w:val="20"/>
-              </w:rPr>
-              <w:t xml:space="preserve">YAML program files</w:t>
+            <w:shd w:fill="F2F7FB" w:val="clear"/>
+            <w:tcMar>
+              <w:top w:type="dxa" w:w="60"/>
+              <w:left w:type="dxa" w:w="100"/>
+              <w:bottom w:type="dxa" w:w="60"/>
+              <w:right w:type="dxa" w:w="100"/>
+            </w:tcMar>
+          </w:tcPr>
+          <w:p>
+            <w:r>
+              <w:rPr>
+                <w:rFonts w:ascii="Arial" w:cs="Arial" w:eastAsia="Arial" w:hAnsi="Arial"/>
+                <w:b w:val="false"/>
+                <w:bCs w:val="false"/>
+                <w:i w:val="false"/>
+                <w:iCs w:val="false"/>
+                <w:sz w:val="20"/>
+                <w:szCs w:val="20"/>
+              </w:rPr>
+              <w:t xml:space="preserve">Approved Domain PRDs</w:t>
             </w:r>
           </w:p>
         </w:tc>
@@ -1468,25 +1467,26 @@
               <w:bottom w:val="single" w:color="AAAAAA" w:sz="1"/>
               <w:right w:val="single" w:color="AAAAAA" w:sz="1"/>
             </w:tcBorders>
-            <w:tcMar>
-              <w:top w:type="dxa" w:w="60"/>
-              <w:left w:type="dxa" w:w="100"/>
-              <w:bottom w:type="dxa" w:w="60"/>
-              <w:right w:type="dxa" w:w="100"/>
-            </w:tcMar>
-          </w:tcPr>
-          <w:p>
-            <w:r>
-              <w:rPr>
-                <w:rFonts w:ascii="Arial" w:cs="Arial" w:eastAsia="Arial" w:hAnsi="Arial"/>
-                <w:b w:val="false"/>
-                <w:bCs w:val="false"/>
-                <w:i w:val="false"/>
-                <w:iCs w:val="false"/>
-                <w:sz w:val="20"/>
-                <w:szCs w:val="20"/>
-              </w:rPr>
-              <w:t xml:space="preserve">1 per domain</w:t>
+            <w:shd w:fill="F2F7FB" w:val="clear"/>
+            <w:tcMar>
+              <w:top w:type="dxa" w:w="60"/>
+              <w:left w:type="dxa" w:w="100"/>
+              <w:bottom w:type="dxa" w:w="60"/>
+              <w:right w:type="dxa" w:w="100"/>
+            </w:tcMar>
+          </w:tcPr>
+          <w:p>
+            <w:r>
+              <w:rPr>
+                <w:rFonts w:ascii="Arial" w:cs="Arial" w:eastAsia="Arial" w:hAnsi="Arial"/>
+                <w:b w:val="false"/>
+                <w:bCs w:val="false"/>
+                <w:i w:val="false"/>
+                <w:iCs w:val="false"/>
+                <w:sz w:val="20"/>
+                <w:szCs w:val="20"/>
+              </w:rPr>
+              <w:t xml:space="preserve">Outside Claude</w:t>
             </w:r>
           </w:p>
         </w:tc>
@@ -1501,7 +1501,6 @@
               <w:bottom w:val="single" w:color="AAAAAA" w:sz="1"/>
               <w:right w:val="single" w:color="AAAAAA" w:sz="1"/>
             </w:tcBorders>
-            <w:shd w:fill="F2F7FB" w:val="clear"/>
             <w:tcMar>
               <w:top w:type="dxa" w:w="60"/>
               <w:left w:type="dxa" w:w="100"/>
@@ -1533,26 +1532,25 @@
               <w:bottom w:val="single" w:color="AAAAAA" w:sz="1"/>
               <w:right w:val="single" w:color="AAAAAA" w:sz="1"/>
             </w:tcBorders>
-            <w:shd w:fill="F2F7FB" w:val="clear"/>
-            <w:tcMar>
-              <w:top w:type="dxa" w:w="60"/>
-              <w:left w:type="dxa" w:w="100"/>
-              <w:bottom w:type="dxa" w:w="60"/>
-              <w:right w:type="dxa" w:w="100"/>
-            </w:tcMar>
-          </w:tcPr>
-          <w:p>
-            <w:r>
-              <w:rPr>
-                <w:rFonts w:ascii="Arial" w:cs="Arial" w:eastAsia="Arial" w:hAnsi="Arial"/>
-                <w:b w:val="false"/>
-                <w:bCs w:val="false"/>
-                <w:i w:val="false"/>
-                <w:iCs w:val="false"/>
-                <w:sz w:val="20"/>
-                <w:szCs w:val="20"/>
-              </w:rPr>
-              <w:t xml:space="preserve">CRM Selection</w:t>
+            <w:tcMar>
+              <w:top w:type="dxa" w:w="60"/>
+              <w:left w:type="dxa" w:w="100"/>
+              <w:bottom w:type="dxa" w:w="60"/>
+              <w:right w:type="dxa" w:w="100"/>
+            </w:tcMar>
+          </w:tcPr>
+          <w:p>
+            <w:r>
+              <w:rPr>
+                <w:rFonts w:ascii="Arial" w:cs="Arial" w:eastAsia="Arial" w:hAnsi="Arial"/>
+                <w:b w:val="false"/>
+                <w:bCs w:val="false"/>
+                <w:i w:val="false"/>
+                <w:iCs w:val="false"/>
+                <w:sz w:val="20"/>
+                <w:szCs w:val="20"/>
+              </w:rPr>
+              <w:t xml:space="preserve">YAML Generation</w:t>
             </w:r>
           </w:p>
         </w:tc>
@@ -1565,26 +1563,25 @@
               <w:bottom w:val="single" w:color="AAAAAA" w:sz="1"/>
               <w:right w:val="single" w:color="AAAAAA" w:sz="1"/>
             </w:tcBorders>
-            <w:shd w:fill="F2F7FB" w:val="clear"/>
-            <w:tcMar>
-              <w:top w:type="dxa" w:w="60"/>
-              <w:left w:type="dxa" w:w="100"/>
-              <w:bottom w:type="dxa" w:w="60"/>
-              <w:right w:type="dxa" w:w="100"/>
-            </w:tcMar>
-          </w:tcPr>
-          <w:p>
-            <w:r>
-              <w:rPr>
-                <w:rFonts w:ascii="Arial" w:cs="Arial" w:eastAsia="Arial" w:hAnsi="Arial"/>
-                <w:b w:val="false"/>
-                <w:bCs w:val="false"/>
-                <w:i w:val="false"/>
-                <w:iCs w:val="false"/>
-                <w:sz w:val="20"/>
-                <w:szCs w:val="20"/>
-              </w:rPr>
-              <w:t xml:space="preserve">CRM Evaluation Report (Word)</w:t>
+            <w:tcMar>
+              <w:top w:type="dxa" w:w="60"/>
+              <w:left w:type="dxa" w:w="100"/>
+              <w:bottom w:type="dxa" w:w="60"/>
+              <w:right w:type="dxa" w:w="100"/>
+            </w:tcMar>
+          </w:tcPr>
+          <w:p>
+            <w:r>
+              <w:rPr>
+                <w:rFonts w:ascii="Arial" w:cs="Arial" w:eastAsia="Arial" w:hAnsi="Arial"/>
+                <w:b w:val="false"/>
+                <w:bCs w:val="false"/>
+                <w:i w:val="false"/>
+                <w:iCs w:val="false"/>
+                <w:sz w:val="20"/>
+                <w:szCs w:val="20"/>
+              </w:rPr>
+              <w:t xml:space="preserve">YAML program files</w:t>
             </w:r>
           </w:p>
         </w:tc>
@@ -1597,26 +1594,25 @@
               <w:bottom w:val="single" w:color="AAAAAA" w:sz="1"/>
               <w:right w:val="single" w:color="AAAAAA" w:sz="1"/>
             </w:tcBorders>
-            <w:shd w:fill="F2F7FB" w:val="clear"/>
-            <w:tcMar>
-              <w:top w:type="dxa" w:w="60"/>
-              <w:left w:type="dxa" w:w="100"/>
-              <w:bottom w:type="dxa" w:w="60"/>
-              <w:right w:type="dxa" w:w="100"/>
-            </w:tcMar>
-          </w:tcPr>
-          <w:p>
-            <w:r>
-              <w:rPr>
-                <w:rFonts w:ascii="Arial" w:cs="Arial" w:eastAsia="Arial" w:hAnsi="Arial"/>
-                <w:b w:val="false"/>
-                <w:bCs w:val="false"/>
-                <w:i w:val="false"/>
-                <w:iCs w:val="false"/>
-                <w:sz w:val="20"/>
-                <w:szCs w:val="20"/>
-              </w:rPr>
-              <w:t xml:space="preserve">1</w:t>
+            <w:tcMar>
+              <w:top w:type="dxa" w:w="60"/>
+              <w:left w:type="dxa" w:w="100"/>
+              <w:bottom w:type="dxa" w:w="60"/>
+              <w:right w:type="dxa" w:w="100"/>
+            </w:tcMar>
+          </w:tcPr>
+          <w:p>
+            <w:r>
+              <w:rPr>
+                <w:rFonts w:ascii="Arial" w:cs="Arial" w:eastAsia="Arial" w:hAnsi="Arial"/>
+                <w:b w:val="false"/>
+                <w:bCs w:val="false"/>
+                <w:i w:val="false"/>
+                <w:iCs w:val="false"/>
+                <w:sz w:val="20"/>
+                <w:szCs w:val="20"/>
+              </w:rPr>
+              <w:t xml:space="preserve">1 per domain</w:t>
             </w:r>
           </w:p>
         </w:tc>
@@ -1631,6 +1627,7 @@
               <w:bottom w:val="single" w:color="AAAAAA" w:sz="1"/>
               <w:right w:val="single" w:color="AAAAAA" w:sz="1"/>
             </w:tcBorders>
+            <w:shd w:fill="F2F7FB" w:val="clear"/>
             <w:tcMar>
               <w:top w:type="dxa" w:w="60"/>
               <w:left w:type="dxa" w:w="100"/>
@@ -1662,25 +1659,26 @@
               <w:bottom w:val="single" w:color="AAAAAA" w:sz="1"/>
               <w:right w:val="single" w:color="AAAAAA" w:sz="1"/>
             </w:tcBorders>
-            <w:tcMar>
-              <w:top w:type="dxa" w:w="60"/>
-              <w:left w:type="dxa" w:w="100"/>
-              <w:bottom w:type="dxa" w:w="60"/>
-              <w:right w:type="dxa" w:w="100"/>
-            </w:tcMar>
-          </w:tcPr>
-          <w:p>
-            <w:r>
-              <w:rPr>
-                <w:rFonts w:ascii="Arial" w:cs="Arial" w:eastAsia="Arial" w:hAnsi="Arial"/>
-                <w:b w:val="false"/>
-                <w:bCs w:val="false"/>
-                <w:i w:val="false"/>
-                <w:iCs w:val="false"/>
-                <w:sz w:val="20"/>
-                <w:szCs w:val="20"/>
-              </w:rPr>
-              <w:t xml:space="preserve">CRM Deployment</w:t>
+            <w:shd w:fill="F2F7FB" w:val="clear"/>
+            <w:tcMar>
+              <w:top w:type="dxa" w:w="60"/>
+              <w:left w:type="dxa" w:w="100"/>
+              <w:bottom w:type="dxa" w:w="60"/>
+              <w:right w:type="dxa" w:w="100"/>
+            </w:tcMar>
+          </w:tcPr>
+          <w:p>
+            <w:r>
+              <w:rPr>
+                <w:rFonts w:ascii="Arial" w:cs="Arial" w:eastAsia="Arial" w:hAnsi="Arial"/>
+                <w:b w:val="false"/>
+                <w:bCs w:val="false"/>
+                <w:i w:val="false"/>
+                <w:iCs w:val="false"/>
+                <w:sz w:val="20"/>
+                <w:szCs w:val="20"/>
+              </w:rPr>
+              <w:t xml:space="preserve">CRM Selection</w:t>
             </w:r>
           </w:p>
         </w:tc>
@@ -1693,25 +1691,26 @@
               <w:bottom w:val="single" w:color="AAAAAA" w:sz="1"/>
               <w:right w:val="single" w:color="AAAAAA" w:sz="1"/>
             </w:tcBorders>
-            <w:tcMar>
-              <w:top w:type="dxa" w:w="60"/>
-              <w:left w:type="dxa" w:w="100"/>
-              <w:bottom w:type="dxa" w:w="60"/>
-              <w:right w:type="dxa" w:w="100"/>
-            </w:tcMar>
-          </w:tcPr>
-          <w:p>
-            <w:r>
-              <w:rPr>
-                <w:rFonts w:ascii="Arial" w:cs="Arial" w:eastAsia="Arial" w:hAnsi="Arial"/>
-                <w:b w:val="false"/>
-                <w:bCs w:val="false"/>
-                <w:i w:val="false"/>
-                <w:iCs w:val="false"/>
-                <w:sz w:val="20"/>
-                <w:szCs w:val="20"/>
-              </w:rPr>
-              <w:t xml:space="preserve">Deployed CRM instance</w:t>
+            <w:shd w:fill="F2F7FB" w:val="clear"/>
+            <w:tcMar>
+              <w:top w:type="dxa" w:w="60"/>
+              <w:left w:type="dxa" w:w="100"/>
+              <w:bottom w:type="dxa" w:w="60"/>
+              <w:right w:type="dxa" w:w="100"/>
+            </w:tcMar>
+          </w:tcPr>
+          <w:p>
+            <w:r>
+              <w:rPr>
+                <w:rFonts w:ascii="Arial" w:cs="Arial" w:eastAsia="Arial" w:hAnsi="Arial"/>
+                <w:b w:val="false"/>
+                <w:bCs w:val="false"/>
+                <w:i w:val="false"/>
+                <w:iCs w:val="false"/>
+                <w:sz w:val="20"/>
+                <w:szCs w:val="20"/>
+              </w:rPr>
+              <w:t xml:space="preserve">CRM Evaluation Report (Word)</w:t>
             </w:r>
           </w:p>
         </w:tc>
@@ -1724,25 +1723,26 @@
               <w:bottom w:val="single" w:color="AAAAAA" w:sz="1"/>
               <w:right w:val="single" w:color="AAAAAA" w:sz="1"/>
             </w:tcBorders>
-            <w:tcMar>
-              <w:top w:type="dxa" w:w="60"/>
-              <w:left w:type="dxa" w:w="100"/>
-              <w:bottom w:type="dxa" w:w="60"/>
-              <w:right w:type="dxa" w:w="100"/>
-            </w:tcMar>
-          </w:tcPr>
-          <w:p>
-            <w:r>
-              <w:rPr>
-                <w:rFonts w:ascii="Arial" w:cs="Arial" w:eastAsia="Arial" w:hAnsi="Arial"/>
-                <w:b w:val="false"/>
-                <w:bCs w:val="false"/>
-                <w:i w:val="false"/>
-                <w:iCs w:val="false"/>
-                <w:sz w:val="20"/>
-                <w:szCs w:val="20"/>
-              </w:rPr>
-              <w:t xml:space="preserve">None — administrator-driven</w:t>
+            <w:shd w:fill="F2F7FB" w:val="clear"/>
+            <w:tcMar>
+              <w:top w:type="dxa" w:w="60"/>
+              <w:left w:type="dxa" w:w="100"/>
+              <w:bottom w:type="dxa" w:w="60"/>
+              <w:right w:type="dxa" w:w="100"/>
+            </w:tcMar>
+          </w:tcPr>
+          <w:p>
+            <w:r>
+              <w:rPr>
+                <w:rFonts w:ascii="Arial" w:cs="Arial" w:eastAsia="Arial" w:hAnsi="Arial"/>
+                <w:b w:val="false"/>
+                <w:bCs w:val="false"/>
+                <w:i w:val="false"/>
+                <w:iCs w:val="false"/>
+                <w:sz w:val="20"/>
+                <w:szCs w:val="20"/>
+              </w:rPr>
+              <w:t xml:space="preserve">1</w:t>
             </w:r>
           </w:p>
         </w:tc>
@@ -1757,7 +1757,6 @@
               <w:bottom w:val="single" w:color="AAAAAA" w:sz="1"/>
               <w:right w:val="single" w:color="AAAAAA" w:sz="1"/>
             </w:tcBorders>
-            <w:shd w:fill="F2F7FB" w:val="clear"/>
             <w:tcMar>
               <w:top w:type="dxa" w:w="60"/>
               <w:left w:type="dxa" w:w="100"/>
@@ -1789,26 +1788,25 @@
               <w:bottom w:val="single" w:color="AAAAAA" w:sz="1"/>
               <w:right w:val="single" w:color="AAAAAA" w:sz="1"/>
             </w:tcBorders>
-            <w:shd w:fill="F2F7FB" w:val="clear"/>
-            <w:tcMar>
-              <w:top w:type="dxa" w:w="60"/>
-              <w:left w:type="dxa" w:w="100"/>
-              <w:bottom w:type="dxa" w:w="60"/>
-              <w:right w:type="dxa" w:w="100"/>
-            </w:tcMar>
-          </w:tcPr>
-          <w:p>
-            <w:r>
-              <w:rPr>
-                <w:rFonts w:ascii="Arial" w:cs="Arial" w:eastAsia="Arial" w:hAnsi="Arial"/>
-                <w:b w:val="false"/>
-                <w:bCs w:val="false"/>
-                <w:i w:val="false"/>
-                <w:iCs w:val="false"/>
-                <w:sz w:val="20"/>
-                <w:szCs w:val="20"/>
-              </w:rPr>
-              <w:t xml:space="preserve">CRM Configuration</w:t>
+            <w:tcMar>
+              <w:top w:type="dxa" w:w="60"/>
+              <w:left w:type="dxa" w:w="100"/>
+              <w:bottom w:type="dxa" w:w="60"/>
+              <w:right w:type="dxa" w:w="100"/>
+            </w:tcMar>
+          </w:tcPr>
+          <w:p>
+            <w:r>
+              <w:rPr>
+                <w:rFonts w:ascii="Arial" w:cs="Arial" w:eastAsia="Arial" w:hAnsi="Arial"/>
+                <w:b w:val="false"/>
+                <w:bCs w:val="false"/>
+                <w:i w:val="false"/>
+                <w:iCs w:val="false"/>
+                <w:sz w:val="20"/>
+                <w:szCs w:val="20"/>
+              </w:rPr>
+              <w:t xml:space="preserve">CRM Deployment</w:t>
             </w:r>
           </w:p>
         </w:tc>
@@ -1821,26 +1819,25 @@
               <w:bottom w:val="single" w:color="AAAAAA" w:sz="1"/>
               <w:right w:val="single" w:color="AAAAAA" w:sz="1"/>
             </w:tcBorders>
-            <w:shd w:fill="F2F7FB" w:val="clear"/>
-            <w:tcMar>
-              <w:top w:type="dxa" w:w="60"/>
-              <w:left w:type="dxa" w:w="100"/>
-              <w:bottom w:type="dxa" w:w="60"/>
-              <w:right w:type="dxa" w:w="100"/>
-            </w:tcMar>
-          </w:tcPr>
-          <w:p>
-            <w:r>
-              <w:rPr>
-                <w:rFonts w:ascii="Arial" w:cs="Arial" w:eastAsia="Arial" w:hAnsi="Arial"/>
-                <w:b w:val="false"/>
-                <w:bCs w:val="false"/>
-                <w:i w:val="false"/>
-                <w:iCs w:val="false"/>
-                <w:sz w:val="20"/>
-                <w:szCs w:val="20"/>
-              </w:rPr>
-              <w:t xml:space="preserve">Configured CRM instance</w:t>
+            <w:tcMar>
+              <w:top w:type="dxa" w:w="60"/>
+              <w:left w:type="dxa" w:w="100"/>
+              <w:bottom w:type="dxa" w:w="60"/>
+              <w:right w:type="dxa" w:w="100"/>
+            </w:tcMar>
+          </w:tcPr>
+          <w:p>
+            <w:r>
+              <w:rPr>
+                <w:rFonts w:ascii="Arial" w:cs="Arial" w:eastAsia="Arial" w:hAnsi="Arial"/>
+                <w:b w:val="false"/>
+                <w:bCs w:val="false"/>
+                <w:i w:val="false"/>
+                <w:iCs w:val="false"/>
+                <w:sz w:val="20"/>
+                <w:szCs w:val="20"/>
+              </w:rPr>
+              <w:t xml:space="preserve">Deployed CRM instance</w:t>
             </w:r>
           </w:p>
         </w:tc>
@@ -1853,26 +1850,25 @@
               <w:bottom w:val="single" w:color="AAAAAA" w:sz="1"/>
               <w:right w:val="single" w:color="AAAAAA" w:sz="1"/>
             </w:tcBorders>
-            <w:shd w:fill="F2F7FB" w:val="clear"/>
-            <w:tcMar>
-              <w:top w:type="dxa" w:w="60"/>
-              <w:left w:type="dxa" w:w="100"/>
-              <w:bottom w:type="dxa" w:w="60"/>
-              <w:right w:type="dxa" w:w="100"/>
-            </w:tcMar>
-          </w:tcPr>
-          <w:p>
-            <w:r>
-              <w:rPr>
-                <w:rFonts w:ascii="Arial" w:cs="Arial" w:eastAsia="Arial" w:hAnsi="Arial"/>
-                <w:b w:val="false"/>
-                <w:bCs w:val="false"/>
-                <w:i w:val="false"/>
-                <w:iCs w:val="false"/>
-                <w:sz w:val="20"/>
-                <w:szCs w:val="20"/>
-              </w:rPr>
-              <w:t xml:space="preserve">Tool-driven</w:t>
+            <w:tcMar>
+              <w:top w:type="dxa" w:w="60"/>
+              <w:left w:type="dxa" w:w="100"/>
+              <w:bottom w:type="dxa" w:w="60"/>
+              <w:right w:type="dxa" w:w="100"/>
+            </w:tcMar>
+          </w:tcPr>
+          <w:p>
+            <w:r>
+              <w:rPr>
+                <w:rFonts w:ascii="Arial" w:cs="Arial" w:eastAsia="Arial" w:hAnsi="Arial"/>
+                <w:b w:val="false"/>
+                <w:bCs w:val="false"/>
+                <w:i w:val="false"/>
+                <w:iCs w:val="false"/>
+                <w:sz w:val="20"/>
+                <w:szCs w:val="20"/>
+              </w:rPr>
+              <w:t xml:space="preserve">None — administrator-driven</w:t>
             </w:r>
           </w:p>
         </w:tc>
@@ -1887,6 +1883,7 @@
               <w:bottom w:val="single" w:color="AAAAAA" w:sz="1"/>
               <w:right w:val="single" w:color="AAAAAA" w:sz="1"/>
             </w:tcBorders>
+            <w:shd w:fill="F2F7FB" w:val="clear"/>
             <w:tcMar>
               <w:top w:type="dxa" w:w="60"/>
               <w:left w:type="dxa" w:w="100"/>
@@ -1906,6 +1903,135 @@
                 <w:szCs w:val="20"/>
               </w:rPr>
               <w:t xml:space="preserve">11</w:t>
+            </w:r>
+          </w:p>
+        </w:tc>
+        <w:tc>
+          <w:tcPr>
+            <w:tcW w:type="dxa" w:w="2400"/>
+            <w:tcBorders>
+              <w:top w:val="single" w:color="AAAAAA" w:sz="1"/>
+              <w:left w:val="single" w:color="AAAAAA" w:sz="1"/>
+              <w:bottom w:val="single" w:color="AAAAAA" w:sz="1"/>
+              <w:right w:val="single" w:color="AAAAAA" w:sz="1"/>
+            </w:tcBorders>
+            <w:shd w:fill="F2F7FB" w:val="clear"/>
+            <w:tcMar>
+              <w:top w:type="dxa" w:w="60"/>
+              <w:left w:type="dxa" w:w="100"/>
+              <w:bottom w:type="dxa" w:w="60"/>
+              <w:right w:type="dxa" w:w="100"/>
+            </w:tcMar>
+          </w:tcPr>
+          <w:p>
+            <w:r>
+              <w:rPr>
+                <w:rFonts w:ascii="Arial" w:cs="Arial" w:eastAsia="Arial" w:hAnsi="Arial"/>
+                <w:b w:val="false"/>
+                <w:bCs w:val="false"/>
+                <w:i w:val="false"/>
+                <w:iCs w:val="false"/>
+                <w:sz w:val="20"/>
+                <w:szCs w:val="20"/>
+              </w:rPr>
+              <w:t xml:space="preserve">CRM Configuration</w:t>
+            </w:r>
+          </w:p>
+        </w:tc>
+        <w:tc>
+          <w:tcPr>
+            <w:tcW w:type="dxa" w:w="4060"/>
+            <w:tcBorders>
+              <w:top w:val="single" w:color="AAAAAA" w:sz="1"/>
+              <w:left w:val="single" w:color="AAAAAA" w:sz="1"/>
+              <w:bottom w:val="single" w:color="AAAAAA" w:sz="1"/>
+              <w:right w:val="single" w:color="AAAAAA" w:sz="1"/>
+            </w:tcBorders>
+            <w:shd w:fill="F2F7FB" w:val="clear"/>
+            <w:tcMar>
+              <w:top w:type="dxa" w:w="60"/>
+              <w:left w:type="dxa" w:w="100"/>
+              <w:bottom w:type="dxa" w:w="60"/>
+              <w:right w:type="dxa" w:w="100"/>
+            </w:tcMar>
+          </w:tcPr>
+          <w:p>
+            <w:r>
+              <w:rPr>
+                <w:rFonts w:ascii="Arial" w:cs="Arial" w:eastAsia="Arial" w:hAnsi="Arial"/>
+                <w:b w:val="false"/>
+                <w:bCs w:val="false"/>
+                <w:i w:val="false"/>
+                <w:iCs w:val="false"/>
+                <w:sz w:val="20"/>
+                <w:szCs w:val="20"/>
+              </w:rPr>
+              <w:t xml:space="preserve">Configured CRM instance</w:t>
+            </w:r>
+          </w:p>
+        </w:tc>
+        <w:tc>
+          <w:tcPr>
+            <w:tcW w:type="dxa" w:w="2200"/>
+            <w:tcBorders>
+              <w:top w:val="single" w:color="AAAAAA" w:sz="1"/>
+              <w:left w:val="single" w:color="AAAAAA" w:sz="1"/>
+              <w:bottom w:val="single" w:color="AAAAAA" w:sz="1"/>
+              <w:right w:val="single" w:color="AAAAAA" w:sz="1"/>
+            </w:tcBorders>
+            <w:shd w:fill="F2F7FB" w:val="clear"/>
+            <w:tcMar>
+              <w:top w:type="dxa" w:w="60"/>
+              <w:left w:type="dxa" w:w="100"/>
+              <w:bottom w:type="dxa" w:w="60"/>
+              <w:right w:type="dxa" w:w="100"/>
+            </w:tcMar>
+          </w:tcPr>
+          <w:p>
+            <w:r>
+              <w:rPr>
+                <w:rFonts w:ascii="Arial" w:cs="Arial" w:eastAsia="Arial" w:hAnsi="Arial"/>
+                <w:b w:val="false"/>
+                <w:bCs w:val="false"/>
+                <w:i w:val="false"/>
+                <w:iCs w:val="false"/>
+                <w:sz w:val="20"/>
+                <w:szCs w:val="20"/>
+              </w:rPr>
+              <w:t xml:space="preserve">Tool-driven</w:t>
+            </w:r>
+          </w:p>
+        </w:tc>
+      </w:tr>
+      <w:tr>
+        <w:tc>
+          <w:tcPr>
+            <w:tcW w:type="dxa" w:w="700"/>
+            <w:tcBorders>
+              <w:top w:val="single" w:color="AAAAAA" w:sz="1"/>
+              <w:left w:val="single" w:color="AAAAAA" w:sz="1"/>
+              <w:bottom w:val="single" w:color="AAAAAA" w:sz="1"/>
+              <w:right w:val="single" w:color="AAAAAA" w:sz="1"/>
+            </w:tcBorders>
+            <w:tcMar>
+              <w:top w:type="dxa" w:w="60"/>
+              <w:left w:type="dxa" w:w="100"/>
+              <w:bottom w:type="dxa" w:w="60"/>
+              <w:right w:type="dxa" w:w="100"/>
+            </w:tcMar>
+          </w:tcPr>
+          <w:p>
+            <w:r>
+              <w:rPr>
+                <w:rFonts w:ascii="Arial" w:cs="Arial" w:eastAsia="Arial" w:hAnsi="Arial"/>
+                <w:b w:val="false"/>
+                <w:bCs w:val="false"/>
+                <w:i w:val="false"/>
+                <w:iCs w:val="false"/>
+                <w:sz w:val="20"/>
+                <w:szCs w:val="20"/>
+              </w:rPr>
+              <w:t xml:space="preserve">12</w:t>
             </w:r>
           </w:p>
         </w:tc>
@@ -2282,6 +2408,24 @@
     </w:p>
     <w:p>
       <w:pPr>
+        <w:pStyle w:val="ListParagraph"/>
+        <w:numPr>
+          <w:ilvl w:val="0"/>
+          <w:numId w:val="2"/>
+        </w:numPr>
+        <w:spacing w:after="80"/>
+      </w:pPr>
+      <w:r>
+        <w:rPr>
+          <w:rFonts w:ascii="Arial" w:cs="Arial" w:eastAsia="Arial" w:hAnsi="Arial"/>
+          <w:sz w:val="22"/>
+          <w:szCs w:val="22"/>
+        </w:rPr>
+        <w:t xml:space="preserve">The list of Cross-Domain Services — shared platform capabilities (such as Notes, Email, Calendar, Surveys) that are not owned by any single domain but are consumed by multiple domains</w:t>
+      </w:r>
+    </w:p>
+    <w:p>
+      <w:pPr>
         <w:spacing w:after="120"/>
       </w:pPr>
       <w:r>
@@ -2386,225 +2530,27 @@
         <w:pStyle w:val="ListParagraph"/>
         <w:numPr>
           <w:ilvl w:val="0"/>
-          <w:numId w:val="2"/>
+          <w:numId w:val="3"/>
         </w:numPr>
-        <w:spacing w:after="60"/>
-      </w:pPr>
-      <w:r>
-        <w:rPr>
-          <w:rFonts w:ascii="Arial" w:cs="Arial" w:eastAsia="Arial" w:hAnsi="Arial"/>
-          <w:b w:val="false"/>
-          <w:bCs w:val="false"/>
-          <w:i w:val="false"/>
-          <w:iCs w:val="false"/>
-          <w:sz w:val="22"/>
-          <w:szCs w:val="22"/>
-        </w:rPr>
-        <w:t xml:space="preserve">System Scope — in scope, out of scope, key integrations described generically by function</w:t>
-      </w:r>
-    </w:p>
-    <w:p>
-      <w:pPr>
-        <w:pStyle w:val="Heading2"/>
-        <w:spacing w:after="120" w:before="240"/>
+        <w:spacing w:after="80"/>
       </w:pPr>
       <w:r>
         <w:rPr>
           <w:rFonts w:ascii="Arial" w:cs="Arial" w:eastAsia="Arial" w:hAnsi="Arial"/>
           <w:b/>
           <w:bCs/>
-          <w:i w:val="false"/>
-          <w:iCs w:val="false"/>
-          <w:color w:val="1F3864"/>
-          <w:sz w:val="28"/>
-          <w:szCs w:val="28"/>
-        </w:rPr>
-        <w:t xml:space="preserve">3.2 Phase 2: Entity Definition</w:t>
-      </w:r>
-    </w:p>
-    <w:p>
-      <w:pPr>
-        <w:spacing w:after="120"/>
-      </w:pPr>
-      <w:r>
-        <w:rPr>
-          <w:rFonts w:ascii="Arial" w:cs="Arial" w:eastAsia="Arial" w:hAnsi="Arial"/>
-          <w:b w:val="false"/>
-          <w:bCs w:val="false"/>
-          <w:i w:val="false"/>
-          <w:iCs w:val="false"/>
-          <w:sz w:val="22"/>
-          <w:szCs w:val="22"/>
-        </w:rPr>
-        <w:t xml:space="preserve">Entity Definition establishes the data objects the CRM must manage before any process is defined in detail. It consists of two steps performed in sequence.</w:t>
-      </w:r>
-    </w:p>
-    <w:p>
-      <w:pPr>
-        <w:pStyle w:val="Heading3"/>
-        <w:spacing w:after="120" w:before="240"/>
-      </w:pPr>
-      <w:r>
-        <w:rPr>
-          <w:rFonts w:ascii="Arial" w:cs="Arial" w:eastAsia="Arial" w:hAnsi="Arial"/>
-          <w:b/>
-          <w:bCs/>
-          <w:i w:val="false"/>
-          <w:iCs w:val="false"/>
-          <w:sz w:val="24"/>
-          <w:szCs w:val="24"/>
-        </w:rPr>
-        <w:t xml:space="preserve">Step 1: Entity Discovery</w:t>
-      </w:r>
-    </w:p>
-    <w:p>
-      <w:pPr>
-        <w:spacing w:after="120"/>
-      </w:pPr>
-      <w:r>
-        <w:rPr>
-          <w:rFonts w:ascii="Arial" w:cs="Arial" w:eastAsia="Arial" w:hAnsi="Arial"/>
-          <w:b/>
-          <w:bCs/>
-          <w:i w:val="false"/>
-          <w:iCs w:val="false"/>
-          <w:sz w:val="22"/>
-          <w:szCs w:val="22"/>
-        </w:rPr>
-        <w:t xml:space="preserve">Conversations: </w:t>
-      </w:r>
-      <w:r>
-        <w:rPr>
-          <w:rFonts w:ascii="Arial" w:cs="Arial" w:eastAsia="Arial" w:hAnsi="Arial"/>
-          <w:b w:val="false"/>
-          <w:bCs w:val="false"/>
-          <w:i w:val="false"/>
-          <w:iCs w:val="false"/>
-          <w:sz w:val="22"/>
-          <w:szCs w:val="22"/>
-        </w:rPr>
-        <w:t xml:space="preserve">1</w:t>
-      </w:r>
-    </w:p>
-    <w:p>
-      <w:pPr>
-        <w:spacing w:after="120"/>
-      </w:pPr>
-      <w:r>
-        <w:rPr>
-          <w:rFonts w:ascii="Arial" w:cs="Arial" w:eastAsia="Arial" w:hAnsi="Arial"/>
-          <w:b/>
-          <w:bCs/>
-          <w:i w:val="false"/>
-          <w:iCs w:val="false"/>
-          <w:sz w:val="22"/>
-          <w:szCs w:val="22"/>
-        </w:rPr>
-        <w:t xml:space="preserve">Input: </w:t>
-      </w:r>
-      <w:r>
-        <w:rPr>
-          <w:rFonts w:ascii="Arial" w:cs="Arial" w:eastAsia="Arial" w:hAnsi="Arial"/>
-          <w:b w:val="false"/>
-          <w:bCs w:val="false"/>
-          <w:i w:val="false"/>
-          <w:iCs w:val="false"/>
-          <w:sz w:val="22"/>
-          <w:szCs w:val="22"/>
-        </w:rPr>
-        <w:t xml:space="preserve">Master PRD.</w:t>
-      </w:r>
-    </w:p>
-    <w:p>
-      <w:pPr>
-        <w:spacing w:after="120"/>
-      </w:pPr>
-      <w:r>
-        <w:rPr>
-          <w:rFonts w:ascii="Arial" w:cs="Arial" w:eastAsia="Arial" w:hAnsi="Arial"/>
-          <w:b/>
-          <w:bCs/>
-          <w:i w:val="false"/>
-          <w:iCs w:val="false"/>
-          <w:sz w:val="22"/>
-          <w:szCs w:val="22"/>
-        </w:rPr>
-        <w:t xml:space="preserve">Output: </w:t>
-      </w:r>
-      <w:r>
-        <w:rPr>
-          <w:rFonts w:ascii="Arial" w:cs="Arial" w:eastAsia="Arial" w:hAnsi="Arial"/>
-          <w:b w:val="false"/>
-          <w:bCs w:val="false"/>
-          <w:i w:val="false"/>
-          <w:iCs w:val="false"/>
-          <w:sz w:val="22"/>
-          <w:szCs w:val="22"/>
-        </w:rPr>
-        <w:t xml:space="preserve">Entity Inventory (Word document).</w:t>
-      </w:r>
-    </w:p>
-    <w:p>
-      <w:pPr>
-        <w:spacing w:after="120"/>
-      </w:pPr>
-      <w:r>
-        <w:rPr>
-          <w:rFonts w:ascii="Arial" w:cs="Arial" w:eastAsia="Arial" w:hAnsi="Arial"/>
-          <w:b/>
-          <w:bCs/>
-          <w:i w:val="false"/>
-          <w:iCs w:val="false"/>
-          <w:sz w:val="22"/>
-          <w:szCs w:val="22"/>
-        </w:rPr>
-        <w:t xml:space="preserve">Repository location: </w:t>
-      </w:r>
-      <w:r>
-        <w:rPr>
-          <w:rFonts w:ascii="Arial" w:cs="Arial" w:eastAsia="Arial" w:hAnsi="Arial"/>
-          <w:b w:val="false"/>
-          <w:bCs w:val="false"/>
-          <w:i w:val="false"/>
-          <w:iCs w:val="false"/>
-          <w:sz w:val="22"/>
-          <w:szCs w:val="22"/>
-        </w:rPr>
-        <w:t xml:space="preserve">PRDs/{Implementation}-Entity-Inventory.docx</w:t>
-      </w:r>
-    </w:p>
-    <w:p>
-      <w:pPr>
-        <w:spacing w:after="120"/>
-      </w:pPr>
-      <w:r>
-        <w:rPr>
-          <w:rFonts w:ascii="Arial" w:cs="Arial" w:eastAsia="Arial" w:hAnsi="Arial"/>
-          <w:b w:val="false"/>
-          <w:bCs w:val="false"/>
-          <w:i w:val="false"/>
-          <w:iCs w:val="false"/>
-          <w:sz w:val="22"/>
-          <w:szCs w:val="22"/>
-        </w:rPr>
-        <w:t xml:space="preserve">Claude and the administrator walk through each domain and its processes as defined in the Master PRD, asking: what things does the system need to track to support this? The goal is completeness — identifying every entity before going deep on any one of them.</w:t>
-      </w:r>
-    </w:p>
-    <w:p>
-      <w:pPr>
-        <w:spacing w:after="120"/>
-      </w:pPr>
-      <w:r>
-        <w:rPr>
-          <w:rFonts w:ascii="Arial" w:cs="Arial" w:eastAsia="Arial" w:hAnsi="Arial"/>
-          <w:b w:val="false"/>
-          <w:bCs w:val="false"/>
-          <w:i w:val="false"/>
-          <w:iCs w:val="false"/>
-          <w:sz w:val="22"/>
-          <w:szCs w:val="22"/>
-        </w:rPr>
-        <w:t xml:space="preserve">The Entity Inventory is a single document listing every identified entity. For each entity, the inventory captures:</w:t>
+          <w:sz w:val="22"/>
+          <w:szCs w:val="22"/>
+        </w:rPr>
+        <w:t xml:space="preserve">Cross-Domain Services</w:t>
+      </w:r>
+      <w:r>
+        <w:rPr>
+          <w:rFonts w:ascii="Arial" w:cs="Arial" w:eastAsia="Arial" w:hAnsi="Arial"/>
+          <w:sz w:val="22"/>
+          <w:szCs w:val="22"/>
+        </w:rPr>
+        <w:t xml:space="preserve"> — one section per service with service name, purpose description, capabilities it provides to domains, and any entities it may own. Written in sufficient detail that domain process documents can reference services generically (e.g., “Use the Notes Service to add notes to a contact”) without needing to know internal mechanics. Services are structurally parallel to domains — they can own entities, define processes, and go through the same production phases — but exist to provide shared capabilities consumed by multiple domains rather than fulfilling a standalone business function</w:t>
       </w:r>
     </w:p>
     <w:p>
@@ -2626,7 +2572,211 @@
           <w:sz w:val="22"/>
           <w:szCs w:val="22"/>
         </w:rPr>
-        <w:t xml:space="preserve">Entity name — the human-readable label</w:t>
+        <w:t xml:space="preserve">System Scope — in scope, out of scope, key integrations described generically by function</w:t>
+      </w:r>
+    </w:p>
+    <w:p>
+      <w:pPr>
+        <w:pStyle w:val="Heading2"/>
+        <w:spacing w:after="120" w:before="240"/>
+      </w:pPr>
+      <w:r>
+        <w:rPr>
+          <w:rFonts w:ascii="Arial" w:cs="Arial" w:eastAsia="Arial" w:hAnsi="Arial"/>
+          <w:b/>
+          <w:bCs/>
+          <w:i w:val="false"/>
+          <w:iCs w:val="false"/>
+          <w:color w:val="1F3864"/>
+          <w:sz w:val="28"/>
+          <w:szCs w:val="28"/>
+        </w:rPr>
+        <w:t xml:space="preserve">3.2 Phase 2: Entity Definition</w:t>
+      </w:r>
+    </w:p>
+    <w:p>
+      <w:pPr>
+        <w:spacing w:after="120"/>
+      </w:pPr>
+      <w:r>
+        <w:rPr>
+          <w:rFonts w:ascii="Arial" w:cs="Arial" w:eastAsia="Arial" w:hAnsi="Arial"/>
+          <w:b w:val="false"/>
+          <w:bCs w:val="false"/>
+          <w:i w:val="false"/>
+          <w:iCs w:val="false"/>
+          <w:sz w:val="22"/>
+          <w:szCs w:val="22"/>
+        </w:rPr>
+        <w:t xml:space="preserve">Entity Definition establishes the data objects the CRM must manage before any process is defined in detail. It consists of two steps performed in sequence.</w:t>
+      </w:r>
+    </w:p>
+    <w:p>
+      <w:pPr>
+        <w:pStyle w:val="Heading3"/>
+        <w:spacing w:after="120" w:before="240"/>
+      </w:pPr>
+      <w:r>
+        <w:rPr>
+          <w:rFonts w:ascii="Arial" w:cs="Arial" w:eastAsia="Arial" w:hAnsi="Arial"/>
+          <w:b/>
+          <w:bCs/>
+          <w:i w:val="false"/>
+          <w:iCs w:val="false"/>
+          <w:sz w:val="24"/>
+          <w:szCs w:val="24"/>
+        </w:rPr>
+        <w:t xml:space="preserve">Step 1: Entity Discovery</w:t>
+      </w:r>
+    </w:p>
+    <w:p>
+      <w:pPr>
+        <w:spacing w:after="120"/>
+      </w:pPr>
+      <w:r>
+        <w:rPr>
+          <w:rFonts w:ascii="Arial" w:cs="Arial" w:eastAsia="Arial" w:hAnsi="Arial"/>
+          <w:b/>
+          <w:bCs/>
+          <w:i w:val="false"/>
+          <w:iCs w:val="false"/>
+          <w:sz w:val="22"/>
+          <w:szCs w:val="22"/>
+        </w:rPr>
+        <w:t xml:space="preserve">Conversations: </w:t>
+      </w:r>
+      <w:r>
+        <w:rPr>
+          <w:rFonts w:ascii="Arial" w:cs="Arial" w:eastAsia="Arial" w:hAnsi="Arial"/>
+          <w:b w:val="false"/>
+          <w:bCs w:val="false"/>
+          <w:i w:val="false"/>
+          <w:iCs w:val="false"/>
+          <w:sz w:val="22"/>
+          <w:szCs w:val="22"/>
+        </w:rPr>
+        <w:t xml:space="preserve">1</w:t>
+      </w:r>
+    </w:p>
+    <w:p>
+      <w:pPr>
+        <w:spacing w:after="120"/>
+      </w:pPr>
+      <w:r>
+        <w:rPr>
+          <w:rFonts w:ascii="Arial" w:cs="Arial" w:eastAsia="Arial" w:hAnsi="Arial"/>
+          <w:b/>
+          <w:bCs/>
+          <w:i w:val="false"/>
+          <w:iCs w:val="false"/>
+          <w:sz w:val="22"/>
+          <w:szCs w:val="22"/>
+        </w:rPr>
+        <w:t xml:space="preserve">Input: </w:t>
+      </w:r>
+      <w:r>
+        <w:rPr>
+          <w:rFonts w:ascii="Arial" w:cs="Arial" w:eastAsia="Arial" w:hAnsi="Arial"/>
+          <w:b w:val="false"/>
+          <w:bCs w:val="false"/>
+          <w:i w:val="false"/>
+          <w:iCs w:val="false"/>
+          <w:sz w:val="22"/>
+          <w:szCs w:val="22"/>
+        </w:rPr>
+        <w:t xml:space="preserve">Master PRD.</w:t>
+      </w:r>
+    </w:p>
+    <w:p>
+      <w:pPr>
+        <w:spacing w:after="120"/>
+      </w:pPr>
+      <w:r>
+        <w:rPr>
+          <w:rFonts w:ascii="Arial" w:cs="Arial" w:eastAsia="Arial" w:hAnsi="Arial"/>
+          <w:b/>
+          <w:bCs/>
+          <w:i w:val="false"/>
+          <w:iCs w:val="false"/>
+          <w:sz w:val="22"/>
+          <w:szCs w:val="22"/>
+        </w:rPr>
+        <w:t xml:space="preserve">Output: </w:t>
+      </w:r>
+      <w:r>
+        <w:rPr>
+          <w:rFonts w:ascii="Arial" w:cs="Arial" w:eastAsia="Arial" w:hAnsi="Arial"/>
+          <w:b w:val="false"/>
+          <w:bCs w:val="false"/>
+          <w:i w:val="false"/>
+          <w:iCs w:val="false"/>
+          <w:sz w:val="22"/>
+          <w:szCs w:val="22"/>
+        </w:rPr>
+        <w:t xml:space="preserve">Entity Inventory (Word document).</w:t>
+      </w:r>
+    </w:p>
+    <w:p>
+      <w:pPr>
+        <w:spacing w:after="120"/>
+      </w:pPr>
+      <w:r>
+        <w:rPr>
+          <w:rFonts w:ascii="Arial" w:cs="Arial" w:eastAsia="Arial" w:hAnsi="Arial"/>
+          <w:b/>
+          <w:bCs/>
+          <w:i w:val="false"/>
+          <w:iCs w:val="false"/>
+          <w:sz w:val="22"/>
+          <w:szCs w:val="22"/>
+        </w:rPr>
+        <w:t xml:space="preserve">Repository location: </w:t>
+      </w:r>
+      <w:r>
+        <w:rPr>
+          <w:rFonts w:ascii="Arial" w:cs="Arial" w:eastAsia="Arial" w:hAnsi="Arial"/>
+          <w:b w:val="false"/>
+          <w:bCs w:val="false"/>
+          <w:i w:val="false"/>
+          <w:iCs w:val="false"/>
+          <w:sz w:val="22"/>
+          <w:szCs w:val="22"/>
+        </w:rPr>
+        <w:t xml:space="preserve">PRDs/{Implementation}-Entity-Inventory.docx</w:t>
+      </w:r>
+    </w:p>
+    <w:p>
+      <w:pPr>
+        <w:spacing w:after="120"/>
+      </w:pPr>
+      <w:r>
+        <w:rPr>
+          <w:rFonts w:ascii="Arial" w:cs="Arial" w:eastAsia="Arial" w:hAnsi="Arial"/>
+          <w:b w:val="false"/>
+          <w:bCs w:val="false"/>
+          <w:i w:val="false"/>
+          <w:iCs w:val="false"/>
+          <w:sz w:val="22"/>
+          <w:szCs w:val="22"/>
+        </w:rPr>
+        <w:t xml:space="preserve">Claude and the administrator walk through each domain and its processes as defined in the Master PRD, asking: what things does the system need to track to support this? The goal is completeness — identifying every entity before going deep on any one of them.</w:t>
+      </w:r>
+    </w:p>
+    <w:p>
+      <w:pPr>
+        <w:spacing w:after="120"/>
+      </w:pPr>
+      <w:r>
+        <w:rPr>
+          <w:rFonts w:ascii="Arial" w:cs="Arial" w:eastAsia="Arial" w:hAnsi="Arial"/>
+          <w:b w:val="false"/>
+          <w:bCs w:val="false"/>
+          <w:i w:val="false"/>
+          <w:iCs w:val="false"/>
+          <w:sz w:val="22"/>
+          <w:szCs w:val="22"/>
+        </w:rPr>
+        <w:t xml:space="preserve">The Entity Inventory is a single document listing every identified entity. For each entity, the inventory captures:</w:t>
       </w:r>
     </w:p>
     <w:p>
@@ -2648,7 +2798,7 @@
           <w:sz w:val="22"/>
           <w:szCs w:val="22"/>
         </w:rPr>
-        <w:t xml:space="preserve">Purpose — a one-sentence description of what the entity represents</w:t>
+        <w:t xml:space="preserve">Entity name — the human-readable label</w:t>
       </w:r>
     </w:p>
     <w:p>
@@ -2670,7 +2820,7 @@
           <w:sz w:val="22"/>
           <w:szCs w:val="22"/>
         </w:rPr>
-        <w:t xml:space="preserve">Primary domain — the domain that owns the entity’s lifecycle</w:t>
+        <w:t xml:space="preserve">Purpose — a one-sentence description of what the entity represents</w:t>
       </w:r>
     </w:p>
     <w:p>
@@ -2692,7 +2842,7 @@
           <w:sz w:val="22"/>
           <w:szCs w:val="22"/>
         </w:rPr>
-        <w:t xml:space="preserve">Additional domains — other domains that reference or interact with the entity</w:t>
+        <w:t xml:space="preserve">Primary domain — the domain that owns the entity’s lifecycle</w:t>
       </w:r>
     </w:p>
     <w:p>
@@ -2714,24 +2864,7 @@
           <w:sz w:val="22"/>
           <w:szCs w:val="22"/>
         </w:rPr>
-        <w:t xml:space="preserve">Participating processes — which processes create, read, update, or depend on this entity</w:t>
-      </w:r>
-    </w:p>
-    <w:p>
-      <w:pPr>
-        <w:spacing w:after="120"/>
-      </w:pPr>
-      <w:r>
-        <w:rPr>
-          <w:rFonts w:ascii="Arial" w:cs="Arial" w:eastAsia="Arial" w:hAnsi="Arial"/>
-          <w:b w:val="false"/>
-          <w:bCs w:val="false"/>
-          <w:i w:val="false"/>
-          <w:iCs w:val="false"/>
-          <w:sz w:val="22"/>
-          <w:szCs w:val="22"/>
-        </w:rPr>
-        <w:t xml:space="preserve">During the discovery conversation, Claude also identifies:</w:t>
+        <w:t xml:space="preserve">Additional domains — other domains that reference or interact with the entity</w:t>
       </w:r>
     </w:p>
     <w:p>
@@ -2753,7 +2886,24 @@
           <w:sz w:val="22"/>
           <w:szCs w:val="22"/>
         </w:rPr>
-        <w:t xml:space="preserve">Cross-domain entities — entities that appear in multiple domains are flagged so the detailed interview can capture all perspectives, not just one domain’s view</w:t>
+        <w:t xml:space="preserve">Participating processes — which processes create, read, update, or depend on this entity</w:t>
+      </w:r>
+    </w:p>
+    <w:p>
+      <w:pPr>
+        <w:spacing w:after="120"/>
+      </w:pPr>
+      <w:r>
+        <w:rPr>
+          <w:rFonts w:ascii="Arial" w:cs="Arial" w:eastAsia="Arial" w:hAnsi="Arial"/>
+          <w:b w:val="false"/>
+          <w:bCs w:val="false"/>
+          <w:i w:val="false"/>
+          <w:iCs w:val="false"/>
+          <w:sz w:val="22"/>
+          <w:szCs w:val="22"/>
+        </w:rPr>
+        <w:t xml:space="preserve">During the discovery conversation, Claude also identifies:</w:t>
       </w:r>
     </w:p>
     <w:p>
@@ -2775,7 +2925,7 @@
           <w:sz w:val="22"/>
           <w:szCs w:val="22"/>
         </w:rPr>
-        <w:t xml:space="preserve">Entity vs. entity variant — whether something is its own entity or a type/variant of another (e.g., whether Partner Contact is a separate entity or a Contact with a type field)</w:t>
+        <w:t xml:space="preserve">Cross-domain entities — entities that appear in multiple domains are flagged so the detailed interview can capture all perspectives, not just one domain’s view</w:t>
       </w:r>
     </w:p>
     <w:p>
@@ -2797,245 +2947,7 @@
           <w:sz w:val="22"/>
           <w:szCs w:val="22"/>
         </w:rPr>
-        <w:t xml:space="preserve">Dependency order — a recommended sequence for the entity definition interviews, with foundational entities (those that other entities reference) defined first</w:t>
-      </w:r>
-    </w:p>
-    <w:p>
-      <w:pPr>
-        <w:pStyle w:val="Heading3"/>
-        <w:spacing w:after="120" w:before="240"/>
-      </w:pPr>
-      <w:r>
-        <w:rPr>
-          <w:rFonts w:ascii="Arial" w:cs="Arial" w:eastAsia="Arial" w:hAnsi="Arial"/>
-          <w:b/>
-          <w:bCs/>
-          <w:i w:val="false"/>
-          <w:iCs w:val="false"/>
-          <w:sz w:val="24"/>
-          <w:szCs w:val="24"/>
-        </w:rPr>
-        <w:t xml:space="preserve">Step 2: Entity Definition Interviews</w:t>
-      </w:r>
-    </w:p>
-    <w:p>
-      <w:pPr>
-        <w:spacing w:after="120"/>
-      </w:pPr>
-      <w:r>
-        <w:rPr>
-          <w:rFonts w:ascii="Arial" w:cs="Arial" w:eastAsia="Arial" w:hAnsi="Arial"/>
-          <w:b/>
-          <w:bCs/>
-          <w:i w:val="false"/>
-          <w:iCs w:val="false"/>
-          <w:sz w:val="22"/>
-          <w:szCs w:val="22"/>
-        </w:rPr>
-        <w:t xml:space="preserve">Conversations: </w:t>
-      </w:r>
-      <w:r>
-        <w:rPr>
-          <w:rFonts w:ascii="Arial" w:cs="Arial" w:eastAsia="Arial" w:hAnsi="Arial"/>
-          <w:b w:val="false"/>
-          <w:bCs w:val="false"/>
-          <w:i w:val="false"/>
-          <w:iCs w:val="false"/>
-          <w:sz w:val="22"/>
-          <w:szCs w:val="22"/>
-        </w:rPr>
-        <w:t xml:space="preserve">1 per entity, done in the dependency order established in Step 1.</w:t>
-      </w:r>
-    </w:p>
-    <w:p>
-      <w:pPr>
-        <w:spacing w:after="120"/>
-      </w:pPr>
-      <w:r>
-        <w:rPr>
-          <w:rFonts w:ascii="Arial" w:cs="Arial" w:eastAsia="Arial" w:hAnsi="Arial"/>
-          <w:b/>
-          <w:bCs/>
-          <w:i w:val="false"/>
-          <w:iCs w:val="false"/>
-          <w:sz w:val="22"/>
-          <w:szCs w:val="22"/>
-        </w:rPr>
-        <w:t xml:space="preserve">Input: </w:t>
-      </w:r>
-      <w:r>
-        <w:rPr>
-          <w:rFonts w:ascii="Arial" w:cs="Arial" w:eastAsia="Arial" w:hAnsi="Arial"/>
-          <w:b w:val="false"/>
-          <w:bCs w:val="false"/>
-          <w:i w:val="false"/>
-          <w:iCs w:val="false"/>
-          <w:sz w:val="22"/>
-          <w:szCs w:val="22"/>
-        </w:rPr>
-        <w:t xml:space="preserve">Master PRD + Entity Inventory + all previously completed Entity PRDs.</w:t>
-      </w:r>
-    </w:p>
-    <w:p>
-      <w:pPr>
-        <w:spacing w:after="120"/>
-      </w:pPr>
-      <w:r>
-        <w:rPr>
-          <w:rFonts w:ascii="Arial" w:cs="Arial" w:eastAsia="Arial" w:hAnsi="Arial"/>
-          <w:b/>
-          <w:bCs/>
-          <w:i w:val="false"/>
-          <w:iCs w:val="false"/>
-          <w:sz w:val="22"/>
-          <w:szCs w:val="22"/>
-        </w:rPr>
-        <w:t xml:space="preserve">Output: </w:t>
-      </w:r>
-      <w:r>
-        <w:rPr>
-          <w:rFonts w:ascii="Arial" w:cs="Arial" w:eastAsia="Arial" w:hAnsi="Arial"/>
-          <w:b w:val="false"/>
-          <w:bCs w:val="false"/>
-          <w:i w:val="false"/>
-          <w:iCs w:val="false"/>
-          <w:sz w:val="22"/>
-          <w:szCs w:val="22"/>
-        </w:rPr>
-        <w:t xml:space="preserve">One Entity PRD (Word document) per entity.</w:t>
-      </w:r>
-    </w:p>
-    <w:p>
-      <w:pPr>
-        <w:spacing w:after="120"/>
-      </w:pPr>
-      <w:r>
-        <w:rPr>
-          <w:rFonts w:ascii="Arial" w:cs="Arial" w:eastAsia="Arial" w:hAnsi="Arial"/>
-          <w:b/>
-          <w:bCs/>
-          <w:i w:val="false"/>
-          <w:iCs w:val="false"/>
-          <w:sz w:val="22"/>
-          <w:szCs w:val="22"/>
-        </w:rPr>
-        <w:t xml:space="preserve">Repository location: </w:t>
-      </w:r>
-      <w:r>
-        <w:rPr>
-          <w:rFonts w:ascii="Arial" w:cs="Arial" w:eastAsia="Arial" w:hAnsi="Arial"/>
-          <w:b w:val="false"/>
-          <w:bCs w:val="false"/>
-          <w:i w:val="false"/>
-          <w:iCs w:val="false"/>
-          <w:sz w:val="22"/>
-          <w:szCs w:val="22"/>
-        </w:rPr>
-        <w:t xml:space="preserve">PRDs/entities/{EntityName}.docx</w:t>
-      </w:r>
-    </w:p>
-    <w:p>
-      <w:pPr>
-        <w:spacing w:after="120"/>
-      </w:pPr>
-      <w:r>
-        <w:rPr>
-          <w:rFonts w:ascii="Arial" w:cs="Arial" w:eastAsia="Arial" w:hAnsi="Arial"/>
-          <w:b w:val="false"/>
-          <w:bCs w:val="false"/>
-          <w:i w:val="false"/>
-          <w:iCs w:val="false"/>
-          <w:sz w:val="22"/>
-          <w:szCs w:val="22"/>
-        </w:rPr>
-        <w:t xml:space="preserve">Each conversation focuses on a single entity. Claude conducts a focused interview about the entity’s purpose, fields, relationships, and business rules, producing an Entity PRD document.</w:t>
-      </w:r>
-    </w:p>
-    <w:p>
-      <w:pPr>
-        <w:pStyle w:val="Heading3"/>
-        <w:spacing w:after="120" w:before="240"/>
-      </w:pPr>
-      <w:r>
-        <w:rPr>
-          <w:rFonts w:ascii="Arial" w:cs="Arial" w:eastAsia="Arial" w:hAnsi="Arial"/>
-          <w:b/>
-          <w:bCs/>
-          <w:i w:val="false"/>
-          <w:iCs w:val="false"/>
-          <w:sz w:val="24"/>
-          <w:szCs w:val="24"/>
-        </w:rPr>
-        <w:t xml:space="preserve">Context Passing</w:t>
-      </w:r>
-    </w:p>
-    <w:p>
-      <w:pPr>
-        <w:spacing w:after="120"/>
-      </w:pPr>
-      <w:r>
-        <w:rPr>
-          <w:rFonts w:ascii="Arial" w:cs="Arial" w:eastAsia="Arial" w:hAnsi="Arial"/>
-          <w:b w:val="false"/>
-          <w:bCs w:val="false"/>
-          <w:i w:val="false"/>
-          <w:iCs w:val="false"/>
-          <w:sz w:val="22"/>
-          <w:szCs w:val="22"/>
-        </w:rPr>
-        <w:t xml:space="preserve">Each entity conversation receives the Master PRD, the Entity Inventory, and all previously completed Entity PRDs as uploaded files. This gives Claude full visibility into what entities have already been defined and what relationships have been established — without requiring cross-session memory.</w:t>
-      </w:r>
-    </w:p>
-    <w:p>
-      <w:pPr>
-        <w:spacing w:after="120"/>
-      </w:pPr>
-      <w:r>
-        <w:rPr>
-          <w:rFonts w:ascii="Arial" w:cs="Arial" w:eastAsia="Arial" w:hAnsi="Arial"/>
-          <w:b w:val="false"/>
-          <w:bCs w:val="false"/>
-          <w:i w:val="false"/>
-          <w:iCs w:val="false"/>
-          <w:sz w:val="22"/>
-          <w:szCs w:val="22"/>
-        </w:rPr>
-        <w:t xml:space="preserve">By the time the last entity is being defined, Claude has the complete entity context available in the conversation.</w:t>
-      </w:r>
-    </w:p>
-    <w:p>
-      <w:pPr>
-        <w:pStyle w:val="Heading3"/>
-        <w:spacing w:after="120" w:before="240"/>
-      </w:pPr>
-      <w:r>
-        <w:rPr>
-          <w:rFonts w:ascii="Arial" w:cs="Arial" w:eastAsia="Arial" w:hAnsi="Arial"/>
-          <w:b/>
-          <w:bCs/>
-          <w:i w:val="false"/>
-          <w:iCs w:val="false"/>
-          <w:sz w:val="24"/>
-          <w:szCs w:val="24"/>
-        </w:rPr>
-        <w:t xml:space="preserve">Entity PRD Structure</w:t>
-      </w:r>
-    </w:p>
-    <w:p>
-      <w:pPr>
-        <w:spacing w:after="120"/>
-      </w:pPr>
-      <w:r>
-        <w:rPr>
-          <w:rFonts w:ascii="Arial" w:cs="Arial" w:eastAsia="Arial" w:hAnsi="Arial"/>
-          <w:b w:val="false"/>
-          <w:bCs w:val="false"/>
-          <w:i w:val="false"/>
-          <w:iCs w:val="false"/>
-          <w:sz w:val="22"/>
-          <w:szCs w:val="22"/>
-        </w:rPr>
-        <w:t xml:space="preserve">Every Entity PRD must contain all nine of the following sections. The Entity Definition guide (guide-entity-definition.md) provides detailed descriptions of each section. A generator template (generate-entity-prd-template.js) is available to produce Entity PRDs with consistent formatting.</w:t>
+        <w:t xml:space="preserve">Entity vs. entity variant — whether something is its own entity or a type/variant of another (e.g., whether Partner Contact is a separate entity or a Contact with a type field)</w:t>
       </w:r>
     </w:p>
     <w:p>
@@ -3057,7 +2969,245 @@
           <w:sz w:val="22"/>
           <w:szCs w:val="22"/>
         </w:rPr>
-        <w:t xml:space="preserve">Entity Overview — entity metadata, native/custom status, entity type, contributing domains, and discriminator details for shared entities</w:t>
+        <w:t xml:space="preserve">Dependency order — a recommended sequence for the entity definition interviews, with foundational entities (those that other entities reference) defined first</w:t>
+      </w:r>
+    </w:p>
+    <w:p>
+      <w:pPr>
+        <w:pStyle w:val="Heading3"/>
+        <w:spacing w:after="120" w:before="240"/>
+      </w:pPr>
+      <w:r>
+        <w:rPr>
+          <w:rFonts w:ascii="Arial" w:cs="Arial" w:eastAsia="Arial" w:hAnsi="Arial"/>
+          <w:b/>
+          <w:bCs/>
+          <w:i w:val="false"/>
+          <w:iCs w:val="false"/>
+          <w:sz w:val="24"/>
+          <w:szCs w:val="24"/>
+        </w:rPr>
+        <w:t xml:space="preserve">Step 2: Entity Definition Interviews</w:t>
+      </w:r>
+    </w:p>
+    <w:p>
+      <w:pPr>
+        <w:spacing w:after="120"/>
+      </w:pPr>
+      <w:r>
+        <w:rPr>
+          <w:rFonts w:ascii="Arial" w:cs="Arial" w:eastAsia="Arial" w:hAnsi="Arial"/>
+          <w:b/>
+          <w:bCs/>
+          <w:i w:val="false"/>
+          <w:iCs w:val="false"/>
+          <w:sz w:val="22"/>
+          <w:szCs w:val="22"/>
+        </w:rPr>
+        <w:t xml:space="preserve">Conversations: </w:t>
+      </w:r>
+      <w:r>
+        <w:rPr>
+          <w:rFonts w:ascii="Arial" w:cs="Arial" w:eastAsia="Arial" w:hAnsi="Arial"/>
+          <w:b w:val="false"/>
+          <w:bCs w:val="false"/>
+          <w:i w:val="false"/>
+          <w:iCs w:val="false"/>
+          <w:sz w:val="22"/>
+          <w:szCs w:val="22"/>
+        </w:rPr>
+        <w:t xml:space="preserve">1 per entity, done in the dependency order established in Step 1.</w:t>
+      </w:r>
+    </w:p>
+    <w:p>
+      <w:pPr>
+        <w:spacing w:after="120"/>
+      </w:pPr>
+      <w:r>
+        <w:rPr>
+          <w:rFonts w:ascii="Arial" w:cs="Arial" w:eastAsia="Arial" w:hAnsi="Arial"/>
+          <w:b/>
+          <w:bCs/>
+          <w:i w:val="false"/>
+          <w:iCs w:val="false"/>
+          <w:sz w:val="22"/>
+          <w:szCs w:val="22"/>
+        </w:rPr>
+        <w:t xml:space="preserve">Input: </w:t>
+      </w:r>
+      <w:r>
+        <w:rPr>
+          <w:rFonts w:ascii="Arial" w:cs="Arial" w:eastAsia="Arial" w:hAnsi="Arial"/>
+          <w:b w:val="false"/>
+          <w:bCs w:val="false"/>
+          <w:i w:val="false"/>
+          <w:iCs w:val="false"/>
+          <w:sz w:val="22"/>
+          <w:szCs w:val="22"/>
+        </w:rPr>
+        <w:t xml:space="preserve">Master PRD + Entity Inventory + all previously completed Entity PRDs.</w:t>
+      </w:r>
+    </w:p>
+    <w:p>
+      <w:pPr>
+        <w:spacing w:after="120"/>
+      </w:pPr>
+      <w:r>
+        <w:rPr>
+          <w:rFonts w:ascii="Arial" w:cs="Arial" w:eastAsia="Arial" w:hAnsi="Arial"/>
+          <w:b/>
+          <w:bCs/>
+          <w:i w:val="false"/>
+          <w:iCs w:val="false"/>
+          <w:sz w:val="22"/>
+          <w:szCs w:val="22"/>
+        </w:rPr>
+        <w:t xml:space="preserve">Output: </w:t>
+      </w:r>
+      <w:r>
+        <w:rPr>
+          <w:rFonts w:ascii="Arial" w:cs="Arial" w:eastAsia="Arial" w:hAnsi="Arial"/>
+          <w:b w:val="false"/>
+          <w:bCs w:val="false"/>
+          <w:i w:val="false"/>
+          <w:iCs w:val="false"/>
+          <w:sz w:val="22"/>
+          <w:szCs w:val="22"/>
+        </w:rPr>
+        <w:t xml:space="preserve">One Entity PRD (Word document) per entity.</w:t>
+      </w:r>
+    </w:p>
+    <w:p>
+      <w:pPr>
+        <w:spacing w:after="120"/>
+      </w:pPr>
+      <w:r>
+        <w:rPr>
+          <w:rFonts w:ascii="Arial" w:cs="Arial" w:eastAsia="Arial" w:hAnsi="Arial"/>
+          <w:b/>
+          <w:bCs/>
+          <w:i w:val="false"/>
+          <w:iCs w:val="false"/>
+          <w:sz w:val="22"/>
+          <w:szCs w:val="22"/>
+        </w:rPr>
+        <w:t xml:space="preserve">Repository location: </w:t>
+      </w:r>
+      <w:r>
+        <w:rPr>
+          <w:rFonts w:ascii="Arial" w:cs="Arial" w:eastAsia="Arial" w:hAnsi="Arial"/>
+          <w:b w:val="false"/>
+          <w:bCs w:val="false"/>
+          <w:i w:val="false"/>
+          <w:iCs w:val="false"/>
+          <w:sz w:val="22"/>
+          <w:szCs w:val="22"/>
+        </w:rPr>
+        <w:t xml:space="preserve">PRDs/entities/{EntityName}.docx</w:t>
+      </w:r>
+    </w:p>
+    <w:p>
+      <w:pPr>
+        <w:spacing w:after="120"/>
+      </w:pPr>
+      <w:r>
+        <w:rPr>
+          <w:rFonts w:ascii="Arial" w:cs="Arial" w:eastAsia="Arial" w:hAnsi="Arial"/>
+          <w:b w:val="false"/>
+          <w:bCs w:val="false"/>
+          <w:i w:val="false"/>
+          <w:iCs w:val="false"/>
+          <w:sz w:val="22"/>
+          <w:szCs w:val="22"/>
+        </w:rPr>
+        <w:t xml:space="preserve">Each conversation focuses on a single entity. Claude conducts a focused interview about the entity’s purpose, fields, relationships, and business rules, producing an Entity PRD document.</w:t>
+      </w:r>
+    </w:p>
+    <w:p>
+      <w:pPr>
+        <w:pStyle w:val="Heading3"/>
+        <w:spacing w:after="120" w:before="240"/>
+      </w:pPr>
+      <w:r>
+        <w:rPr>
+          <w:rFonts w:ascii="Arial" w:cs="Arial" w:eastAsia="Arial" w:hAnsi="Arial"/>
+          <w:b/>
+          <w:bCs/>
+          <w:i w:val="false"/>
+          <w:iCs w:val="false"/>
+          <w:sz w:val="24"/>
+          <w:szCs w:val="24"/>
+        </w:rPr>
+        <w:t xml:space="preserve">Context Passing</w:t>
+      </w:r>
+    </w:p>
+    <w:p>
+      <w:pPr>
+        <w:spacing w:after="120"/>
+      </w:pPr>
+      <w:r>
+        <w:rPr>
+          <w:rFonts w:ascii="Arial" w:cs="Arial" w:eastAsia="Arial" w:hAnsi="Arial"/>
+          <w:b w:val="false"/>
+          <w:bCs w:val="false"/>
+          <w:i w:val="false"/>
+          <w:iCs w:val="false"/>
+          <w:sz w:val="22"/>
+          <w:szCs w:val="22"/>
+        </w:rPr>
+        <w:t xml:space="preserve">Each entity conversation receives the Master PRD, the Entity Inventory, and all previously completed Entity PRDs as uploaded files. This gives Claude full visibility into what entities have already been defined and what relationships have been established — without requiring cross-session memory.</w:t>
+      </w:r>
+    </w:p>
+    <w:p>
+      <w:pPr>
+        <w:spacing w:after="120"/>
+      </w:pPr>
+      <w:r>
+        <w:rPr>
+          <w:rFonts w:ascii="Arial" w:cs="Arial" w:eastAsia="Arial" w:hAnsi="Arial"/>
+          <w:b w:val="false"/>
+          <w:bCs w:val="false"/>
+          <w:i w:val="false"/>
+          <w:iCs w:val="false"/>
+          <w:sz w:val="22"/>
+          <w:szCs w:val="22"/>
+        </w:rPr>
+        <w:t xml:space="preserve">By the time the last entity is being defined, Claude has the complete entity context available in the conversation.</w:t>
+      </w:r>
+    </w:p>
+    <w:p>
+      <w:pPr>
+        <w:pStyle w:val="Heading3"/>
+        <w:spacing w:after="120" w:before="240"/>
+      </w:pPr>
+      <w:r>
+        <w:rPr>
+          <w:rFonts w:ascii="Arial" w:cs="Arial" w:eastAsia="Arial" w:hAnsi="Arial"/>
+          <w:b/>
+          <w:bCs/>
+          <w:i w:val="false"/>
+          <w:iCs w:val="false"/>
+          <w:sz w:val="24"/>
+          <w:szCs w:val="24"/>
+        </w:rPr>
+        <w:t xml:space="preserve">Entity PRD Structure</w:t>
+      </w:r>
+    </w:p>
+    <w:p>
+      <w:pPr>
+        <w:spacing w:after="120"/>
+      </w:pPr>
+      <w:r>
+        <w:rPr>
+          <w:rFonts w:ascii="Arial" w:cs="Arial" w:eastAsia="Arial" w:hAnsi="Arial"/>
+          <w:b w:val="false"/>
+          <w:bCs w:val="false"/>
+          <w:i w:val="false"/>
+          <w:iCs w:val="false"/>
+          <w:sz w:val="22"/>
+          <w:szCs w:val="22"/>
+        </w:rPr>
+        <w:t xml:space="preserve">Every Entity PRD must contain all nine of the following sections. The Entity Definition guide (guide-entity-definition.md) provides detailed descriptions of each section. A generator template (generate-entity-prd-template.js) is available to produce Entity PRDs with consistent formatting.</w:t>
       </w:r>
     </w:p>
     <w:p>
@@ -3079,7 +3229,7 @@
           <w:sz w:val="22"/>
           <w:szCs w:val="22"/>
         </w:rPr>
-        <w:t xml:space="preserve">Native Fields — fields that already exist on the entity because of its platform entity type, documented to prevent duplicate creation during YAML generation</w:t>
+        <w:t xml:space="preserve">Entity Overview — entity metadata, native/custom status, entity type, contributing domains, and discriminator details for shared entities</w:t>
       </w:r>
     </w:p>
     <w:p>
@@ -3101,7 +3251,7 @@
           <w:sz w:val="22"/>
           <w:szCs w:val="22"/>
         </w:rPr>
-        <w:t xml:space="preserve">Custom Fields — fields created via YAML, organized by scope (shared vs. type-specific) with full field-level detail including domain attribution, visibility rules, and implementation notes</w:t>
+        <w:t xml:space="preserve">Native Fields — fields that already exist on the entity because of its platform entity type, documented to prevent duplicate creation during YAML generation</w:t>
       </w:r>
     </w:p>
     <w:p>
@@ -3123,7 +3273,7 @@
           <w:sz w:val="22"/>
           <w:szCs w:val="22"/>
         </w:rPr>
-        <w:t xml:space="preserve">Relationships — all relationships involving this entity, compiled from all domains, with link types, PRD references, and domain attribution</w:t>
+        <w:t xml:space="preserve">Custom Fields — fields created via YAML, organized by scope (shared vs. type-specific) with full field-level detail including domain attribution, visibility rules, and implementation notes</w:t>
       </w:r>
     </w:p>
     <w:p>
@@ -3145,7 +3295,7 @@
           <w:sz w:val="22"/>
           <w:szCs w:val="22"/>
         </w:rPr>
-        <w:t xml:space="preserve">Dynamic Logic Rules — consolidated visibility rules for type-specific fields and panels, grouped by discriminator value</w:t>
+        <w:t xml:space="preserve">Relationships — all relationships involving this entity, compiled from all domains, with link types, PRD references, and domain attribution</w:t>
       </w:r>
     </w:p>
     <w:p>
@@ -3167,7 +3317,7 @@
           <w:sz w:val="22"/>
           <w:szCs w:val="22"/>
         </w:rPr>
-        <w:t xml:space="preserve">Layout Guidance — suggested panel and tab grouping for the detail view, with notes on which panels are controlled by dynamic logic</w:t>
+        <w:t xml:space="preserve">Dynamic Logic Rules — consolidated visibility rules for type-specific fields and panels, grouped by discriminator value</w:t>
       </w:r>
     </w:p>
     <w:p>
@@ -3189,7 +3339,7 @@
           <w:sz w:val="22"/>
           <w:szCs w:val="22"/>
         </w:rPr>
-        <w:t xml:space="preserve">Implementation Notes — calculated field formulas, access control restrictions, audited fields, system-populated fields, and other implementation details</w:t>
+        <w:t xml:space="preserve">Layout Guidance — suggested panel and tab grouping for the detail view, with notes on which panels are controlled by dynamic logic</w:t>
       </w:r>
     </w:p>
     <w:p>
@@ -3211,7 +3361,7 @@
           <w:sz w:val="22"/>
           <w:szCs w:val="22"/>
         </w:rPr>
-        <w:t xml:space="preserve">Open Issues — unresolved questions specific to this entity’s implementation, including issues carried forward from the Entity Inventory</w:t>
+        <w:t xml:space="preserve">Implementation Notes — calculated field formulas, access control restrictions, audited fields, system-populated fields, and other implementation details</w:t>
       </w:r>
     </w:p>
     <w:p>
@@ -3233,42 +3383,7 @@
           <w:sz w:val="22"/>
           <w:szCs w:val="22"/>
         </w:rPr>
-        <w:t xml:space="preserve">Decisions Made — decisions made during the entity definition session, with identifiers and rationale, including decisions that affect other Entity PRDs</w:t>
-      </w:r>
-    </w:p>
-    <w:p>
-      <w:pPr>
-        <w:pStyle w:val="Heading3"/>
-        <w:spacing w:after="120" w:before="240"/>
-      </w:pPr>
-      <w:r>
-        <w:rPr>
-          <w:rFonts w:ascii="Arial" w:cs="Arial" w:eastAsia="Arial" w:hAnsi="Arial"/>
-          <w:b/>
-          <w:bCs/>
-          <w:i w:val="false"/>
-          <w:iCs w:val="false"/>
-          <w:sz w:val="24"/>
-          <w:szCs w:val="24"/>
-        </w:rPr>
-        <w:t xml:space="preserve">Completeness Standard</w:t>
-      </w:r>
-    </w:p>
-    <w:p>
-      <w:pPr>
-        <w:spacing w:after="120"/>
-      </w:pPr>
-      <w:r>
-        <w:rPr>
-          <w:rFonts w:ascii="Arial" w:cs="Arial" w:eastAsia="Arial" w:hAnsi="Arial"/>
-          <w:b w:val="false"/>
-          <w:bCs w:val="false"/>
-          <w:i w:val="false"/>
-          <w:iCs w:val="false"/>
-          <w:sz w:val="22"/>
-          <w:szCs w:val="22"/>
-        </w:rPr>
-        <w:t xml:space="preserve">An Entity PRD is not complete until all nine sections are present and:</w:t>
+        <w:t xml:space="preserve">Open Issues — unresolved questions specific to this entity’s implementation, including issues carried forward from the Entity Inventory</w:t>
       </w:r>
     </w:p>
     <w:p>
@@ -3290,7 +3405,42 @@
           <w:sz w:val="22"/>
           <w:szCs w:val="22"/>
         </w:rPr>
-        <w:t xml:space="preserve">Every field has full field-level detail (name, type, required status, enum values where applicable, and description)</w:t>
+        <w:t xml:space="preserve">Decisions Made — decisions made during the entity definition session, with identifiers and rationale, including decisions that affect other Entity PRDs</w:t>
+      </w:r>
+    </w:p>
+    <w:p>
+      <w:pPr>
+        <w:pStyle w:val="Heading3"/>
+        <w:spacing w:after="120" w:before="240"/>
+      </w:pPr>
+      <w:r>
+        <w:rPr>
+          <w:rFonts w:ascii="Arial" w:cs="Arial" w:eastAsia="Arial" w:hAnsi="Arial"/>
+          <w:b/>
+          <w:bCs/>
+          <w:i w:val="false"/>
+          <w:iCs w:val="false"/>
+          <w:sz w:val="24"/>
+          <w:szCs w:val="24"/>
+        </w:rPr>
+        <w:t xml:space="preserve">Completeness Standard</w:t>
+      </w:r>
+    </w:p>
+    <w:p>
+      <w:pPr>
+        <w:spacing w:after="120"/>
+      </w:pPr>
+      <w:r>
+        <w:rPr>
+          <w:rFonts w:ascii="Arial" w:cs="Arial" w:eastAsia="Arial" w:hAnsi="Arial"/>
+          <w:b w:val="false"/>
+          <w:bCs w:val="false"/>
+          <w:i w:val="false"/>
+          <w:iCs w:val="false"/>
+          <w:sz w:val="22"/>
+          <w:szCs w:val="22"/>
+        </w:rPr>
+        <w:t xml:space="preserve">An Entity PRD is not complete until all nine sections are present and:</w:t>
       </w:r>
     </w:p>
     <w:p>
@@ -3312,7 +3462,7 @@
           <w:sz w:val="22"/>
           <w:szCs w:val="22"/>
         </w:rPr>
-        <w:t xml:space="preserve">Every relationship to a previously defined entity is confirmed by both sides</w:t>
+        <w:t xml:space="preserve">Every field has full field-level detail (name, type, required status, enum values where applicable, and description)</w:t>
       </w:r>
     </w:p>
     <w:p>
@@ -3334,7 +3484,7 @@
           <w:sz w:val="22"/>
           <w:szCs w:val="22"/>
         </w:rPr>
-        <w:t xml:space="preserve">All dynamic logic visibility rules are documented for type-specific fields</w:t>
+        <w:t xml:space="preserve">Every relationship to a previously defined entity is confirmed by both sides</w:t>
       </w:r>
     </w:p>
     <w:p>
@@ -3356,246 +3506,7 @@
           <w:sz w:val="22"/>
           <w:szCs w:val="22"/>
         </w:rPr>
-        <w:t xml:space="preserve">Native fields are clearly distinguished from custom fields so that YAML generation does not attempt to create fields that already exist on the platform</w:t>
-      </w:r>
-    </w:p>
-    <w:p>
-      <w:pPr>
-        <w:pStyle w:val="Heading2"/>
-        <w:spacing w:after="120" w:before="240"/>
-      </w:pPr>
-      <w:r>
-        <w:rPr>
-          <w:rFonts w:ascii="Arial" w:cs="Arial" w:eastAsia="Arial" w:hAnsi="Arial"/>
-          <w:b/>
-          <w:bCs/>
-          <w:i w:val="false"/>
-          <w:iCs w:val="false"/>
-          <w:color w:val="1F3864"/>
-          <w:sz w:val="28"/>
-          <w:szCs w:val="28"/>
-        </w:rPr>
-        <w:t xml:space="preserve">3.3 Phase 3: Domain Overview</w:t>
-      </w:r>
-    </w:p>
-    <w:p>
-      <w:pPr>
-        <w:spacing w:after="120"/>
-      </w:pPr>
-      <w:r>
-        <w:rPr>
-          <w:rFonts w:ascii="Arial" w:cs="Arial" w:eastAsia="Arial" w:hAnsi="Arial"/>
-          <w:b/>
-          <w:bCs/>
-          <w:i w:val="false"/>
-          <w:iCs w:val="false"/>
-          <w:sz w:val="22"/>
-          <w:szCs w:val="22"/>
-        </w:rPr>
-        <w:t xml:space="preserve">Conversations: </w:t>
-      </w:r>
-      <w:r>
-        <w:rPr>
-          <w:rFonts w:ascii="Arial" w:cs="Arial" w:eastAsia="Arial" w:hAnsi="Arial"/>
-          <w:b w:val="false"/>
-          <w:bCs w:val="false"/>
-          <w:i w:val="false"/>
-          <w:iCs w:val="false"/>
-          <w:sz w:val="22"/>
-          <w:szCs w:val="22"/>
-        </w:rPr>
-        <w:t xml:space="preserve">1 per domain.</w:t>
-      </w:r>
-    </w:p>
-    <w:p>
-      <w:pPr>
-        <w:spacing w:after="120"/>
-      </w:pPr>
-      <w:r>
-        <w:rPr>
-          <w:rFonts w:ascii="Arial" w:cs="Arial" w:eastAsia="Arial" w:hAnsi="Arial"/>
-          <w:b/>
-          <w:bCs/>
-          <w:i w:val="false"/>
-          <w:iCs w:val="false"/>
-          <w:sz w:val="22"/>
-          <w:szCs w:val="22"/>
-        </w:rPr>
-        <w:t xml:space="preserve">Input: </w:t>
-      </w:r>
-      <w:r>
-        <w:rPr>
-          <w:rFonts w:ascii="Arial" w:cs="Arial" w:eastAsia="Arial" w:hAnsi="Arial"/>
-          <w:b w:val="false"/>
-          <w:bCs w:val="false"/>
-          <w:i w:val="false"/>
-          <w:iCs w:val="false"/>
-          <w:sz w:val="22"/>
-          <w:szCs w:val="22"/>
-        </w:rPr>
-        <w:t xml:space="preserve">Master PRD + Entity Inventory + Entity PRDs for entities participating in this domain.</w:t>
-      </w:r>
-    </w:p>
-    <w:p>
-      <w:pPr>
-        <w:spacing w:after="120"/>
-      </w:pPr>
-      <w:r>
-        <w:rPr>
-          <w:rFonts w:ascii="Arial" w:cs="Arial" w:eastAsia="Arial" w:hAnsi="Arial"/>
-          <w:b/>
-          <w:bCs/>
-          <w:i w:val="false"/>
-          <w:iCs w:val="false"/>
-          <w:sz w:val="22"/>
-          <w:szCs w:val="22"/>
-        </w:rPr>
-        <w:t xml:space="preserve">Output: </w:t>
-      </w:r>
-      <w:r>
-        <w:rPr>
-          <w:rFonts w:ascii="Arial" w:cs="Arial" w:eastAsia="Arial" w:hAnsi="Arial"/>
-          <w:b w:val="false"/>
-          <w:bCs w:val="false"/>
-          <w:i w:val="false"/>
-          <w:iCs w:val="false"/>
-          <w:sz w:val="22"/>
-          <w:szCs w:val="22"/>
-        </w:rPr>
-        <w:t xml:space="preserve">Domain Overview document (Word).</w:t>
-      </w:r>
-    </w:p>
-    <w:p>
-      <w:pPr>
-        <w:spacing w:after="120"/>
-      </w:pPr>
-      <w:r>
-        <w:rPr>
-          <w:rFonts w:ascii="Arial" w:cs="Arial" w:eastAsia="Arial" w:hAnsi="Arial"/>
-          <w:b/>
-          <w:bCs/>
-          <w:i w:val="false"/>
-          <w:iCs w:val="false"/>
-          <w:sz w:val="22"/>
-          <w:szCs w:val="22"/>
-        </w:rPr>
-        <w:t xml:space="preserve">Repository location: </w:t>
-      </w:r>
-      <w:r>
-        <w:rPr>
-          <w:rFonts w:ascii="Arial" w:cs="Arial" w:eastAsia="Arial" w:hAnsi="Arial"/>
-          <w:b w:val="false"/>
-          <w:bCs w:val="false"/>
-          <w:i w:val="false"/>
-          <w:iCs w:val="false"/>
-          <w:sz w:val="22"/>
-          <w:szCs w:val="22"/>
-        </w:rPr>
-        <w:t xml:space="preserve">PRDs/{domain_code}/{Implementation}-Domain-Overview-{DomainName}.docx</w:t>
-      </w:r>
-    </w:p>
-    <w:p>
-      <w:pPr>
-        <w:spacing w:after="120"/>
-      </w:pPr>
-      <w:r>
-        <w:rPr>
-          <w:rFonts w:ascii="Arial" w:cs="Arial" w:eastAsia="Arial" w:hAnsi="Arial"/>
-          <w:b w:val="false"/>
-          <w:bCs w:val="false"/>
-          <w:i w:val="false"/>
-          <w:iCs w:val="false"/>
-          <w:sz w:val="22"/>
-          <w:szCs w:val="22"/>
-        </w:rPr>
-        <w:t xml:space="preserve">Each domain receives a focused overview conversation before its process definition work begins. Claude assembles content from the Master PRD and completed Entity PRDs into a single domain-scoped reference document. The Domain Overview provides context that all process definition conversations in the domain will use as their primary input, replacing the need to upload the Master PRD, Entity Inventory, and individual Entity PRDs separately into each process session.</w:t>
-      </w:r>
-    </w:p>
-    <w:p>
-      <w:pPr>
-        <w:spacing w:after="120"/>
-      </w:pPr>
-      <w:r>
-        <w:rPr>
-          <w:rFonts w:ascii="Arial" w:cs="Arial" w:eastAsia="Arial" w:hAnsi="Arial"/>
-          <w:b w:val="false"/>
-          <w:bCs w:val="false"/>
-          <w:i w:val="false"/>
-          <w:iCs w:val="false"/>
-          <w:sz w:val="22"/>
-          <w:szCs w:val="22"/>
-        </w:rPr>
-        <w:t xml:space="preserve">The conversation also confirms the process inventory and dependency ordering for the domain, and identifies any gaps or ambiguities in the upstream documents that should be resolved before process work begins.</w:t>
-      </w:r>
-    </w:p>
-    <w:p>
-      <w:pPr>
-        <w:pStyle w:val="Heading3"/>
-        <w:spacing w:after="120" w:before="240"/>
-      </w:pPr>
-      <w:r>
-        <w:rPr>
-          <w:rFonts w:ascii="Arial" w:cs="Arial" w:eastAsia="Arial" w:hAnsi="Arial"/>
-          <w:b/>
-          <w:bCs/>
-          <w:i w:val="false"/>
-          <w:iCs w:val="false"/>
-          <w:sz w:val="24"/>
-          <w:szCs w:val="24"/>
-        </w:rPr>
-        <w:t xml:space="preserve">Context Passing</w:t>
-      </w:r>
-    </w:p>
-    <w:p>
-      <w:pPr>
-        <w:spacing w:after="120"/>
-      </w:pPr>
-      <w:r>
-        <w:rPr>
-          <w:rFonts w:ascii="Arial" w:cs="Arial" w:eastAsia="Arial" w:hAnsi="Arial"/>
-          <w:b w:val="false"/>
-          <w:bCs w:val="false"/>
-          <w:i w:val="false"/>
-          <w:iCs w:val="false"/>
-          <w:sz w:val="22"/>
-          <w:szCs w:val="22"/>
-        </w:rPr>
-        <w:t xml:space="preserve">Each Domain Overview conversation receives the Master PRD, the Entity Inventory, and the Entity PRDs for every entity whose Entity Inventory data lists it as participating in this domain. This gives Claude the complete upstream context needed to assemble the domain-scoped reference.</w:t>
-      </w:r>
-    </w:p>
-    <w:p>
-      <w:pPr>
-        <w:pStyle w:val="Heading3"/>
-        <w:spacing w:after="120" w:before="240"/>
-      </w:pPr>
-      <w:r>
-        <w:rPr>
-          <w:rFonts w:ascii="Arial" w:cs="Arial" w:eastAsia="Arial" w:hAnsi="Arial"/>
-          <w:b/>
-          <w:bCs/>
-          <w:i w:val="false"/>
-          <w:iCs w:val="false"/>
-          <w:sz w:val="24"/>
-          <w:szCs w:val="24"/>
-        </w:rPr>
-        <w:t xml:space="preserve">Domain Overview Document Structure</w:t>
-      </w:r>
-    </w:p>
-    <w:p>
-      <w:pPr>
-        <w:spacing w:after="120"/>
-      </w:pPr>
-      <w:r>
-        <w:rPr>
-          <w:rFonts w:ascii="Arial" w:cs="Arial" w:eastAsia="Arial" w:hAnsi="Arial"/>
-          <w:b w:val="false"/>
-          <w:bCs w:val="false"/>
-          <w:i w:val="false"/>
-          <w:iCs w:val="false"/>
-          <w:sz w:val="22"/>
-          <w:szCs w:val="22"/>
-        </w:rPr>
-        <w:t xml:space="preserve">Every Domain Overview document must contain all four of the following sections:</w:t>
+        <w:t xml:space="preserve">All dynamic logic visibility rules are documented for type-specific fields</w:t>
       </w:r>
     </w:p>
     <w:p>
@@ -3610,26 +3521,253 @@
       <w:r>
         <w:rPr>
           <w:rFonts w:ascii="Arial" w:cs="Arial" w:eastAsia="Arial" w:hAnsi="Arial"/>
+          <w:b w:val="false"/>
+          <w:bCs w:val="false"/>
+          <w:i w:val="false"/>
+          <w:iCs w:val="false"/>
+          <w:sz w:val="22"/>
+          <w:szCs w:val="22"/>
+        </w:rPr>
+        <w:t xml:space="preserve">Native fields are clearly distinguished from custom fields so that YAML generation does not attempt to create fields that already exist on the platform</w:t>
+      </w:r>
+    </w:p>
+    <w:p>
+      <w:pPr>
+        <w:pStyle w:val="Heading2"/>
+        <w:spacing w:after="120" w:before="240"/>
+      </w:pPr>
+      <w:r>
+        <w:rPr>
+          <w:rFonts w:ascii="Arial" w:cs="Arial" w:eastAsia="Arial" w:hAnsi="Arial"/>
           <w:b/>
           <w:bCs/>
           <w:i w:val="false"/>
           <w:iCs w:val="false"/>
-          <w:sz w:val="22"/>
-          <w:szCs w:val="22"/>
-        </w:rPr>
-        <w:t xml:space="preserve">Domain Purpose</w:t>
-      </w:r>
-      <w:r>
-        <w:rPr>
-          <w:rFonts w:ascii="Arial" w:cs="Arial" w:eastAsia="Arial" w:hAnsi="Arial"/>
-          <w:b w:val="false"/>
-          <w:bCs w:val="false"/>
-          <w:i w:val="false"/>
-          <w:iCs w:val="false"/>
-          <w:sz w:val="22"/>
-          <w:szCs w:val="22"/>
-        </w:rPr>
-        <w:t xml:space="preserve"> — expanded business context, drawn from and elaborating on the Master PRD’s domain description.</w:t>
+          <w:color w:val="1F3864"/>
+          <w:sz w:val="28"/>
+          <w:szCs w:val="28"/>
+        </w:rPr>
+        <w:t xml:space="preserve">3.3 Phase 3: Domain Overview</w:t>
+      </w:r>
+    </w:p>
+    <w:p>
+      <w:pPr>
+        <w:spacing w:after="120"/>
+      </w:pPr>
+      <w:r>
+        <w:rPr>
+          <w:rFonts w:ascii="Arial" w:cs="Arial" w:eastAsia="Arial" w:hAnsi="Arial"/>
+          <w:b/>
+          <w:bCs/>
+          <w:i w:val="false"/>
+          <w:iCs w:val="false"/>
+          <w:sz w:val="22"/>
+          <w:szCs w:val="22"/>
+        </w:rPr>
+        <w:t xml:space="preserve">Conversations: </w:t>
+      </w:r>
+      <w:r>
+        <w:rPr>
+          <w:rFonts w:ascii="Arial" w:cs="Arial" w:eastAsia="Arial" w:hAnsi="Arial"/>
+          <w:b w:val="false"/>
+          <w:bCs w:val="false"/>
+          <w:i w:val="false"/>
+          <w:iCs w:val="false"/>
+          <w:sz w:val="22"/>
+          <w:szCs w:val="22"/>
+        </w:rPr>
+        <w:t xml:space="preserve">1 per domain.</w:t>
+      </w:r>
+    </w:p>
+    <w:p>
+      <w:pPr>
+        <w:spacing w:after="120"/>
+      </w:pPr>
+      <w:r>
+        <w:rPr>
+          <w:rFonts w:ascii="Arial" w:cs="Arial" w:eastAsia="Arial" w:hAnsi="Arial"/>
+          <w:b/>
+          <w:bCs/>
+          <w:i w:val="false"/>
+          <w:iCs w:val="false"/>
+          <w:sz w:val="22"/>
+          <w:szCs w:val="22"/>
+        </w:rPr>
+        <w:t xml:space="preserve">Input: </w:t>
+      </w:r>
+      <w:r>
+        <w:rPr>
+          <w:rFonts w:ascii="Arial" w:cs="Arial" w:eastAsia="Arial" w:hAnsi="Arial"/>
+          <w:b w:val="false"/>
+          <w:bCs w:val="false"/>
+          <w:i w:val="false"/>
+          <w:iCs w:val="false"/>
+          <w:sz w:val="22"/>
+          <w:szCs w:val="22"/>
+        </w:rPr>
+        <w:t xml:space="preserve">Master PRD + Entity Inventory + Entity PRDs for entities participating in this domain.</w:t>
+      </w:r>
+    </w:p>
+    <w:p>
+      <w:pPr>
+        <w:spacing w:after="120"/>
+      </w:pPr>
+      <w:r>
+        <w:rPr>
+          <w:rFonts w:ascii="Arial" w:cs="Arial" w:eastAsia="Arial" w:hAnsi="Arial"/>
+          <w:b/>
+          <w:bCs/>
+          <w:i w:val="false"/>
+          <w:iCs w:val="false"/>
+          <w:sz w:val="22"/>
+          <w:szCs w:val="22"/>
+        </w:rPr>
+        <w:t xml:space="preserve">Output: </w:t>
+      </w:r>
+      <w:r>
+        <w:rPr>
+          <w:rFonts w:ascii="Arial" w:cs="Arial" w:eastAsia="Arial" w:hAnsi="Arial"/>
+          <w:b w:val="false"/>
+          <w:bCs w:val="false"/>
+          <w:i w:val="false"/>
+          <w:iCs w:val="false"/>
+          <w:sz w:val="22"/>
+          <w:szCs w:val="22"/>
+        </w:rPr>
+        <w:t xml:space="preserve">Domain Overview document (Word).</w:t>
+      </w:r>
+    </w:p>
+    <w:p>
+      <w:pPr>
+        <w:spacing w:after="120"/>
+      </w:pPr>
+      <w:r>
+        <w:rPr>
+          <w:rFonts w:ascii="Arial" w:cs="Arial" w:eastAsia="Arial" w:hAnsi="Arial"/>
+          <w:b/>
+          <w:bCs/>
+          <w:i w:val="false"/>
+          <w:iCs w:val="false"/>
+          <w:sz w:val="22"/>
+          <w:szCs w:val="22"/>
+        </w:rPr>
+        <w:t xml:space="preserve">Repository location: </w:t>
+      </w:r>
+      <w:r>
+        <w:rPr>
+          <w:rFonts w:ascii="Arial" w:cs="Arial" w:eastAsia="Arial" w:hAnsi="Arial"/>
+          <w:b w:val="false"/>
+          <w:bCs w:val="false"/>
+          <w:i w:val="false"/>
+          <w:iCs w:val="false"/>
+          <w:sz w:val="22"/>
+          <w:szCs w:val="22"/>
+        </w:rPr>
+        <w:t xml:space="preserve">PRDs/{domain_code}/{Implementation}-Domain-Overview-{DomainName}.docx</w:t>
+      </w:r>
+    </w:p>
+    <w:p>
+      <w:pPr>
+        <w:spacing w:after="120"/>
+      </w:pPr>
+      <w:r>
+        <w:rPr>
+          <w:rFonts w:ascii="Arial" w:cs="Arial" w:eastAsia="Arial" w:hAnsi="Arial"/>
+          <w:b w:val="false"/>
+          <w:bCs w:val="false"/>
+          <w:i w:val="false"/>
+          <w:iCs w:val="false"/>
+          <w:sz w:val="22"/>
+          <w:szCs w:val="22"/>
+        </w:rPr>
+        <w:t xml:space="preserve">Each domain receives a focused overview conversation before its process definition work begins. Claude assembles content from the Master PRD and completed Entity PRDs into a single domain-scoped reference document. The Domain Overview provides context that all process definition conversations in the domain will use as their primary input, replacing the need to upload the Master PRD, Entity Inventory, and individual Entity PRDs separately into each process session.</w:t>
+      </w:r>
+    </w:p>
+    <w:p>
+      <w:pPr>
+        <w:spacing w:after="120"/>
+      </w:pPr>
+      <w:r>
+        <w:rPr>
+          <w:rFonts w:ascii="Arial" w:cs="Arial" w:eastAsia="Arial" w:hAnsi="Arial"/>
+          <w:b w:val="false"/>
+          <w:bCs w:val="false"/>
+          <w:i w:val="false"/>
+          <w:iCs w:val="false"/>
+          <w:sz w:val="22"/>
+          <w:szCs w:val="22"/>
+        </w:rPr>
+        <w:t xml:space="preserve">The conversation also confirms the process inventory and dependency ordering for the domain, and identifies any gaps or ambiguities in the upstream documents that should be resolved before process work begins.</w:t>
+      </w:r>
+    </w:p>
+    <w:p>
+      <w:pPr>
+        <w:pStyle w:val="Heading3"/>
+        <w:spacing w:after="120" w:before="240"/>
+      </w:pPr>
+      <w:r>
+        <w:rPr>
+          <w:rFonts w:ascii="Arial" w:cs="Arial" w:eastAsia="Arial" w:hAnsi="Arial"/>
+          <w:b/>
+          <w:bCs/>
+          <w:i w:val="false"/>
+          <w:iCs w:val="false"/>
+          <w:sz w:val="24"/>
+          <w:szCs w:val="24"/>
+        </w:rPr>
+        <w:t xml:space="preserve">Context Passing</w:t>
+      </w:r>
+    </w:p>
+    <w:p>
+      <w:pPr>
+        <w:spacing w:after="120"/>
+      </w:pPr>
+      <w:r>
+        <w:rPr>
+          <w:rFonts w:ascii="Arial" w:cs="Arial" w:eastAsia="Arial" w:hAnsi="Arial"/>
+          <w:b w:val="false"/>
+          <w:bCs w:val="false"/>
+          <w:i w:val="false"/>
+          <w:iCs w:val="false"/>
+          <w:sz w:val="22"/>
+          <w:szCs w:val="22"/>
+        </w:rPr>
+        <w:t xml:space="preserve">Each Domain Overview conversation receives the Master PRD, the Entity Inventory, and the Entity PRDs for every entity whose Entity Inventory data lists it as participating in this domain. This gives Claude the complete upstream context needed to assemble the domain-scoped reference.</w:t>
+      </w:r>
+    </w:p>
+    <w:p>
+      <w:pPr>
+        <w:pStyle w:val="Heading3"/>
+        <w:spacing w:after="120" w:before="240"/>
+      </w:pPr>
+      <w:r>
+        <w:rPr>
+          <w:rFonts w:ascii="Arial" w:cs="Arial" w:eastAsia="Arial" w:hAnsi="Arial"/>
+          <w:b/>
+          <w:bCs/>
+          <w:i w:val="false"/>
+          <w:iCs w:val="false"/>
+          <w:sz w:val="24"/>
+          <w:szCs w:val="24"/>
+        </w:rPr>
+        <w:t xml:space="preserve">Domain Overview Document Structure</w:t>
+      </w:r>
+    </w:p>
+    <w:p>
+      <w:pPr>
+        <w:spacing w:after="120"/>
+      </w:pPr>
+      <w:r>
+        <w:rPr>
+          <w:rFonts w:ascii="Arial" w:cs="Arial" w:eastAsia="Arial" w:hAnsi="Arial"/>
+          <w:b w:val="false"/>
+          <w:bCs w:val="false"/>
+          <w:i w:val="false"/>
+          <w:iCs w:val="false"/>
+          <w:sz w:val="22"/>
+          <w:szCs w:val="22"/>
+        </w:rPr>
+        <w:t xml:space="preserve">Every Domain Overview document must contain all four of the following sections:</w:t>
       </w:r>
     </w:p>
     <w:p>
@@ -3651,19 +3789,19 @@
           <w:sz w:val="22"/>
           <w:szCs w:val="22"/>
         </w:rPr>
-        <w:t xml:space="preserve">Personas</w:t>
-      </w:r>
-      <w:r>
-        <w:rPr>
-          <w:rFonts w:ascii="Arial" w:cs="Arial" w:eastAsia="Arial" w:hAnsi="Arial"/>
-          <w:b w:val="false"/>
-          <w:bCs w:val="false"/>
-          <w:i w:val="false"/>
-          <w:iCs w:val="false"/>
-          <w:sz w:val="22"/>
-          <w:szCs w:val="22"/>
-        </w:rPr>
-        <w:t xml:space="preserve"> — personas participating in this domain, scoped from the Master PRD’s persona definitions to their domain-specific roles.</w:t>
+        <w:t xml:space="preserve">Domain Purpose</w:t>
+      </w:r>
+      <w:r>
+        <w:rPr>
+          <w:rFonts w:ascii="Arial" w:cs="Arial" w:eastAsia="Arial" w:hAnsi="Arial"/>
+          <w:b w:val="false"/>
+          <w:bCs w:val="false"/>
+          <w:i w:val="false"/>
+          <w:iCs w:val="false"/>
+          <w:sz w:val="22"/>
+          <w:szCs w:val="22"/>
+        </w:rPr>
+        <w:t xml:space="preserve"> — expanded business context, drawn from and elaborating on the Master PRD’s domain description.</w:t>
       </w:r>
     </w:p>
     <w:p>
@@ -3685,19 +3823,19 @@
           <w:sz w:val="22"/>
           <w:szCs w:val="22"/>
         </w:rPr>
-        <w:t xml:space="preserve">Business Processes</w:t>
-      </w:r>
-      <w:r>
-        <w:rPr>
-          <w:rFonts w:ascii="Arial" w:cs="Arial" w:eastAsia="Arial" w:hAnsi="Arial"/>
-          <w:b w:val="false"/>
-          <w:bCs w:val="false"/>
-          <w:i w:val="false"/>
-          <w:iCs w:val="false"/>
-          <w:sz w:val="22"/>
-          <w:szCs w:val="22"/>
-        </w:rPr>
-        <w:t xml:space="preserve"> — the complete process inventory for the domain with lifecycle narrative, process relationships, and dependency ordering. Describes how the processes connect end to end.</w:t>
+        <w:t xml:space="preserve">Personas</w:t>
+      </w:r>
+      <w:r>
+        <w:rPr>
+          <w:rFonts w:ascii="Arial" w:cs="Arial" w:eastAsia="Arial" w:hAnsi="Arial"/>
+          <w:b w:val="false"/>
+          <w:bCs w:val="false"/>
+          <w:i w:val="false"/>
+          <w:iCs w:val="false"/>
+          <w:sz w:val="22"/>
+          <w:szCs w:val="22"/>
+        </w:rPr>
+        <w:t xml:space="preserve"> — personas participating in this domain, scoped from the Master PRD’s persona definitions to their domain-specific roles.</w:t>
       </w:r>
     </w:p>
     <w:p>
@@ -3719,6 +3857,40 @@
           <w:sz w:val="22"/>
           <w:szCs w:val="22"/>
         </w:rPr>
+        <w:t xml:space="preserve">Business Processes</w:t>
+      </w:r>
+      <w:r>
+        <w:rPr>
+          <w:rFonts w:ascii="Arial" w:cs="Arial" w:eastAsia="Arial" w:hAnsi="Arial"/>
+          <w:b w:val="false"/>
+          <w:bCs w:val="false"/>
+          <w:i w:val="false"/>
+          <w:iCs w:val="false"/>
+          <w:sz w:val="22"/>
+          <w:szCs w:val="22"/>
+        </w:rPr>
+        <w:t xml:space="preserve"> — the complete process inventory for the domain with lifecycle narrative, process relationships, and dependency ordering. Describes how the processes connect end to end.</w:t>
+      </w:r>
+    </w:p>
+    <w:p>
+      <w:pPr>
+        <w:pStyle w:val="ListParagraph"/>
+        <w:numPr>
+          <w:ilvl w:val="0"/>
+          <w:numId w:val="2"/>
+        </w:numPr>
+        <w:spacing w:after="60"/>
+      </w:pPr>
+      <w:r>
+        <w:rPr>
+          <w:rFonts w:ascii="Arial" w:cs="Arial" w:eastAsia="Arial" w:hAnsi="Arial"/>
+          <w:b/>
+          <w:bCs/>
+          <w:i w:val="false"/>
+          <w:iCs w:val="false"/>
+          <w:sz w:val="22"/>
+          <w:szCs w:val="22"/>
+        </w:rPr>
         <w:t xml:space="preserve">Data Reference</w:t>
       </w:r>
       <w:r>
@@ -3820,70 +3992,121 @@
           <w:sz w:val="28"/>
           <w:szCs w:val="28"/>
         </w:rPr>
-        <w:t xml:space="preserve">3.4 Phase 4: Process Definition</w:t>
-      </w:r>
-    </w:p>
-    <w:p>
-      <w:pPr>
-        <w:spacing w:after="120"/>
+        <w:t xml:space="preserve">3.4 Phase 4: Cross-Domain Service Definition</w:t>
+      </w:r>
+    </w:p>
+    <w:p>
+      <w:pPr>
+        <w:spacing w:after="120"/>
+      </w:pPr>
+      <w:r>
+        <w:rPr>
+          <w:rFonts w:ascii="Arial" w:cs="Arial" w:eastAsia="Arial" w:hAnsi="Arial"/>
+          <w:sz w:val="22"/>
+          <w:szCs w:val="22"/>
+        </w:rPr>
+        <w:t xml:space="preserve">Cross-Domain Services are shared platform capabilities that are not owned by any single domain but are consumed by multiple domains. Examples include Notes, Email, Calendar, and Surveys. Services are identified by their full name rather than a short code, to avoid confusion with domain codes.</w:t>
+      </w:r>
+    </w:p>
+    <w:p>
+      <w:pPr>
+        <w:spacing w:after="120"/>
+      </w:pPr>
+      <w:r>
+        <w:rPr>
+          <w:rFonts w:ascii="Arial" w:cs="Arial" w:eastAsia="Arial" w:hAnsi="Arial"/>
+          <w:sz w:val="22"/>
+          <w:szCs w:val="22"/>
+        </w:rPr>
+        <w:t xml:space="preserve">Services are structurally parallel to domains. A service can own entities, define processes, and produce its own reconciled Service PRD. Service entities are defined in Phase 2 (Entity Definition) alongside domain entities. Service process definition and reconciliation are handled within this phase:</w:t>
+      </w:r>
+    </w:p>
+    <w:p>
+      <w:pPr>
+        <w:pStyle w:val="ListParagraph"/>
+        <w:numPr>
+          <w:ilvl w:val="0"/>
+          <w:numId w:val="2"/>
+        </w:numPr>
+        <w:spacing w:after="80"/>
       </w:pPr>
       <w:r>
         <w:rPr>
           <w:rFonts w:ascii="Arial" w:cs="Arial" w:eastAsia="Arial" w:hAnsi="Arial"/>
           <w:b/>
           <w:bCs/>
-          <w:i w:val="false"/>
-          <w:iCs w:val="false"/>
-          <w:sz w:val="22"/>
-          <w:szCs w:val="22"/>
-        </w:rPr>
-        <w:t xml:space="preserve">Conversations: </w:t>
-      </w:r>
-      <w:r>
-        <w:rPr>
-          <w:rFonts w:ascii="Arial" w:cs="Arial" w:eastAsia="Arial" w:hAnsi="Arial"/>
-          <w:b w:val="false"/>
-          <w:bCs w:val="false"/>
-          <w:i w:val="false"/>
-          <w:iCs w:val="false"/>
-          <w:sz w:val="22"/>
-          <w:szCs w:val="22"/>
-        </w:rPr>
-        <w:t xml:space="preserve">1 per business process, done in dependency order within each domain.</w:t>
-      </w:r>
-    </w:p>
-    <w:p>
-      <w:pPr>
-        <w:spacing w:after="120"/>
+          <w:sz w:val="22"/>
+          <w:szCs w:val="22"/>
+        </w:rPr>
+        <w:t xml:space="preserve">Service Process Definition</w:t>
+      </w:r>
+      <w:r>
+        <w:rPr>
+          <w:rFonts w:ascii="Arial" w:cs="Arial" w:eastAsia="Arial" w:hAnsi="Arial"/>
+          <w:sz w:val="22"/>
+          <w:szCs w:val="22"/>
+        </w:rPr>
+        <w:t xml:space="preserve"> — each service process gets its own conversation, producing one process document per process, following the same required sections and standards as domain process documents</w:t>
+      </w:r>
+    </w:p>
+    <w:p>
+      <w:pPr>
+        <w:pStyle w:val="ListParagraph"/>
+        <w:numPr>
+          <w:ilvl w:val="0"/>
+          <w:numId w:val="2"/>
+        </w:numPr>
+        <w:spacing w:after="80"/>
       </w:pPr>
       <w:r>
         <w:rPr>
           <w:rFonts w:ascii="Arial" w:cs="Arial" w:eastAsia="Arial" w:hAnsi="Arial"/>
           <w:b/>
           <w:bCs/>
-          <w:i w:val="false"/>
-          <w:iCs w:val="false"/>
-          <w:sz w:val="22"/>
-          <w:szCs w:val="22"/>
-        </w:rPr>
-        <w:t xml:space="preserve">Input: </w:t>
-      </w:r>
-      <w:r>
-        <w:rPr>
-          <w:rFonts w:ascii="Arial" w:cs="Arial" w:eastAsia="Arial" w:hAnsi="Arial"/>
-          <w:b w:val="false"/>
-          <w:bCs w:val="false"/>
-          <w:i w:val="false"/>
-          <w:iCs w:val="false"/>
-          <w:sz w:val="22"/>
-          <w:szCs w:val="22"/>
-        </w:rPr>
-        <w:t xml:space="preserve">Domain Overview + all previously completed process documents for this domain.</w:t>
-      </w:r>
-    </w:p>
-    <w:p>
-      <w:pPr>
-        <w:spacing w:after="120"/>
+          <w:sz w:val="22"/>
+          <w:szCs w:val="22"/>
+        </w:rPr>
+        <w:t xml:space="preserve">Service Reconciliation</w:t>
+      </w:r>
+      <w:r>
+        <w:rPr>
+          <w:rFonts w:ascii="Arial" w:cs="Arial" w:eastAsia="Arial" w:hAnsi="Arial"/>
+          <w:sz w:val="22"/>
+          <w:szCs w:val="22"/>
+        </w:rPr>
+        <w:t xml:space="preserve"> — after all process conversations for a service are complete, Claude synthesizes them into a reconciled Service PRD following the same structure as a Domain PRD</w:t>
+      </w:r>
+    </w:p>
+    <w:p>
+      <w:pPr>
+        <w:spacing w:after="120"/>
+      </w:pPr>
+      <w:r>
+        <w:rPr>
+          <w:rFonts w:ascii="Arial" w:cs="Arial" w:eastAsia="Arial" w:hAnsi="Arial"/>
+          <w:sz w:val="22"/>
+          <w:szCs w:val="22"/>
+        </w:rPr>
+        <w:t xml:space="preserve">Services should be processed before the domains that reference them when practical. However, domain process documents may reference services generically based on the Master PRD descriptions without requiring the service’s full definition to be complete. For example, a domain process document may state “Use the Notes Service to add notes to a contact” before the Notes service has its own process documents or Service PRD.</w:t>
+      </w:r>
+    </w:p>
+    <w:p>
+      <w:pPr>
+        <w:spacing w:after="120"/>
+      </w:pPr>
+      <w:r>
+        <w:rPr>
+          <w:rFonts w:ascii="Arial" w:cs="Arial" w:eastAsia="Arial" w:hAnsi="Arial"/>
+          <w:sz w:val="22"/>
+          <w:szCs w:val="22"/>
+        </w:rPr>
+        <w:t xml:space="preserve">Service process documents and Service PRDs are stored in the services folder of the repository, organized by service name (see Section 6).</w:t>
+      </w:r>
+    </w:p>
+    <w:p>
+      <w:pPr>
+        <w:pStyle w:val="Heading2"/>
+        <w:spacing w:after="120" w:before="240"/>
       </w:pPr>
       <w:r>
         <w:rPr>
@@ -3892,22 +4115,11 @@
           <w:bCs/>
           <w:i w:val="false"/>
           <w:iCs w:val="false"/>
-          <w:sz w:val="22"/>
-          <w:szCs w:val="22"/>
-        </w:rPr>
-        <w:t xml:space="preserve">Output: </w:t>
-      </w:r>
-      <w:r>
-        <w:rPr>
-          <w:rFonts w:ascii="Arial" w:cs="Arial" w:eastAsia="Arial" w:hAnsi="Arial"/>
-          <w:b w:val="false"/>
-          <w:bCs w:val="false"/>
-          <w:i w:val="false"/>
-          <w:iCs w:val="false"/>
-          <w:sz w:val="22"/>
-          <w:szCs w:val="22"/>
-        </w:rPr>
-        <w:t xml:space="preserve">One process document (Word).</w:t>
+          <w:color w:val="1F3864"/>
+          <w:sz w:val="28"/>
+          <w:szCs w:val="28"/>
+        </w:rPr>
+        <w:t xml:space="preserve">3.5 Phase 5: Process Definition</w:t>
       </w:r>
     </w:p>
     <w:p>
@@ -3924,6 +4136,93 @@
           <w:sz w:val="22"/>
           <w:szCs w:val="22"/>
         </w:rPr>
+        <w:t xml:space="preserve">Conversations: </w:t>
+      </w:r>
+      <w:r>
+        <w:rPr>
+          <w:rFonts w:ascii="Arial" w:cs="Arial" w:eastAsia="Arial" w:hAnsi="Arial"/>
+          <w:b w:val="false"/>
+          <w:bCs w:val="false"/>
+          <w:i w:val="false"/>
+          <w:iCs w:val="false"/>
+          <w:sz w:val="22"/>
+          <w:szCs w:val="22"/>
+        </w:rPr>
+        <w:t xml:space="preserve">1 per business process, done in dependency order within each domain.</w:t>
+      </w:r>
+    </w:p>
+    <w:p>
+      <w:pPr>
+        <w:spacing w:after="120"/>
+      </w:pPr>
+      <w:r>
+        <w:rPr>
+          <w:rFonts w:ascii="Arial" w:cs="Arial" w:eastAsia="Arial" w:hAnsi="Arial"/>
+          <w:b/>
+          <w:bCs/>
+          <w:i w:val="false"/>
+          <w:iCs w:val="false"/>
+          <w:sz w:val="22"/>
+          <w:szCs w:val="22"/>
+        </w:rPr>
+        <w:t xml:space="preserve">Input: </w:t>
+      </w:r>
+      <w:r>
+        <w:rPr>
+          <w:rFonts w:ascii="Arial" w:cs="Arial" w:eastAsia="Arial" w:hAnsi="Arial"/>
+          <w:b w:val="false"/>
+          <w:bCs w:val="false"/>
+          <w:i w:val="false"/>
+          <w:iCs w:val="false"/>
+          <w:sz w:val="22"/>
+          <w:szCs w:val="22"/>
+        </w:rPr>
+        <w:t xml:space="preserve">Domain Overview + all previously completed process documents for this domain.</w:t>
+      </w:r>
+    </w:p>
+    <w:p>
+      <w:pPr>
+        <w:spacing w:after="120"/>
+      </w:pPr>
+      <w:r>
+        <w:rPr>
+          <w:rFonts w:ascii="Arial" w:cs="Arial" w:eastAsia="Arial" w:hAnsi="Arial"/>
+          <w:b/>
+          <w:bCs/>
+          <w:i w:val="false"/>
+          <w:iCs w:val="false"/>
+          <w:sz w:val="22"/>
+          <w:szCs w:val="22"/>
+        </w:rPr>
+        <w:t xml:space="preserve">Output: </w:t>
+      </w:r>
+      <w:r>
+        <w:rPr>
+          <w:rFonts w:ascii="Arial" w:cs="Arial" w:eastAsia="Arial" w:hAnsi="Arial"/>
+          <w:b w:val="false"/>
+          <w:bCs w:val="false"/>
+          <w:i w:val="false"/>
+          <w:iCs w:val="false"/>
+          <w:sz w:val="22"/>
+          <w:szCs w:val="22"/>
+        </w:rPr>
+        <w:t xml:space="preserve">One process document (Word).</w:t>
+      </w:r>
+    </w:p>
+    <w:p>
+      <w:pPr>
+        <w:spacing w:after="120"/>
+      </w:pPr>
+      <w:r>
+        <w:rPr>
+          <w:rFonts w:ascii="Arial" w:cs="Arial" w:eastAsia="Arial" w:hAnsi="Arial"/>
+          <w:b/>
+          <w:bCs/>
+          <w:i w:val="false"/>
+          <w:iCs w:val="false"/>
+          <w:sz w:val="22"/>
+          <w:szCs w:val="22"/>
+        </w:rPr>
         <w:t xml:space="preserve">Repository location: </w:t>
       </w:r>
       <w:r>
@@ -3970,7 +4269,7 @@
           <w:sz w:val="22"/>
           <w:szCs w:val="22"/>
         </w:rPr>
-        <w:t xml:space="preserve">Process conversations reference entities that are already defined in the Entity PRDs. The process document identifies which entities the process uses or affects, and captures process-specific details about how those entities are created, read, or updated during the process. If a process reveals a field or entity not captured during Entity Definition, the discovery is handled per the scope change protocol in Section 10.</w:t>
+        <w:t xml:space="preserve">Process conversations reference entities that are already defined in the Entity PRDs and may reference Cross-Domain Services as described in the Master PRD. The process document identifies which entities the process uses or affects, and captures process-specific details about how those entities are created, read, or updated during the process. If a process reveals a field or entity not captured during Entity Definition, the discovery is handled per the scope change protocol in Section 10.</w:t>
       </w:r>
     </w:p>
     <w:p>
@@ -5011,7 +5310,7 @@
           <w:sz w:val="28"/>
           <w:szCs w:val="28"/>
         </w:rPr>
-        <w:t xml:space="preserve">3.5 Phase 5: Domain Reconciliation</w:t>
+        <w:t xml:space="preserve">3.6 Phase 6: Domain Reconciliation</w:t>
       </w:r>
     </w:p>
     <w:p>
@@ -5440,7 +5739,7 @@
           <w:sz w:val="28"/>
           <w:szCs w:val="28"/>
         </w:rPr>
-        <w:t xml:space="preserve">3.6 Phase 6: Stakeholder Review</w:t>
+        <w:t xml:space="preserve">3.7 Phase 7: Stakeholder Review</w:t>
       </w:r>
     </w:p>
     <w:p>
@@ -5498,7 +5797,7 @@
           <w:sz w:val="22"/>
           <w:szCs w:val="22"/>
         </w:rPr>
-        <w:t xml:space="preserve">Domain PRDs produced in Phase 5.</w:t>
+        <w:t xml:space="preserve">Domain PRDs produced in Phase 6.</w:t>
       </w:r>
     </w:p>
     <w:p>
@@ -5614,7 +5913,7 @@
           <w:sz w:val="28"/>
           <w:szCs w:val="28"/>
         </w:rPr>
-        <w:t xml:space="preserve">3.7 Phase 7: YAML Generation</w:t>
+        <w:t xml:space="preserve">3.8 Phase 8: YAML Generation</w:t>
       </w:r>
     </w:p>
     <w:p>
@@ -5869,7 +6168,7 @@
           <w:sz w:val="22"/>
           <w:szCs w:val="22"/>
         </w:rPr>
-        <w:t xml:space="preserve">By the end of Phase 7, you have complete YAML and a short list of resolved exceptions (if any).</w:t>
+        <w:t xml:space="preserve">By the end of Phase 8, you have complete YAML and a short list of resolved exceptions (if any).</w:t>
       </w:r>
     </w:p>
     <w:p>
@@ -5888,7 +6187,7 @@
           <w:sz w:val="28"/>
           <w:szCs w:val="28"/>
         </w:rPr>
-        <w:t xml:space="preserve">3.8 Phase 8: CRM Selection</w:t>
+        <w:t xml:space="preserve">3.9 Phase 9: CRM Selection</w:t>
       </w:r>
     </w:p>
     <w:p>
@@ -6184,7 +6483,7 @@
           <w:sz w:val="28"/>
           <w:szCs w:val="28"/>
         </w:rPr>
-        <w:t xml:space="preserve">3.9 Phase 9: CRM Deployment</w:t>
+        <w:t xml:space="preserve">3.10 Phase 10: CRM Deployment</w:t>
       </w:r>
     </w:p>
     <w:p>
@@ -6324,7 +6623,7 @@
           <w:sz w:val="28"/>
           <w:szCs w:val="28"/>
         </w:rPr>
-        <w:t xml:space="preserve">3.10 Phase 10: CRM Configuration</w:t>
+        <w:t xml:space="preserve">3.11 Phase 11: CRM Configuration</w:t>
       </w:r>
     </w:p>
     <w:p>
@@ -6481,7 +6780,7 @@
           <w:sz w:val="28"/>
           <w:szCs w:val="28"/>
         </w:rPr>
-        <w:t xml:space="preserve">3.11 Phase 11: Verification</w:t>
+        <w:t xml:space="preserve">3.12 Phase 12: Verification</w:t>
       </w:r>
     </w:p>
     <w:p>
@@ -6667,7 +6966,7 @@
           <w:sz w:val="22"/>
           <w:szCs w:val="22"/>
         </w:rPr>
-        <w:t xml:space="preserve">All requirements documents (Master PRD, Entity PRDs, Domain Overview documents, process documents, and Domain PRDs) are produced as Word documents (.docx). Word is the primary format because:</w:t>
+        <w:t xml:space="preserve">All requirements documents (Master PRD, Entity PRDs, Domain Overview documents, process documents, Domain PRDs, and Service PRDs) are produced as Word documents (.docx). Word is the primary format because:</w:t>
       </w:r>
     </w:p>
     <w:p>
@@ -7442,6 +7741,89 @@
               <w:bottom w:val="single" w:color="AAAAAA" w:sz="1"/>
               <w:right w:val="single" w:color="AAAAAA" w:sz="1"/>
             </w:tcBorders>
+            <w:tcMar>
+              <w:top w:type="dxa" w:w="60"/>
+              <w:left w:type="dxa" w:w="100"/>
+              <w:bottom w:type="dxa" w:w="60"/>
+              <w:right w:type="dxa" w:w="100"/>
+            </w:tcMar>
+          </w:tcPr>
+          <w:p>
+            <w:r>
+              <w:rPr>
+                <w:rFonts w:ascii="Arial" w:cs="Arial" w:eastAsia="Arial" w:hAnsi="Arial"/>
+                <w:sz w:val="20"/>
+                <w:szCs w:val="20"/>
+              </w:rPr>
+              <w:t xml:space="preserve">Service PRDs</w:t>
+            </w:r>
+          </w:p>
+        </w:tc>
+        <w:tc>
+          <w:tcPr>
+            <w:tcW w:type="dxa" w:w="3000"/>
+            <w:tcBorders>
+              <w:top w:val="single" w:color="AAAAAA" w:sz="1"/>
+              <w:left w:val="single" w:color="AAAAAA" w:sz="1"/>
+              <w:bottom w:val="single" w:color="AAAAAA" w:sz="1"/>
+              <w:right w:val="single" w:color="AAAAAA" w:sz="1"/>
+            </w:tcBorders>
+            <w:tcMar>
+              <w:top w:type="dxa" w:w="60"/>
+              <w:left w:type="dxa" w:w="100"/>
+              <w:bottom w:type="dxa" w:w="60"/>
+              <w:right w:type="dxa" w:w="100"/>
+            </w:tcMar>
+          </w:tcPr>
+          <w:p>
+            <w:r>
+              <w:rPr>
+                <w:rFonts w:ascii="Arial" w:cs="Arial" w:eastAsia="Arial" w:hAnsi="Arial"/>
+                <w:sz w:val="20"/>
+                <w:szCs w:val="20"/>
+              </w:rPr>
+              <w:t xml:space="preserve">Domain stakeholders, administrators</w:t>
+            </w:r>
+          </w:p>
+        </w:tc>
+        <w:tc>
+          <w:tcPr>
+            <w:tcW w:type="dxa" w:w="4160"/>
+            <w:tcBorders>
+              <w:top w:val="single" w:color="AAAAAA" w:sz="1"/>
+              <w:left w:val="single" w:color="AAAAAA" w:sz="1"/>
+              <w:bottom w:val="single" w:color="AAAAAA" w:sz="1"/>
+              <w:right w:val="single" w:color="AAAAAA" w:sz="1"/>
+            </w:tcBorders>
+            <w:tcMar>
+              <w:top w:type="dxa" w:w="60"/>
+              <w:left w:type="dxa" w:w="100"/>
+              <w:bottom w:type="dxa" w:w="60"/>
+              <w:right w:type="dxa" w:w="100"/>
+            </w:tcMar>
+          </w:tcPr>
+          <w:p>
+            <w:r>
+              <w:rPr>
+                <w:rFonts w:ascii="Arial" w:cs="Arial" w:eastAsia="Arial" w:hAnsi="Arial"/>
+                <w:sz w:val="20"/>
+                <w:szCs w:val="20"/>
+              </w:rPr>
+              <w:t xml:space="preserve">Business — no product names or implementation details</w:t>
+            </w:r>
+          </w:p>
+        </w:tc>
+      </w:tr>
+      <w:tr>
+        <w:tc>
+          <w:tcPr>
+            <w:tcW w:type="dxa" w:w="2200"/>
+            <w:tcBorders>
+              <w:top w:val="single" w:color="AAAAAA" w:sz="1"/>
+              <w:left w:val="single" w:color="AAAAAA" w:sz="1"/>
+              <w:bottom w:val="single" w:color="AAAAAA" w:sz="1"/>
+              <w:right w:val="single" w:color="AAAAAA" w:sz="1"/>
+            </w:tcBorders>
             <w:shd w:fill="F2F7FB" w:val="clear"/>
             <w:tcMar>
               <w:top w:type="dxa" w:w="60"/>
@@ -8106,7 +8488,7 @@
                 <w:sz w:val="20"/>
                 <w:szCs w:val="20"/>
               </w:rPr>
-              <w:t xml:space="preserve">Domain code (2–4 uppercase letters) assigned during the Master PRD, or a reserved code (MST for Master PRD items).</w:t>
+              <w:t xml:space="preserve">Domain code (2–4 uppercase letters) or Cross-Domain Service name (uppercase) assigned during the Master PRD, or a reserved code (MST for Master PRD items).</w:t>
             </w:r>
           </w:p>
         </w:tc>
@@ -9858,6 +10240,70 @@
           </w:p>
         </w:tc>
       </w:tr>
+      <w:tr>
+        <w:tc>
+          <w:tcPr>
+            <w:tcW w:type="dxa" w:w="2800"/>
+            <w:tcBorders>
+              <w:top w:val="single" w:color="AAAAAA" w:sz="1"/>
+              <w:left w:val="single" w:color="AAAAAA" w:sz="1"/>
+              <w:bottom w:val="single" w:color="AAAAAA" w:sz="1"/>
+              <w:right w:val="single" w:color="AAAAAA" w:sz="1"/>
+            </w:tcBorders>
+            <w:tcMar>
+              <w:top w:type="dxa" w:w="60"/>
+              <w:left w:type="dxa" w:w="100"/>
+              <w:bottom w:type="dxa" w:w="60"/>
+              <w:right w:type="dxa" w:w="100"/>
+            </w:tcMar>
+          </w:tcPr>
+          <w:p>
+            <w:r>
+              <w:rPr>
+                <w:rFonts w:ascii="Arial" w:cs="Arial" w:eastAsia="Arial" w:hAnsi="Arial"/>
+                <w:b w:val="false"/>
+                <w:bCs w:val="false"/>
+                <w:i w:val="false"/>
+                <w:iCs w:val="false"/>
+                <w:sz w:val="20"/>
+                <w:szCs w:val="20"/>
+              </w:rPr>
+              <w:t xml:space="preserve">NOTES-MANAGE-REQ-001</w:t>
+            </w:r>
+          </w:p>
+        </w:tc>
+        <w:tc>
+          <w:tcPr>
+            <w:tcW w:type="dxa" w:w="6560"/>
+            <w:tcBorders>
+              <w:top w:val="single" w:color="AAAAAA" w:sz="1"/>
+              <w:left w:val="single" w:color="AAAAAA" w:sz="1"/>
+              <w:bottom w:val="single" w:color="AAAAAA" w:sz="1"/>
+              <w:right w:val="single" w:color="AAAAAA" w:sz="1"/>
+            </w:tcBorders>
+            <w:tcMar>
+              <w:top w:type="dxa" w:w="60"/>
+              <w:left w:type="dxa" w:w="100"/>
+              <w:bottom w:type="dxa" w:w="60"/>
+              <w:right w:type="dxa" w:w="100"/>
+            </w:tcMar>
+          </w:tcPr>
+          <w:p>
+            <w:r>
+              <w:rPr>
+                <w:rFonts w:ascii="Arial" w:cs="Arial" w:eastAsia="Arial" w:hAnsi="Arial"/>
+                <w:b w:val="false"/>
+                <w:bCs w:val="false"/>
+                <w:i w:val="false"/>
+                <w:iCs w:val="false"/>
+                <w:sz w:val="20"/>
+                <w:szCs w:val="20"/>
+              </w:rPr>
+              <w:t xml:space="preserve">Notes service, Manage process, Requirement 1</w:t>
+            </w:r>
+          </w:p>
+        </w:tc>
+      </w:tr>
     </w:tbl>
     <w:p>
       <w:pPr>
@@ -10275,6 +10721,58 @@
           <w:iCs w:val="false"/>
           <w:sz w:val="22"/>
           <w:szCs w:val="22"/>
+        </w:rPr>
+        <w:t xml:space="preserve">    services/</w:t>
+      </w:r>
+    </w:p>
+    <w:p>
+      <w:pPr>
+        <w:spacing w:after="40"/>
+      </w:pPr>
+      <w:r>
+        <w:rPr>
+          <w:rFonts w:ascii="Courier New" w:cs="Courier New" w:eastAsia="Courier New" w:hAnsi="Courier New"/>
+          <w:sz w:val="18"/>
+          <w:szCs w:val="18"/>
+        </w:rPr>
+        <w:t xml:space="preserve">        {SERVICE_NAME}/</w:t>
+      </w:r>
+    </w:p>
+    <w:p>
+      <w:pPr>
+        <w:spacing w:after="40"/>
+      </w:pPr>
+      <w:r>
+        <w:rPr>
+          <w:rFonts w:ascii="Courier New" w:cs="Courier New" w:eastAsia="Courier New" w:hAnsi="Courier New"/>
+          <w:sz w:val="18"/>
+          <w:szCs w:val="18"/>
+        </w:rPr>
+        <w:t xml:space="preserve">            {SERVICE-PROCESS-CODE}.docx</w:t>
+      </w:r>
+    </w:p>
+    <w:p>
+      <w:pPr>
+        <w:spacing w:after="40"/>
+      </w:pPr>
+      <w:r>
+        <w:rPr>
+          <w:rFonts w:ascii="Courier New" w:cs="Courier New" w:eastAsia="Courier New" w:hAnsi="Courier New"/>
+          <w:sz w:val="18"/>
+          <w:szCs w:val="18"/>
+        </w:rPr>
+        <w:t xml:space="preserve">            {Implementation}-Service-PRD-{ServiceName}.docx</w:t>
+      </w:r>
+    </w:p>
+    <w:p>
+      <w:pPr>
+        <w:spacing w:after="40"/>
+      </w:pPr>
+      <w:r>
+        <w:rPr>
+          <w:rFonts w:ascii="Courier New" w:cs="Courier New" w:eastAsia="Courier New" w:hAnsi="Courier New"/>
+          <w:sz w:val="18"/>
+          <w:szCs w:val="18"/>
         </w:rPr>
         <w:t xml:space="preserve">    programs/</w:t>
       </w:r>
@@ -10895,7 +11393,7 @@
                 <w:sz w:val="20"/>
                 <w:szCs w:val="20"/>
               </w:rPr>
-              <w:t xml:space="preserve">Domain Overview + all prior process documents for this domain.</w:t>
+              <w:t xml:space="preserve">Domain Overview + all prior process documents for this domain + relevant Service PRDs (if completed).</w:t>
             </w:r>
           </w:p>
         </w:tc>
@@ -10962,6 +11460,120 @@
                 <w:szCs w:val="20"/>
               </w:rPr>
               <w:t xml:space="preserve">Domain Overview + relevant Entity PRDs + all process documents for this domain.</w:t>
+            </w:r>
+          </w:p>
+        </w:tc>
+      </w:tr>
+      <w:tr>
+        <w:tc>
+          <w:tcPr>
+            <w:tcW w:type="dxa" w:w="2600"/>
+            <w:tcBorders>
+              <w:top w:val="single" w:color="AAAAAA" w:sz="1"/>
+              <w:left w:val="single" w:color="AAAAAA" w:sz="1"/>
+              <w:bottom w:val="single" w:color="AAAAAA" w:sz="1"/>
+              <w:right w:val="single" w:color="AAAAAA" w:sz="1"/>
+            </w:tcBorders>
+            <w:shd w:fill="F2F7FB" w:val="clear"/>
+            <w:tcMar>
+              <w:top w:type="dxa" w:w="60"/>
+              <w:left w:type="dxa" w:w="100"/>
+              <w:bottom w:type="dxa" w:w="60"/>
+              <w:right w:type="dxa" w:w="100"/>
+            </w:tcMar>
+          </w:tcPr>
+          <w:p>
+            <w:r>
+              <w:rPr>
+                <w:rFonts w:ascii="Arial" w:cs="Arial" w:eastAsia="Arial" w:hAnsi="Arial"/>
+                <w:sz w:val="20"/>
+                <w:szCs w:val="20"/>
+              </w:rPr>
+              <w:t xml:space="preserve">Service Process Definition</w:t>
+            </w:r>
+          </w:p>
+        </w:tc>
+        <w:tc>
+          <w:tcPr>
+            <w:tcW w:type="dxa" w:w="6760"/>
+            <w:tcBorders>
+              <w:top w:val="single" w:color="AAAAAA" w:sz="1"/>
+              <w:left w:val="single" w:color="AAAAAA" w:sz="1"/>
+              <w:bottom w:val="single" w:color="AAAAAA" w:sz="1"/>
+              <w:right w:val="single" w:color="AAAAAA" w:sz="1"/>
+            </w:tcBorders>
+            <w:shd w:fill="F2F7FB" w:val="clear"/>
+            <w:tcMar>
+              <w:top w:type="dxa" w:w="60"/>
+              <w:left w:type="dxa" w:w="100"/>
+              <w:bottom w:type="dxa" w:w="60"/>
+              <w:right w:type="dxa" w:w="100"/>
+            </w:tcMar>
+          </w:tcPr>
+          <w:p>
+            <w:r>
+              <w:rPr>
+                <w:rFonts w:ascii="Arial" w:cs="Arial" w:eastAsia="Arial" w:hAnsi="Arial"/>
+                <w:sz w:val="20"/>
+                <w:szCs w:val="20"/>
+              </w:rPr>
+              <w:t xml:space="preserve">Master PRD + Entity Inventory + relevant Entity PRDs + all previously completed service process documents for this service.</w:t>
+            </w:r>
+          </w:p>
+        </w:tc>
+      </w:tr>
+      <w:tr>
+        <w:tc>
+          <w:tcPr>
+            <w:tcW w:type="dxa" w:w="2600"/>
+            <w:tcBorders>
+              <w:top w:val="single" w:color="AAAAAA" w:sz="1"/>
+              <w:left w:val="single" w:color="AAAAAA" w:sz="1"/>
+              <w:bottom w:val="single" w:color="AAAAAA" w:sz="1"/>
+              <w:right w:val="single" w:color="AAAAAA" w:sz="1"/>
+            </w:tcBorders>
+            <w:tcMar>
+              <w:top w:type="dxa" w:w="60"/>
+              <w:left w:type="dxa" w:w="100"/>
+              <w:bottom w:type="dxa" w:w="60"/>
+              <w:right w:type="dxa" w:w="100"/>
+            </w:tcMar>
+          </w:tcPr>
+          <w:p>
+            <w:r>
+              <w:rPr>
+                <w:rFonts w:ascii="Arial" w:cs="Arial" w:eastAsia="Arial" w:hAnsi="Arial"/>
+                <w:sz w:val="20"/>
+                <w:szCs w:val="20"/>
+              </w:rPr>
+              <w:t xml:space="preserve">Service Reconciliation</w:t>
+            </w:r>
+          </w:p>
+        </w:tc>
+        <w:tc>
+          <w:tcPr>
+            <w:tcW w:type="dxa" w:w="6760"/>
+            <w:tcBorders>
+              <w:top w:val="single" w:color="AAAAAA" w:sz="1"/>
+              <w:left w:val="single" w:color="AAAAAA" w:sz="1"/>
+              <w:bottom w:val="single" w:color="AAAAAA" w:sz="1"/>
+              <w:right w:val="single" w:color="AAAAAA" w:sz="1"/>
+            </w:tcBorders>
+            <w:tcMar>
+              <w:top w:type="dxa" w:w="60"/>
+              <w:left w:type="dxa" w:w="100"/>
+              <w:bottom w:type="dxa" w:w="60"/>
+              <w:right w:type="dxa" w:w="100"/>
+            </w:tcMar>
+          </w:tcPr>
+          <w:p>
+            <w:r>
+              <w:rPr>
+                <w:rFonts w:ascii="Arial" w:cs="Arial" w:eastAsia="Arial" w:hAnsi="Arial"/>
+                <w:sz w:val="20"/>
+                <w:szCs w:val="20"/>
+              </w:rPr>
+              <w:t xml:space="preserve">Master PRD + Entity Inventory + relevant Entity PRDs + all process documents for this service.</w:t>
             </w:r>
           </w:p>
         </w:tc>
@@ -11450,7 +12062,7 @@
                 <w:sz w:val="20"/>
                 <w:szCs w:val="20"/>
               </w:rPr>
-              <w:t xml:space="preserve">Cross-domain conflict detection happens during stakeholder review (Phase 6) and YAML generation (Phase 7). A separate intermediate document added an extra translation step without sufficient value for the current team size.</w:t>
+              <w:t xml:space="preserve">Cross-domain conflict detection happens during stakeholder review (Phase 7) and YAML generation (Phase 8). A separate intermediate document added an extra translation step without sufficient value for the current team size.</w:t>
             </w:r>
           </w:p>
         </w:tc>
@@ -12165,6 +12777,70 @@
                 <w:szCs w:val="20"/>
               </w:rPr>
               <w:t xml:space="preserve">Presenting two options with explicit tradeoffs gives the administrator an informed choice rather than a single take-it-or-leave-it recommendation. The tradeoff analysis also serves as documentation for why the selected platform was chosen.</w:t>
+            </w:r>
+          </w:p>
+        </w:tc>
+      </w:tr>
+      <w:tr>
+        <w:tc>
+          <w:tcPr>
+            <w:tcW w:type="dxa" w:w="4680"/>
+            <w:tcBorders>
+              <w:top w:val="single" w:color="AAAAAA" w:sz="1"/>
+              <w:left w:val="single" w:color="AAAAAA" w:sz="1"/>
+              <w:bottom w:val="single" w:color="AAAAAA" w:sz="1"/>
+              <w:right w:val="single" w:color="AAAAAA" w:sz="1"/>
+            </w:tcBorders>
+            <w:tcMar>
+              <w:top w:type="dxa" w:w="60"/>
+              <w:left w:type="dxa" w:w="100"/>
+              <w:bottom w:type="dxa" w:w="60"/>
+              <w:right w:type="dxa" w:w="100"/>
+            </w:tcMar>
+          </w:tcPr>
+          <w:p>
+            <w:r>
+              <w:rPr>
+                <w:rFonts w:ascii="Arial" w:cs="Arial" w:eastAsia="Arial" w:hAnsi="Arial"/>
+                <w:b w:val="false"/>
+                <w:bCs w:val="false"/>
+                <w:i w:val="false"/>
+                <w:iCs w:val="false"/>
+                <w:sz w:val="20"/>
+                <w:szCs w:val="20"/>
+              </w:rPr>
+              <w:t xml:space="preserve">Cross-Domain Services are structurally parallel to domains but provide shared capabilities consumed by multiple domains.</w:t>
+            </w:r>
+          </w:p>
+        </w:tc>
+        <w:tc>
+          <w:tcPr>
+            <w:tcW w:type="dxa" w:w="4680"/>
+            <w:tcBorders>
+              <w:top w:val="single" w:color="AAAAAA" w:sz="1"/>
+              <w:left w:val="single" w:color="AAAAAA" w:sz="1"/>
+              <w:bottom w:val="single" w:color="AAAAAA" w:sz="1"/>
+              <w:right w:val="single" w:color="AAAAAA" w:sz="1"/>
+            </w:tcBorders>
+            <w:tcMar>
+              <w:top w:type="dxa" w:w="60"/>
+              <w:left w:type="dxa" w:w="100"/>
+              <w:bottom w:type="dxa" w:w="60"/>
+              <w:right w:type="dxa" w:w="100"/>
+            </w:tcMar>
+          </w:tcPr>
+          <w:p>
+            <w:r>
+              <w:rPr>
+                <w:rFonts w:ascii="Arial" w:cs="Arial" w:eastAsia="Arial" w:hAnsi="Arial"/>
+                <w:b w:val="false"/>
+                <w:bCs w:val="false"/>
+                <w:i w:val="false"/>
+                <w:iCs w:val="false"/>
+                <w:sz w:val="20"/>
+                <w:szCs w:val="20"/>
+              </w:rPr>
+              <w:t xml:space="preserve">Some capabilities (Notes, Email, Calendar, Surveys) are not owned by any single domain. Defining them as services avoids duplicating their specifications across multiple domain process documents and provides a single authoritative definition that all domains reference.</w:t>
             </w:r>
           </w:p>
         </w:tc>
@@ -12443,7 +13119,7 @@
           <w:sz w:val="22"/>
           <w:szCs w:val="22"/>
         </w:rPr>
-        <w:t xml:space="preserve">Level 5: Process Documents — detailed process workflows, requirements, and field-level data usage per process</w:t>
+        <w:t xml:space="preserve">Level 5: Process Documents and Service Process Documents — detailed process workflows, requirements, and field-level data usage per process</w:t>
       </w:r>
     </w:p>
     <w:p>
@@ -12465,7 +13141,7 @@
           <w:sz w:val="22"/>
           <w:szCs w:val="22"/>
         </w:rPr>
-        <w:t xml:space="preserve">Level 6: Domain PRDs — reconciled synthesis of all entities and processes within a domain</w:t>
+        <w:t xml:space="preserve">Level 6: Domain PRDs and Service PRDs — reconciled synthesis of all entities and processes within a domain</w:t>
       </w:r>
     </w:p>
     <w:p>
@@ -13201,7 +13877,111 @@
           <w:sz w:val="28"/>
           <w:szCs w:val="28"/>
         </w:rPr>
-        <w:t xml:space="preserve">10.6 Principle</w:t>
+        <w:t xml:space="preserve">10.6 New Cross-Domain Service Discovered</w:t>
+      </w:r>
+    </w:p>
+    <w:p>
+      <w:pPr>
+        <w:spacing w:after="120"/>
+      </w:pPr>
+      <w:r>
+        <w:rPr>
+          <w:rFonts w:ascii="Arial" w:cs="Arial" w:eastAsia="Arial" w:hAnsi="Arial"/>
+          <w:sz w:val="22"/>
+          <w:szCs w:val="22"/>
+        </w:rPr>
+        <w:t xml:space="preserve">If a process conversation reveals a shared capability that should be defined as a Cross-Domain Service rather than handled within a single domain:</w:t>
+      </w:r>
+    </w:p>
+    <w:p>
+      <w:pPr>
+        <w:pStyle w:val="ListParagraph"/>
+        <w:numPr>
+          <w:ilvl w:val="0"/>
+          <w:numId w:val="2"/>
+        </w:numPr>
+        <w:spacing w:after="80"/>
+      </w:pPr>
+      <w:r>
+        <w:rPr>
+          <w:rFonts w:ascii="Arial" w:cs="Arial" w:eastAsia="Arial" w:hAnsi="Arial"/>
+          <w:sz w:val="22"/>
+          <w:szCs w:val="22"/>
+        </w:rPr>
+        <w:t xml:space="preserve">Stop the current conversation at a clean stopping point.</w:t>
+      </w:r>
+    </w:p>
+    <w:p>
+      <w:pPr>
+        <w:pStyle w:val="ListParagraph"/>
+        <w:numPr>
+          <w:ilvl w:val="0"/>
+          <w:numId w:val="2"/>
+        </w:numPr>
+        <w:spacing w:after="80"/>
+      </w:pPr>
+      <w:r>
+        <w:rPr>
+          <w:rFonts w:ascii="Arial" w:cs="Arial" w:eastAsia="Arial" w:hAnsi="Arial"/>
+          <w:sz w:val="22"/>
+          <w:szCs w:val="22"/>
+        </w:rPr>
+        <w:t xml:space="preserve">Update the Master PRD to add the new service with its description and capabilities.</w:t>
+      </w:r>
+    </w:p>
+    <w:p>
+      <w:pPr>
+        <w:pStyle w:val="ListParagraph"/>
+        <w:numPr>
+          <w:ilvl w:val="0"/>
+          <w:numId w:val="2"/>
+        </w:numPr>
+        <w:spacing w:after="80"/>
+      </w:pPr>
+      <w:r>
+        <w:rPr>
+          <w:rFonts w:ascii="Arial" w:cs="Arial" w:eastAsia="Arial" w:hAnsi="Arial"/>
+          <w:sz w:val="22"/>
+          <w:szCs w:val="22"/>
+        </w:rPr>
+        <w:t xml:space="preserve">Optionally conduct service entity and process definition before resuming, or continue domain work referencing the service generically from the Master PRD description.</w:t>
+      </w:r>
+    </w:p>
+    <w:p>
+      <w:pPr>
+        <w:pStyle w:val="ListParagraph"/>
+        <w:numPr>
+          <w:ilvl w:val="0"/>
+          <w:numId w:val="2"/>
+        </w:numPr>
+        <w:spacing w:after="80"/>
+      </w:pPr>
+      <w:r>
+        <w:rPr>
+          <w:rFonts w:ascii="Arial" w:cs="Arial" w:eastAsia="Arial" w:hAnsi="Arial"/>
+          <w:sz w:val="22"/>
+          <w:szCs w:val="22"/>
+        </w:rPr>
+        <w:t xml:space="preserve">Resume domain work from the updated Master PRD.</w:t>
+      </w:r>
+    </w:p>
+    <w:p>
+      <w:pPr>
+        <w:pStyle w:val="Heading2"/>
+        <w:spacing w:after="120" w:before="240"/>
+      </w:pPr>
+      <w:r>
+        <w:rPr>
+          <w:rFonts w:ascii="Arial" w:cs="Arial" w:eastAsia="Arial" w:hAnsi="Arial"/>
+          <w:b/>
+          <w:bCs/>
+          <w:i w:val="false"/>
+          <w:iCs w:val="false"/>
+          <w:color w:val="1F3864"/>
+          <w:sz w:val="28"/>
+          <w:szCs w:val="28"/>
+        </w:rPr>
+        <w:t xml:space="preserve">10.7 Principle</w:t>
       </w:r>
     </w:p>
     <w:p>
@@ -13240,7 +14020,7 @@
           <w:sz w:val="22"/>
           <w:szCs w:val="22"/>
         </w:rPr>
-        <w:t xml:space="preserve">This document defines the governing process for all CRM Builder document production. It replaces v1.4.</w:t>
+        <w:t xml:space="preserve">This document defines the governing process for all CRM Builder document production. It replaces v1.5.</w:t>
       </w:r>
     </w:p>
     <w:sectPr>

</xml_diff>

<commit_message>
Document Production Process v1.7: Add sub-domain framework
- Section 2: Sub-domain definition and decision rule
- Section 3.1: Master PRD acknowledges sub-domain groupings
- Section 3.3: Parent Domain Overview + Sub-Domain Overviews
- Section 3.5: Process definition inputs use Sub-Domain Overview
- Section 3.6: Two-tier reconciliation (Sub-Domain PRD then Domain PRD)
- Section 5: Four-level identifier format for sub-domain processes
- Section 6: Sub-domain folder structure in repository
- Section 7.2: Context requirements for sub-domain conversations
- Section 8: Design decision documenting sub-domain rationale
- Section 9: Document hierarchy levels 4a/4b and 6a/6b
- Section 10: New 10.6 Sub-Domain Structure Discovered scope change
</commit_message>
<xml_diff>
--- a/PRDs/process/CRM-Builder-Document-Production-Process.docx
+++ b/PRDs/process/CRM-Builder-Document-Production-Process.docx
@@ -121,7 +121,7 @@
                 <w:sz w:val="20"/>
                 <w:szCs w:val="20"/>
               </w:rPr>
-              <w:t xml:space="preserve">1.6</w:t>
+              <w:t xml:space="preserve">1.7</w:t>
             </w:r>
           </w:p>
         </w:tc>
@@ -251,7 +251,7 @@
                 <w:sz w:val="20"/>
                 <w:szCs w:val="20"/>
               </w:rPr>
-              <w:t xml:space="preserve">04-03-26 16:00</w:t>
+              <w:t xml:space="preserve">04-04-26 20:00</w:t>
             </w:r>
           </w:p>
         </w:tc>
@@ -316,7 +316,7 @@
                 <w:sz w:val="20"/>
                 <w:szCs w:val="20"/>
               </w:rPr>
-              <w:t xml:space="preserve">v1.5</w:t>
+              <w:t xml:space="preserve">v1.6</w:t>
             </w:r>
           </w:p>
         </w:tc>
@@ -2132,6 +2132,23 @@
     </w:tbl>
     <w:p>
       <w:pPr>
+        <w:spacing w:after="120"/>
+      </w:pPr>
+      <w:r>
+        <w:rPr>
+          <w:rFonts w:ascii="Arial" w:cs="Arial" w:eastAsia="Arial" w:hAnsi="Arial"/>
+          <w:b w:val="false"/>
+          <w:bCs w:val="false"/>
+          <w:i w:val="false"/>
+          <w:iCs w:val="false"/>
+          <w:sz w:val="22"/>
+          <w:szCs w:val="22"/>
+        </w:rPr>
+        <w:t xml:space="preserve">Domains may optionally be organized into sub-domains when the domain contains multiple autonomous process areas that share a common purpose and benefit from unified oversight, reporting, and analytics. Sub-domains are an intermediate organizational tier between the domain and its processes. Each sub-domain contains its own process inventory and is processed through Phases 3–6 independently. The parent domain provides cross-sub-domain oversight, coordination, and consolidated analytics. Not all domains require sub-domains — simple domains with sequential lifecycle processes remain flat.</w:t>
+      </w:r>
+    </w:p>
+    <w:p>
+      <w:pPr>
         <w:pStyle w:val="Heading1"/>
         <w:spacing w:after="120" w:before="360"/>
       </w:pPr>
@@ -2359,7 +2376,7 @@
           <w:sz w:val="22"/>
           <w:szCs w:val="22"/>
         </w:rPr>
-        <w:t xml:space="preserve">The business processes within each domain</w:t>
+        <w:t xml:space="preserve">The business processes within each domain, and for complex domains, the sub-domain groupings that organize those processes</w:t>
       </w:r>
     </w:p>
     <w:p>
@@ -2522,7 +2539,7 @@
           <w:sz w:val="22"/>
           <w:szCs w:val="22"/>
         </w:rPr>
-        <w:t xml:space="preserve">Key Business Domains — one section per domain with domain purpose, personas involved, process list with one-line descriptions, and key data categories</w:t>
+        <w:t xml:space="preserve">Key Business Domains — one section per domain with domain purpose, personas involved, process list with one-line descriptions (organized by sub-domain where applicable), and key data categories</w:t>
       </w:r>
     </w:p>
     <w:p>
@@ -3992,6 +4009,76 @@
           <w:sz w:val="28"/>
           <w:szCs w:val="28"/>
         </w:rPr>
+        <w:t xml:space="preserve">Sub-Domain Overviews</w:t>
+      </w:r>
+    </w:p>
+    <w:p>
+      <w:pPr>
+        <w:spacing w:after="120"/>
+      </w:pPr>
+      <w:r>
+        <w:rPr>
+          <w:rFonts w:ascii="Arial" w:cs="Arial" w:eastAsia="Arial" w:hAnsi="Arial"/>
+          <w:b w:val="false"/>
+          <w:bCs w:val="false"/>
+          <w:i w:val="false"/>
+          <w:iCs w:val="false"/>
+          <w:sz w:val="22"/>
+          <w:szCs w:val="22"/>
+        </w:rPr>
+        <w:t xml:space="preserve">For domains with sub-domains, Phase 3 produces multiple overview documents. The parent domain receives a Domain Overview that covers the domain’s overall purpose, the sub-domain structure and rationale, shared personas, cross-sub-domain relationships, and consolidated oversight and analytics requirements. Each sub-domain then receives its own Sub-Domain Overview following the standard Domain Overview structure — purpose, personas, process inventory with dependency ordering, and data reference. Sub-Domain Overview documents are the primary input for process definition conversations within that sub-domain, replacing the parent Domain Overview for that purpose.</w:t>
+      </w:r>
+    </w:p>
+    <w:p>
+      <w:pPr>
+        <w:spacing w:after="120"/>
+      </w:pPr>
+      <w:r>
+        <w:rPr>
+          <w:rFonts w:ascii="Arial" w:cs="Arial" w:eastAsia="Arial" w:hAnsi="Arial"/>
+          <w:b w:val="false"/>
+          <w:bCs w:val="false"/>
+          <w:i w:val="false"/>
+          <w:iCs w:val="false"/>
+          <w:sz w:val="22"/>
+          <w:szCs w:val="22"/>
+        </w:rPr>
+        <w:t xml:space="preserve">Conversations: 1 per domain. For domains with sub-domains, 1 for the parent domain overview plus 1 per sub-domain overview.</w:t>
+      </w:r>
+    </w:p>
+    <w:p>
+      <w:pPr>
+        <w:spacing w:after="120"/>
+      </w:pPr>
+      <w:r>
+        <w:rPr>
+          <w:rFonts w:ascii="Arial" w:cs="Arial" w:eastAsia="Arial" w:hAnsi="Arial"/>
+          <w:b w:val="false"/>
+          <w:bCs w:val="false"/>
+          <w:i w:val="false"/>
+          <w:iCs w:val="false"/>
+          <w:sz w:val="22"/>
+          <w:szCs w:val="22"/>
+        </w:rPr>
+        <w:t xml:space="preserve">Context passing for sub-domain overviews: the parent Domain Overview plus the Master PRD, Entity Inventory, and Entity PRDs for entities participating in that sub-domain.</w:t>
+      </w:r>
+    </w:p>
+    <w:p>
+      <w:pPr>
+        <w:pStyle w:val="Heading2"/>
+        <w:spacing w:after="120" w:before="240"/>
+      </w:pPr>
+      <w:r>
+        <w:rPr>
+          <w:rFonts w:ascii="Arial" w:cs="Arial" w:eastAsia="Arial" w:hAnsi="Arial"/>
+          <w:b/>
+          <w:bCs/>
+          <w:i w:val="false"/>
+          <w:iCs w:val="false"/>
+          <w:color w:val="1F3864"/>
+          <w:sz w:val="28"/>
+          <w:szCs w:val="28"/>
+        </w:rPr>
         <w:t xml:space="preserve">3.4 Phase 4: Cross-Domain Service Definition</w:t>
       </w:r>
     </w:p>
@@ -4374,6 +4461,40 @@
           <w:szCs w:val="22"/>
         </w:rPr>
         <w:t xml:space="preserve">Each process conversation receives the Domain Overview and all previously completed process documents for that domain as uploaded files. The Domain Overview provides the complete upstream context — personas, process inventory, and entity data reference — in a single document, replacing the need to upload the Master PRD, Entity Inventory, and individual Entity PRDs separately.</w:t>
+      </w:r>
+    </w:p>
+    <w:p>
+      <w:pPr>
+        <w:spacing w:after="120"/>
+      </w:pPr>
+      <w:r>
+        <w:rPr>
+          <w:rFonts w:ascii="Arial" w:cs="Arial" w:eastAsia="Arial" w:hAnsi="Arial"/>
+          <w:b w:val="false"/>
+          <w:bCs w:val="false"/>
+          <w:i w:val="false"/>
+          <w:iCs w:val="false"/>
+          <w:sz w:val="22"/>
+          <w:szCs w:val="22"/>
+        </w:rPr>
+        <w:t xml:space="preserve">For processes within a sub-domain, the primary input is the Sub-Domain Overview plus all previously completed process documents within that sub-domain. The parent Domain Overview is not uploaded into individual process conversations — its content relevant to the sub-domain has already been incorporated into the Sub-Domain Overview.</w:t>
+      </w:r>
+    </w:p>
+    <w:p>
+      <w:pPr>
+        <w:spacing w:after="120"/>
+      </w:pPr>
+      <w:r>
+        <w:rPr>
+          <w:rFonts w:ascii="Arial" w:cs="Arial" w:eastAsia="Arial" w:hAnsi="Arial"/>
+          <w:b w:val="false"/>
+          <w:bCs w:val="false"/>
+          <w:i w:val="false"/>
+          <w:iCs w:val="false"/>
+          <w:sz w:val="22"/>
+          <w:szCs w:val="22"/>
+        </w:rPr>
+        <w:t xml:space="preserve">Within domains that use sub-domains, process ordering is determined within each sub-domain independently. Cross-sub-domain dependencies are identified in the parent Domain Overview but are expected to be rare given that sub-domains are designed to be autonomous.</w:t>
       </w:r>
     </w:p>
     <w:p>
@@ -5571,6 +5692,23 @@
           <w:szCs w:val="22"/>
         </w:rPr>
         <w:t xml:space="preserve">After Claude produces the Domain PRD, humans own the document. They clean up formatting, add workflow diagrams, refine wording, and prepare it for stakeholder review.</w:t>
+      </w:r>
+    </w:p>
+    <w:p>
+      <w:pPr>
+        <w:spacing w:after="120"/>
+      </w:pPr>
+      <w:r>
+        <w:rPr>
+          <w:rFonts w:ascii="Arial" w:cs="Arial" w:eastAsia="Arial" w:hAnsi="Arial"/>
+          <w:b w:val="false"/>
+          <w:bCs w:val="false"/>
+          <w:i w:val="false"/>
+          <w:iCs w:val="false"/>
+          <w:sz w:val="22"/>
+          <w:szCs w:val="22"/>
+        </w:rPr>
+        <w:t xml:space="preserve">For domains with sub-domains, reconciliation is performed in two tiers. First, each sub-domain is reconciled independently, producing a Sub-Domain PRD following the standard Domain PRD structure. Then a parent Domain Reconciliation conversation synthesizes the Sub-Domain PRDs into a consolidated Domain PRD that addresses cross-sub-domain consistency, shared entity usage, and consolidated oversight and analytics. The parent Domain PRD is the authoritative document for stakeholder review.</w:t>
       </w:r>
     </w:p>
     <w:p>
@@ -8345,6 +8483,57 @@
         <w:t xml:space="preserve">[DOMAIN]-[PROCESS]-[TYPE]-[SEQ]</w:t>
       </w:r>
     </w:p>
+    <w:p>
+      <w:pPr>
+        <w:spacing w:after="120"/>
+      </w:pPr>
+      <w:r>
+        <w:rPr>
+          <w:rFonts w:ascii="Arial" w:cs="Arial" w:eastAsia="Arial" w:hAnsi="Arial"/>
+          <w:b w:val="false"/>
+          <w:bCs w:val="false"/>
+          <w:i w:val="false"/>
+          <w:iCs w:val="false"/>
+          <w:sz w:val="22"/>
+          <w:szCs w:val="22"/>
+        </w:rPr>
+        <w:t xml:space="preserve">For processes within a sub-domain, identifiers use a four-level format:</w:t>
+      </w:r>
+    </w:p>
+    <w:p>
+      <w:pPr>
+        <w:spacing w:after="120"/>
+      </w:pPr>
+      <w:r>
+        <w:rPr>
+          <w:rFonts w:ascii="Arial" w:cs="Arial" w:eastAsia="Arial" w:hAnsi="Arial"/>
+          <w:b w:val="false"/>
+          <w:bCs w:val="false"/>
+          <w:i w:val="false"/>
+          <w:iCs w:val="false"/>
+          <w:sz w:val="22"/>
+          <w:szCs w:val="22"/>
+        </w:rPr>
+        <w:t xml:space="preserve">[DOMAIN]-[SUBDOMAIN]-[PROCESS]-[TYPE]-[SEQ]</w:t>
+      </w:r>
+    </w:p>
+    <w:p>
+      <w:pPr>
+        <w:spacing w:after="120"/>
+      </w:pPr>
+      <w:r>
+        <w:rPr>
+          <w:rFonts w:ascii="Arial" w:cs="Arial" w:eastAsia="Arial" w:hAnsi="Arial"/>
+          <w:b w:val="false"/>
+          <w:bCs w:val="false"/>
+          <w:i w:val="false"/>
+          <w:iCs w:val="false"/>
+          <w:sz w:val="22"/>
+          <w:szCs w:val="22"/>
+        </w:rPr>
+        <w:t xml:space="preserve">The sub-domain component is included only for processes within a sub-domain. Domains without sub-domains continue to use the three-level format.</w:t>
+      </w:r>
+    </w:p>
     <w:tbl>
       <w:tblPr>
         <w:tblW w:type="dxa" w:w="9360"/>
@@ -10307,21 +10496,19 @@
     </w:tbl>
     <w:p>
       <w:pPr>
-        <w:pStyle w:val="Heading2"/>
-        <w:spacing w:after="120" w:before="240"/>
-      </w:pPr>
-      <w:r>
-        <w:rPr>
-          <w:rFonts w:ascii="Arial" w:cs="Arial" w:eastAsia="Arial" w:hAnsi="Arial"/>
-          <w:b/>
-          <w:bCs/>
-          <w:i w:val="false"/>
-          <w:iCs w:val="false"/>
-          <w:color w:val="1F3864"/>
-          <w:sz w:val="28"/>
-          <w:szCs w:val="28"/>
-        </w:rPr>
-        <w:t xml:space="preserve">5.4 Identifier Rules</w:t>
+        <w:spacing w:after="120"/>
+      </w:pPr>
+      <w:r>
+        <w:rPr>
+          <w:rFonts w:ascii="Arial" w:cs="Arial" w:eastAsia="Arial" w:hAnsi="Arial"/>
+          <w:b w:val="false"/>
+          <w:bCs w:val="false"/>
+          <w:i w:val="false"/>
+          <w:iCs w:val="false"/>
+          <w:sz w:val="22"/>
+          <w:szCs w:val="22"/>
+        </w:rPr>
+        <w:t xml:space="preserve">Sub-domain identifier examples:</w:t>
       </w:r>
     </w:p>
     <w:p>
@@ -10343,7 +10530,7 @@
           <w:sz w:val="22"/>
           <w:szCs w:val="22"/>
         </w:rPr>
-        <w:t xml:space="preserve">Identifiers are permanent. Once assigned, an identifier is never reassigned, renumbered, or reused.</w:t>
+        <w:t xml:space="preserve">CR-PARTNER-IDENTIFY-REQ-001 — Client Recruiting domain, Partner sub-domain, Identify process, Requirement 1</w:t>
       </w:r>
     </w:p>
     <w:p>
@@ -10365,7 +10552,26 @@
           <w:sz w:val="22"/>
           <w:szCs w:val="22"/>
         </w:rPr>
-        <w:t xml:space="preserve">If an item is removed, its identifier is marked as deprecated but never reused.</w:t>
+        <w:t xml:space="preserve">CR-OUTREACH-CAMPAIGN-DAT-003 — Client Recruiting domain, Outreach sub-domain, Campaign process, Data/Field item 3</w:t>
+      </w:r>
+    </w:p>
+    <w:p>
+      <w:pPr>
+        <w:pStyle w:val="Heading2"/>
+        <w:spacing w:after="120" w:before="240"/>
+      </w:pPr>
+      <w:r>
+        <w:rPr>
+          <w:rFonts w:ascii="Arial" w:cs="Arial" w:eastAsia="Arial" w:hAnsi="Arial"/>
+          <w:b/>
+          <w:bCs/>
+          <w:i w:val="false"/>
+          <w:iCs w:val="false"/>
+          <w:color w:val="1F3864"/>
+          <w:sz w:val="28"/>
+          <w:szCs w:val="28"/>
+        </w:rPr>
+        <w:t xml:space="preserve">5.4 Identifier Rules</w:t>
       </w:r>
     </w:p>
     <w:p>
@@ -10387,7 +10593,7 @@
           <w:sz w:val="22"/>
           <w:szCs w:val="22"/>
         </w:rPr>
-        <w:t xml:space="preserve">New items receive the next available sequential number. They never cause existing items to renumber.</w:t>
+        <w:t xml:space="preserve">Identifiers are permanent. Once assigned, an identifier is never reassigned, renumbered, or reused.</w:t>
       </w:r>
     </w:p>
     <w:p>
@@ -10409,7 +10615,7 @@
           <w:sz w:val="22"/>
           <w:szCs w:val="22"/>
         </w:rPr>
-        <w:t xml:space="preserve">Domain codes and process codes are fixed at creation and never changed after assignment.</w:t>
+        <w:t xml:space="preserve">If an item is removed, its identifier is marked as deprecated but never reused.</w:t>
       </w:r>
     </w:p>
     <w:p>
@@ -10431,7 +10637,73 @@
           <w:sz w:val="22"/>
           <w:szCs w:val="22"/>
         </w:rPr>
+        <w:t xml:space="preserve">New items receive the next available sequential number. They never cause existing items to renumber.</w:t>
+      </w:r>
+    </w:p>
+    <w:p>
+      <w:pPr>
+        <w:pStyle w:val="ListParagraph"/>
+        <w:numPr>
+          <w:ilvl w:val="0"/>
+          <w:numId w:val="2"/>
+        </w:numPr>
+        <w:spacing w:after="60"/>
+      </w:pPr>
+      <w:r>
+        <w:rPr>
+          <w:rFonts w:ascii="Arial" w:cs="Arial" w:eastAsia="Arial" w:hAnsi="Arial"/>
+          <w:b w:val="false"/>
+          <w:bCs w:val="false"/>
+          <w:i w:val="false"/>
+          <w:iCs w:val="false"/>
+          <w:sz w:val="22"/>
+          <w:szCs w:val="22"/>
+        </w:rPr>
+        <w:t xml:space="preserve">Domain codes and process codes are fixed at creation and never changed after assignment.</w:t>
+      </w:r>
+    </w:p>
+    <w:p>
+      <w:pPr>
+        <w:pStyle w:val="ListParagraph"/>
+        <w:numPr>
+          <w:ilvl w:val="0"/>
+          <w:numId w:val="2"/>
+        </w:numPr>
+        <w:spacing w:after="60"/>
+      </w:pPr>
+      <w:r>
+        <w:rPr>
+          <w:rFonts w:ascii="Arial" w:cs="Arial" w:eastAsia="Arial" w:hAnsi="Arial"/>
+          <w:b w:val="false"/>
+          <w:bCs w:val="false"/>
+          <w:i w:val="false"/>
+          <w:iCs w:val="false"/>
+          <w:sz w:val="22"/>
+          <w:szCs w:val="22"/>
+        </w:rPr>
         <w:t xml:space="preserve">Claude assigns identifiers during the conversation. The administrator confirms them.</w:t>
+      </w:r>
+    </w:p>
+    <w:p>
+      <w:pPr>
+        <w:pStyle w:val="ListParagraph"/>
+        <w:numPr>
+          <w:ilvl w:val="0"/>
+          <w:numId w:val="2"/>
+        </w:numPr>
+        <w:spacing w:after="60"/>
+      </w:pPr>
+      <w:r>
+        <w:rPr>
+          <w:rFonts w:ascii="Arial" w:cs="Arial" w:eastAsia="Arial" w:hAnsi="Arial"/>
+          <w:b w:val="false"/>
+          <w:bCs w:val="false"/>
+          <w:i w:val="false"/>
+          <w:iCs w:val="false"/>
+          <w:sz w:val="22"/>
+          <w:szCs w:val="22"/>
+        </w:rPr>
+        <w:t xml:space="preserve">Sub-domain codes are fixed at creation and never changed after assignment, following the same permanence rule as domain codes and process codes.</w:t>
       </w:r>
     </w:p>
     <w:p>
@@ -10809,6 +11081,133 @@
           <w:szCs w:val="22"/>
         </w:rPr>
         <w:t xml:space="preserve">When starting a new process conversation, the administrator uploads the Domain Overview plus everything in that domain’s folder. This provides Claude with full context from all prior work.</w:t>
+      </w:r>
+    </w:p>
+    <w:p>
+      <w:pPr>
+        <w:spacing w:after="120"/>
+      </w:pPr>
+      <w:r>
+        <w:rPr>
+          <w:rFonts w:ascii="Arial" w:cs="Arial" w:eastAsia="Arial" w:hAnsi="Arial"/>
+          <w:b w:val="false"/>
+          <w:bCs w:val="false"/>
+          <w:i w:val="false"/>
+          <w:iCs w:val="false"/>
+          <w:sz w:val="22"/>
+          <w:szCs w:val="22"/>
+        </w:rPr>
+        <w:t xml:space="preserve">For domains with sub-domains, the domain folder contains sub-domain folders. Each sub-domain folder holds the Sub-Domain Overview, process documents, and Sub-Domain PRD for that sub-domain. The parent Domain Overview and Domain PRD remain at the domain folder level. The structure is:</w:t>
+      </w:r>
+    </w:p>
+    <w:p>
+      <w:pPr>
+        <w:pStyle w:val="ListParagraph"/>
+        <w:numPr>
+          <w:ilvl w:val="0"/>
+          <w:numId w:val="2"/>
+        </w:numPr>
+        <w:spacing w:after="60"/>
+      </w:pPr>
+      <w:r>
+        <w:rPr>
+          <w:rFonts w:ascii="Arial" w:cs="Arial" w:eastAsia="Arial" w:hAnsi="Arial"/>
+          <w:b w:val="false"/>
+          <w:bCs w:val="false"/>
+          <w:i w:val="false"/>
+          <w:iCs w:val="false"/>
+          <w:sz w:val="22"/>
+          <w:szCs w:val="22"/>
+        </w:rPr>
+        <w:t xml:space="preserve">PRDs/{{domain_code}}/{{Implementation}}-Domain-Overview-{{DomainName}}.docx</w:t>
+      </w:r>
+    </w:p>
+    <w:p>
+      <w:pPr>
+        <w:pStyle w:val="ListParagraph"/>
+        <w:numPr>
+          <w:ilvl w:val="0"/>
+          <w:numId w:val="2"/>
+        </w:numPr>
+        <w:spacing w:after="60"/>
+      </w:pPr>
+      <w:r>
+        <w:rPr>
+          <w:rFonts w:ascii="Arial" w:cs="Arial" w:eastAsia="Arial" w:hAnsi="Arial"/>
+          <w:b w:val="false"/>
+          <w:bCs w:val="false"/>
+          <w:i w:val="false"/>
+          <w:iCs w:val="false"/>
+          <w:sz w:val="22"/>
+          <w:szCs w:val="22"/>
+        </w:rPr>
+        <w:t xml:space="preserve">PRDs/{{domain_code}}/{{Implementation}}-Domain-PRD-{{DomainName}}.docx</w:t>
+      </w:r>
+    </w:p>
+    <w:p>
+      <w:pPr>
+        <w:pStyle w:val="ListParagraph"/>
+        <w:numPr>
+          <w:ilvl w:val="0"/>
+          <w:numId w:val="2"/>
+        </w:numPr>
+        <w:spacing w:after="60"/>
+      </w:pPr>
+      <w:r>
+        <w:rPr>
+          <w:rFonts w:ascii="Arial" w:cs="Arial" w:eastAsia="Arial" w:hAnsi="Arial"/>
+          <w:b w:val="false"/>
+          <w:bCs w:val="false"/>
+          <w:i w:val="false"/>
+          <w:iCs w:val="false"/>
+          <w:sz w:val="22"/>
+          <w:szCs w:val="22"/>
+        </w:rPr>
+        <w:t xml:space="preserve">PRDs/{{domain_code}}/{{SUBDOMAIN}}/{{Implementation}}-SubDomain-Overview-{{SubDomainName}}.docx</w:t>
+      </w:r>
+    </w:p>
+    <w:p>
+      <w:pPr>
+        <w:pStyle w:val="ListParagraph"/>
+        <w:numPr>
+          <w:ilvl w:val="0"/>
+          <w:numId w:val="2"/>
+        </w:numPr>
+        <w:spacing w:after="60"/>
+      </w:pPr>
+      <w:r>
+        <w:rPr>
+          <w:rFonts w:ascii="Arial" w:cs="Arial" w:eastAsia="Arial" w:hAnsi="Arial"/>
+          <w:b w:val="false"/>
+          <w:bCs w:val="false"/>
+          <w:i w:val="false"/>
+          <w:iCs w:val="false"/>
+          <w:sz w:val="22"/>
+          <w:szCs w:val="22"/>
+        </w:rPr>
+        <w:t xml:space="preserve">PRDs/{{domain_code}}/{{SUBDOMAIN}}/{{PROCESS-CODE}}.docx</w:t>
+      </w:r>
+    </w:p>
+    <w:p>
+      <w:pPr>
+        <w:pStyle w:val="ListParagraph"/>
+        <w:numPr>
+          <w:ilvl w:val="0"/>
+          <w:numId w:val="2"/>
+        </w:numPr>
+        <w:spacing w:after="60"/>
+      </w:pPr>
+      <w:r>
+        <w:rPr>
+          <w:rFonts w:ascii="Arial" w:cs="Arial" w:eastAsia="Arial" w:hAnsi="Arial"/>
+          <w:b w:val="false"/>
+          <w:bCs w:val="false"/>
+          <w:i w:val="false"/>
+          <w:iCs w:val="false"/>
+          <w:sz w:val="22"/>
+          <w:szCs w:val="22"/>
+        </w:rPr>
+        <w:t xml:space="preserve">PRDs/{{domain_code}}/{{SUBDOMAIN}}/{{Implementation}}-SubDomain-PRD-{{SubDomainName}}.docx</w:t>
       </w:r>
     </w:p>
     <w:p>
@@ -11708,6 +12107,270 @@
           </w:p>
         </w:tc>
       </w:tr>
+      <w:tr>
+        <w:tc>
+          <w:tcPr>
+            <w:tcW w:type="dxa" w:w="2600"/>
+            <w:tcBorders>
+              <w:top w:val="single" w:color="AAAAAA" w:sz="1"/>
+              <w:left w:val="single" w:color="AAAAAA" w:sz="1"/>
+              <w:bottom w:val="single" w:color="AAAAAA" w:sz="1"/>
+              <w:right w:val="single" w:color="AAAAAA" w:sz="1"/>
+            </w:tcBorders>
+            <w:shd w:fill="F2F7FB" w:val="clear"/>
+            <w:tcMar>
+              <w:top w:type="dxa" w:w="60"/>
+              <w:left w:type="dxa" w:w="100"/>
+              <w:bottom w:type="dxa" w:w="60"/>
+              <w:right w:type="dxa" w:w="100"/>
+            </w:tcMar>
+          </w:tcPr>
+          <w:p>
+            <w:r>
+              <w:rPr>
+                <w:rFonts w:ascii="Arial" w:cs="Arial" w:eastAsia="Arial" w:hAnsi="Arial"/>
+                <w:b w:val="false"/>
+                <w:bCs w:val="false"/>
+                <w:i w:val="false"/>
+                <w:iCs w:val="false"/>
+                <w:sz w:val="20"/>
+                <w:szCs w:val="20"/>
+              </w:rPr>
+              <w:t xml:space="preserve">Sub-Domain Overview</w:t>
+            </w:r>
+          </w:p>
+        </w:tc>
+        <w:tc>
+          <w:tcPr>
+            <w:tcW w:type="dxa" w:w="6760"/>
+            <w:tcBorders>
+              <w:top w:val="single" w:color="AAAAAA" w:sz="1"/>
+              <w:left w:val="single" w:color="AAAAAA" w:sz="1"/>
+              <w:bottom w:val="single" w:color="AAAAAA" w:sz="1"/>
+              <w:right w:val="single" w:color="AAAAAA" w:sz="1"/>
+            </w:tcBorders>
+            <w:shd w:fill="F2F7FB" w:val="clear"/>
+            <w:tcMar>
+              <w:top w:type="dxa" w:w="60"/>
+              <w:left w:type="dxa" w:w="100"/>
+              <w:bottom w:type="dxa" w:w="60"/>
+              <w:right w:type="dxa" w:w="100"/>
+            </w:tcMar>
+          </w:tcPr>
+          <w:p>
+            <w:r>
+              <w:rPr>
+                <w:rFonts w:ascii="Arial" w:cs="Arial" w:eastAsia="Arial" w:hAnsi="Arial"/>
+                <w:b w:val="false"/>
+                <w:bCs w:val="false"/>
+                <w:i w:val="false"/>
+                <w:iCs w:val="false"/>
+                <w:sz w:val="20"/>
+                <w:szCs w:val="20"/>
+              </w:rPr>
+              <w:t xml:space="preserve">Parent Domain Overview + Master PRD + Entity Inventory + Entity PRDs for entities participating in this sub-domain.</w:t>
+            </w:r>
+          </w:p>
+        </w:tc>
+      </w:tr>
+      <w:tr>
+        <w:tc>
+          <w:tcPr>
+            <w:tcW w:type="dxa" w:w="2600"/>
+            <w:tcBorders>
+              <w:top w:val="single" w:color="AAAAAA" w:sz="1"/>
+              <w:left w:val="single" w:color="AAAAAA" w:sz="1"/>
+              <w:bottom w:val="single" w:color="AAAAAA" w:sz="1"/>
+              <w:right w:val="single" w:color="AAAAAA" w:sz="1"/>
+            </w:tcBorders>
+            <w:shd w:fill="F2F7FB" w:val="clear"/>
+            <w:tcMar>
+              <w:top w:type="dxa" w:w="60"/>
+              <w:left w:type="dxa" w:w="100"/>
+              <w:bottom w:type="dxa" w:w="60"/>
+              <w:right w:type="dxa" w:w="100"/>
+            </w:tcMar>
+          </w:tcPr>
+          <w:p>
+            <w:r>
+              <w:rPr>
+                <w:rFonts w:ascii="Arial" w:cs="Arial" w:eastAsia="Arial" w:hAnsi="Arial"/>
+                <w:b w:val="false"/>
+                <w:bCs w:val="false"/>
+                <w:i w:val="false"/>
+                <w:iCs w:val="false"/>
+                <w:sz w:val="20"/>
+                <w:szCs w:val="20"/>
+              </w:rPr>
+              <w:t xml:space="preserve">Sub-Domain Reconciliation</w:t>
+            </w:r>
+          </w:p>
+        </w:tc>
+        <w:tc>
+          <w:tcPr>
+            <w:tcW w:type="dxa" w:w="6760"/>
+            <w:tcBorders>
+              <w:top w:val="single" w:color="AAAAAA" w:sz="1"/>
+              <w:left w:val="single" w:color="AAAAAA" w:sz="1"/>
+              <w:bottom w:val="single" w:color="AAAAAA" w:sz="1"/>
+              <w:right w:val="single" w:color="AAAAAA" w:sz="1"/>
+            </w:tcBorders>
+            <w:shd w:fill="F2F7FB" w:val="clear"/>
+            <w:tcMar>
+              <w:top w:type="dxa" w:w="60"/>
+              <w:left w:type="dxa" w:w="100"/>
+              <w:bottom w:type="dxa" w:w="60"/>
+              <w:right w:type="dxa" w:w="100"/>
+            </w:tcMar>
+          </w:tcPr>
+          <w:p>
+            <w:r>
+              <w:rPr>
+                <w:rFonts w:ascii="Arial" w:cs="Arial" w:eastAsia="Arial" w:hAnsi="Arial"/>
+                <w:b w:val="false"/>
+                <w:bCs w:val="false"/>
+                <w:i w:val="false"/>
+                <w:iCs w:val="false"/>
+                <w:sz w:val="20"/>
+                <w:szCs w:val="20"/>
+              </w:rPr>
+              <w:t xml:space="preserve">Sub-Domain Overview + relevant Entity PRDs + all process documents for this sub-domain.</w:t>
+            </w:r>
+          </w:p>
+        </w:tc>
+      </w:tr>
+      <w:tr>
+        <w:tc>
+          <w:tcPr>
+            <w:tcW w:type="dxa" w:w="2600"/>
+            <w:tcBorders>
+              <w:top w:val="single" w:color="AAAAAA" w:sz="1"/>
+              <w:left w:val="single" w:color="AAAAAA" w:sz="1"/>
+              <w:bottom w:val="single" w:color="AAAAAA" w:sz="1"/>
+              <w:right w:val="single" w:color="AAAAAA" w:sz="1"/>
+            </w:tcBorders>
+            <w:shd w:fill="F2F7FB" w:val="clear"/>
+            <w:tcMar>
+              <w:top w:type="dxa" w:w="60"/>
+              <w:left w:type="dxa" w:w="100"/>
+              <w:bottom w:type="dxa" w:w="60"/>
+              <w:right w:type="dxa" w:w="100"/>
+            </w:tcMar>
+          </w:tcPr>
+          <w:p>
+            <w:r>
+              <w:rPr>
+                <w:rFonts w:ascii="Arial" w:cs="Arial" w:eastAsia="Arial" w:hAnsi="Arial"/>
+                <w:b w:val="false"/>
+                <w:bCs w:val="false"/>
+                <w:i w:val="false"/>
+                <w:iCs w:val="false"/>
+                <w:sz w:val="20"/>
+                <w:szCs w:val="20"/>
+              </w:rPr>
+              <w:t xml:space="preserve">Parent Domain Reconciliation (with sub-domains)</w:t>
+            </w:r>
+          </w:p>
+        </w:tc>
+        <w:tc>
+          <w:tcPr>
+            <w:tcW w:type="dxa" w:w="6760"/>
+            <w:tcBorders>
+              <w:top w:val="single" w:color="AAAAAA" w:sz="1"/>
+              <w:left w:val="single" w:color="AAAAAA" w:sz="1"/>
+              <w:bottom w:val="single" w:color="AAAAAA" w:sz="1"/>
+              <w:right w:val="single" w:color="AAAAAA" w:sz="1"/>
+            </w:tcBorders>
+            <w:shd w:fill="F2F7FB" w:val="clear"/>
+            <w:tcMar>
+              <w:top w:type="dxa" w:w="60"/>
+              <w:left w:type="dxa" w:w="100"/>
+              <w:bottom w:type="dxa" w:w="60"/>
+              <w:right w:type="dxa" w:w="100"/>
+            </w:tcMar>
+          </w:tcPr>
+          <w:p>
+            <w:r>
+              <w:rPr>
+                <w:rFonts w:ascii="Arial" w:cs="Arial" w:eastAsia="Arial" w:hAnsi="Arial"/>
+                <w:b w:val="false"/>
+                <w:bCs w:val="false"/>
+                <w:i w:val="false"/>
+                <w:iCs w:val="false"/>
+                <w:sz w:val="20"/>
+                <w:szCs w:val="20"/>
+              </w:rPr>
+              <w:t xml:space="preserve">Parent Domain Overview + all Sub-Domain PRDs for this domain.</w:t>
+            </w:r>
+          </w:p>
+        </w:tc>
+      </w:tr>
+      <w:tr>
+        <w:tc>
+          <w:tcPr>
+            <w:tcW w:type="dxa" w:w="2600"/>
+            <w:tcBorders>
+              <w:top w:val="single" w:color="AAAAAA" w:sz="1"/>
+              <w:left w:val="single" w:color="AAAAAA" w:sz="1"/>
+              <w:bottom w:val="single" w:color="AAAAAA" w:sz="1"/>
+              <w:right w:val="single" w:color="AAAAAA" w:sz="1"/>
+            </w:tcBorders>
+            <w:shd w:fill="F2F7FB" w:val="clear"/>
+            <w:tcMar>
+              <w:top w:type="dxa" w:w="60"/>
+              <w:left w:type="dxa" w:w="100"/>
+              <w:bottom w:type="dxa" w:w="60"/>
+              <w:right w:type="dxa" w:w="100"/>
+            </w:tcMar>
+          </w:tcPr>
+          <w:p>
+            <w:r>
+              <w:rPr>
+                <w:rFonts w:ascii="Arial" w:cs="Arial" w:eastAsia="Arial" w:hAnsi="Arial"/>
+                <w:b w:val="false"/>
+                <w:bCs w:val="false"/>
+                <w:i w:val="false"/>
+                <w:iCs w:val="false"/>
+                <w:sz w:val="20"/>
+                <w:szCs w:val="20"/>
+              </w:rPr>
+              <w:t xml:space="preserve">Process Definition (within sub-domain)</w:t>
+            </w:r>
+          </w:p>
+        </w:tc>
+        <w:tc>
+          <w:tcPr>
+            <w:tcW w:type="dxa" w:w="6760"/>
+            <w:tcBorders>
+              <w:top w:val="single" w:color="AAAAAA" w:sz="1"/>
+              <w:left w:val="single" w:color="AAAAAA" w:sz="1"/>
+              <w:bottom w:val="single" w:color="AAAAAA" w:sz="1"/>
+              <w:right w:val="single" w:color="AAAAAA" w:sz="1"/>
+            </w:tcBorders>
+            <w:shd w:fill="F2F7FB" w:val="clear"/>
+            <w:tcMar>
+              <w:top w:type="dxa" w:w="60"/>
+              <w:left w:type="dxa" w:w="100"/>
+              <w:bottom w:type="dxa" w:w="60"/>
+              <w:right w:type="dxa" w:w="100"/>
+            </w:tcMar>
+          </w:tcPr>
+          <w:p>
+            <w:r>
+              <w:rPr>
+                <w:rFonts w:ascii="Arial" w:cs="Arial" w:eastAsia="Arial" w:hAnsi="Arial"/>
+                <w:b w:val="false"/>
+                <w:bCs w:val="false"/>
+                <w:i w:val="false"/>
+                <w:iCs w:val="false"/>
+                <w:sz w:val="20"/>
+                <w:szCs w:val="20"/>
+              </w:rPr>
+              <w:t xml:space="preserve">Sub-Domain Overview + all previously completed process documents within that sub-domain.</w:t>
+            </w:r>
+          </w:p>
+        </w:tc>
+      </w:tr>
     </w:tbl>
     <w:p>
       <w:pPr>
@@ -12975,6 +13638,72 @@
           </w:p>
         </w:tc>
       </w:tr>
+      <w:tr>
+        <w:tc>
+          <w:tcPr>
+            <w:tcW w:type="dxa" w:w="3600"/>
+            <w:tcBorders>
+              <w:top w:val="single" w:color="AAAAAA" w:sz="1"/>
+              <w:left w:val="single" w:color="AAAAAA" w:sz="1"/>
+              <w:bottom w:val="single" w:color="AAAAAA" w:sz="1"/>
+              <w:right w:val="single" w:color="AAAAAA" w:sz="1"/>
+            </w:tcBorders>
+            <w:shd w:fill="F2F7FB" w:val="clear"/>
+            <w:tcMar>
+              <w:top w:type="dxa" w:w="60"/>
+              <w:left w:type="dxa" w:w="100"/>
+              <w:bottom w:type="dxa" w:w="60"/>
+              <w:right w:type="dxa" w:w="100"/>
+            </w:tcMar>
+          </w:tcPr>
+          <w:p>
+            <w:r>
+              <w:rPr>
+                <w:rFonts w:ascii="Arial" w:cs="Arial" w:eastAsia="Arial" w:hAnsi="Arial"/>
+                <w:b w:val="false"/>
+                <w:bCs w:val="false"/>
+                <w:i w:val="false"/>
+                <w:iCs w:val="false"/>
+                <w:sz w:val="20"/>
+                <w:szCs w:val="20"/>
+              </w:rPr>
+              <w:t xml:space="preserve">Domains may optionally contain sub-domains as an intermediate organizational tier between the domain and its processes.</w:t>
+            </w:r>
+          </w:p>
+        </w:tc>
+        <w:tc>
+          <w:tcPr>
+            <w:tcW w:type="dxa" w:w="5760"/>
+            <w:tcBorders>
+              <w:top w:val="single" w:color="AAAAAA" w:sz="1"/>
+              <w:left w:val="single" w:color="AAAAAA" w:sz="1"/>
+              <w:bottom w:val="single" w:color="AAAAAA" w:sz="1"/>
+              <w:right w:val="single" w:color="AAAAAA" w:sz="1"/>
+            </w:tcBorders>
+            <w:shd w:fill="F2F7FB" w:val="clear"/>
+            <w:tcMar>
+              <w:top w:type="dxa" w:w="60"/>
+              <w:left w:type="dxa" w:w="100"/>
+              <w:bottom w:type="dxa" w:w="60"/>
+              <w:right w:type="dxa" w:w="100"/>
+            </w:tcMar>
+          </w:tcPr>
+          <w:p>
+            <w:r>
+              <w:rPr>
+                <w:rFonts w:ascii="Arial" w:cs="Arial" w:eastAsia="Arial" w:hAnsi="Arial"/>
+                <w:b w:val="false"/>
+                <w:bCs w:val="false"/>
+                <w:i w:val="false"/>
+                <w:iCs w:val="false"/>
+                <w:sz w:val="20"/>
+                <w:szCs w:val="20"/>
+              </w:rPr>
+              <w:t xml:space="preserve">Some domains contain multiple autonomous process areas that share a common purpose but are too complex to be individual processes. Sub-domains provide organizational grouping with independent process inventories, overviews, and reconciliation, while the parent domain provides unified oversight, reporting, and analytics. The decision rule: sub-domains are appropriate when autonomous process areas share a common purpose and benefit from unified oversight. The work required is comparable to promoting each area to a full domain or combining them into one large domain, but sub-domains produce better organization and add the cross-cutting oversight layer that neither alternative provides.</w:t>
+            </w:r>
+          </w:p>
+        </w:tc>
+      </w:tr>
     </w:tbl>
     <w:p>
       <w:pPr>
@@ -13097,7 +13826,7 @@
           <w:sz w:val="22"/>
           <w:szCs w:val="22"/>
         </w:rPr>
-        <w:t xml:space="preserve">Level 4: Domain Overview — domain-scoped reference assembling personas, process inventory, and data reference from upstream documents</w:t>
+        <w:t xml:space="preserve">Level 4a: Domain Overview — domain-scoped reference assembling personas, process inventory, and data reference from upstream documents</w:t>
       </w:r>
     </w:p>
     <w:p>
@@ -13119,7 +13848,7 @@
           <w:sz w:val="22"/>
           <w:szCs w:val="22"/>
         </w:rPr>
-        <w:t xml:space="preserve">Level 5: Process Documents and Service Process Documents — detailed process workflows, requirements, and field-level data usage per process</w:t>
+        <w:t xml:space="preserve">Level 4b: Sub-Domain Overview (where applicable) — sub-domain-scoped reference providing focused context for process definition conversations within the sub-domain</w:t>
       </w:r>
     </w:p>
     <w:p>
@@ -13141,7 +13870,7 @@
           <w:sz w:val="22"/>
           <w:szCs w:val="22"/>
         </w:rPr>
-        <w:t xml:space="preserve">Level 6: Domain PRDs and Service PRDs — reconciled synthesis of all entities and processes within a domain</w:t>
+        <w:t xml:space="preserve">Level 5: Process Documents and Service Process Documents — detailed process workflows, requirements, and field-level data usage per process</w:t>
       </w:r>
     </w:p>
     <w:p>
@@ -13163,7 +13892,7 @@
           <w:sz w:val="22"/>
           <w:szCs w:val="22"/>
         </w:rPr>
-        <w:t xml:space="preserve">Level 7: YAML Program Files — implementation-ready configuration derived from approved Domain PRDs</w:t>
+        <w:t xml:space="preserve">Level 6a: Sub-Domain PRDs (where applicable) — reconciled synthesis of all processes within a sub-domain</w:t>
       </w:r>
     </w:p>
     <w:p>
@@ -13185,7 +13914,7 @@
           <w:sz w:val="22"/>
           <w:szCs w:val="22"/>
         </w:rPr>
-        <w:t xml:space="preserve">Level 8: CRM Evaluation Report — platform comparison and recommendation based on defined requirements</w:t>
+        <w:t xml:space="preserve">Level 6b: Domain PRDs and Service PRDs — reconciled synthesis of all entities and processes within a domain, incorporating Sub-Domain PRDs where applicable</w:t>
       </w:r>
     </w:p>
     <w:p>
@@ -13207,7 +13936,7 @@
           <w:sz w:val="22"/>
           <w:szCs w:val="22"/>
         </w:rPr>
-        <w:t xml:space="preserve">Level 9: Configured CRM Instance — deployed and configured platform matching YAML definitions</w:t>
+        <w:t xml:space="preserve">Level 7: YAML Program Files — implementation-ready configuration derived from approved Domain PRDs</w:t>
       </w:r>
     </w:p>
     <w:p>
@@ -13229,79 +13958,7 @@
           <w:sz w:val="22"/>
           <w:szCs w:val="22"/>
         </w:rPr>
-        <w:t xml:space="preserve">Level 10: Verification Spec — QA artifact confirming configuration matches requirements</w:t>
-      </w:r>
-    </w:p>
-    <w:p>
-      <w:pPr>
-        <w:pStyle w:val="Heading1"/>
-        <w:spacing w:after="120" w:before="360"/>
-      </w:pPr>
-      <w:r>
-        <w:rPr>
-          <w:rFonts w:ascii="Arial" w:cs="Arial" w:eastAsia="Arial" w:hAnsi="Arial"/>
-          <w:b/>
-          <w:bCs/>
-          <w:i w:val="false"/>
-          <w:iCs w:val="false"/>
-          <w:color w:val="1F3864"/>
-          <w:sz w:val="32"/>
-          <w:szCs w:val="32"/>
-        </w:rPr>
-        <w:t xml:space="preserve">10. Handling Scope Changes During Process Definition</w:t>
-      </w:r>
-    </w:p>
-    <w:p>
-      <w:pPr>
-        <w:spacing w:after="120"/>
-      </w:pPr>
-      <w:r>
-        <w:rPr>
-          <w:rFonts w:ascii="Arial" w:cs="Arial" w:eastAsia="Arial" w:hAnsi="Arial"/>
-          <w:b w:val="false"/>
-          <w:bCs w:val="false"/>
-          <w:i w:val="false"/>
-          <w:iCs w:val="false"/>
-          <w:sz w:val="22"/>
-          <w:szCs w:val="22"/>
-        </w:rPr>
-        <w:t xml:space="preserve">During process definition or entity definition conversations, it is common to discover that earlier documents are incomplete. A conversation about one process may reveal an unidentified process, an unrecognized entity, a missing field on an existing entity, or a structural issue with how domains were originally defined. This is normal and expected — the interview process is designed to surface exactly these kinds of gaps.</w:t>
-      </w:r>
-    </w:p>
-    <w:p>
-      <w:pPr>
-        <w:spacing w:after="120"/>
-      </w:pPr>
-      <w:r>
-        <w:rPr>
-          <w:rFonts w:ascii="Arial" w:cs="Arial" w:eastAsia="Arial" w:hAnsi="Arial"/>
-          <w:b w:val="false"/>
-          <w:bCs w:val="false"/>
-          <w:i w:val="false"/>
-          <w:iCs w:val="false"/>
-          <w:sz w:val="22"/>
-          <w:szCs w:val="22"/>
-        </w:rPr>
-        <w:t xml:space="preserve">The default response to any scope discovery is to stop the current work and fix the missing information before proceeding. This prevents the compounding errors that occur when a conversation tries to absorb a scope change mid-stream.</w:t>
-      </w:r>
-    </w:p>
-    <w:p>
-      <w:pPr>
-        <w:pStyle w:val="Heading2"/>
-        <w:spacing w:after="120" w:before="240"/>
-      </w:pPr>
-      <w:r>
-        <w:rPr>
-          <w:rFonts w:ascii="Arial" w:cs="Arial" w:eastAsia="Arial" w:hAnsi="Arial"/>
-          <w:b/>
-          <w:bCs/>
-          <w:i w:val="false"/>
-          <w:iCs w:val="false"/>
-          <w:color w:val="1F3864"/>
-          <w:sz w:val="28"/>
-          <w:szCs w:val="28"/>
-        </w:rPr>
-        <w:t xml:space="preserve">10.1 Discovery Protocol</w:t>
+        <w:t xml:space="preserve">Level 8: CRM Evaluation Report — platform comparison and recommendation based on defined requirements</w:t>
       </w:r>
     </w:p>
     <w:p>
@@ -13323,7 +13980,7 @@
           <w:sz w:val="22"/>
           <w:szCs w:val="22"/>
         </w:rPr>
-        <w:t xml:space="preserve">Claude flags the discovery explicitly and pauses the current conversation.</w:t>
+        <w:t xml:space="preserve">Level 9: Configured CRM Instance — deployed and configured platform matching YAML definitions</w:t>
       </w:r>
     </w:p>
     <w:p>
@@ -13345,7 +14002,79 @@
           <w:sz w:val="22"/>
           <w:szCs w:val="22"/>
         </w:rPr>
-        <w:t xml:space="preserve">Claude and the administrator assess the scope of the discovery.</w:t>
+        <w:t xml:space="preserve">Level 10: Verification Spec — QA artifact confirming configuration matches requirements</w:t>
+      </w:r>
+    </w:p>
+    <w:p>
+      <w:pPr>
+        <w:pStyle w:val="Heading1"/>
+        <w:spacing w:after="120" w:before="360"/>
+      </w:pPr>
+      <w:r>
+        <w:rPr>
+          <w:rFonts w:ascii="Arial" w:cs="Arial" w:eastAsia="Arial" w:hAnsi="Arial"/>
+          <w:b/>
+          <w:bCs/>
+          <w:i w:val="false"/>
+          <w:iCs w:val="false"/>
+          <w:color w:val="1F3864"/>
+          <w:sz w:val="32"/>
+          <w:szCs w:val="32"/>
+        </w:rPr>
+        <w:t xml:space="preserve">10. Handling Scope Changes During Process Definition</w:t>
+      </w:r>
+    </w:p>
+    <w:p>
+      <w:pPr>
+        <w:spacing w:after="120"/>
+      </w:pPr>
+      <w:r>
+        <w:rPr>
+          <w:rFonts w:ascii="Arial" w:cs="Arial" w:eastAsia="Arial" w:hAnsi="Arial"/>
+          <w:b w:val="false"/>
+          <w:bCs w:val="false"/>
+          <w:i w:val="false"/>
+          <w:iCs w:val="false"/>
+          <w:sz w:val="22"/>
+          <w:szCs w:val="22"/>
+        </w:rPr>
+        <w:t xml:space="preserve">During process definition or entity definition conversations, it is common to discover that earlier documents are incomplete. A conversation about one process may reveal an unidentified process, an unrecognized entity, a missing field on an existing entity, or a structural issue with how domains were originally defined. This is normal and expected — the interview process is designed to surface exactly these kinds of gaps.</w:t>
+      </w:r>
+    </w:p>
+    <w:p>
+      <w:pPr>
+        <w:spacing w:after="120"/>
+      </w:pPr>
+      <w:r>
+        <w:rPr>
+          <w:rFonts w:ascii="Arial" w:cs="Arial" w:eastAsia="Arial" w:hAnsi="Arial"/>
+          <w:b w:val="false"/>
+          <w:bCs w:val="false"/>
+          <w:i w:val="false"/>
+          <w:iCs w:val="false"/>
+          <w:sz w:val="22"/>
+          <w:szCs w:val="22"/>
+        </w:rPr>
+        <w:t xml:space="preserve">The default response to any scope discovery is to stop the current work and fix the missing information before proceeding. This prevents the compounding errors that occur when a conversation tries to absorb a scope change mid-stream.</w:t>
+      </w:r>
+    </w:p>
+    <w:p>
+      <w:pPr>
+        <w:pStyle w:val="Heading2"/>
+        <w:spacing w:after="120" w:before="240"/>
+      </w:pPr>
+      <w:r>
+        <w:rPr>
+          <w:rFonts w:ascii="Arial" w:cs="Arial" w:eastAsia="Arial" w:hAnsi="Arial"/>
+          <w:b/>
+          <w:bCs/>
+          <w:i w:val="false"/>
+          <w:iCs w:val="false"/>
+          <w:color w:val="1F3864"/>
+          <w:sz w:val="28"/>
+          <w:szCs w:val="28"/>
+        </w:rPr>
+        <w:t xml:space="preserve">10.1 Discovery Protocol</w:t>
       </w:r>
     </w:p>
     <w:p>
@@ -13367,7 +14096,7 @@
           <w:sz w:val="22"/>
           <w:szCs w:val="22"/>
         </w:rPr>
-        <w:t xml:space="preserve">The appropriate upstream document is updated to reflect the new information before work resumes.</w:t>
+        <w:t xml:space="preserve">Claude flags the discovery explicitly and pauses the current conversation.</w:t>
       </w:r>
     </w:p>
     <w:p>
@@ -13389,43 +14118,7 @@
           <w:sz w:val="22"/>
           <w:szCs w:val="22"/>
         </w:rPr>
-        <w:t xml:space="preserve">Work resumes from the updated plan.</w:t>
-      </w:r>
-    </w:p>
-    <w:p>
-      <w:pPr>
-        <w:pStyle w:val="Heading2"/>
-        <w:spacing w:after="120" w:before="240"/>
-      </w:pPr>
-      <w:r>
-        <w:rPr>
-          <w:rFonts w:ascii="Arial" w:cs="Arial" w:eastAsia="Arial" w:hAnsi="Arial"/>
-          <w:b/>
-          <w:bCs/>
-          <w:i w:val="false"/>
-          <w:iCs w:val="false"/>
-          <w:color w:val="1F3864"/>
-          <w:sz w:val="28"/>
-          <w:szCs w:val="28"/>
-        </w:rPr>
-        <w:t xml:space="preserve">10.2 New Entity Discovered During Process Definition</w:t>
-      </w:r>
-    </w:p>
-    <w:p>
-      <w:pPr>
-        <w:spacing w:after="120"/>
-      </w:pPr>
-      <w:r>
-        <w:rPr>
-          <w:rFonts w:ascii="Arial" w:cs="Arial" w:eastAsia="Arial" w:hAnsi="Arial"/>
-          <w:b w:val="false"/>
-          <w:bCs w:val="false"/>
-          <w:i w:val="false"/>
-          <w:iCs w:val="false"/>
-          <w:sz w:val="22"/>
-          <w:szCs w:val="22"/>
-        </w:rPr>
-        <w:t xml:space="preserve">If a process conversation reveals an entity that was not captured during Entity Definition:</w:t>
+        <w:t xml:space="preserve">Claude and the administrator assess the scope of the discovery.</w:t>
       </w:r>
     </w:p>
     <w:p>
@@ -13447,7 +14140,7 @@
           <w:sz w:val="22"/>
           <w:szCs w:val="22"/>
         </w:rPr>
-        <w:t xml:space="preserve">Pause the current process conversation at a clean stopping point.</w:t>
+        <w:t xml:space="preserve">The appropriate upstream document is updated to reflect the new information before work resumes.</w:t>
       </w:r>
     </w:p>
     <w:p>
@@ -13469,7 +14162,43 @@
           <w:sz w:val="22"/>
           <w:szCs w:val="22"/>
         </w:rPr>
-        <w:t xml:space="preserve">Update the Entity Inventory to add the new entity.</w:t>
+        <w:t xml:space="preserve">Work resumes from the updated plan.</w:t>
+      </w:r>
+    </w:p>
+    <w:p>
+      <w:pPr>
+        <w:pStyle w:val="Heading2"/>
+        <w:spacing w:after="120" w:before="240"/>
+      </w:pPr>
+      <w:r>
+        <w:rPr>
+          <w:rFonts w:ascii="Arial" w:cs="Arial" w:eastAsia="Arial" w:hAnsi="Arial"/>
+          <w:b/>
+          <w:bCs/>
+          <w:i w:val="false"/>
+          <w:iCs w:val="false"/>
+          <w:color w:val="1F3864"/>
+          <w:sz w:val="28"/>
+          <w:szCs w:val="28"/>
+        </w:rPr>
+        <w:t xml:space="preserve">10.2 New Entity Discovered During Process Definition</w:t>
+      </w:r>
+    </w:p>
+    <w:p>
+      <w:pPr>
+        <w:spacing w:after="120"/>
+      </w:pPr>
+      <w:r>
+        <w:rPr>
+          <w:rFonts w:ascii="Arial" w:cs="Arial" w:eastAsia="Arial" w:hAnsi="Arial"/>
+          <w:b w:val="false"/>
+          <w:bCs w:val="false"/>
+          <w:i w:val="false"/>
+          <w:iCs w:val="false"/>
+          <w:sz w:val="22"/>
+          <w:szCs w:val="22"/>
+        </w:rPr>
+        <w:t xml:space="preserve">If a process conversation reveals an entity that was not captured during Entity Definition:</w:t>
       </w:r>
     </w:p>
     <w:p>
@@ -13491,7 +14220,7 @@
           <w:sz w:val="22"/>
           <w:szCs w:val="22"/>
         </w:rPr>
-        <w:t xml:space="preserve">Conduct an Entity Definition interview for the new entity.</w:t>
+        <w:t xml:space="preserve">Pause the current process conversation at a clean stopping point.</w:t>
       </w:r>
     </w:p>
     <w:p>
@@ -13513,43 +14242,7 @@
           <w:sz w:val="22"/>
           <w:szCs w:val="22"/>
         </w:rPr>
-        <w:t xml:space="preserve">Resume the process conversation with the new Entity PRD available as input.</w:t>
-      </w:r>
-    </w:p>
-    <w:p>
-      <w:pPr>
-        <w:pStyle w:val="Heading2"/>
-        <w:spacing w:after="120" w:before="240"/>
-      </w:pPr>
-      <w:r>
-        <w:rPr>
-          <w:rFonts w:ascii="Arial" w:cs="Arial" w:eastAsia="Arial" w:hAnsi="Arial"/>
-          <w:b/>
-          <w:bCs/>
-          <w:i w:val="false"/>
-          <w:iCs w:val="false"/>
-          <w:color w:val="1F3864"/>
-          <w:sz w:val="28"/>
-          <w:szCs w:val="28"/>
-        </w:rPr>
-        <w:t xml:space="preserve">10.3 New Field or Relationship Discovered on an Existing Entity</w:t>
-      </w:r>
-    </w:p>
-    <w:p>
-      <w:pPr>
-        <w:spacing w:after="120"/>
-      </w:pPr>
-      <w:r>
-        <w:rPr>
-          <w:rFonts w:ascii="Arial" w:cs="Arial" w:eastAsia="Arial" w:hAnsi="Arial"/>
-          <w:b w:val="false"/>
-          <w:bCs w:val="false"/>
-          <w:i w:val="false"/>
-          <w:iCs w:val="false"/>
-          <w:sz w:val="22"/>
-          <w:szCs w:val="22"/>
-        </w:rPr>
-        <w:t xml:space="preserve">If a process conversation reveals a field or relationship that should exist on an already-defined entity but was not captured in its Entity PRD:</w:t>
+        <w:t xml:space="preserve">Update the Entity Inventory to add the new entity.</w:t>
       </w:r>
     </w:p>
     <w:p>
@@ -13571,7 +14264,7 @@
           <w:sz w:val="22"/>
           <w:szCs w:val="22"/>
         </w:rPr>
-        <w:t xml:space="preserve">Note the discovery in the process document.</w:t>
+        <w:t xml:space="preserve">Conduct an Entity Definition interview for the new entity.</w:t>
       </w:r>
     </w:p>
     <w:p>
@@ -13593,7 +14286,43 @@
           <w:sz w:val="22"/>
           <w:szCs w:val="22"/>
         </w:rPr>
-        <w:t xml:space="preserve">After the process conversation is complete, update the Entity PRD to add the missing field or relationship.</w:t>
+        <w:t xml:space="preserve">Resume the process conversation with the new Entity PRD available as input.</w:t>
+      </w:r>
+    </w:p>
+    <w:p>
+      <w:pPr>
+        <w:pStyle w:val="Heading2"/>
+        <w:spacing w:after="120" w:before="240"/>
+      </w:pPr>
+      <w:r>
+        <w:rPr>
+          <w:rFonts w:ascii="Arial" w:cs="Arial" w:eastAsia="Arial" w:hAnsi="Arial"/>
+          <w:b/>
+          <w:bCs/>
+          <w:i w:val="false"/>
+          <w:iCs w:val="false"/>
+          <w:color w:val="1F3864"/>
+          <w:sz w:val="28"/>
+          <w:szCs w:val="28"/>
+        </w:rPr>
+        <w:t xml:space="preserve">10.3 New Field or Relationship Discovered on an Existing Entity</w:t>
+      </w:r>
+    </w:p>
+    <w:p>
+      <w:pPr>
+        <w:spacing w:after="120"/>
+      </w:pPr>
+      <w:r>
+        <w:rPr>
+          <w:rFonts w:ascii="Arial" w:cs="Arial" w:eastAsia="Arial" w:hAnsi="Arial"/>
+          <w:b w:val="false"/>
+          <w:bCs w:val="false"/>
+          <w:i w:val="false"/>
+          <w:iCs w:val="false"/>
+          <w:sz w:val="22"/>
+          <w:szCs w:val="22"/>
+        </w:rPr>
+        <w:t xml:space="preserve">If a process conversation reveals a field or relationship that should exist on an already-defined entity but was not captured in its Entity PRD:</w:t>
       </w:r>
     </w:p>
     <w:p>
@@ -13615,43 +14344,7 @@
           <w:sz w:val="22"/>
           <w:szCs w:val="22"/>
         </w:rPr>
-        <w:t xml:space="preserve">For minor additions (a single field), the administrator may choose to update the Entity PRD directly without a full interview conversation.</w:t>
-      </w:r>
-    </w:p>
-    <w:p>
-      <w:pPr>
-        <w:pStyle w:val="Heading2"/>
-        <w:spacing w:after="120" w:before="240"/>
-      </w:pPr>
-      <w:r>
-        <w:rPr>
-          <w:rFonts w:ascii="Arial" w:cs="Arial" w:eastAsia="Arial" w:hAnsi="Arial"/>
-          <w:b/>
-          <w:bCs/>
-          <w:i w:val="false"/>
-          <w:iCs w:val="false"/>
-          <w:color w:val="1F3864"/>
-          <w:sz w:val="28"/>
-          <w:szCs w:val="28"/>
-        </w:rPr>
-        <w:t xml:space="preserve">10.4 Small Scope: New Process in an Existing Domain</w:t>
-      </w:r>
-    </w:p>
-    <w:p>
-      <w:pPr>
-        <w:spacing w:after="120"/>
-      </w:pPr>
-      <w:r>
-        <w:rPr>
-          <w:rFonts w:ascii="Arial" w:cs="Arial" w:eastAsia="Arial" w:hAnsi="Arial"/>
-          <w:b w:val="false"/>
-          <w:bCs w:val="false"/>
-          <w:i w:val="false"/>
-          <w:iCs w:val="false"/>
-          <w:sz w:val="22"/>
-          <w:szCs w:val="22"/>
-        </w:rPr>
-        <w:t xml:space="preserve">If the discovery is a new process within a domain that is already defined — for example, realizing that Engagement Management should be split into two separate processes, or that a Mentor Reassignment process was not identified — the response is:</w:t>
+        <w:t xml:space="preserve">Note the discovery in the process document.</w:t>
       </w:r>
     </w:p>
     <w:p>
@@ -13673,7 +14366,7 @@
           <w:sz w:val="22"/>
           <w:szCs w:val="22"/>
         </w:rPr>
-        <w:t xml:space="preserve">Complete or pause the current process conversation at a clean stopping point.</w:t>
+        <w:t xml:space="preserve">After the process conversation is complete, update the Entity PRD to add the missing field or relationship.</w:t>
       </w:r>
     </w:p>
     <w:p>
@@ -13695,7 +14388,43 @@
           <w:sz w:val="22"/>
           <w:szCs w:val="22"/>
         </w:rPr>
-        <w:t xml:space="preserve">Update the Master PRD to add the new process to the domain’s process list and place it in the correct dependency order.</w:t>
+        <w:t xml:space="preserve">For minor additions (a single field), the administrator may choose to update the Entity PRD directly without a full interview conversation.</w:t>
+      </w:r>
+    </w:p>
+    <w:p>
+      <w:pPr>
+        <w:pStyle w:val="Heading2"/>
+        <w:spacing w:after="120" w:before="240"/>
+      </w:pPr>
+      <w:r>
+        <w:rPr>
+          <w:rFonts w:ascii="Arial" w:cs="Arial" w:eastAsia="Arial" w:hAnsi="Arial"/>
+          <w:b/>
+          <w:bCs/>
+          <w:i w:val="false"/>
+          <w:iCs w:val="false"/>
+          <w:color w:val="1F3864"/>
+          <w:sz w:val="28"/>
+          <w:szCs w:val="28"/>
+        </w:rPr>
+        <w:t xml:space="preserve">10.4 Small Scope: New Process in an Existing Domain</w:t>
+      </w:r>
+    </w:p>
+    <w:p>
+      <w:pPr>
+        <w:spacing w:after="120"/>
+      </w:pPr>
+      <w:r>
+        <w:rPr>
+          <w:rFonts w:ascii="Arial" w:cs="Arial" w:eastAsia="Arial" w:hAnsi="Arial"/>
+          <w:b w:val="false"/>
+          <w:bCs w:val="false"/>
+          <w:i w:val="false"/>
+          <w:iCs w:val="false"/>
+          <w:sz w:val="22"/>
+          <w:szCs w:val="22"/>
+        </w:rPr>
+        <w:t xml:space="preserve">If the discovery is a new process within a domain that is already defined — for example, realizing that Engagement Management should be split into two separate processes, or that a Mentor Reassignment process was not identified — the response is:</w:t>
       </w:r>
     </w:p>
     <w:p>
@@ -13717,60 +14446,7 @@
           <w:sz w:val="22"/>
           <w:szCs w:val="22"/>
         </w:rPr>
-        <w:t xml:space="preserve">The new process gets its own conversation in the normal sequence.</w:t>
-      </w:r>
-    </w:p>
-    <w:p>
-      <w:pPr>
-        <w:spacing w:after="120"/>
-      </w:pPr>
-      <w:r>
-        <w:rPr>
-          <w:rFonts w:ascii="Arial" w:cs="Arial" w:eastAsia="Arial" w:hAnsi="Arial"/>
-          <w:b w:val="false"/>
-          <w:bCs w:val="false"/>
-          <w:i w:val="false"/>
-          <w:iCs w:val="false"/>
-          <w:sz w:val="22"/>
-          <w:szCs w:val="22"/>
-        </w:rPr>
-        <w:t xml:space="preserve">For very minor discoveries (e.g., a process name change or a small scope clarification), Claude and the administrator may make a judgment call to handle it inline rather than pausing. This is the exception, not the default.</w:t>
-      </w:r>
-    </w:p>
-    <w:p>
-      <w:pPr>
-        <w:pStyle w:val="Heading2"/>
-        <w:spacing w:after="120" w:before="240"/>
-      </w:pPr>
-      <w:r>
-        <w:rPr>
-          <w:rFonts w:ascii="Arial" w:cs="Arial" w:eastAsia="Arial" w:hAnsi="Arial"/>
-          <w:b/>
-          <w:bCs/>
-          <w:i w:val="false"/>
-          <w:iCs w:val="false"/>
-          <w:color w:val="1F3864"/>
-          <w:sz w:val="28"/>
-          <w:szCs w:val="28"/>
-        </w:rPr>
-        <w:t xml:space="preserve">10.5 Large Scope: New Domain or Structural Change</w:t>
-      </w:r>
-    </w:p>
-    <w:p>
-      <w:pPr>
-        <w:spacing w:after="120"/>
-      </w:pPr>
-      <w:r>
-        <w:rPr>
-          <w:rFonts w:ascii="Arial" w:cs="Arial" w:eastAsia="Arial" w:hAnsi="Arial"/>
-          <w:b w:val="false"/>
-          <w:bCs w:val="false"/>
-          <w:i w:val="false"/>
-          <w:iCs w:val="false"/>
-          <w:sz w:val="22"/>
-          <w:szCs w:val="22"/>
-        </w:rPr>
-        <w:t xml:space="preserve">If the discovery is a new domain entirely, or a change that affects the structure of existing domains — for example, realizing that volunteer coordination is a separate domain, or that two domains should be merged — the response is:</w:t>
+        <w:t xml:space="preserve">Complete or pause the current process conversation at a clean stopping point.</w:t>
       </w:r>
     </w:p>
     <w:p>
@@ -13792,7 +14468,7 @@
           <w:sz w:val="22"/>
           <w:szCs w:val="22"/>
         </w:rPr>
-        <w:t xml:space="preserve">Stop all domain work immediately.</w:t>
+        <w:t xml:space="preserve">Update the Master PRD to add the new process to the domain’s process list and place it in the correct dependency order.</w:t>
       </w:r>
     </w:p>
     <w:p>
@@ -13814,7 +14490,60 @@
           <w:sz w:val="22"/>
           <w:szCs w:val="22"/>
         </w:rPr>
-        <w:t xml:space="preserve">Conduct a dedicated Master PRD revision conversation to add the new domain, redefine domain boundaries, update personas, and determine where the new domain fits in the processing order.</w:t>
+        <w:t xml:space="preserve">The new process gets its own conversation in the normal sequence.</w:t>
+      </w:r>
+    </w:p>
+    <w:p>
+      <w:pPr>
+        <w:spacing w:after="120"/>
+      </w:pPr>
+      <w:r>
+        <w:rPr>
+          <w:rFonts w:ascii="Arial" w:cs="Arial" w:eastAsia="Arial" w:hAnsi="Arial"/>
+          <w:b w:val="false"/>
+          <w:bCs w:val="false"/>
+          <w:i w:val="false"/>
+          <w:iCs w:val="false"/>
+          <w:sz w:val="22"/>
+          <w:szCs w:val="22"/>
+        </w:rPr>
+        <w:t xml:space="preserve">For very minor discoveries (e.g., a process name change or a small scope clarification), Claude and the administrator may make a judgment call to handle it inline rather than pausing. This is the exception, not the default.</w:t>
+      </w:r>
+    </w:p>
+    <w:p>
+      <w:pPr>
+        <w:pStyle w:val="Heading2"/>
+        <w:spacing w:after="120" w:before="240"/>
+      </w:pPr>
+      <w:r>
+        <w:rPr>
+          <w:rFonts w:ascii="Arial" w:cs="Arial" w:eastAsia="Arial" w:hAnsi="Arial"/>
+          <w:b/>
+          <w:bCs/>
+          <w:i w:val="false"/>
+          <w:iCs w:val="false"/>
+          <w:color w:val="1F3864"/>
+          <w:sz w:val="28"/>
+          <w:szCs w:val="28"/>
+        </w:rPr>
+        <w:t xml:space="preserve">10.5 Large Scope: New Domain or Structural Change</w:t>
+      </w:r>
+    </w:p>
+    <w:p>
+      <w:pPr>
+        <w:spacing w:after="120"/>
+      </w:pPr>
+      <w:r>
+        <w:rPr>
+          <w:rFonts w:ascii="Arial" w:cs="Arial" w:eastAsia="Arial" w:hAnsi="Arial"/>
+          <w:b w:val="false"/>
+          <w:bCs w:val="false"/>
+          <w:i w:val="false"/>
+          <w:iCs w:val="false"/>
+          <w:sz w:val="22"/>
+          <w:szCs w:val="22"/>
+        </w:rPr>
+        <w:t xml:space="preserve">If the discovery is a new domain entirely, or a change that affects the structure of existing domains — for example, realizing that volunteer coordination is a separate domain, or that two domains should be merged — the response is:</w:t>
       </w:r>
     </w:p>
     <w:p>
@@ -13836,7 +14565,7 @@
           <w:sz w:val="22"/>
           <w:szCs w:val="22"/>
         </w:rPr>
-        <w:t xml:space="preserve">Review whether any already-completed Entity PRDs, process documents, or Domain PRDs are affected by the structural change.</w:t>
+        <w:t xml:space="preserve">Stop all domain work immediately.</w:t>
       </w:r>
     </w:p>
     <w:p>
@@ -13858,6 +14587,50 @@
           <w:sz w:val="22"/>
           <w:szCs w:val="22"/>
         </w:rPr>
+        <w:t xml:space="preserve">Conduct a dedicated Master PRD revision conversation to add the new domain, redefine domain boundaries, update personas, and determine where the new domain fits in the processing order.</w:t>
+      </w:r>
+    </w:p>
+    <w:p>
+      <w:pPr>
+        <w:pStyle w:val="ListParagraph"/>
+        <w:numPr>
+          <w:ilvl w:val="0"/>
+          <w:numId w:val="2"/>
+        </w:numPr>
+        <w:spacing w:after="60"/>
+      </w:pPr>
+      <w:r>
+        <w:rPr>
+          <w:rFonts w:ascii="Arial" w:cs="Arial" w:eastAsia="Arial" w:hAnsi="Arial"/>
+          <w:b w:val="false"/>
+          <w:bCs w:val="false"/>
+          <w:i w:val="false"/>
+          <w:iCs w:val="false"/>
+          <w:sz w:val="22"/>
+          <w:szCs w:val="22"/>
+        </w:rPr>
+        <w:t xml:space="preserve">Review whether any already-completed Entity PRDs, process documents, or Domain PRDs are affected by the structural change.</w:t>
+      </w:r>
+    </w:p>
+    <w:p>
+      <w:pPr>
+        <w:pStyle w:val="ListParagraph"/>
+        <w:numPr>
+          <w:ilvl w:val="0"/>
+          <w:numId w:val="2"/>
+        </w:numPr>
+        <w:spacing w:after="60"/>
+      </w:pPr>
+      <w:r>
+        <w:rPr>
+          <w:rFonts w:ascii="Arial" w:cs="Arial" w:eastAsia="Arial" w:hAnsi="Arial"/>
+          <w:b w:val="false"/>
+          <w:bCs w:val="false"/>
+          <w:i w:val="false"/>
+          <w:iCs w:val="false"/>
+          <w:sz w:val="22"/>
+          <w:szCs w:val="22"/>
+        </w:rPr>
         <w:t xml:space="preserve">Resume domain work from the updated Master PRD.</w:t>
       </w:r>
     </w:p>
@@ -13877,20 +14650,24 @@
           <w:sz w:val="28"/>
           <w:szCs w:val="28"/>
         </w:rPr>
-        <w:t xml:space="preserve">10.6 New Cross-Domain Service Discovered</w:t>
-      </w:r>
-    </w:p>
-    <w:p>
-      <w:pPr>
-        <w:spacing w:after="120"/>
-      </w:pPr>
-      <w:r>
-        <w:rPr>
-          <w:rFonts w:ascii="Arial" w:cs="Arial" w:eastAsia="Arial" w:hAnsi="Arial"/>
-          <w:sz w:val="22"/>
-          <w:szCs w:val="22"/>
-        </w:rPr>
-        <w:t xml:space="preserve">If a process conversation reveals a shared capability that should be defined as a Cross-Domain Service rather than handled within a single domain:</w:t>
+        <w:t xml:space="preserve">10.6 Sub-Domain Structure Discovered</w:t>
+      </w:r>
+    </w:p>
+    <w:p>
+      <w:pPr>
+        <w:spacing w:after="120"/>
+      </w:pPr>
+      <w:r>
+        <w:rPr>
+          <w:rFonts w:ascii="Arial" w:cs="Arial" w:eastAsia="Arial" w:hAnsi="Arial"/>
+          <w:b w:val="false"/>
+          <w:bCs w:val="false"/>
+          <w:i w:val="false"/>
+          <w:iCs w:val="false"/>
+          <w:sz w:val="22"/>
+          <w:szCs w:val="22"/>
+        </w:rPr>
+        <w:t xml:space="preserve">If process definition work reveals that a domain’s processes are too complex or too parallel for a flat structure and would benefit from sub-domain organization:</w:t>
       </w:r>
     </w:p>
     <w:p>
@@ -13905,6 +14682,10 @@
       <w:r>
         <w:rPr>
           <w:rFonts w:ascii="Arial" w:cs="Arial" w:eastAsia="Arial" w:hAnsi="Arial"/>
+          <w:b w:val="false"/>
+          <w:bCs w:val="false"/>
+          <w:i w:val="false"/>
+          <w:iCs w:val="false"/>
           <w:sz w:val="22"/>
           <w:szCs w:val="22"/>
         </w:rPr>
@@ -13923,10 +14704,14 @@
       <w:r>
         <w:rPr>
           <w:rFonts w:ascii="Arial" w:cs="Arial" w:eastAsia="Arial" w:hAnsi="Arial"/>
-          <w:sz w:val="22"/>
-          <w:szCs w:val="22"/>
-        </w:rPr>
-        <w:t xml:space="preserve">Update the Master PRD to add the new service with its description and capabilities.</w:t>
+          <w:b w:val="false"/>
+          <w:bCs w:val="false"/>
+          <w:i w:val="false"/>
+          <w:iCs w:val="false"/>
+          <w:sz w:val="22"/>
+          <w:szCs w:val="22"/>
+        </w:rPr>
+        <w:t xml:space="preserve">Update the Master PRD to restructure the domain’s process inventory into sub-domains.</w:t>
       </w:r>
     </w:p>
     <w:p>
@@ -13941,10 +14726,14 @@
       <w:r>
         <w:rPr>
           <w:rFonts w:ascii="Arial" w:cs="Arial" w:eastAsia="Arial" w:hAnsi="Arial"/>
-          <w:sz w:val="22"/>
-          <w:szCs w:val="22"/>
-        </w:rPr>
-        <w:t xml:space="preserve">Optionally conduct service entity and process definition before resuming, or continue domain work referencing the service generically from the Master PRD description.</w:t>
+          <w:b w:val="false"/>
+          <w:bCs w:val="false"/>
+          <w:i w:val="false"/>
+          <w:iCs w:val="false"/>
+          <w:sz w:val="22"/>
+          <w:szCs w:val="22"/>
+        </w:rPr>
+        <w:t xml:space="preserve">Produce the parent Domain Overview if not already complete, reflecting the sub-domain structure.</w:t>
       </w:r>
     </w:p>
     <w:p>
@@ -13959,10 +14748,14 @@
       <w:r>
         <w:rPr>
           <w:rFonts w:ascii="Arial" w:cs="Arial" w:eastAsia="Arial" w:hAnsi="Arial"/>
-          <w:sz w:val="22"/>
-          <w:szCs w:val="22"/>
-        </w:rPr>
-        <w:t xml:space="preserve">Resume domain work from the updated Master PRD.</w:t>
+          <w:b w:val="false"/>
+          <w:bCs w:val="false"/>
+          <w:i w:val="false"/>
+          <w:iCs w:val="false"/>
+          <w:sz w:val="22"/>
+          <w:szCs w:val="22"/>
+        </w:rPr>
+        <w:t xml:space="preserve">Resume work through the sub-domain overview and process definition sequence.</w:t>
       </w:r>
     </w:p>
     <w:p>
@@ -13981,7 +14774,111 @@
           <w:sz w:val="28"/>
           <w:szCs w:val="28"/>
         </w:rPr>
-        <w:t xml:space="preserve">10.7 Principle</w:t>
+        <w:t xml:space="preserve">10.7 New Cross-Domain Service Discovered</w:t>
+      </w:r>
+    </w:p>
+    <w:p>
+      <w:pPr>
+        <w:spacing w:after="120"/>
+      </w:pPr>
+      <w:r>
+        <w:rPr>
+          <w:rFonts w:ascii="Arial" w:cs="Arial" w:eastAsia="Arial" w:hAnsi="Arial"/>
+          <w:sz w:val="22"/>
+          <w:szCs w:val="22"/>
+        </w:rPr>
+        <w:t xml:space="preserve">If a process conversation reveals a shared capability that should be defined as a Cross-Domain Service rather than handled within a single domain:</w:t>
+      </w:r>
+    </w:p>
+    <w:p>
+      <w:pPr>
+        <w:pStyle w:val="ListParagraph"/>
+        <w:numPr>
+          <w:ilvl w:val="0"/>
+          <w:numId w:val="2"/>
+        </w:numPr>
+        <w:spacing w:after="80"/>
+      </w:pPr>
+      <w:r>
+        <w:rPr>
+          <w:rFonts w:ascii="Arial" w:cs="Arial" w:eastAsia="Arial" w:hAnsi="Arial"/>
+          <w:sz w:val="22"/>
+          <w:szCs w:val="22"/>
+        </w:rPr>
+        <w:t xml:space="preserve">Stop the current conversation at a clean stopping point.</w:t>
+      </w:r>
+    </w:p>
+    <w:p>
+      <w:pPr>
+        <w:pStyle w:val="ListParagraph"/>
+        <w:numPr>
+          <w:ilvl w:val="0"/>
+          <w:numId w:val="2"/>
+        </w:numPr>
+        <w:spacing w:after="80"/>
+      </w:pPr>
+      <w:r>
+        <w:rPr>
+          <w:rFonts w:ascii="Arial" w:cs="Arial" w:eastAsia="Arial" w:hAnsi="Arial"/>
+          <w:sz w:val="22"/>
+          <w:szCs w:val="22"/>
+        </w:rPr>
+        <w:t xml:space="preserve">Update the Master PRD to add the new service with its description and capabilities.</w:t>
+      </w:r>
+    </w:p>
+    <w:p>
+      <w:pPr>
+        <w:pStyle w:val="ListParagraph"/>
+        <w:numPr>
+          <w:ilvl w:val="0"/>
+          <w:numId w:val="2"/>
+        </w:numPr>
+        <w:spacing w:after="80"/>
+      </w:pPr>
+      <w:r>
+        <w:rPr>
+          <w:rFonts w:ascii="Arial" w:cs="Arial" w:eastAsia="Arial" w:hAnsi="Arial"/>
+          <w:sz w:val="22"/>
+          <w:szCs w:val="22"/>
+        </w:rPr>
+        <w:t xml:space="preserve">Optionally conduct service entity and process definition before resuming, or continue domain work referencing the service generically from the Master PRD description.</w:t>
+      </w:r>
+    </w:p>
+    <w:p>
+      <w:pPr>
+        <w:pStyle w:val="ListParagraph"/>
+        <w:numPr>
+          <w:ilvl w:val="0"/>
+          <w:numId w:val="2"/>
+        </w:numPr>
+        <w:spacing w:after="80"/>
+      </w:pPr>
+      <w:r>
+        <w:rPr>
+          <w:rFonts w:ascii="Arial" w:cs="Arial" w:eastAsia="Arial" w:hAnsi="Arial"/>
+          <w:sz w:val="22"/>
+          <w:szCs w:val="22"/>
+        </w:rPr>
+        <w:t xml:space="preserve">Resume domain work from the updated Master PRD.</w:t>
+      </w:r>
+    </w:p>
+    <w:p>
+      <w:pPr>
+        <w:pStyle w:val="Heading2"/>
+        <w:spacing w:after="120" w:before="240"/>
+      </w:pPr>
+      <w:r>
+        <w:rPr>
+          <w:rFonts w:ascii="Arial" w:cs="Arial" w:eastAsia="Arial" w:hAnsi="Arial"/>
+          <w:b/>
+          <w:bCs/>
+          <w:i w:val="false"/>
+          <w:iCs w:val="false"/>
+          <w:color w:val="1F3864"/>
+          <w:sz w:val="28"/>
+          <w:szCs w:val="28"/>
+        </w:rPr>
+        <w:t xml:space="preserve">10.8 Principle</w:t>
       </w:r>
     </w:p>
     <w:p>

</xml_diff>

<commit_message>
Document Production Process: Add Entity Inventory update step to Phase 4
When Cross-Domain Services own entities not already in the Entity
Inventory, the inventory must be updated and Entity PRDs produced
before service process definition begins. Covers both the case where
services are identified after Phase 2 and where service process
definition reveals unanticipated entities.
</commit_message>
<xml_diff>
--- a/PRDs/process/CRM-Builder-Document-Production-Process.docx
+++ b/PRDs/process/CRM-Builder-Document-Production-Process.docx
@@ -4162,6 +4162,19 @@
           <w:szCs w:val="22"/>
         </w:rPr>
         <w:t xml:space="preserve"> — after all process conversations for a service are complete, Claude synthesizes them into a reconciled Service PRD following the same structure as a Domain PRD</w:t>
+      </w:r>
+    </w:p>
+    <w:p>
+      <w:pPr>
+        <w:spacing w:after="120"/>
+      </w:pPr>
+      <w:r>
+        <w:rPr>
+          <w:rFonts w:ascii="Arial" w:cs="Arial" w:eastAsia="Arial" w:hAnsi="Arial"/>
+          <w:sz w:val="22"/>
+          <w:szCs w:val="22"/>
+        </w:rPr>
+        <w:t xml:space="preserve">If a service owns entities not already captured in the Entity Inventory, the Entity Inventory must be updated and Entity PRDs produced for the new entities before service process definition begins. This applies both when services are identified after Phase 2 has been completed and when service process definition reveals entities not anticipated during the original Entity Discovery. The scope change protocol (Section 10) governs discovery of new entities during service process conversations.</w:t>
       </w:r>
     </w:p>
     <w:p>

</xml_diff>

<commit_message>
Add Native/Custom preliminary assessment principle to process doc and entity guide
Process Document (v1.7):
- Added paragraph in Phase 2 Step 1 (Entity Discovery) stating that
  Native/Custom and Entity Type in the Entity Inventory are preliminary
  assessments only; the Entity PRD is authoritative.

Entity Definition Guide (v1.2):
- Added Critical Rule: Native/Custom is determined in the Entity PRD,
  not the Entity Inventory.
- Added note in Step 2 (Propose Entity Mapping) that mappings are
  preliminary until the Entity PRD conversation.
</commit_message>
<xml_diff>
--- a/PRDs/process/CRM-Builder-Document-Production-Process.docx
+++ b/PRDs/process/CRM-Builder-Document-Production-Process.docx
@@ -251,7 +251,7 @@
                 <w:sz w:val="20"/>
                 <w:szCs w:val="20"/>
               </w:rPr>
-              <w:t xml:space="preserve">04-04-26 20:00</w:t>
+              <w:t xml:space="preserve">04-04-26 21:30</w:t>
             </w:r>
           </w:p>
         </w:tc>
@@ -316,7 +316,7 @@
                 <w:sz w:val="20"/>
                 <w:szCs w:val="20"/>
               </w:rPr>
-              <w:t xml:space="preserve">v1.6</w:t>
+              <w:t xml:space="preserve">v1.7</w:t>
             </w:r>
           </w:p>
         </w:tc>
@@ -2991,6 +2991,23 @@
     </w:p>
     <w:p>
       <w:pPr>
+        <w:spacing w:after="120"/>
+      </w:pPr>
+      <w:r>
+        <w:rPr>
+          <w:rFonts w:ascii="Arial" w:cs="Arial" w:eastAsia="Arial" w:hAnsi="Arial"/>
+          <w:b w:val="false"/>
+          <w:bCs w:val="false"/>
+          <w:i w:val="false"/>
+          <w:iCs w:val="false"/>
+          <w:sz w:val="22"/>
+          <w:szCs w:val="22"/>
+        </w:rPr>
+        <w:t xml:space="preserve">The Entity Inventory may record preliminary Native/Custom and Entity Type assessments when the target platform is known and the mapping is straightforward. However, these assessments are preliminary only. The authoritative determination of whether an entity is native or custom — and its entity type — is established during the Entity PRD conversation (Step 2). Entities added to the inventory before their full requirements are defined should record TBD for Native/Custom and Entity Type.</w:t>
+      </w:r>
+    </w:p>
+    <w:p>
+      <w:pPr>
         <w:pStyle w:val="Heading3"/>
         <w:spacing w:after="120" w:before="240"/>
       </w:pPr>
@@ -14930,7 +14947,7 @@
           <w:sz w:val="22"/>
           <w:szCs w:val="22"/>
         </w:rPr>
-        <w:t xml:space="preserve">This document defines the governing process for all CRM Builder document production. It replaces v1.5.</w:t>
+        <w:t xml:space="preserve">This document defines the governing process for all CRM Builder document production. It replaces v1.6.</w:t>
       </w:r>
     </w:p>
     <w:sectPr>

</xml_diff>

<commit_message>
WIP: Document Production Process v2.0 — Step 1 Purpose paragraph + continuation prompt
Step 1 of the v2.0 rewrite is applied: Section 1 Purpose now contains
the mission-anchored paragraph defining the methodology as
mission-anchored (not technology-anchored) and pointing forward to
Rule 2.1 in Phase 2. Header still reads v1.7; full version bump happens
at the end of the v2.0 execution plan.

Steps 2-10 are captured in the new continuation prompt:
PRDs/process/SESSION-PROMPT-doc-production-process-v2.0-continuation-part2.md

Design decisions D1-D9 from the original continuation prompt remain
locked and are not reopened in the follow-up session.
</commit_message>
<xml_diff>
--- a/PRDs/process/CRM-Builder-Document-Production-Process.docx
+++ b/PRDs/process/CRM-Builder-Document-Production-Process.docx
@@ -390,6 +390,23 @@
           <w:szCs w:val="22"/>
         </w:rPr>
         <w:t xml:space="preserve">This document governs all CRM implementations using CRM Builder. Implementation-specific details (domains, personas, process lists) are captured in the implementation documents themselves, not here.</w:t>
+      </w:r>
+    </w:p>
+    <w:p>
+      <w:pPr>
+        <w:spacing w:after="120"/>
+      </w:pPr>
+      <w:r>
+        <w:rPr>
+          <w:rFonts w:ascii="Arial" w:cs="Arial" w:eastAsia="Arial" w:hAnsi="Arial"/>
+          <w:b w:val="false"/>
+          <w:bCs w:val="false"/>
+          <w:i w:val="false"/>
+          <w:iCs w:val="false"/>
+          <w:sz w:val="22"/>
+          <w:szCs w:val="22"/>
+        </w:rPr>
+        <w:t xml:space="preserve">The methodology is mission-anchored, not technology-anchored. Requirements belong to the business, are captured in business terms, and are expressed independently of any specific CRM product. A domain is one of the big questions the mission forces the organization to answer — not a department, not a screen, not a feature of a product. The full definition and the validation test appear in Phase 2 as Rule 2.1.</w:t>
       </w:r>
     </w:p>
     <w:p>

</xml_diff>

<commit_message>
WIP: Document Production Process v2.0 — Step 3c.1 (new 3.2 Domain Discovery)
</commit_message>
<xml_diff>
--- a/PRDs/process/CRM-Builder-Document-Production-Process.docx
+++ b/PRDs/process/CRM-Builder-Document-Production-Process.docx
@@ -2713,6 +2713,579 @@
           <w:szCs w:val="22"/>
         </w:rPr>
         <w:t xml:space="preserve">System Scope — in scope, out of scope, key integrations described generically by function</w:t>
+      </w:r>
+    </w:p>
+    <w:p>
+      <w:pPr>
+        <w:pStyle w:val="Heading2"/>
+      </w:pPr>
+      <w:r>
+        <w:t xml:space="preserve">3.2 Phase 2: Domain Discovery</w:t>
+      </w:r>
+    </w:p>
+    <w:p>
+      <w:pPr>
+        <w:pStyle w:val="BodyText"/>
+      </w:pPr>
+      <w:r>
+        <w:rPr>
+          <w:b/>
+          <w:bCs/>
+        </w:rPr>
+        <w:t xml:space="preserve">Purpose.</w:t>
+      </w:r>
+      <w:r>
+        <w:t xml:space="preserve"> Domain Discovery is the first client-facing implementation phase. Working from the Master PRD's mission statement and scope, the implementer and the client jointly identify the organization's domains, capture candidate entities, and capture candidate personas — all in the same set of conversations. Doing these three things together is deliberate: domains, entities, and personas surface in the client's own language at the same time, and separating them into distinct phases creates artificial boundaries that lose context.</w:t>
+      </w:r>
+    </w:p>
+    <w:p>
+      <w:pPr>
+        <w:pStyle w:val="BodyText"/>
+      </w:pPr>
+      <w:r>
+        <w:rPr>
+          <w:b/>
+          <w:bCs/>
+        </w:rPr>
+        <w:t xml:space="preserve">Activity.</w:t>
+      </w:r>
+      <w:r>
+        <w:t xml:space="preserve"> The implementer interviews stakeholders using the Domain Discovery interview guide. As stakeholders describe what the organization does, the implementer listens for three things simultaneously: areas of mission-critical work (candidate domains), nouns the organization tracks (candidate entities), and roles the organization recognizes (candidate personas). Candidates are captured verbatim from the client's language — reconciliation, deduplication, and ID assignment happen in Phase 3, not here.</w:t>
+      </w:r>
+    </w:p>
+    <w:p>
+      <w:pPr>
+        <w:pStyle w:val="BodyText"/>
+      </w:pPr>
+      <w:r>
+        <w:rPr>
+          <w:b/>
+          <w:bCs/>
+        </w:rPr>
+        <w:t xml:space="preserve">Output.</w:t>
+      </w:r>
+      <w:r>
+        <w:t xml:space="preserve"> A single Word document, PRDs/Domain-Discovery-Report.docx, containing three sections: a Domain List with proposed domains, one-paragraph descriptions, and the mission tie-in for each; a Candidate Entity Inventory of nouns captured during discovery with source attribution and disambiguation notes; and a Candidate Persona Inventory of roles captured during discovery with source attribution and provisional backing notes. This document is a working artifact, not a durable inventory. It feeds Phase 3, where its contents are reconciled with the client and the durable Entity-Inventory.docx and Persona-Inventory.docx are produced.</w:t>
+      </w:r>
+    </w:p>
+    <w:p>
+      <w:pPr>
+        <w:pStyle w:val="BodyText"/>
+        <w:ind w:left="360"/>
+      </w:pPr>
+      <w:r>
+        <w:rPr>
+          <w:b/>
+          <w:bCs/>
+        </w:rPr>
+        <w:t xml:space="preserve">Rule 2.1 — Domain Validation Test. </w:t>
+      </w:r>
+      <w:r>
+        <w:t xml:space="preserve">If this area of work stopped tomorrow, would the mission be in trouble? If yes → domain. If no → probably a process or a cross-domain service.</w:t>
+      </w:r>
+    </w:p>
+    <w:p>
+      <w:pPr>
+        <w:pStyle w:val="BodyText"/>
+        <w:ind w:left="360"/>
+      </w:pPr>
+      <w:r>
+        <w:rPr>
+          <w:b/>
+          <w:bCs/>
+        </w:rPr>
+        <w:t xml:space="preserve">Rule 2.2 — Persona Backing Rule. </w:t>
+      </w:r>
+      <w:r>
+        <w:t xml:space="preserve">Every persona is either backed by an entity record in the system, or declared External (an outside role not tracked as data).</w:t>
+      </w:r>
+    </w:p>
+    <w:p>
+      <w:pPr>
+        <w:pStyle w:val="BodyText"/>
+      </w:pPr>
+      <w:r>
+        <w:rPr>
+          <w:b/>
+          <w:bCs/>
+        </w:rPr>
+        <w:t xml:space="preserve">Persona Inventory schema.</w:t>
+      </w:r>
+      <w:r>
+        <w:t xml:space="preserve"> Both the candidate inventory captured here and the durable inventory produced in Phase 3 use the following schema:</w:t>
+      </w:r>
+    </w:p>
+    <w:tbl>
+      <w:tblPr>
+        <w:tblW w:w="5000" w:type="pct"/>
+        <w:tblBorders>
+          <w:top w:val="single" w:sz="4" w:color="AAAAAA"/>
+          <w:left w:val="single" w:sz="4" w:color="AAAAAA"/>
+          <w:bottom w:val="single" w:sz="4" w:color="AAAAAA"/>
+          <w:right w:val="single" w:sz="4" w:color="AAAAAA"/>
+          <w:insideH w:val="single" w:sz="4" w:color="AAAAAA"/>
+          <w:insideV w:val="single" w:sz="4" w:color="AAAAAA"/>
+        </w:tblBorders>
+      </w:tblPr>
+      <w:tblGrid>
+        <w:gridCol w:w="2200"/>
+        <w:gridCol w:w="1200"/>
+        <w:gridCol w:w="5960"/>
+      </w:tblGrid>
+      <w:tr>
+        <w:tc>
+          <w:tcPr>
+            <w:tcW w:w="0" w:type="auto"/>
+            <w:tcBorders>
+              <w:top w:val="single" w:sz="4" w:color="AAAAAA"/>
+              <w:left w:val="single" w:sz="4" w:color="AAAAAA"/>
+              <w:bottom w:val="single" w:sz="4" w:color="AAAAAA"/>
+              <w:right w:val="single" w:sz="4" w:color="AAAAAA"/>
+            </w:tcBorders>
+            <w:shd w:val="clear" w:color="auto" w:fill="1F3864"/>
+          </w:tcPr>
+          <w:p>
+            <w:pPr>
+              <w:pStyle w:val="BodyText"/>
+            </w:pPr>
+            <w:r>
+              <w:rPr>
+                <w:b/>
+                <w:bCs/>
+                <w:color w:val="FFFFFF"/>
+              </w:rPr>
+              <w:t xml:space="preserve">Field</w:t>
+            </w:r>
+          </w:p>
+        </w:tc>
+        <w:tc>
+          <w:tcPr>
+            <w:tcW w:w="0" w:type="auto"/>
+            <w:tcBorders>
+              <w:top w:val="single" w:sz="4" w:color="AAAAAA"/>
+              <w:left w:val="single" w:sz="4" w:color="AAAAAA"/>
+              <w:bottom w:val="single" w:sz="4" w:color="AAAAAA"/>
+              <w:right w:val="single" w:sz="4" w:color="AAAAAA"/>
+            </w:tcBorders>
+            <w:shd w:val="clear" w:color="auto" w:fill="1F3864"/>
+          </w:tcPr>
+          <w:p>
+            <w:pPr>
+              <w:pStyle w:val="BodyText"/>
+            </w:pPr>
+            <w:r>
+              <w:rPr>
+                <w:b/>
+                <w:bCs/>
+                <w:color w:val="FFFFFF"/>
+              </w:rPr>
+              <w:t xml:space="preserve">Required</w:t>
+            </w:r>
+          </w:p>
+        </w:tc>
+        <w:tc>
+          <w:tcPr>
+            <w:tcW w:w="0" w:type="auto"/>
+            <w:tcBorders>
+              <w:top w:val="single" w:sz="4" w:color="AAAAAA"/>
+              <w:left w:val="single" w:sz="4" w:color="AAAAAA"/>
+              <w:bottom w:val="single" w:sz="4" w:color="AAAAAA"/>
+              <w:right w:val="single" w:sz="4" w:color="AAAAAA"/>
+            </w:tcBorders>
+            <w:shd w:val="clear" w:color="auto" w:fill="1F3864"/>
+          </w:tcPr>
+          <w:p>
+            <w:pPr>
+              <w:pStyle w:val="BodyText"/>
+            </w:pPr>
+            <w:r>
+              <w:rPr>
+                <w:b/>
+                <w:bCs/>
+                <w:color w:val="FFFFFF"/>
+              </w:rPr>
+              <w:t xml:space="preserve">Notes</w:t>
+            </w:r>
+          </w:p>
+        </w:tc>
+      </w:tr>
+      <w:tr>
+        <w:tc>
+          <w:tcPr>
+            <w:tcW w:w="0" w:type="auto"/>
+            <w:tcBorders>
+              <w:top w:val="single" w:sz="4" w:color="AAAAAA"/>
+              <w:left w:val="single" w:sz="4" w:color="AAAAAA"/>
+              <w:bottom w:val="single" w:sz="4" w:color="AAAAAA"/>
+              <w:right w:val="single" w:sz="4" w:color="AAAAAA"/>
+            </w:tcBorders>
+            <w:shd w:val="clear" w:color="auto" w:fill="F2F7FB"/>
+          </w:tcPr>
+          <w:p>
+            <w:pPr>
+              <w:pStyle w:val="BodyText"/>
+            </w:pPr>
+            <w:r>
+              <w:t xml:space="preserve">Persona Name</w:t>
+            </w:r>
+          </w:p>
+        </w:tc>
+        <w:tc>
+          <w:tcPr>
+            <w:tcW w:w="0" w:type="auto"/>
+            <w:tcBorders>
+              <w:top w:val="single" w:sz="4" w:color="AAAAAA"/>
+              <w:left w:val="single" w:sz="4" w:color="AAAAAA"/>
+              <w:bottom w:val="single" w:sz="4" w:color="AAAAAA"/>
+              <w:right w:val="single" w:sz="4" w:color="AAAAAA"/>
+            </w:tcBorders>
+            <w:shd w:val="clear" w:color="auto" w:fill="F2F7FB"/>
+          </w:tcPr>
+          <w:p>
+            <w:pPr>
+              <w:pStyle w:val="BodyText"/>
+            </w:pPr>
+            <w:r>
+              <w:t xml:space="preserve">Yes</w:t>
+            </w:r>
+          </w:p>
+        </w:tc>
+        <w:tc>
+          <w:tcPr>
+            <w:tcW w:w="0" w:type="auto"/>
+            <w:tcBorders>
+              <w:top w:val="single" w:sz="4" w:color="AAAAAA"/>
+              <w:left w:val="single" w:sz="4" w:color="AAAAAA"/>
+              <w:bottom w:val="single" w:sz="4" w:color="AAAAAA"/>
+              <w:right w:val="single" w:sz="4" w:color="AAAAAA"/>
+            </w:tcBorders>
+            <w:shd w:val="clear" w:color="auto" w:fill="F2F7FB"/>
+          </w:tcPr>
+          <w:p>
+            <w:pPr>
+              <w:pStyle w:val="BodyText"/>
+            </w:pPr>
+            <w:r>
+              <w:t xml:space="preserve">Human-readable name from the client's own language.</w:t>
+            </w:r>
+          </w:p>
+        </w:tc>
+      </w:tr>
+      <w:tr>
+        <w:tc>
+          <w:tcPr>
+            <w:tcW w:w="0" w:type="auto"/>
+            <w:tcBorders>
+              <w:top w:val="single" w:sz="4" w:color="AAAAAA"/>
+              <w:left w:val="single" w:sz="4" w:color="AAAAAA"/>
+              <w:bottom w:val="single" w:sz="4" w:color="AAAAAA"/>
+              <w:right w:val="single" w:sz="4" w:color="AAAAAA"/>
+            </w:tcBorders>
+          </w:tcPr>
+          <w:p>
+            <w:pPr>
+              <w:pStyle w:val="BodyText"/>
+            </w:pPr>
+            <w:r>
+              <w:t xml:space="preserve">Persona ID</w:t>
+            </w:r>
+          </w:p>
+        </w:tc>
+        <w:tc>
+          <w:tcPr>
+            <w:tcW w:w="0" w:type="auto"/>
+            <w:tcBorders>
+              <w:top w:val="single" w:sz="4" w:color="AAAAAA"/>
+              <w:left w:val="single" w:sz="4" w:color="AAAAAA"/>
+              <w:bottom w:val="single" w:sz="4" w:color="AAAAAA"/>
+              <w:right w:val="single" w:sz="4" w:color="AAAAAA"/>
+            </w:tcBorders>
+          </w:tcPr>
+          <w:p>
+            <w:pPr>
+              <w:pStyle w:val="BodyText"/>
+            </w:pPr>
+            <w:r>
+              <w:t xml:space="preserve">Yes</w:t>
+            </w:r>
+          </w:p>
+        </w:tc>
+        <w:tc>
+          <w:tcPr>
+            <w:tcW w:w="0" w:type="auto"/>
+            <w:tcBorders>
+              <w:top w:val="single" w:sz="4" w:color="AAAAAA"/>
+              <w:left w:val="single" w:sz="4" w:color="AAAAAA"/>
+              <w:bottom w:val="single" w:sz="4" w:color="AAAAAA"/>
+              <w:right w:val="single" w:sz="4" w:color="AAAAAA"/>
+            </w:tcBorders>
+          </w:tcPr>
+          <w:p>
+            <w:pPr>
+              <w:pStyle w:val="BodyText"/>
+            </w:pPr>
+            <w:r>
+              <w:t xml:space="preserve">Format PER-NNN. Assigned in Phase 3, implementation-wide scope (not domain-scoped).</w:t>
+            </w:r>
+          </w:p>
+        </w:tc>
+      </w:tr>
+      <w:tr>
+        <w:tc>
+          <w:tcPr>
+            <w:tcW w:w="0" w:type="auto"/>
+            <w:tcBorders>
+              <w:top w:val="single" w:sz="4" w:color="AAAAAA"/>
+              <w:left w:val="single" w:sz="4" w:color="AAAAAA"/>
+              <w:bottom w:val="single" w:sz="4" w:color="AAAAAA"/>
+              <w:right w:val="single" w:sz="4" w:color="AAAAAA"/>
+            </w:tcBorders>
+            <w:shd w:val="clear" w:color="auto" w:fill="F2F7FB"/>
+          </w:tcPr>
+          <w:p>
+            <w:pPr>
+              <w:pStyle w:val="BodyText"/>
+            </w:pPr>
+            <w:r>
+              <w:t xml:space="preserve">Backing</w:t>
+            </w:r>
+          </w:p>
+        </w:tc>
+        <w:tc>
+          <w:tcPr>
+            <w:tcW w:w="0" w:type="auto"/>
+            <w:tcBorders>
+              <w:top w:val="single" w:sz="4" w:color="AAAAAA"/>
+              <w:left w:val="single" w:sz="4" w:color="AAAAAA"/>
+              <w:bottom w:val="single" w:sz="4" w:color="AAAAAA"/>
+              <w:right w:val="single" w:sz="4" w:color="AAAAAA"/>
+            </w:tcBorders>
+            <w:shd w:val="clear" w:color="auto" w:fill="F2F7FB"/>
+          </w:tcPr>
+          <w:p>
+            <w:pPr>
+              <w:pStyle w:val="BodyText"/>
+            </w:pPr>
+            <w:r>
+              <w:t xml:space="preserve">Yes</w:t>
+            </w:r>
+          </w:p>
+        </w:tc>
+        <w:tc>
+          <w:tcPr>
+            <w:tcW w:w="0" w:type="auto"/>
+            <w:tcBorders>
+              <w:top w:val="single" w:sz="4" w:color="AAAAAA"/>
+              <w:left w:val="single" w:sz="4" w:color="AAAAAA"/>
+              <w:bottom w:val="single" w:sz="4" w:color="AAAAAA"/>
+              <w:right w:val="single" w:sz="4" w:color="AAAAAA"/>
+            </w:tcBorders>
+            <w:shd w:val="clear" w:color="auto" w:fill="F2F7FB"/>
+          </w:tcPr>
+          <w:p>
+            <w:pPr>
+              <w:pStyle w:val="BodyText"/>
+            </w:pPr>
+            <w:r>
+              <w:t xml:space="preserve">Entity reference (e.g., Contact / contactType=mentor) or External for roles not tracked as data.</w:t>
+            </w:r>
+          </w:p>
+        </w:tc>
+      </w:tr>
+      <w:tr>
+        <w:tc>
+          <w:tcPr>
+            <w:tcW w:w="0" w:type="auto"/>
+            <w:tcBorders>
+              <w:top w:val="single" w:sz="4" w:color="AAAAAA"/>
+              <w:left w:val="single" w:sz="4" w:color="AAAAAA"/>
+              <w:bottom w:val="single" w:sz="4" w:color="AAAAAA"/>
+              <w:right w:val="single" w:sz="4" w:color="AAAAAA"/>
+            </w:tcBorders>
+          </w:tcPr>
+          <w:p>
+            <w:pPr>
+              <w:pStyle w:val="BodyText"/>
+            </w:pPr>
+            <w:r>
+              <w:t xml:space="preserve">Description</w:t>
+            </w:r>
+          </w:p>
+        </w:tc>
+        <w:tc>
+          <w:tcPr>
+            <w:tcW w:w="0" w:type="auto"/>
+            <w:tcBorders>
+              <w:top w:val="single" w:sz="4" w:color="AAAAAA"/>
+              <w:left w:val="single" w:sz="4" w:color="AAAAAA"/>
+              <w:bottom w:val="single" w:sz="4" w:color="AAAAAA"/>
+              <w:right w:val="single" w:sz="4" w:color="AAAAAA"/>
+            </w:tcBorders>
+          </w:tcPr>
+          <w:p>
+            <w:pPr>
+              <w:pStyle w:val="BodyText"/>
+            </w:pPr>
+            <w:r>
+              <w:t xml:space="preserve">Yes</w:t>
+            </w:r>
+          </w:p>
+        </w:tc>
+        <w:tc>
+          <w:tcPr>
+            <w:tcW w:w="0" w:type="auto"/>
+            <w:tcBorders>
+              <w:top w:val="single" w:sz="4" w:color="AAAAAA"/>
+              <w:left w:val="single" w:sz="4" w:color="AAAAAA"/>
+              <w:bottom w:val="single" w:sz="4" w:color="AAAAAA"/>
+              <w:right w:val="single" w:sz="4" w:color="AAAAAA"/>
+            </w:tcBorders>
+          </w:tcPr>
+          <w:p>
+            <w:pPr>
+              <w:pStyle w:val="BodyText"/>
+            </w:pPr>
+            <w:r>
+              <w:t xml:space="preserve">One to three sentences describing the role and its relationship to the mission.</w:t>
+            </w:r>
+          </w:p>
+        </w:tc>
+      </w:tr>
+      <w:tr>
+        <w:tc>
+          <w:tcPr>
+            <w:tcW w:w="0" w:type="auto"/>
+            <w:tcBorders>
+              <w:top w:val="single" w:sz="4" w:color="AAAAAA"/>
+              <w:left w:val="single" w:sz="4" w:color="AAAAAA"/>
+              <w:bottom w:val="single" w:sz="4" w:color="AAAAAA"/>
+              <w:right w:val="single" w:sz="4" w:color="AAAAAA"/>
+            </w:tcBorders>
+            <w:shd w:val="clear" w:color="auto" w:fill="F2F7FB"/>
+          </w:tcPr>
+          <w:p>
+            <w:pPr>
+              <w:pStyle w:val="BodyText"/>
+            </w:pPr>
+            <w:r>
+              <w:t xml:space="preserve">Source</w:t>
+            </w:r>
+          </w:p>
+        </w:tc>
+        <w:tc>
+          <w:tcPr>
+            <w:tcW w:w="0" w:type="auto"/>
+            <w:tcBorders>
+              <w:top w:val="single" w:sz="4" w:color="AAAAAA"/>
+              <w:left w:val="single" w:sz="4" w:color="AAAAAA"/>
+              <w:bottom w:val="single" w:sz="4" w:color="AAAAAA"/>
+              <w:right w:val="single" w:sz="4" w:color="AAAAAA"/>
+            </w:tcBorders>
+            <w:shd w:val="clear" w:color="auto" w:fill="F2F7FB"/>
+          </w:tcPr>
+          <w:p>
+            <w:pPr>
+              <w:pStyle w:val="BodyText"/>
+            </w:pPr>
+            <w:r>
+              <w:t xml:space="preserve">Yes</w:t>
+            </w:r>
+          </w:p>
+        </w:tc>
+        <w:tc>
+          <w:tcPr>
+            <w:tcW w:w="0" w:type="auto"/>
+            <w:tcBorders>
+              <w:top w:val="single" w:sz="4" w:color="AAAAAA"/>
+              <w:left w:val="single" w:sz="4" w:color="AAAAAA"/>
+              <w:bottom w:val="single" w:sz="4" w:color="AAAAAA"/>
+              <w:right w:val="single" w:sz="4" w:color="AAAAAA"/>
+            </w:tcBorders>
+            <w:shd w:val="clear" w:color="auto" w:fill="F2F7FB"/>
+          </w:tcPr>
+          <w:p>
+            <w:pPr>
+              <w:pStyle w:val="BodyText"/>
+            </w:pPr>
+            <w:r>
+              <w:t xml:space="preserve">Stakeholder name, document, or interview where the persona was first identified.</w:t>
+            </w:r>
+          </w:p>
+        </w:tc>
+      </w:tr>
+      <w:tr>
+        <w:tc>
+          <w:tcPr>
+            <w:tcW w:w="0" w:type="auto"/>
+            <w:tcBorders>
+              <w:top w:val="single" w:sz="4" w:color="AAAAAA"/>
+              <w:left w:val="single" w:sz="4" w:color="AAAAAA"/>
+              <w:bottom w:val="single" w:sz="4" w:color="AAAAAA"/>
+              <w:right w:val="single" w:sz="4" w:color="AAAAAA"/>
+            </w:tcBorders>
+          </w:tcPr>
+          <w:p>
+            <w:pPr>
+              <w:pStyle w:val="BodyText"/>
+            </w:pPr>
+            <w:r>
+              <w:t xml:space="preserve">Notes</w:t>
+            </w:r>
+          </w:p>
+        </w:tc>
+        <w:tc>
+          <w:tcPr>
+            <w:tcW w:w="0" w:type="auto"/>
+            <w:tcBorders>
+              <w:top w:val="single" w:sz="4" w:color="AAAAAA"/>
+              <w:left w:val="single" w:sz="4" w:color="AAAAAA"/>
+              <w:bottom w:val="single" w:sz="4" w:color="AAAAAA"/>
+              <w:right w:val="single" w:sz="4" w:color="AAAAAA"/>
+            </w:tcBorders>
+          </w:tcPr>
+          <w:p>
+            <w:pPr>
+              <w:pStyle w:val="BodyText"/>
+            </w:pPr>
+            <w:r>
+              <w:t xml:space="preserve">No</w:t>
+            </w:r>
+          </w:p>
+        </w:tc>
+        <w:tc>
+          <w:tcPr>
+            <w:tcW w:w="0" w:type="auto"/>
+            <w:tcBorders>
+              <w:top w:val="single" w:sz="4" w:color="AAAAAA"/>
+              <w:left w:val="single" w:sz="4" w:color="AAAAAA"/>
+              <w:bottom w:val="single" w:sz="4" w:color="AAAAAA"/>
+              <w:right w:val="single" w:sz="4" w:color="AAAAAA"/>
+            </w:tcBorders>
+          </w:tcPr>
+          <w:p>
+            <w:pPr>
+              <w:pStyle w:val="BodyText"/>
+            </w:pPr>
+            <w:r>
+              <w:t xml:space="preserve">Disambiguation, aliases, merge history.</w:t>
+            </w:r>
+          </w:p>
+        </w:tc>
+      </w:tr>
+    </w:tbl>
+    <w:p>
+      <w:pPr>
+        <w:pStyle w:val="BodyText"/>
+      </w:pPr>
+      <w:r>
+        <w:rPr>
+          <w:b/>
+          <w:bCs/>
+        </w:rPr>
+        <w:t xml:space="preserve">Conversation count.</w:t>
+      </w:r>
+      <w:r>
+        <w:t xml:space="preserve"> Typically 1–3 stakeholder conversations depending on organization size. The phase ends when no new domains, entities, or personas are surfacing in additional interviews.</w:t>
       </w:r>
     </w:p>
     <w:p>

</xml_diff>

<commit_message>
WIP: Document Production Process v2.0 — Step 3c.2 (new 3.3 Inventory Reconciliation)
</commit_message>
<xml_diff>
--- a/PRDs/process/CRM-Builder-Document-Production-Process.docx
+++ b/PRDs/process/CRM-Builder-Document-Production-Process.docx
@@ -3286,6 +3286,113 @@
       </w:r>
       <w:r>
         <w:t xml:space="preserve"> Typically 1–3 stakeholder conversations depending on organization size. The phase ends when no new domains, entities, or personas are surfacing in additional interviews.</w:t>
+      </w:r>
+    </w:p>
+    <w:p>
+      <w:pPr>
+        <w:pStyle w:val="Heading2"/>
+      </w:pPr>
+      <w:r>
+        <w:t xml:space="preserve">3.3 Phase 3: Inventory Reconciliation</w:t>
+      </w:r>
+    </w:p>
+    <w:p>
+      <w:pPr>
+        <w:pStyle w:val="BodyText"/>
+      </w:pPr>
+      <w:r>
+        <w:rPr>
+          <w:b/>
+          <w:bCs/>
+        </w:rPr>
+        <w:t xml:space="preserve">Purpose.</w:t>
+      </w:r>
+      <w:r>
+        <w:t xml:space="preserve"> Inventory Reconciliation converts the working artifacts from Phase 2 — the candidate domain list, candidate entity inventory, and candidate persona inventory — into durable, agreed-upon inventories that the rest of the implementation depends on. Reconciliation is where deduplication happens, where the client and implementer agree on canonical names, where IDs are assigned, and where every persona is explicitly tied to either an entity record or an External declaration.</w:t>
+      </w:r>
+    </w:p>
+    <w:p>
+      <w:pPr>
+        <w:pStyle w:val="BodyText"/>
+      </w:pPr>
+      <w:r>
+        <w:rPr>
+          <w:b/>
+          <w:bCs/>
+        </w:rPr>
+        <w:t xml:space="preserve">Activity.</w:t>
+      </w:r>
+      <w:r>
+        <w:t xml:space="preserve"> A client-facing reconciliation session walks through each candidate item from the Domain Discovery Report. For each candidate domain, the client confirms whether it survives, merges with another, or is reclassified as a process or cross-domain service. For each candidate entity, the client confirms the canonical name, resolves duplicates and aliases, and approves the entity for the Entity Inventory. For each candidate persona, the client confirms the name, approves the backing (entity reference or External), and the implementer assigns the PER-NNN ID.</w:t>
+      </w:r>
+    </w:p>
+    <w:p>
+      <w:pPr>
+        <w:pStyle w:val="BodyText"/>
+        <w:ind w:left="360"/>
+      </w:pPr>
+      <w:r>
+        <w:t xml:space="preserve">Inventory Reconciliation is normally a single client-facing session covering both inventories, because personas are defined in terms of entities. Split into two sessions only if (a) the candidate inventories together exceed roughly 40 items, or (b) stakeholder availability forces it.</w:t>
+      </w:r>
+    </w:p>
+    <w:p>
+      <w:pPr>
+        <w:pStyle w:val="BodyText"/>
+      </w:pPr>
+      <w:r>
+        <w:rPr>
+          <w:b/>
+          <w:bCs/>
+        </w:rPr>
+        <w:t xml:space="preserve">Outputs.</w:t>
+      </w:r>
+      <w:r>
+        <w:t xml:space="preserve"> Three artifacts result from this phase: </w:t>
+      </w:r>
+      <w:r>
+        <w:rPr>
+          <w:b/>
+          <w:bCs/>
+        </w:rPr>
+        <w:t xml:space="preserve">PRDs/Entity-Inventory.docx</w:t>
+      </w:r>
+      <w:r>
+        <w:t xml:space="preserve">, the durable root-level Entity Inventory with one row per entity (canonical name, one-sentence description, source domain(s), notes); this is the source of truth for entity references in all subsequent process documents. </w:t>
+      </w:r>
+      <w:r>
+        <w:rPr>
+          <w:b/>
+          <w:bCs/>
+        </w:rPr>
+        <w:t xml:space="preserve">PRDs/Persona-Inventory.docx</w:t>
+      </w:r>
+      <w:r>
+        <w:t xml:space="preserve">, the durable root-level Persona Inventory using the schema defined in Phase 2 (Persona Name, Persona ID, Backing, Description, Source, Notes); IDs are assigned in this phase. </w:t>
+      </w:r>
+      <w:r>
+        <w:rPr>
+          <w:b/>
+          <w:bCs/>
+        </w:rPr>
+        <w:t xml:space="preserve">Updated Master PRD</w:t>
+      </w:r>
+      <w:r>
+        <w:t xml:space="preserve">, in which the finalized domain list is folded back into the Master PRD in place, replacing the candidate list.</w:t>
+      </w:r>
+    </w:p>
+    <w:p>
+      <w:pPr>
+        <w:pStyle w:val="BodyText"/>
+      </w:pPr>
+      <w:r>
+        <w:rPr>
+          <w:b/>
+          <w:bCs/>
+        </w:rPr>
+        <w:t xml:space="preserve">Conversation count.</w:t>
+      </w:r>
+      <w:r>
+        <w:t xml:space="preserve"> Typically 1 session (combined entity + persona reconciliation). 2 sessions only if the threshold or scheduling exceptions in the rule above apply.</w:t>
       </w:r>
     </w:p>
     <w:p>

</xml_diff>

<commit_message>
WIP: Document Production Process v2.0 — Step 3c.3 (new 3.4 Domain Overview + Process Definition)
</commit_message>
<xml_diff>
--- a/PRDs/process/CRM-Builder-Document-Production-Process.docx
+++ b/PRDs/process/CRM-Builder-Document-Production-Process.docx
@@ -3393,6 +3393,1497 @@
       </w:r>
       <w:r>
         <w:t xml:space="preserve"> Typically 1 session (combined entity + persona reconciliation). 2 sessions only if the threshold or scheduling exceptions in the rule above apply.</w:t>
+      </w:r>
+    </w:p>
+    <w:p>
+      <w:pPr>
+        <w:pStyle w:val="Heading2"/>
+      </w:pPr>
+      <w:r>
+        <w:t xml:space="preserve">3.4 Phase 4: Domain Overview + Process Definition</w:t>
+      </w:r>
+    </w:p>
+    <w:p>
+      <w:pPr>
+        <w:pStyle w:val="BodyText"/>
+      </w:pPr>
+      <w:r>
+        <w:t xml:space="preserve">Phase 4 is a single phase containing two activities that, in practice, interleave: producing the Domain Overview document for each domain, and producing the Process Definition document for each process within that domain. They are grouped into one phase because they share the same client conversations and the same interview cadence — the implementer typically works through one domain at a time, drafting its overview and its processes together before moving to the next domain. The two activities are described separately below for clarity, but in execution they are not strictly sequential.</w:t>
+      </w:r>
+    </w:p>
+    <w:p>
+      <w:pPr>
+        <w:pStyle w:val="BodyText"/>
+      </w:pPr>
+      <w:r>
+        <w:t xml:space="preserve">The inputs to Phase 4 are the Master PRD, the reconciled Entity Inventory and Persona Inventory from Phase 3, and the Domain Discovery Report's notes on each domain. The outputs are one Domain Overview document per domain and one Process Definition document per process, all stored under PRDs/{domain_code}/.</w:t>
+      </w:r>
+    </w:p>
+    <w:p>
+      <w:pPr>
+        <w:pStyle w:val="Heading3"/>
+      </w:pPr>
+      <w:r>
+        <w:t xml:space="preserve">Domain Overview Activity</w:t>
+      </w:r>
+    </w:p>
+    <w:p>
+      <w:pPr>
+        <w:spacing w:after="120"/>
+      </w:pPr>
+      <w:r>
+        <w:rPr>
+          <w:rFonts w:ascii="Arial" w:cs="Arial" w:eastAsia="Arial" w:hAnsi="Arial"/>
+          <w:b w:val="false"/>
+          <w:bCs w:val="false"/>
+          <w:i w:val="false"/>
+          <w:iCs w:val="false"/>
+          <w:sz w:val="22"/>
+          <w:szCs w:val="22"/>
+        </w:rPr>
+        <w:t xml:space="preserve">Each domain receives a focused overview conversation before its process definition work begins. Claude assembles content from the Master PRD and completed Entity PRDs into a single domain-scoped reference document. The Domain Overview provides context that all process definition conversations in the domain will use as their primary input, replacing the need to upload the Master PRD, Entity Inventory, and individual Entity PRDs separately into each process session.</w:t>
+      </w:r>
+    </w:p>
+    <w:p>
+      <w:pPr>
+        <w:spacing w:after="120"/>
+      </w:pPr>
+      <w:r>
+        <w:rPr>
+          <w:rFonts w:ascii="Arial" w:cs="Arial" w:eastAsia="Arial" w:hAnsi="Arial"/>
+          <w:b w:val="false"/>
+          <w:bCs w:val="false"/>
+          <w:i w:val="false"/>
+          <w:iCs w:val="false"/>
+          <w:sz w:val="22"/>
+          <w:szCs w:val="22"/>
+        </w:rPr>
+        <w:t xml:space="preserve">The conversation also confirms the process inventory and dependency ordering for the domain, and identifies any gaps or ambiguities in the upstream documents that should be resolved before process work begins.</w:t>
+      </w:r>
+    </w:p>
+    <w:p>
+      <w:pPr>
+        <w:pStyle w:val="Heading3"/>
+        <w:spacing w:after="120" w:before="240"/>
+      </w:pPr>
+      <w:r>
+        <w:rPr>
+          <w:rFonts w:ascii="Arial" w:cs="Arial" w:eastAsia="Arial" w:hAnsi="Arial"/>
+          <w:b/>
+          <w:bCs/>
+          <w:i w:val="false"/>
+          <w:iCs w:val="false"/>
+          <w:sz w:val="24"/>
+          <w:szCs w:val="24"/>
+        </w:rPr>
+        <w:t xml:space="preserve">Domain Overview Context Passing</w:t>
+      </w:r>
+    </w:p>
+    <w:p>
+      <w:pPr>
+        <w:spacing w:after="120"/>
+      </w:pPr>
+      <w:r>
+        <w:rPr>
+          <w:rFonts w:ascii="Arial" w:cs="Arial" w:eastAsia="Arial" w:hAnsi="Arial"/>
+          <w:b w:val="false"/>
+          <w:bCs w:val="false"/>
+          <w:i w:val="false"/>
+          <w:iCs w:val="false"/>
+          <w:sz w:val="22"/>
+          <w:szCs w:val="22"/>
+        </w:rPr>
+        <w:t xml:space="preserve">Each Domain Overview conversation receives the Master PRD, the Entity Inventory, and the Entity PRDs for every entity whose Entity Inventory data lists it as participating in this domain. This gives Claude the complete upstream context needed to assemble the domain-scoped reference.</w:t>
+      </w:r>
+    </w:p>
+    <w:p>
+      <w:pPr>
+        <w:pStyle w:val="Heading3"/>
+        <w:spacing w:after="120" w:before="240"/>
+      </w:pPr>
+      <w:r>
+        <w:rPr>
+          <w:rFonts w:ascii="Arial" w:cs="Arial" w:eastAsia="Arial" w:hAnsi="Arial"/>
+          <w:b/>
+          <w:bCs/>
+          <w:i w:val="false"/>
+          <w:iCs w:val="false"/>
+          <w:sz w:val="24"/>
+          <w:szCs w:val="24"/>
+        </w:rPr>
+        <w:t xml:space="preserve">Domain Overview Document Structure</w:t>
+      </w:r>
+    </w:p>
+    <w:p>
+      <w:pPr>
+        <w:spacing w:after="120"/>
+      </w:pPr>
+      <w:r>
+        <w:rPr>
+          <w:rFonts w:ascii="Arial" w:cs="Arial" w:eastAsia="Arial" w:hAnsi="Arial"/>
+          <w:b w:val="false"/>
+          <w:bCs w:val="false"/>
+          <w:i w:val="false"/>
+          <w:iCs w:val="false"/>
+          <w:sz w:val="22"/>
+          <w:szCs w:val="22"/>
+        </w:rPr>
+        <w:t xml:space="preserve">Every Domain Overview document must contain all four of the following sections:</w:t>
+      </w:r>
+    </w:p>
+    <w:p>
+      <w:pPr>
+        <w:pStyle w:val="ListParagraph"/>
+        <w:numPr>
+          <w:ilvl w:val="0"/>
+          <w:numId w:val="2"/>
+        </w:numPr>
+        <w:spacing w:after="60"/>
+      </w:pPr>
+      <w:r>
+        <w:rPr>
+          <w:rFonts w:ascii="Arial" w:cs="Arial" w:eastAsia="Arial" w:hAnsi="Arial"/>
+          <w:b/>
+          <w:bCs/>
+          <w:i w:val="false"/>
+          <w:iCs w:val="false"/>
+          <w:sz w:val="22"/>
+          <w:szCs w:val="22"/>
+        </w:rPr>
+        <w:t xml:space="preserve">Domain Purpose</w:t>
+      </w:r>
+      <w:r>
+        <w:rPr>
+          <w:rFonts w:ascii="Arial" w:cs="Arial" w:eastAsia="Arial" w:hAnsi="Arial"/>
+          <w:b w:val="false"/>
+          <w:bCs w:val="false"/>
+          <w:i w:val="false"/>
+          <w:iCs w:val="false"/>
+          <w:sz w:val="22"/>
+          <w:szCs w:val="22"/>
+        </w:rPr>
+        <w:t xml:space="preserve"> — expanded business context, drawn from and elaborating on the Master PRD’s domain description.</w:t>
+      </w:r>
+    </w:p>
+    <w:p>
+      <w:pPr>
+        <w:pStyle w:val="ListParagraph"/>
+        <w:numPr>
+          <w:ilvl w:val="0"/>
+          <w:numId w:val="2"/>
+        </w:numPr>
+        <w:spacing w:after="60"/>
+      </w:pPr>
+      <w:r>
+        <w:rPr>
+          <w:rFonts w:ascii="Arial" w:cs="Arial" w:eastAsia="Arial" w:hAnsi="Arial"/>
+          <w:b/>
+          <w:bCs/>
+          <w:i w:val="false"/>
+          <w:iCs w:val="false"/>
+          <w:sz w:val="22"/>
+          <w:szCs w:val="22"/>
+        </w:rPr>
+        <w:t xml:space="preserve">Personas</w:t>
+      </w:r>
+      <w:r>
+        <w:rPr>
+          <w:rFonts w:ascii="Arial" w:cs="Arial" w:eastAsia="Arial" w:hAnsi="Arial"/>
+          <w:b w:val="false"/>
+          <w:bCs w:val="false"/>
+          <w:i w:val="false"/>
+          <w:iCs w:val="false"/>
+          <w:sz w:val="22"/>
+          <w:szCs w:val="22"/>
+        </w:rPr>
+        <w:t xml:space="preserve"> — personas participating in this domain, scoped from the Master PRD’s persona definitions to their domain-specific roles.</w:t>
+      </w:r>
+    </w:p>
+    <w:p>
+      <w:pPr>
+        <w:pStyle w:val="ListParagraph"/>
+        <w:numPr>
+          <w:ilvl w:val="0"/>
+          <w:numId w:val="2"/>
+        </w:numPr>
+        <w:spacing w:after="60"/>
+      </w:pPr>
+      <w:r>
+        <w:rPr>
+          <w:rFonts w:ascii="Arial" w:cs="Arial" w:eastAsia="Arial" w:hAnsi="Arial"/>
+          <w:b/>
+          <w:bCs/>
+          <w:i w:val="false"/>
+          <w:iCs w:val="false"/>
+          <w:sz w:val="22"/>
+          <w:szCs w:val="22"/>
+        </w:rPr>
+        <w:t xml:space="preserve">Business Processes</w:t>
+      </w:r>
+      <w:r>
+        <w:rPr>
+          <w:rFonts w:ascii="Arial" w:cs="Arial" w:eastAsia="Arial" w:hAnsi="Arial"/>
+          <w:b w:val="false"/>
+          <w:bCs w:val="false"/>
+          <w:i w:val="false"/>
+          <w:iCs w:val="false"/>
+          <w:sz w:val="22"/>
+          <w:szCs w:val="22"/>
+        </w:rPr>
+        <w:t xml:space="preserve"> — the complete process inventory for the domain with lifecycle narrative, process relationships, and dependency ordering. Describes how the processes connect end to end.</w:t>
+      </w:r>
+    </w:p>
+    <w:p>
+      <w:pPr>
+        <w:pStyle w:val="ListParagraph"/>
+        <w:numPr>
+          <w:ilvl w:val="0"/>
+          <w:numId w:val="2"/>
+        </w:numPr>
+        <w:spacing w:after="60"/>
+      </w:pPr>
+      <w:r>
+        <w:rPr>
+          <w:rFonts w:ascii="Arial" w:cs="Arial" w:eastAsia="Arial" w:hAnsi="Arial"/>
+          <w:b/>
+          <w:bCs/>
+          <w:i w:val="false"/>
+          <w:iCs w:val="false"/>
+          <w:sz w:val="22"/>
+          <w:szCs w:val="22"/>
+        </w:rPr>
+        <w:t xml:space="preserve">Data Reference</w:t>
+      </w:r>
+      <w:r>
+        <w:rPr>
+          <w:rFonts w:ascii="Arial" w:cs="Arial" w:eastAsia="Arial" w:hAnsi="Arial"/>
+          <w:b w:val="false"/>
+          <w:bCs w:val="false"/>
+          <w:i w:val="false"/>
+          <w:iCs w:val="false"/>
+          <w:sz w:val="22"/>
+          <w:szCs w:val="22"/>
+        </w:rPr>
+        <w:t xml:space="preserve"> — the entities and fields relevant to this domain, assembled by reference to the completed Entity PRDs. Shows which entities the domain uses without redefining them.</w:t>
+      </w:r>
+    </w:p>
+    <w:p>
+      <w:pPr>
+        <w:pStyle w:val="Heading3"/>
+        <w:spacing w:after="120" w:before="240"/>
+      </w:pPr>
+      <w:r>
+        <w:rPr>
+          <w:rFonts w:ascii="Arial" w:cs="Arial" w:eastAsia="Arial" w:hAnsi="Arial"/>
+          <w:b/>
+          <w:bCs/>
+          <w:i w:val="false"/>
+          <w:iCs w:val="false"/>
+          <w:sz w:val="24"/>
+          <w:szCs w:val="24"/>
+        </w:rPr>
+        <w:t xml:space="preserve">Cross-Domain Dependencies</w:t>
+      </w:r>
+    </w:p>
+    <w:p>
+      <w:pPr>
+        <w:spacing w:after="120"/>
+      </w:pPr>
+      <w:r>
+        <w:rPr>
+          <w:rFonts w:ascii="Arial" w:cs="Arial" w:eastAsia="Arial" w:hAnsi="Arial"/>
+          <w:b w:val="false"/>
+          <w:bCs w:val="false"/>
+          <w:i w:val="false"/>
+          <w:iCs w:val="false"/>
+          <w:sz w:val="22"/>
+          <w:szCs w:val="22"/>
+        </w:rPr>
+        <w:t xml:space="preserve">Domains are processed independently by default. If one domain must complete before another begins — for example, if the Mentoring domain must be fully defined before Mentor Recruitment work starts — the administrator sets the later domain’s overview to depend on the earlier domain’s reconciliation. This is an optional constraint applied when the business logic requires it, not a default for all domains.</w:t>
+      </w:r>
+    </w:p>
+    <w:p>
+      <w:pPr>
+        <w:pStyle w:val="Heading3"/>
+        <w:spacing w:after="120" w:before="240"/>
+      </w:pPr>
+      <w:r>
+        <w:rPr>
+          <w:rFonts w:ascii="Arial" w:cs="Arial" w:eastAsia="Arial" w:hAnsi="Arial"/>
+          <w:b/>
+          <w:bCs/>
+          <w:i w:val="false"/>
+          <w:iCs w:val="false"/>
+          <w:sz w:val="24"/>
+          <w:szCs w:val="24"/>
+        </w:rPr>
+        <w:t xml:space="preserve">Completeness Standard</w:t>
+      </w:r>
+    </w:p>
+    <w:p>
+      <w:pPr>
+        <w:spacing w:after="120"/>
+      </w:pPr>
+      <w:r>
+        <w:rPr>
+          <w:rFonts w:ascii="Arial" w:cs="Arial" w:eastAsia="Arial" w:hAnsi="Arial"/>
+          <w:b w:val="false"/>
+          <w:bCs w:val="false"/>
+          <w:i w:val="false"/>
+          <w:iCs w:val="false"/>
+          <w:sz w:val="22"/>
+          <w:szCs w:val="22"/>
+        </w:rPr>
+        <w:t xml:space="preserve">A Domain Overview is not complete until all four sections are present, the process inventory matches the Master PRD (with any additions noted), and the Data Reference correctly identifies every entity that participates in this domain.</w:t>
+      </w:r>
+    </w:p>
+    <w:p>
+      <w:pPr>
+        <w:spacing w:after="120"/>
+      </w:pPr>
+      <w:r>
+        <w:rPr>
+          <w:rFonts w:ascii="Arial" w:cs="Arial" w:eastAsia="Arial" w:hAnsi="Arial"/>
+          <w:b w:val="false"/>
+          <w:bCs w:val="false"/>
+          <w:i w:val="false"/>
+          <w:iCs w:val="false"/>
+          <w:sz w:val="22"/>
+          <w:szCs w:val="22"/>
+        </w:rPr>
+        <w:t xml:space="preserve">For domains with sub-domains, the Domain Overview Activity produces multiple overview documents. The parent domain receives a Domain Overview that covers the domain’s overall purpose, the sub-domain structure and rationale, shared personas, cross-sub-domain relationships, and consolidated oversight and analytics requirements. Each sub-domain then receives its own Sub-Domain Overview following the standard Domain Overview structure — purpose, personas, process inventory with dependency ordering, and data reference. Sub-Domain Overview documents are the primary input for process definition conversations within that sub-domain, replacing the parent Domain Overview for that purpose.</w:t>
+      </w:r>
+    </w:p>
+    <w:p>
+      <w:pPr>
+        <w:spacing w:after="120"/>
+      </w:pPr>
+      <w:r>
+        <w:rPr>
+          <w:rFonts w:ascii="Arial" w:cs="Arial" w:eastAsia="Arial" w:hAnsi="Arial"/>
+          <w:b w:val="false"/>
+          <w:bCs w:val="false"/>
+          <w:i w:val="false"/>
+          <w:iCs w:val="false"/>
+          <w:sz w:val="22"/>
+          <w:szCs w:val="22"/>
+        </w:rPr>
+        <w:t xml:space="preserve">Conversations: 1 per domain. For domains with sub-domains, 1 for the parent domain overview plus 1 per sub-domain overview.</w:t>
+      </w:r>
+    </w:p>
+    <w:p>
+      <w:pPr>
+        <w:spacing w:after="120"/>
+      </w:pPr>
+      <w:r>
+        <w:rPr>
+          <w:rFonts w:ascii="Arial" w:cs="Arial" w:eastAsia="Arial" w:hAnsi="Arial"/>
+          <w:b w:val="false"/>
+          <w:bCs w:val="false"/>
+          <w:i w:val="false"/>
+          <w:iCs w:val="false"/>
+          <w:sz w:val="22"/>
+          <w:szCs w:val="22"/>
+        </w:rPr>
+        <w:t xml:space="preserve">Context passing for sub-domain overviews: the parent Domain Overview plus the Master PRD, Entity Inventory, and Entity PRDs for entities participating in that sub-domain.</w:t>
+      </w:r>
+    </w:p>
+    <w:p>
+      <w:pPr>
+        <w:pStyle w:val="Heading3"/>
+      </w:pPr>
+      <w:r>
+        <w:t xml:space="preserve">Process Definition Activity</w:t>
+      </w:r>
+    </w:p>
+    <w:p>
+      <w:pPr>
+        <w:spacing w:after="120"/>
+      </w:pPr>
+      <w:r>
+        <w:rPr>
+          <w:rFonts w:ascii="Arial" w:cs="Arial" w:eastAsia="Arial" w:hAnsi="Arial"/>
+          <w:b w:val="false"/>
+          <w:bCs w:val="false"/>
+          <w:i w:val="false"/>
+          <w:iCs w:val="false"/>
+          <w:sz w:val="22"/>
+          <w:szCs w:val="22"/>
+        </w:rPr>
+        <w:t xml:space="preserve">Each conversation focuses on a single business process. Claude conducts a focused interview about that process, producing a document with nine required sections. A process document is not complete until all nine sections are present and meet their respective standards.</w:t>
+      </w:r>
+    </w:p>
+    <w:p>
+      <w:pPr>
+        <w:spacing w:after="120"/>
+      </w:pPr>
+      <w:r>
+        <w:rPr>
+          <w:rFonts w:ascii="Arial" w:cs="Arial" w:eastAsia="Arial" w:hAnsi="Arial"/>
+          <w:b w:val="false"/>
+          <w:bCs w:val="false"/>
+          <w:i w:val="false"/>
+          <w:iCs w:val="false"/>
+          <w:sz w:val="22"/>
+          <w:szCs w:val="22"/>
+        </w:rPr>
+        <w:t xml:space="preserve">Process conversations reference entities from the reconciled Entity Inventory produced in Phase 3 (Inventory Reconciliation) and may reference Cross-Domain Services as described in the Master PRD. Full Entity PRDs are produced later in Phase 5. The process document identifies which entities the process uses or affects, and captures process-specific details about how those entities are created, read, or updated during the process. If a process reveals a field or entity not captured in the reconciled Entity Inventory, the discovery is handled per the scope change protocol in Section 10.</w:t>
+      </w:r>
+    </w:p>
+    <w:p>
+      <w:pPr>
+        <w:pStyle w:val="Heading3"/>
+        <w:spacing w:after="120" w:before="240"/>
+      </w:pPr>
+      <w:r>
+        <w:rPr>
+          <w:rFonts w:ascii="Arial" w:cs="Arial" w:eastAsia="Arial" w:hAnsi="Arial"/>
+          <w:b/>
+          <w:bCs/>
+          <w:i w:val="false"/>
+          <w:iCs w:val="false"/>
+          <w:sz w:val="24"/>
+          <w:szCs w:val="24"/>
+        </w:rPr>
+        <w:t xml:space="preserve">Process Order</w:t>
+      </w:r>
+    </w:p>
+    <w:p>
+      <w:pPr>
+        <w:spacing w:after="120"/>
+      </w:pPr>
+      <w:r>
+        <w:rPr>
+          <w:rFonts w:ascii="Arial" w:cs="Arial" w:eastAsia="Arial" w:hAnsi="Arial"/>
+          <w:b w:val="false"/>
+          <w:bCs w:val="false"/>
+          <w:i w:val="false"/>
+          <w:iCs w:val="false"/>
+          <w:sz w:val="22"/>
+          <w:szCs w:val="22"/>
+        </w:rPr>
+        <w:t xml:space="preserve">Within each domain, processes are defined in dependency order. Sequential lifecycle processes come first because they establish the core entities, field values, and status transitions that later processes depend on. Asynchronous processes come second because they read and react to data already defined by the lifecycle processes.</w:t>
+      </w:r>
+    </w:p>
+    <w:p>
+      <w:pPr>
+        <w:spacing w:after="120"/>
+      </w:pPr>
+      <w:r>
+        <w:rPr>
+          <w:rFonts w:ascii="Arial" w:cs="Arial" w:eastAsia="Arial" w:hAnsi="Arial"/>
+          <w:b w:val="false"/>
+          <w:bCs w:val="false"/>
+          <w:i w:val="false"/>
+          <w:iCs w:val="false"/>
+          <w:sz w:val="22"/>
+          <w:szCs w:val="22"/>
+        </w:rPr>
+        <w:t xml:space="preserve">For example, in a Mentoring domain, the natural order might be: Client Intake (creates records), Mentor Matching (updates status), Engagement Management (adds session data), Engagement Closure (defines final states) — then the async processes: Inactivity Monitoring and Client Satisfaction Tracking.</w:t>
+      </w:r>
+    </w:p>
+    <w:p>
+      <w:pPr>
+        <w:spacing w:after="120"/>
+      </w:pPr>
+      <w:r>
+        <w:rPr>
+          <w:rFonts w:ascii="Arial" w:cs="Arial" w:eastAsia="Arial" w:hAnsi="Arial"/>
+          <w:b w:val="false"/>
+          <w:bCs w:val="false"/>
+          <w:i w:val="false"/>
+          <w:iCs w:val="false"/>
+          <w:sz w:val="22"/>
+          <w:szCs w:val="22"/>
+        </w:rPr>
+        <w:t xml:space="preserve">Claude guides the ordering based on what it learned in the Master PRD. Outliers that don’t fit neatly into either category are handled case by case.</w:t>
+      </w:r>
+    </w:p>
+    <w:p>
+      <w:pPr>
+        <w:pStyle w:val="Heading3"/>
+        <w:spacing w:after="120" w:before="240"/>
+      </w:pPr>
+      <w:r>
+        <w:rPr>
+          <w:rFonts w:ascii="Arial" w:cs="Arial" w:eastAsia="Arial" w:hAnsi="Arial"/>
+          <w:b/>
+          <w:bCs/>
+          <w:i w:val="false"/>
+          <w:iCs w:val="false"/>
+          <w:sz w:val="24"/>
+          <w:szCs w:val="24"/>
+        </w:rPr>
+        <w:t xml:space="preserve">Process Definition Context Passing</w:t>
+      </w:r>
+    </w:p>
+    <w:p>
+      <w:pPr>
+        <w:spacing w:after="120"/>
+      </w:pPr>
+      <w:r>
+        <w:rPr>
+          <w:rFonts w:ascii="Arial" w:cs="Arial" w:eastAsia="Arial" w:hAnsi="Arial"/>
+          <w:b w:val="false"/>
+          <w:bCs w:val="false"/>
+          <w:i w:val="false"/>
+          <w:iCs w:val="false"/>
+          <w:sz w:val="22"/>
+          <w:szCs w:val="22"/>
+        </w:rPr>
+        <w:t xml:space="preserve">Each process conversation receives the Domain Overview and all previously completed process documents for that domain as uploaded files. The Domain Overview provides the complete upstream context — personas, process inventory, and entity data reference — in a single document, replacing the need to upload the Master PRD, Entity Inventory, and individual Entity PRDs separately.</w:t>
+      </w:r>
+    </w:p>
+    <w:p>
+      <w:pPr>
+        <w:spacing w:after="120"/>
+      </w:pPr>
+      <w:r>
+        <w:rPr>
+          <w:rFonts w:ascii="Arial" w:cs="Arial" w:eastAsia="Arial" w:hAnsi="Arial"/>
+          <w:b w:val="false"/>
+          <w:bCs w:val="false"/>
+          <w:i w:val="false"/>
+          <w:iCs w:val="false"/>
+          <w:sz w:val="22"/>
+          <w:szCs w:val="22"/>
+        </w:rPr>
+        <w:t xml:space="preserve">For processes within a sub-domain, the primary input is the Sub-Domain Overview plus all previously completed process documents within that sub-domain. The parent Domain Overview is not uploaded into individual process conversations — its content relevant to the sub-domain has already been incorporated into the Sub-Domain Overview.</w:t>
+      </w:r>
+    </w:p>
+    <w:p>
+      <w:pPr>
+        <w:spacing w:after="120"/>
+      </w:pPr>
+      <w:r>
+        <w:rPr>
+          <w:rFonts w:ascii="Arial" w:cs="Arial" w:eastAsia="Arial" w:hAnsi="Arial"/>
+          <w:b w:val="false"/>
+          <w:bCs w:val="false"/>
+          <w:i w:val="false"/>
+          <w:iCs w:val="false"/>
+          <w:sz w:val="22"/>
+          <w:szCs w:val="22"/>
+        </w:rPr>
+        <w:t xml:space="preserve">Within domains that use sub-domains, process ordering is determined within each sub-domain independently. Cross-sub-domain dependencies are identified in the parent Domain Overview but are expected to be rare given that sub-domains are designed to be autonomous.</w:t>
+      </w:r>
+    </w:p>
+    <w:p>
+      <w:pPr>
+        <w:spacing w:after="120"/>
+      </w:pPr>
+      <w:r>
+        <w:rPr>
+          <w:rFonts w:ascii="Arial" w:cs="Arial" w:eastAsia="Arial" w:hAnsi="Arial"/>
+          <w:b w:val="false"/>
+          <w:bCs w:val="false"/>
+          <w:i w:val="false"/>
+          <w:iCs w:val="false"/>
+          <w:sz w:val="22"/>
+          <w:szCs w:val="22"/>
+        </w:rPr>
+        <w:t xml:space="preserve">By the time the last process in a domain is being defined, Claude has the complete field context from all prior processes available in the conversation.</w:t>
+      </w:r>
+    </w:p>
+    <w:p>
+      <w:pPr>
+        <w:pStyle w:val="Heading3"/>
+        <w:spacing w:after="120" w:before="240"/>
+      </w:pPr>
+      <w:r>
+        <w:rPr>
+          <w:rFonts w:ascii="Arial" w:cs="Arial" w:eastAsia="Arial" w:hAnsi="Arial"/>
+          <w:b/>
+          <w:bCs/>
+          <w:i w:val="false"/>
+          <w:iCs w:val="false"/>
+          <w:sz w:val="24"/>
+          <w:szCs w:val="24"/>
+        </w:rPr>
+        <w:t xml:space="preserve">Required Sections</w:t>
+      </w:r>
+    </w:p>
+    <w:p>
+      <w:pPr>
+        <w:spacing w:after="120"/>
+      </w:pPr>
+      <w:r>
+        <w:rPr>
+          <w:rFonts w:ascii="Arial" w:cs="Arial" w:eastAsia="Arial" w:hAnsi="Arial"/>
+          <w:b w:val="false"/>
+          <w:bCs w:val="false"/>
+          <w:i w:val="false"/>
+          <w:iCs w:val="false"/>
+          <w:sz w:val="22"/>
+          <w:szCs w:val="22"/>
+        </w:rPr>
+        <w:t xml:space="preserve">Every process document must contain all nine of the following sections. Sections 7 and 8 must meet the field-level detail standard. If any section is missing or at the summary-bullet level rather than the required detail level, the document is not complete.</w:t>
+      </w:r>
+    </w:p>
+    <w:tbl>
+      <w:tblPr>
+        <w:tblW w:type="dxa" w:w="9360"/>
+        <w:tblBorders>
+          <w:top w:val="single" w:color="auto" w:sz="4"/>
+          <w:left w:val="single" w:color="auto" w:sz="4"/>
+          <w:bottom w:val="single" w:color="auto" w:sz="4"/>
+          <w:right w:val="single" w:color="auto" w:sz="4"/>
+          <w:insideH w:val="single" w:color="auto" w:sz="4"/>
+          <w:insideV w:val="single" w:color="auto" w:sz="4"/>
+        </w:tblBorders>
+      </w:tblPr>
+      <w:tblGrid>
+        <w:gridCol w:w="2200"/>
+        <w:gridCol w:w="7160"/>
+      </w:tblGrid>
+      <w:tr>
+        <w:tc>
+          <w:tcPr>
+            <w:tcW w:type="dxa" w:w="2200"/>
+            <w:tcBorders>
+              <w:top w:val="single" w:color="AAAAAA" w:sz="1"/>
+              <w:left w:val="single" w:color="AAAAAA" w:sz="1"/>
+              <w:bottom w:val="single" w:color="AAAAAA" w:sz="1"/>
+              <w:right w:val="single" w:color="AAAAAA" w:sz="1"/>
+            </w:tcBorders>
+            <w:shd w:fill="1F3864" w:val="clear"/>
+            <w:tcMar>
+              <w:top w:type="dxa" w:w="60"/>
+              <w:left w:type="dxa" w:w="100"/>
+              <w:bottom w:type="dxa" w:w="60"/>
+              <w:right w:type="dxa" w:w="100"/>
+            </w:tcMar>
+          </w:tcPr>
+          <w:p>
+            <w:r>
+              <w:rPr>
+                <w:rFonts w:ascii="Arial" w:cs="Arial" w:eastAsia="Arial" w:hAnsi="Arial"/>
+                <w:b/>
+                <w:bCs/>
+                <w:i w:val="false"/>
+                <w:iCs w:val="false"/>
+                <w:color w:val="FFFFFF"/>
+                <w:sz w:val="20"/>
+                <w:szCs w:val="20"/>
+              </w:rPr>
+              <w:t xml:space="preserve">Section</w:t>
+            </w:r>
+          </w:p>
+        </w:tc>
+        <w:tc>
+          <w:tcPr>
+            <w:tcW w:type="dxa" w:w="7160"/>
+            <w:tcBorders>
+              <w:top w:val="single" w:color="AAAAAA" w:sz="1"/>
+              <w:left w:val="single" w:color="AAAAAA" w:sz="1"/>
+              <w:bottom w:val="single" w:color="AAAAAA" w:sz="1"/>
+              <w:right w:val="single" w:color="AAAAAA" w:sz="1"/>
+            </w:tcBorders>
+            <w:shd w:fill="1F3864" w:val="clear"/>
+            <w:tcMar>
+              <w:top w:type="dxa" w:w="60"/>
+              <w:left w:type="dxa" w:w="100"/>
+              <w:bottom w:type="dxa" w:w="60"/>
+              <w:right w:type="dxa" w:w="100"/>
+            </w:tcMar>
+          </w:tcPr>
+          <w:p>
+            <w:r>
+              <w:rPr>
+                <w:rFonts w:ascii="Arial" w:cs="Arial" w:eastAsia="Arial" w:hAnsi="Arial"/>
+                <w:b/>
+                <w:bCs/>
+                <w:i w:val="false"/>
+                <w:iCs w:val="false"/>
+                <w:color w:val="FFFFFF"/>
+                <w:sz w:val="20"/>
+                <w:szCs w:val="20"/>
+              </w:rPr>
+              <w:t xml:space="preserve">Content</w:t>
+            </w:r>
+          </w:p>
+        </w:tc>
+      </w:tr>
+      <w:tr>
+        <w:tc>
+          <w:tcPr>
+            <w:tcW w:type="dxa" w:w="2200"/>
+            <w:tcBorders>
+              <w:top w:val="single" w:color="AAAAAA" w:sz="1"/>
+              <w:left w:val="single" w:color="AAAAAA" w:sz="1"/>
+              <w:bottom w:val="single" w:color="AAAAAA" w:sz="1"/>
+              <w:right w:val="single" w:color="AAAAAA" w:sz="1"/>
+            </w:tcBorders>
+            <w:tcMar>
+              <w:top w:type="dxa" w:w="60"/>
+              <w:left w:type="dxa" w:w="100"/>
+              <w:bottom w:type="dxa" w:w="60"/>
+              <w:right w:type="dxa" w:w="100"/>
+            </w:tcMar>
+          </w:tcPr>
+          <w:p>
+            <w:r>
+              <w:rPr>
+                <w:rFonts w:ascii="Arial" w:cs="Arial" w:eastAsia="Arial" w:hAnsi="Arial"/>
+                <w:b w:val="false"/>
+                <w:bCs w:val="false"/>
+                <w:i w:val="false"/>
+                <w:iCs w:val="false"/>
+                <w:sz w:val="20"/>
+                <w:szCs w:val="20"/>
+              </w:rPr>
+              <w:t xml:space="preserve">1. Process Purpose</w:t>
+            </w:r>
+          </w:p>
+        </w:tc>
+        <w:tc>
+          <w:tcPr>
+            <w:tcW w:type="dxa" w:w="7160"/>
+            <w:tcBorders>
+              <w:top w:val="single" w:color="AAAAAA" w:sz="1"/>
+              <w:left w:val="single" w:color="AAAAAA" w:sz="1"/>
+              <w:bottom w:val="single" w:color="AAAAAA" w:sz="1"/>
+              <w:right w:val="single" w:color="AAAAAA" w:sz="1"/>
+            </w:tcBorders>
+            <w:tcMar>
+              <w:top w:type="dxa" w:w="60"/>
+              <w:left w:type="dxa" w:w="100"/>
+              <w:bottom w:type="dxa" w:w="60"/>
+              <w:right w:type="dxa" w:w="100"/>
+            </w:tcMar>
+          </w:tcPr>
+          <w:p>
+            <w:r>
+              <w:rPr>
+                <w:rFonts w:ascii="Arial" w:cs="Arial" w:eastAsia="Arial" w:hAnsi="Arial"/>
+                <w:b w:val="false"/>
+                <w:bCs w:val="false"/>
+                <w:i w:val="false"/>
+                <w:iCs w:val="false"/>
+                <w:sz w:val="20"/>
+                <w:szCs w:val="20"/>
+              </w:rPr>
+              <w:t xml:space="preserve">What the process accomplishes and its defined end state.</w:t>
+            </w:r>
+          </w:p>
+        </w:tc>
+      </w:tr>
+      <w:tr>
+        <w:tc>
+          <w:tcPr>
+            <w:tcW w:type="dxa" w:w="2200"/>
+            <w:tcBorders>
+              <w:top w:val="single" w:color="AAAAAA" w:sz="1"/>
+              <w:left w:val="single" w:color="AAAAAA" w:sz="1"/>
+              <w:bottom w:val="single" w:color="AAAAAA" w:sz="1"/>
+              <w:right w:val="single" w:color="AAAAAA" w:sz="1"/>
+            </w:tcBorders>
+            <w:shd w:fill="F2F7FB" w:val="clear"/>
+            <w:tcMar>
+              <w:top w:type="dxa" w:w="60"/>
+              <w:left w:type="dxa" w:w="100"/>
+              <w:bottom w:type="dxa" w:w="60"/>
+              <w:right w:type="dxa" w:w="100"/>
+            </w:tcMar>
+          </w:tcPr>
+          <w:p>
+            <w:r>
+              <w:rPr>
+                <w:rFonts w:ascii="Arial" w:cs="Arial" w:eastAsia="Arial" w:hAnsi="Arial"/>
+                <w:b w:val="false"/>
+                <w:bCs w:val="false"/>
+                <w:i w:val="false"/>
+                <w:iCs w:val="false"/>
+                <w:sz w:val="20"/>
+                <w:szCs w:val="20"/>
+              </w:rPr>
+              <w:t xml:space="preserve">2. Process Triggers</w:t>
+            </w:r>
+          </w:p>
+        </w:tc>
+        <w:tc>
+          <w:tcPr>
+            <w:tcW w:type="dxa" w:w="7160"/>
+            <w:tcBorders>
+              <w:top w:val="single" w:color="AAAAAA" w:sz="1"/>
+              <w:left w:val="single" w:color="AAAAAA" w:sz="1"/>
+              <w:bottom w:val="single" w:color="AAAAAA" w:sz="1"/>
+              <w:right w:val="single" w:color="AAAAAA" w:sz="1"/>
+            </w:tcBorders>
+            <w:shd w:fill="F2F7FB" w:val="clear"/>
+            <w:tcMar>
+              <w:top w:type="dxa" w:w="60"/>
+              <w:left w:type="dxa" w:w="100"/>
+              <w:bottom w:type="dxa" w:w="60"/>
+              <w:right w:type="dxa" w:w="100"/>
+            </w:tcMar>
+          </w:tcPr>
+          <w:p>
+            <w:r>
+              <w:rPr>
+                <w:rFonts w:ascii="Arial" w:cs="Arial" w:eastAsia="Arial" w:hAnsi="Arial"/>
+                <w:b w:val="false"/>
+                <w:bCs w:val="false"/>
+                <w:i w:val="false"/>
+                <w:iCs w:val="false"/>
+                <w:sz w:val="20"/>
+                <w:szCs w:val="20"/>
+              </w:rPr>
+              <w:t xml:space="preserve">Preconditions, required data, initiation mechanism, and initiating persona.</w:t>
+            </w:r>
+          </w:p>
+        </w:tc>
+      </w:tr>
+      <w:tr>
+        <w:tc>
+          <w:tcPr>
+            <w:tcW w:type="dxa" w:w="2200"/>
+            <w:tcBorders>
+              <w:top w:val="single" w:color="AAAAAA" w:sz="1"/>
+              <w:left w:val="single" w:color="AAAAAA" w:sz="1"/>
+              <w:bottom w:val="single" w:color="AAAAAA" w:sz="1"/>
+              <w:right w:val="single" w:color="AAAAAA" w:sz="1"/>
+            </w:tcBorders>
+            <w:tcMar>
+              <w:top w:type="dxa" w:w="60"/>
+              <w:left w:type="dxa" w:w="100"/>
+              <w:bottom w:type="dxa" w:w="60"/>
+              <w:right w:type="dxa" w:w="100"/>
+            </w:tcMar>
+          </w:tcPr>
+          <w:p>
+            <w:r>
+              <w:rPr>
+                <w:rFonts w:ascii="Arial" w:cs="Arial" w:eastAsia="Arial" w:hAnsi="Arial"/>
+                <w:b w:val="false"/>
+                <w:bCs w:val="false"/>
+                <w:i w:val="false"/>
+                <w:iCs w:val="false"/>
+                <w:sz w:val="20"/>
+                <w:szCs w:val="20"/>
+              </w:rPr>
+              <w:t xml:space="preserve">3. Personas Involved</w:t>
+            </w:r>
+          </w:p>
+        </w:tc>
+        <w:tc>
+          <w:tcPr>
+            <w:tcW w:type="dxa" w:w="7160"/>
+            <w:tcBorders>
+              <w:top w:val="single" w:color="AAAAAA" w:sz="1"/>
+              <w:left w:val="single" w:color="AAAAAA" w:sz="1"/>
+              <w:bottom w:val="single" w:color="AAAAAA" w:sz="1"/>
+              <w:right w:val="single" w:color="AAAAAA" w:sz="1"/>
+            </w:tcBorders>
+            <w:tcMar>
+              <w:top w:type="dxa" w:w="60"/>
+              <w:left w:type="dxa" w:w="100"/>
+              <w:bottom w:type="dxa" w:w="60"/>
+              <w:right w:type="dxa" w:w="100"/>
+            </w:tcMar>
+          </w:tcPr>
+          <w:p>
+            <w:r>
+              <w:rPr>
+                <w:rFonts w:ascii="Arial" w:cs="Arial" w:eastAsia="Arial" w:hAnsi="Arial"/>
+                <w:b w:val="false"/>
+                <w:bCs w:val="false"/>
+                <w:i w:val="false"/>
+                <w:iCs w:val="false"/>
+                <w:sz w:val="20"/>
+                <w:szCs w:val="20"/>
+              </w:rPr>
+              <w:t xml:space="preserve">Which personas participate and their specific role in this process.</w:t>
+            </w:r>
+          </w:p>
+        </w:tc>
+      </w:tr>
+      <w:tr>
+        <w:tc>
+          <w:tcPr>
+            <w:tcW w:type="dxa" w:w="2200"/>
+            <w:tcBorders>
+              <w:top w:val="single" w:color="AAAAAA" w:sz="1"/>
+              <w:left w:val="single" w:color="AAAAAA" w:sz="1"/>
+              <w:bottom w:val="single" w:color="AAAAAA" w:sz="1"/>
+              <w:right w:val="single" w:color="AAAAAA" w:sz="1"/>
+            </w:tcBorders>
+            <w:shd w:fill="F2F7FB" w:val="clear"/>
+            <w:tcMar>
+              <w:top w:type="dxa" w:w="60"/>
+              <w:left w:type="dxa" w:w="100"/>
+              <w:bottom w:type="dxa" w:w="60"/>
+              <w:right w:type="dxa" w:w="100"/>
+            </w:tcMar>
+          </w:tcPr>
+          <w:p>
+            <w:r>
+              <w:rPr>
+                <w:rFonts w:ascii="Arial" w:cs="Arial" w:eastAsia="Arial" w:hAnsi="Arial"/>
+                <w:b w:val="false"/>
+                <w:bCs w:val="false"/>
+                <w:i w:val="false"/>
+                <w:iCs w:val="false"/>
+                <w:sz w:val="20"/>
+                <w:szCs w:val="20"/>
+              </w:rPr>
+              <w:t xml:space="preserve">4. Process Workflow</w:t>
+            </w:r>
+          </w:p>
+        </w:tc>
+        <w:tc>
+          <w:tcPr>
+            <w:tcW w:type="dxa" w:w="7160"/>
+            <w:tcBorders>
+              <w:top w:val="single" w:color="AAAAAA" w:sz="1"/>
+              <w:left w:val="single" w:color="AAAAAA" w:sz="1"/>
+              <w:bottom w:val="single" w:color="AAAAAA" w:sz="1"/>
+              <w:right w:val="single" w:color="AAAAAA" w:sz="1"/>
+            </w:tcBorders>
+            <w:shd w:fill="F2F7FB" w:val="clear"/>
+            <w:tcMar>
+              <w:top w:type="dxa" w:w="60"/>
+              <w:left w:type="dxa" w:w="100"/>
+              <w:bottom w:type="dxa" w:w="60"/>
+              <w:right w:type="dxa" w:w="100"/>
+            </w:tcMar>
+          </w:tcPr>
+          <w:p>
+            <w:r>
+              <w:rPr>
+                <w:rFonts w:ascii="Arial" w:cs="Arial" w:eastAsia="Arial" w:hAnsi="Arial"/>
+                <w:b w:val="false"/>
+                <w:bCs w:val="false"/>
+                <w:i w:val="false"/>
+                <w:iCs w:val="false"/>
+                <w:sz w:val="20"/>
+                <w:szCs w:val="20"/>
+              </w:rPr>
+              <w:t xml:space="preserve">What happens, in what order, and what decisions are made. Written as a numbered narrative at a level of detail sufficient for a knowledgeable stakeholder to follow the process end to end.</w:t>
+            </w:r>
+          </w:p>
+        </w:tc>
+      </w:tr>
+      <w:tr>
+        <w:tc>
+          <w:tcPr>
+            <w:tcW w:type="dxa" w:w="2200"/>
+            <w:tcBorders>
+              <w:top w:val="single" w:color="AAAAAA" w:sz="1"/>
+              <w:left w:val="single" w:color="AAAAAA" w:sz="1"/>
+              <w:bottom w:val="single" w:color="AAAAAA" w:sz="1"/>
+              <w:right w:val="single" w:color="AAAAAA" w:sz="1"/>
+            </w:tcBorders>
+            <w:tcMar>
+              <w:top w:type="dxa" w:w="60"/>
+              <w:left w:type="dxa" w:w="100"/>
+              <w:bottom w:type="dxa" w:w="60"/>
+              <w:right w:type="dxa" w:w="100"/>
+            </w:tcMar>
+          </w:tcPr>
+          <w:p>
+            <w:r>
+              <w:rPr>
+                <w:rFonts w:ascii="Arial" w:cs="Arial" w:eastAsia="Arial" w:hAnsi="Arial"/>
+                <w:b w:val="false"/>
+                <w:bCs w:val="false"/>
+                <w:i w:val="false"/>
+                <w:iCs w:val="false"/>
+                <w:sz w:val="20"/>
+                <w:szCs w:val="20"/>
+              </w:rPr>
+              <w:t xml:space="preserve">5. Process Completion</w:t>
+            </w:r>
+          </w:p>
+        </w:tc>
+        <w:tc>
+          <w:tcPr>
+            <w:tcW w:type="dxa" w:w="7160"/>
+            <w:tcBorders>
+              <w:top w:val="single" w:color="AAAAAA" w:sz="1"/>
+              <w:left w:val="single" w:color="AAAAAA" w:sz="1"/>
+              <w:bottom w:val="single" w:color="AAAAAA" w:sz="1"/>
+              <w:right w:val="single" w:color="AAAAAA" w:sz="1"/>
+            </w:tcBorders>
+            <w:tcMar>
+              <w:top w:type="dxa" w:w="60"/>
+              <w:left w:type="dxa" w:w="100"/>
+              <w:bottom w:type="dxa" w:w="60"/>
+              <w:right w:type="dxa" w:w="100"/>
+            </w:tcMar>
+          </w:tcPr>
+          <w:p>
+            <w:r>
+              <w:rPr>
+                <w:rFonts w:ascii="Arial" w:cs="Arial" w:eastAsia="Arial" w:hAnsi="Arial"/>
+                <w:b w:val="false"/>
+                <w:bCs w:val="false"/>
+                <w:i w:val="false"/>
+                <w:iCs w:val="false"/>
+                <w:sz w:val="20"/>
+                <w:szCs w:val="20"/>
+              </w:rPr>
+              <w:t xml:space="preserve">How the process ends — normal completion, alternative end states, early termination, and post-completion handoffs.</w:t>
+            </w:r>
+          </w:p>
+        </w:tc>
+      </w:tr>
+      <w:tr>
+        <w:tc>
+          <w:tcPr>
+            <w:tcW w:type="dxa" w:w="2200"/>
+            <w:tcBorders>
+              <w:top w:val="single" w:color="AAAAAA" w:sz="1"/>
+              <w:left w:val="single" w:color="AAAAAA" w:sz="1"/>
+              <w:bottom w:val="single" w:color="AAAAAA" w:sz="1"/>
+              <w:right w:val="single" w:color="AAAAAA" w:sz="1"/>
+            </w:tcBorders>
+            <w:shd w:fill="F2F7FB" w:val="clear"/>
+            <w:tcMar>
+              <w:top w:type="dxa" w:w="60"/>
+              <w:left w:type="dxa" w:w="100"/>
+              <w:bottom w:type="dxa" w:w="60"/>
+              <w:right w:type="dxa" w:w="100"/>
+            </w:tcMar>
+          </w:tcPr>
+          <w:p>
+            <w:r>
+              <w:rPr>
+                <w:rFonts w:ascii="Arial" w:cs="Arial" w:eastAsia="Arial" w:hAnsi="Arial"/>
+                <w:b w:val="false"/>
+                <w:bCs w:val="false"/>
+                <w:i w:val="false"/>
+                <w:iCs w:val="false"/>
+                <w:sz w:val="20"/>
+                <w:szCs w:val="20"/>
+              </w:rPr>
+              <w:t xml:space="preserve">6. System Requirements</w:t>
+            </w:r>
+          </w:p>
+        </w:tc>
+        <w:tc>
+          <w:tcPr>
+            <w:tcW w:type="dxa" w:w="7160"/>
+            <w:tcBorders>
+              <w:top w:val="single" w:color="AAAAAA" w:sz="1"/>
+              <w:left w:val="single" w:color="AAAAAA" w:sz="1"/>
+              <w:bottom w:val="single" w:color="AAAAAA" w:sz="1"/>
+              <w:right w:val="single" w:color="AAAAAA" w:sz="1"/>
+            </w:tcBorders>
+            <w:shd w:fill="F2F7FB" w:val="clear"/>
+            <w:tcMar>
+              <w:top w:type="dxa" w:w="60"/>
+              <w:left w:type="dxa" w:w="100"/>
+              <w:bottom w:type="dxa" w:w="60"/>
+              <w:right w:type="dxa" w:w="100"/>
+            </w:tcMar>
+          </w:tcPr>
+          <w:p>
+            <w:r>
+              <w:rPr>
+                <w:rFonts w:ascii="Arial" w:cs="Arial" w:eastAsia="Arial" w:hAnsi="Arial"/>
+                <w:b w:val="false"/>
+                <w:bCs w:val="false"/>
+                <w:i w:val="false"/>
+                <w:iCs w:val="false"/>
+                <w:sz w:val="20"/>
+                <w:szCs w:val="20"/>
+              </w:rPr>
+              <w:t xml:space="preserve">What the CRM must do to support this process. Stated as “The system must...” statements. Each requirement receives a unique identifier.</w:t>
+            </w:r>
+          </w:p>
+        </w:tc>
+      </w:tr>
+      <w:tr>
+        <w:tc>
+          <w:tcPr>
+            <w:tcW w:type="dxa" w:w="2200"/>
+            <w:tcBorders>
+              <w:top w:val="single" w:color="AAAAAA" w:sz="1"/>
+              <w:left w:val="single" w:color="AAAAAA" w:sz="1"/>
+              <w:bottom w:val="single" w:color="AAAAAA" w:sz="1"/>
+              <w:right w:val="single" w:color="AAAAAA" w:sz="1"/>
+            </w:tcBorders>
+            <w:tcMar>
+              <w:top w:type="dxa" w:w="60"/>
+              <w:left w:type="dxa" w:w="100"/>
+              <w:bottom w:type="dxa" w:w="60"/>
+              <w:right w:type="dxa" w:w="100"/>
+            </w:tcMar>
+          </w:tcPr>
+          <w:p>
+            <w:r>
+              <w:rPr>
+                <w:rFonts w:ascii="Arial" w:cs="Arial" w:eastAsia="Arial" w:hAnsi="Arial"/>
+                <w:b w:val="false"/>
+                <w:bCs w:val="false"/>
+                <w:i w:val="false"/>
+                <w:iCs w:val="false"/>
+                <w:sz w:val="20"/>
+                <w:szCs w:val="20"/>
+              </w:rPr>
+              <w:t xml:space="preserve">7. Process Data</w:t>
+            </w:r>
+          </w:p>
+        </w:tc>
+        <w:tc>
+          <w:tcPr>
+            <w:tcW w:type="dxa" w:w="7160"/>
+            <w:tcBorders>
+              <w:top w:val="single" w:color="AAAAAA" w:sz="1"/>
+              <w:left w:val="single" w:color="AAAAAA" w:sz="1"/>
+              <w:bottom w:val="single" w:color="AAAAAA" w:sz="1"/>
+              <w:right w:val="single" w:color="AAAAAA" w:sz="1"/>
+            </w:tcBorders>
+            <w:tcMar>
+              <w:top w:type="dxa" w:w="60"/>
+              <w:left w:type="dxa" w:w="100"/>
+              <w:bottom w:type="dxa" w:w="60"/>
+              <w:right w:type="dxa" w:w="100"/>
+            </w:tcMar>
+          </w:tcPr>
+          <w:p>
+            <w:r>
+              <w:rPr>
+                <w:rFonts w:ascii="Arial" w:cs="Arial" w:eastAsia="Arial" w:hAnsi="Arial"/>
+                <w:b w:val="false"/>
+                <w:bCs w:val="false"/>
+                <w:i w:val="false"/>
+                <w:iCs w:val="false"/>
+                <w:sz w:val="20"/>
+                <w:szCs w:val="20"/>
+              </w:rPr>
+              <w:t xml:space="preserve">Fields this process references or uses to support its work (pre-existing data requirements). Grouped by entity with full field-level detail.</w:t>
+            </w:r>
+          </w:p>
+        </w:tc>
+      </w:tr>
+      <w:tr>
+        <w:tc>
+          <w:tcPr>
+            <w:tcW w:type="dxa" w:w="2200"/>
+            <w:tcBorders>
+              <w:top w:val="single" w:color="AAAAAA" w:sz="1"/>
+              <w:left w:val="single" w:color="AAAAAA" w:sz="1"/>
+              <w:bottom w:val="single" w:color="AAAAAA" w:sz="1"/>
+              <w:right w:val="single" w:color="AAAAAA" w:sz="1"/>
+            </w:tcBorders>
+            <w:shd w:fill="F2F7FB" w:val="clear"/>
+            <w:tcMar>
+              <w:top w:type="dxa" w:w="60"/>
+              <w:left w:type="dxa" w:w="100"/>
+              <w:bottom w:type="dxa" w:w="60"/>
+              <w:right w:type="dxa" w:w="100"/>
+            </w:tcMar>
+          </w:tcPr>
+          <w:p>
+            <w:r>
+              <w:rPr>
+                <w:rFonts w:ascii="Arial" w:cs="Arial" w:eastAsia="Arial" w:hAnsi="Arial"/>
+                <w:b w:val="false"/>
+                <w:bCs w:val="false"/>
+                <w:i w:val="false"/>
+                <w:iCs w:val="false"/>
+                <w:sz w:val="20"/>
+                <w:szCs w:val="20"/>
+              </w:rPr>
+              <w:t xml:space="preserve">8. Data Collected</w:t>
+            </w:r>
+          </w:p>
+        </w:tc>
+        <w:tc>
+          <w:tcPr>
+            <w:tcW w:type="dxa" w:w="7160"/>
+            <w:tcBorders>
+              <w:top w:val="single" w:color="AAAAAA" w:sz="1"/>
+              <w:left w:val="single" w:color="AAAAAA" w:sz="1"/>
+              <w:bottom w:val="single" w:color="AAAAAA" w:sz="1"/>
+              <w:right w:val="single" w:color="AAAAAA" w:sz="1"/>
+            </w:tcBorders>
+            <w:shd w:fill="F2F7FB" w:val="clear"/>
+            <w:tcMar>
+              <w:top w:type="dxa" w:w="60"/>
+              <w:left w:type="dxa" w:w="100"/>
+              <w:bottom w:type="dxa" w:w="60"/>
+              <w:right w:type="dxa" w:w="100"/>
+            </w:tcMar>
+          </w:tcPr>
+          <w:p>
+            <w:r>
+              <w:rPr>
+                <w:rFonts w:ascii="Arial" w:cs="Arial" w:eastAsia="Arial" w:hAnsi="Arial"/>
+                <w:b w:val="false"/>
+                <w:bCs w:val="false"/>
+                <w:i w:val="false"/>
+                <w:iCs w:val="false"/>
+                <w:sz w:val="20"/>
+                <w:szCs w:val="20"/>
+              </w:rPr>
+              <w:t xml:space="preserve">Fields this process creates or updates (new data created by the process). Grouped by entity with full field-level detail.</w:t>
+            </w:r>
+          </w:p>
+        </w:tc>
+      </w:tr>
+      <w:tr>
+        <w:tc>
+          <w:tcPr>
+            <w:tcW w:type="dxa" w:w="2200"/>
+            <w:tcBorders>
+              <w:top w:val="single" w:color="AAAAAA" w:sz="1"/>
+              <w:left w:val="single" w:color="AAAAAA" w:sz="1"/>
+              <w:bottom w:val="single" w:color="AAAAAA" w:sz="1"/>
+              <w:right w:val="single" w:color="AAAAAA" w:sz="1"/>
+            </w:tcBorders>
+            <w:tcMar>
+              <w:top w:type="dxa" w:w="60"/>
+              <w:left w:type="dxa" w:w="100"/>
+              <w:bottom w:type="dxa" w:w="60"/>
+              <w:right w:type="dxa" w:w="100"/>
+            </w:tcMar>
+          </w:tcPr>
+          <w:p>
+            <w:r>
+              <w:rPr>
+                <w:rFonts w:ascii="Arial" w:cs="Arial" w:eastAsia="Arial" w:hAnsi="Arial"/>
+                <w:b w:val="false"/>
+                <w:bCs w:val="false"/>
+                <w:i w:val="false"/>
+                <w:iCs w:val="false"/>
+                <w:sz w:val="20"/>
+                <w:szCs w:val="20"/>
+              </w:rPr>
+              <w:t xml:space="preserve">9. Interview Transcript</w:t>
+            </w:r>
+          </w:p>
+        </w:tc>
+        <w:tc>
+          <w:tcPr>
+            <w:tcW w:type="dxa" w:w="7160"/>
+            <w:tcBorders>
+              <w:top w:val="single" w:color="AAAAAA" w:sz="1"/>
+              <w:left w:val="single" w:color="AAAAAA" w:sz="1"/>
+              <w:bottom w:val="single" w:color="AAAAAA" w:sz="1"/>
+              <w:right w:val="single" w:color="AAAAAA" w:sz="1"/>
+            </w:tcBorders>
+            <w:tcMar>
+              <w:top w:type="dxa" w:w="60"/>
+              <w:left w:type="dxa" w:w="100"/>
+              <w:bottom w:type="dxa" w:w="60"/>
+              <w:right w:type="dxa" w:w="100"/>
+            </w:tcMar>
+          </w:tcPr>
+          <w:p>
+            <w:r>
+              <w:rPr>
+                <w:rFonts w:ascii="Arial" w:cs="Arial" w:eastAsia="Arial" w:hAnsi="Arial"/>
+                <w:b w:val="false"/>
+                <w:bCs w:val="false"/>
+                <w:i w:val="false"/>
+                <w:iCs w:val="false"/>
+                <w:sz w:val="20"/>
+                <w:szCs w:val="20"/>
+              </w:rPr>
+              <w:t xml:space="preserve">Complete record of all interview questions and answers from the session. Provides an audit trail for decisions made during the interview.</w:t>
+            </w:r>
+          </w:p>
+        </w:tc>
+      </w:tr>
+    </w:tbl>
+    <w:p>
+      <w:pPr>
+        <w:pStyle w:val="Heading3"/>
+        <w:spacing w:after="120" w:before="240"/>
+      </w:pPr>
+      <w:r>
+        <w:rPr>
+          <w:rFonts w:ascii="Arial" w:cs="Arial" w:eastAsia="Arial" w:hAnsi="Arial"/>
+          <w:b/>
+          <w:bCs/>
+          <w:i w:val="false"/>
+          <w:iCs w:val="false"/>
+          <w:sz w:val="24"/>
+          <w:szCs w:val="24"/>
+        </w:rPr>
+        <w:t xml:space="preserve">Entities Used</w:t>
+      </w:r>
+    </w:p>
+    <w:p>
+      <w:pPr>
+        <w:spacing w:after="120"/>
+      </w:pPr>
+      <w:r>
+        <w:rPr>
+          <w:rFonts w:ascii="Arial" w:cs="Arial" w:eastAsia="Arial" w:hAnsi="Arial"/>
+          <w:b w:val="false"/>
+          <w:bCs w:val="false"/>
+          <w:i w:val="false"/>
+          <w:iCs w:val="false"/>
+          <w:sz w:val="22"/>
+          <w:szCs w:val="22"/>
+        </w:rPr>
+        <w:t xml:space="preserve">Each process document must explicitly list the entities it uses or affects, referencing them by their defined names from the Entity PRDs. For each entity, the process document states whether the process creates new records, reads existing records, updates existing records, or a combination. This traceability ensures that every entity interaction is accounted for and that no process silently introduces undefined entities.</w:t>
+      </w:r>
+    </w:p>
+    <w:p>
+      <w:pPr>
+        <w:pStyle w:val="Heading3"/>
+        <w:spacing w:after="120" w:before="240"/>
+      </w:pPr>
+      <w:r>
+        <w:rPr>
+          <w:rFonts w:ascii="Arial" w:cs="Arial" w:eastAsia="Arial" w:hAnsi="Arial"/>
+          <w:b/>
+          <w:bCs/>
+          <w:i w:val="false"/>
+          <w:iCs w:val="false"/>
+          <w:sz w:val="24"/>
+          <w:szCs w:val="24"/>
+        </w:rPr>
+        <w:t xml:space="preserve">Field-Level Detail Standard</w:t>
+      </w:r>
+    </w:p>
+    <w:p>
+      <w:pPr>
+        <w:spacing w:after="120"/>
+      </w:pPr>
+      <w:r>
+        <w:rPr>
+          <w:rFonts w:ascii="Arial" w:cs="Arial" w:eastAsia="Arial" w:hAnsi="Arial"/>
+          <w:b w:val="false"/>
+          <w:bCs w:val="false"/>
+          <w:i w:val="false"/>
+          <w:iCs w:val="false"/>
+          <w:sz w:val="22"/>
+          <w:szCs w:val="22"/>
+        </w:rPr>
+        <w:t xml:space="preserve">For both Process Data and Data Collected sections, each field entry must include:</w:t>
+      </w:r>
+    </w:p>
+    <w:p>
+      <w:pPr>
+        <w:pStyle w:val="ListParagraph"/>
+        <w:numPr>
+          <w:ilvl w:val="0"/>
+          <w:numId w:val="2"/>
+        </w:numPr>
+        <w:spacing w:after="60"/>
+      </w:pPr>
+      <w:r>
+        <w:rPr>
+          <w:rFonts w:ascii="Arial" w:cs="Arial" w:eastAsia="Arial" w:hAnsi="Arial"/>
+          <w:b w:val="false"/>
+          <w:bCs w:val="false"/>
+          <w:i w:val="false"/>
+          <w:iCs w:val="false"/>
+          <w:sz w:val="22"/>
+          <w:szCs w:val="22"/>
+        </w:rPr>
+        <w:t xml:space="preserve">Field name — the human-readable label</w:t>
+      </w:r>
+    </w:p>
+    <w:p>
+      <w:pPr>
+        <w:pStyle w:val="ListParagraph"/>
+        <w:numPr>
+          <w:ilvl w:val="0"/>
+          <w:numId w:val="2"/>
+        </w:numPr>
+        <w:spacing w:after="60"/>
+      </w:pPr>
+      <w:r>
+        <w:rPr>
+          <w:rFonts w:ascii="Arial" w:cs="Arial" w:eastAsia="Arial" w:hAnsi="Arial"/>
+          <w:b w:val="false"/>
+          <w:bCs w:val="false"/>
+          <w:i w:val="false"/>
+          <w:iCs w:val="false"/>
+          <w:sz w:val="22"/>
+          <w:szCs w:val="22"/>
+        </w:rPr>
+        <w:t xml:space="preserve">Field type — text, dropdown, multi-select, date, integer, currency, yes/no, etc.</w:t>
+      </w:r>
+    </w:p>
+    <w:p>
+      <w:pPr>
+        <w:pStyle w:val="ListParagraph"/>
+        <w:numPr>
+          <w:ilvl w:val="0"/>
+          <w:numId w:val="2"/>
+        </w:numPr>
+        <w:spacing w:after="60"/>
+      </w:pPr>
+      <w:r>
+        <w:rPr>
+          <w:rFonts w:ascii="Arial" w:cs="Arial" w:eastAsia="Arial" w:hAnsi="Arial"/>
+          <w:b w:val="false"/>
+          <w:bCs w:val="false"/>
+          <w:i w:val="false"/>
+          <w:iCs w:val="false"/>
+          <w:sz w:val="22"/>
+          <w:szCs w:val="22"/>
+        </w:rPr>
+        <w:t xml:space="preserve">Required status — required, optional, conditional (with condition stated), or system-calculated</w:t>
+      </w:r>
+    </w:p>
+    <w:p>
+      <w:pPr>
+        <w:pStyle w:val="ListParagraph"/>
+        <w:numPr>
+          <w:ilvl w:val="0"/>
+          <w:numId w:val="2"/>
+        </w:numPr>
+        <w:spacing w:after="60"/>
+      </w:pPr>
+      <w:r>
+        <w:rPr>
+          <w:rFonts w:ascii="Arial" w:cs="Arial" w:eastAsia="Arial" w:hAnsi="Arial"/>
+          <w:b w:val="false"/>
+          <w:bCs w:val="false"/>
+          <w:i w:val="false"/>
+          <w:iCs w:val="false"/>
+          <w:sz w:val="22"/>
+          <w:szCs w:val="22"/>
+        </w:rPr>
+        <w:t xml:space="preserve">Enum values — for dropdowns and multi-selects, the complete list of allowed values</w:t>
+      </w:r>
+    </w:p>
+    <w:p>
+      <w:pPr>
+        <w:pStyle w:val="ListParagraph"/>
+        <w:numPr>
+          <w:ilvl w:val="0"/>
+          <w:numId w:val="2"/>
+        </w:numPr>
+        <w:spacing w:after="60"/>
+      </w:pPr>
+      <w:r>
+        <w:rPr>
+          <w:rFonts w:ascii="Arial" w:cs="Arial" w:eastAsia="Arial" w:hAnsi="Arial"/>
+          <w:b w:val="false"/>
+          <w:bCs w:val="false"/>
+          <w:i w:val="false"/>
+          <w:iCs w:val="false"/>
+          <w:sz w:val="22"/>
+          <w:szCs w:val="22"/>
+        </w:rPr>
+        <w:t xml:space="preserve">Description — what the field is for and how it is used in this process</w:t>
+      </w:r>
+    </w:p>
+    <w:p>
+      <w:pPr>
+        <w:spacing w:after="120"/>
+      </w:pPr>
+      <w:r>
+        <w:rPr>
+          <w:rFonts w:ascii="Arial" w:cs="Arial" w:eastAsia="Arial" w:hAnsi="Arial"/>
+          <w:b w:val="false"/>
+          <w:bCs w:val="false"/>
+          <w:i w:val="false"/>
+          <w:iCs w:val="false"/>
+          <w:sz w:val="22"/>
+          <w:szCs w:val="22"/>
+        </w:rPr>
+        <w:t xml:space="preserve">This level of detail is necessary because downstream processes reference specific field values in their workflow definitions. Deferring field detail to a later step breaks the dependency chain.</w:t>
       </w:r>
     </w:p>
     <w:p>

</xml_diff>

<commit_message>
WIP: Document Production Process v2.0 — Step 3c.4 (new 3.5 Entity PRDs)
</commit_message>
<xml_diff>
--- a/PRDs/process/CRM-Builder-Document-Production-Process.docx
+++ b/PRDs/process/CRM-Builder-Document-Production-Process.docx
@@ -4884,6 +4884,120 @@
           <w:szCs w:val="22"/>
         </w:rPr>
         <w:t xml:space="preserve">This level of detail is necessary because downstream processes reference specific field values in their workflow definitions. Deferring field detail to a later step breaks the dependency chain.</w:t>
+      </w:r>
+    </w:p>
+    <w:p>
+      <w:pPr>
+        <w:pStyle w:val="Heading2"/>
+      </w:pPr>
+      <w:r>
+        <w:t xml:space="preserve">3.5 Phase 5: Entity PRDs</w:t>
+      </w:r>
+    </w:p>
+    <w:p>
+      <w:pPr>
+        <w:pStyle w:val="BodyText"/>
+      </w:pPr>
+      <w:r>
+        <w:rPr>
+          <w:b/>
+          <w:bCs/>
+        </w:rPr>
+        <w:t xml:space="preserve">Purpose.</w:t>
+      </w:r>
+      <w:r>
+        <w:t xml:space="preserve"> Phase 5 produces the full Entity PRD for each entity in the reconciled Entity Inventory. An Entity PRD is the complete, authoritative definition of an entity: its full field list, field types, required/optional status, allowed values, relationships to other entities, and business rules. Entity PRDs are the source the YAML generation phase reads from when producing CRM-ready configuration.</w:t>
+      </w:r>
+    </w:p>
+    <w:p>
+      <w:pPr>
+        <w:pStyle w:val="BodyText"/>
+      </w:pPr>
+      <w:r>
+        <w:rPr>
+          <w:b/>
+          <w:bCs/>
+        </w:rPr>
+        <w:t xml:space="preserve">Why Phase 5 and not earlier.</w:t>
+      </w:r>
+      <w:r>
+        <w:t xml:space="preserve"> Entities are first surfaced in Phase 2 (Domain Discovery) as nouns from the client's language, and reconciled in Phase 3 (Inventory Reconciliation) into a canonical Entity Inventory. But the full PRD for each entity — every field, every business rule, every relationship — cannot be written responsibly until the Phase 4 process documents that use those entities have been drafted. Process work is what reveals which fields an entity actually needs, which values an enum actually contains, and which relationships matter in practice. Writing Entity PRDs before process work means guessing; writing them after means recording.</w:t>
+      </w:r>
+    </w:p>
+    <w:p>
+      <w:pPr>
+        <w:pStyle w:val="BodyText"/>
+      </w:pPr>
+      <w:r>
+        <w:rPr>
+          <w:b/>
+          <w:bCs/>
+        </w:rPr>
+        <w:t xml:space="preserve">Activity.</w:t>
+      </w:r>
+      <w:r>
+        <w:t xml:space="preserve"> For each entity in the reconciled Entity Inventory, the implementer conducts a focused conversation that walks through the entity's complete field list. The conversation references the Phase 4 process documents that use the entity to ground each field in a concrete process need. The output is a single Entity PRD document covering field name, type, required status, allowed values (for enums), default value, ID, and a description that leads with business purpose before technical detail.</w:t>
+      </w:r>
+    </w:p>
+    <w:p>
+      <w:pPr>
+        <w:pStyle w:val="BodyText"/>
+      </w:pPr>
+      <w:r>
+        <w:rPr>
+          <w:b/>
+          <w:bCs/>
+        </w:rPr>
+        <w:t xml:space="preserve">Input.</w:t>
+      </w:r>
+      <w:r>
+        <w:t xml:space="preserve"> The reconciled Entity Inventory from Phase 3, plus all Phase 4 process documents that reference the entity.</w:t>
+      </w:r>
+    </w:p>
+    <w:p>
+      <w:pPr>
+        <w:pStyle w:val="BodyText"/>
+      </w:pPr>
+      <w:r>
+        <w:rPr>
+          <w:b/>
+          <w:bCs/>
+        </w:rPr>
+        <w:t xml:space="preserve">Output.</w:t>
+      </w:r>
+      <w:r>
+        <w:t xml:space="preserve"> One Entity PRD document per entity, stored at PRDs/{domain_code}/{ENTITY-NAME}-PRD.docx (or under the appropriate cross-domain service folder for service entities).</w:t>
+      </w:r>
+    </w:p>
+    <w:p>
+      <w:pPr>
+        <w:pStyle w:val="BodyText"/>
+      </w:pPr>
+      <w:r>
+        <w:rPr>
+          <w:b/>
+          <w:bCs/>
+        </w:rPr>
+        <w:t xml:space="preserve">Conversation count.</w:t>
+      </w:r>
+      <w:r>
+        <w:t xml:space="preserve"> Typically 1 per entity. Entities with very large field lists or complex business rules may require 2.</w:t>
+      </w:r>
+    </w:p>
+    <w:p>
+      <w:pPr>
+        <w:pStyle w:val="BodyText"/>
+        <w:ind w:left="360"/>
+      </w:pPr>
+      <w:r>
+        <w:rPr>
+          <w:b/>
+          <w:bCs/>
+        </w:rPr>
+        <w:t xml:space="preserve">Rule 5.1 — Entity Definition Timing. </w:t>
+      </w:r>
+      <w:r>
+        <w:t xml:space="preserve">Entities are identified and sketched during Phase 2 Domain Discovery to establish shared vocabulary, and reconciled in Phase 3. Full Entity PRDs — including complete field lists, relationships, and business rules — are produced only in Phase 5, after the Phase 4 process documents that use the entities have been drafted. Process documents may reference entity names and obvious fields from the reconciled Entity Inventory without waiting for the full PRD.</w:t>
       </w:r>
     </w:p>
     <w:p>

</xml_diff>

<commit_message>
WIP: Document Production Process v2.0 — Step 3c.5 (3.6 cross-ref rewordings)
</commit_message>
<xml_diff>
--- a/PRDs/process/CRM-Builder-Document-Production-Process.docx
+++ b/PRDs/process/CRM-Builder-Document-Production-Process.docx
@@ -5042,7 +5042,7 @@
           <w:sz w:val="22"/>
           <w:szCs w:val="22"/>
         </w:rPr>
-        <w:t xml:space="preserve">Services are structurally parallel to domains. A service can own entities, define processes, and produce its own reconciled Service PRD. Service entities are defined in Phase 2 (Entity Definition) alongside domain entities. Service process definition and reconciliation are handled within this phase:</w:t>
+        <w:t xml:space="preserve">Services are structurally parallel to domains. A service can own entities, define processes, and produce its own reconciled Service PRD. Service entities are sketched in Phase 2 (Domain Discovery), reconciled in Phase 3 (Inventory Reconciliation), and fully defined in Phase 5 (Entity PRDs) alongside domain entities. Service process definition and reconciliation are handled within this phase:</w:t>
       </w:r>
     </w:p>
     <w:p>
@@ -5111,7 +5111,7 @@
           <w:sz w:val="22"/>
           <w:szCs w:val="22"/>
         </w:rPr>
-        <w:t xml:space="preserve">If a service owns entities not already captured in the Entity Inventory, the Entity Inventory must be updated and Entity PRDs produced for the new entities before service process definition begins. This applies both when services are identified after Phase 2 has been completed and when service process definition reveals entities not anticipated during the original Entity Discovery. The scope change protocol (Section 10) governs discovery of new entities during service process conversations.</w:t>
+        <w:t xml:space="preserve">If a service owns entities not already captured in the Entity Inventory, the Entity Inventory must be updated and Entity PRDs produced for the new entities before service process definition begins. This applies both when services are identified after Phase 5 has been completed and when service process definition reveals entities not anticipated during the original Domain Discovery. The scope change protocol (Section 10) governs discovery of new entities during service process conversations.</w:t>
       </w:r>
     </w:p>
     <w:p>

</xml_diff>

<commit_message>
WIP: Document Production Process v2.0 — Step 4 partial (Section 10.2 Entity Definition refs)
</commit_message>
<xml_diff>
--- a/PRDs/process/CRM-Builder-Document-Production-Process.docx
+++ b/PRDs/process/CRM-Builder-Document-Production-Process.docx
@@ -13923,7 +13923,7 @@
           <w:sz w:val="22"/>
           <w:szCs w:val="22"/>
         </w:rPr>
-        <w:t xml:space="preserve">If a process conversation reveals an entity that was not captured during Entity Definition:</w:t>
+        <w:t xml:space="preserve">If a process conversation reveals an entity that was not captured in the reconciled Entity Inventory:</w:t>
       </w:r>
     </w:p>
     <w:p>
@@ -13989,7 +13989,7 @@
           <w:sz w:val="22"/>
           <w:szCs w:val="22"/>
         </w:rPr>
-        <w:t xml:space="preserve">Conduct an Entity Definition interview for the new entity.</w:t>
+        <w:t xml:space="preserve">Conduct a Phase 5 Entity PRD interview for the new entity.</w:t>
       </w:r>
     </w:p>
     <w:p>

</xml_diff>

<commit_message>
WIP: Document Production Process v2.0 — Step 4 (Section 7.2 Context Requirements table rewrite)
</commit_message>
<xml_diff>
--- a/PRDs/process/CRM-Builder-Document-Production-Process.docx
+++ b/PRDs/process/CRM-Builder-Document-Production-Process.docx
@@ -11272,26 +11272,25 @@
               <w:bottom w:val="single" w:color="AAAAAA" w:sz="1"/>
               <w:right w:val="single" w:color="AAAAAA" w:sz="1"/>
             </w:tcBorders>
-            <w:shd w:fill="F2F7FB" w:val="clear"/>
-            <w:tcMar>
-              <w:top w:type="dxa" w:w="60"/>
-              <w:left w:type="dxa" w:w="100"/>
-              <w:bottom w:type="dxa" w:w="60"/>
-              <w:right w:type="dxa" w:w="100"/>
-            </w:tcMar>
-          </w:tcPr>
-          <w:p>
-            <w:r>
-              <w:rPr>
-                <w:rFonts w:ascii="Arial" w:cs="Arial" w:eastAsia="Arial" w:hAnsi="Arial"/>
-                <w:b w:val="false"/>
-                <w:bCs w:val="false"/>
-                <w:i w:val="false"/>
-                <w:iCs w:val="false"/>
-                <w:sz w:val="20"/>
-                <w:szCs w:val="20"/>
-              </w:rPr>
-              <w:t xml:space="preserve">Entity Discovery</w:t>
+            <w:tcMar>
+              <w:top w:type="dxa" w:w="60"/>
+              <w:left w:type="dxa" w:w="100"/>
+              <w:bottom w:type="dxa" w:w="60"/>
+              <w:right w:type="dxa" w:w="100"/>
+            </w:tcMar>
+          </w:tcPr>
+          <w:p>
+            <w:r>
+              <w:rPr>
+                <w:rFonts w:ascii="Arial" w:cs="Arial" w:eastAsia="Arial" w:hAnsi="Arial"/>
+                <w:b w:val="false"/>
+                <w:bCs w:val="false"/>
+                <w:i w:val="false"/>
+                <w:iCs w:val="false"/>
+                <w:sz w:val="20"/>
+                <w:szCs w:val="20"/>
+              </w:rPr>
+              <w:t xml:space="preserve">Domain Discovery</w:t>
             </w:r>
           </w:p>
         </w:tc>
@@ -11304,7 +11303,6 @@
               <w:bottom w:val="single" w:color="AAAAAA" w:sz="1"/>
               <w:right w:val="single" w:color="AAAAAA" w:sz="1"/>
             </w:tcBorders>
-            <w:shd w:fill="F2F7FB" w:val="clear"/>
             <w:tcMar>
               <w:top w:type="dxa" w:w="60"/>
               <w:left w:type="dxa" w:w="100"/>
@@ -11356,7 +11354,7 @@
                 <w:sz w:val="20"/>
                 <w:szCs w:val="20"/>
               </w:rPr>
-              <w:t xml:space="preserve">Entity Definition</w:t>
+              <w:t xml:space="preserve">Inventory Reconciliation</w:t>
             </w:r>
           </w:p>
         </w:tc>
@@ -11387,7 +11385,7 @@
                 <w:sz w:val="20"/>
                 <w:szCs w:val="20"/>
               </w:rPr>
-              <w:t xml:space="preserve">Master PRD + Entity Inventory + all prior Entity PRDs.</w:t>
+              <w:t xml:space="preserve">Master PRD + Domain Discovery Report.</w:t>
             </w:r>
           </w:p>
         </w:tc>
@@ -11402,26 +11400,25 @@
               <w:bottom w:val="single" w:color="AAAAAA" w:sz="1"/>
               <w:right w:val="single" w:color="AAAAAA" w:sz="1"/>
             </w:tcBorders>
-            <w:shd w:fill="F2F7FB" w:val="clear"/>
-            <w:tcMar>
-              <w:top w:type="dxa" w:w="60"/>
-              <w:left w:type="dxa" w:w="100"/>
-              <w:bottom w:type="dxa" w:w="60"/>
-              <w:right w:type="dxa" w:w="100"/>
-            </w:tcMar>
-          </w:tcPr>
-          <w:p>
-            <w:r>
-              <w:rPr>
-                <w:rFonts w:ascii="Arial" w:cs="Arial" w:eastAsia="Arial" w:hAnsi="Arial"/>
-                <w:b w:val="false"/>
-                <w:bCs w:val="false"/>
-                <w:i w:val="false"/>
-                <w:iCs w:val="false"/>
-                <w:sz w:val="20"/>
-                <w:szCs w:val="20"/>
-              </w:rPr>
-              <w:t xml:space="preserve">Domain Overview</w:t>
+            <w:tcMar>
+              <w:top w:type="dxa" w:w="60"/>
+              <w:left w:type="dxa" w:w="100"/>
+              <w:bottom w:type="dxa" w:w="60"/>
+              <w:right w:type="dxa" w:w="100"/>
+            </w:tcMar>
+          </w:tcPr>
+          <w:p>
+            <w:r>
+              <w:rPr>
+                <w:rFonts w:ascii="Arial" w:cs="Arial" w:eastAsia="Arial" w:hAnsi="Arial"/>
+                <w:b w:val="false"/>
+                <w:bCs w:val="false"/>
+                <w:i w:val="false"/>
+                <w:iCs w:val="false"/>
+                <w:sz w:val="20"/>
+                <w:szCs w:val="20"/>
+              </w:rPr>
+              <w:t xml:space="preserve">Entity PRDs</w:t>
             </w:r>
           </w:p>
         </w:tc>
@@ -11434,26 +11431,25 @@
               <w:bottom w:val="single" w:color="AAAAAA" w:sz="1"/>
               <w:right w:val="single" w:color="AAAAAA" w:sz="1"/>
             </w:tcBorders>
-            <w:shd w:fill="F2F7FB" w:val="clear"/>
-            <w:tcMar>
-              <w:top w:type="dxa" w:w="60"/>
-              <w:left w:type="dxa" w:w="100"/>
-              <w:bottom w:type="dxa" w:w="60"/>
-              <w:right w:type="dxa" w:w="100"/>
-            </w:tcMar>
-          </w:tcPr>
-          <w:p>
-            <w:r>
-              <w:rPr>
-                <w:rFonts w:ascii="Arial" w:cs="Arial" w:eastAsia="Arial" w:hAnsi="Arial"/>
-                <w:b w:val="false"/>
-                <w:bCs w:val="false"/>
-                <w:i w:val="false"/>
-                <w:iCs w:val="false"/>
-                <w:sz w:val="20"/>
-                <w:szCs w:val="20"/>
-              </w:rPr>
-              <w:t xml:space="preserve">Master PRD + Entity Inventory + Entity PRDs for entities participating in this domain.</w:t>
+            <w:tcMar>
+              <w:top w:type="dxa" w:w="60"/>
+              <w:left w:type="dxa" w:w="100"/>
+              <w:bottom w:type="dxa" w:w="60"/>
+              <w:right w:type="dxa" w:w="100"/>
+            </w:tcMar>
+          </w:tcPr>
+          <w:p>
+            <w:r>
+              <w:rPr>
+                <w:rFonts w:ascii="Arial" w:cs="Arial" w:eastAsia="Arial" w:hAnsi="Arial"/>
+                <w:b w:val="false"/>
+                <w:bCs w:val="false"/>
+                <w:i w:val="false"/>
+                <w:iCs w:val="false"/>
+                <w:sz w:val="20"/>
+                <w:szCs w:val="20"/>
+              </w:rPr>
+              <w:t xml:space="preserve">Master PRD + reconciled Entity Inventory + Phase 4 process documents referencing the entity.</w:t>
             </w:r>
           </w:p>
         </w:tc>
@@ -11486,7 +11482,7 @@
                 <w:sz w:val="20"/>
                 <w:szCs w:val="20"/>
               </w:rPr>
-              <w:t xml:space="preserve">Process Definition</w:t>
+              <w:t xml:space="preserve">Domain Overview</w:t>
             </w:r>
           </w:p>
         </w:tc>
@@ -11517,7 +11513,7 @@
                 <w:sz w:val="20"/>
                 <w:szCs w:val="20"/>
               </w:rPr>
-              <w:t xml:space="preserve">Domain Overview + all prior process documents for this domain + relevant Service PRDs (if completed).</w:t>
+              <w:t xml:space="preserve">Master PRD + reconciled Entity Inventory + reconciled Persona Inventory.</w:t>
             </w:r>
           </w:p>
         </w:tc>
@@ -11532,26 +11528,25 @@
               <w:bottom w:val="single" w:color="AAAAAA" w:sz="1"/>
               <w:right w:val="single" w:color="AAAAAA" w:sz="1"/>
             </w:tcBorders>
-            <w:shd w:fill="F2F7FB" w:val="clear"/>
-            <w:tcMar>
-              <w:top w:type="dxa" w:w="60"/>
-              <w:left w:type="dxa" w:w="100"/>
-              <w:bottom w:type="dxa" w:w="60"/>
-              <w:right w:type="dxa" w:w="100"/>
-            </w:tcMar>
-          </w:tcPr>
-          <w:p>
-            <w:r>
-              <w:rPr>
-                <w:rFonts w:ascii="Arial" w:cs="Arial" w:eastAsia="Arial" w:hAnsi="Arial"/>
-                <w:b w:val="false"/>
-                <w:bCs w:val="false"/>
-                <w:i w:val="false"/>
-                <w:iCs w:val="false"/>
-                <w:sz w:val="20"/>
-                <w:szCs w:val="20"/>
-              </w:rPr>
-              <w:t xml:space="preserve">Domain Reconciliation</w:t>
+            <w:tcMar>
+              <w:top w:type="dxa" w:w="60"/>
+              <w:left w:type="dxa" w:w="100"/>
+              <w:bottom w:type="dxa" w:w="60"/>
+              <w:right w:type="dxa" w:w="100"/>
+            </w:tcMar>
+          </w:tcPr>
+          <w:p>
+            <w:r>
+              <w:rPr>
+                <w:rFonts w:ascii="Arial" w:cs="Arial" w:eastAsia="Arial" w:hAnsi="Arial"/>
+                <w:b w:val="false"/>
+                <w:bCs w:val="false"/>
+                <w:i w:val="false"/>
+                <w:iCs w:val="false"/>
+                <w:sz w:val="20"/>
+                <w:szCs w:val="20"/>
+              </w:rPr>
+              <w:t xml:space="preserve">Process Definition</w:t>
             </w:r>
           </w:p>
         </w:tc>
@@ -11564,26 +11559,25 @@
               <w:bottom w:val="single" w:color="AAAAAA" w:sz="1"/>
               <w:right w:val="single" w:color="AAAAAA" w:sz="1"/>
             </w:tcBorders>
-            <w:shd w:fill="F2F7FB" w:val="clear"/>
-            <w:tcMar>
-              <w:top w:type="dxa" w:w="60"/>
-              <w:left w:type="dxa" w:w="100"/>
-              <w:bottom w:type="dxa" w:w="60"/>
-              <w:right w:type="dxa" w:w="100"/>
-            </w:tcMar>
-          </w:tcPr>
-          <w:p>
-            <w:r>
-              <w:rPr>
-                <w:rFonts w:ascii="Arial" w:cs="Arial" w:eastAsia="Arial" w:hAnsi="Arial"/>
-                <w:b w:val="false"/>
-                <w:bCs w:val="false"/>
-                <w:i w:val="false"/>
-                <w:iCs w:val="false"/>
-                <w:sz w:val="20"/>
-                <w:szCs w:val="20"/>
-              </w:rPr>
-              <w:t xml:space="preserve">Domain Overview + relevant Entity PRDs + all process documents for this domain.</w:t>
+            <w:tcMar>
+              <w:top w:type="dxa" w:w="60"/>
+              <w:left w:type="dxa" w:w="100"/>
+              <w:bottom w:type="dxa" w:w="60"/>
+              <w:right w:type="dxa" w:w="100"/>
+            </w:tcMar>
+          </w:tcPr>
+          <w:p>
+            <w:r>
+              <w:rPr>
+                <w:rFonts w:ascii="Arial" w:cs="Arial" w:eastAsia="Arial" w:hAnsi="Arial"/>
+                <w:b w:val="false"/>
+                <w:bCs w:val="false"/>
+                <w:i w:val="false"/>
+                <w:iCs w:val="false"/>
+                <w:sz w:val="20"/>
+                <w:szCs w:val="20"/>
+              </w:rPr>
+              <w:t xml:space="preserve">Domain Overview + reconciled Entity Inventory + all prior process documents for this domain + relevant Service PRDs (if completed).</w:t>
             </w:r>
           </w:p>
         </w:tc>
@@ -11598,22 +11592,25 @@
               <w:bottom w:val="single" w:color="AAAAAA" w:sz="1"/>
               <w:right w:val="single" w:color="AAAAAA" w:sz="1"/>
             </w:tcBorders>
-            <w:shd w:fill="F2F7FB" w:val="clear"/>
-            <w:tcMar>
-              <w:top w:type="dxa" w:w="60"/>
-              <w:left w:type="dxa" w:w="100"/>
-              <w:bottom w:type="dxa" w:w="60"/>
-              <w:right w:type="dxa" w:w="100"/>
-            </w:tcMar>
-          </w:tcPr>
-          <w:p>
-            <w:r>
-              <w:rPr>
-                <w:rFonts w:ascii="Arial" w:cs="Arial" w:eastAsia="Arial" w:hAnsi="Arial"/>
-                <w:sz w:val="20"/>
-                <w:szCs w:val="20"/>
-              </w:rPr>
-              <w:t xml:space="preserve">Service Process Definition</w:t>
+            <w:tcMar>
+              <w:top w:type="dxa" w:w="60"/>
+              <w:left w:type="dxa" w:w="100"/>
+              <w:bottom w:type="dxa" w:w="60"/>
+              <w:right w:type="dxa" w:w="100"/>
+            </w:tcMar>
+          </w:tcPr>
+          <w:p>
+            <w:r>
+              <w:rPr>
+                <w:rFonts w:ascii="Arial" w:cs="Arial" w:eastAsia="Arial" w:hAnsi="Arial"/>
+                <w:b w:val="false"/>
+                <w:bCs w:val="false"/>
+                <w:i w:val="false"/>
+                <w:iCs w:val="false"/>
+                <w:sz w:val="20"/>
+                <w:szCs w:val="20"/>
+              </w:rPr>
+              <w:t xml:space="preserve">Domain Reconciliation</w:t>
             </w:r>
           </w:p>
         </w:tc>
@@ -11626,22 +11623,25 @@
               <w:bottom w:val="single" w:color="AAAAAA" w:sz="1"/>
               <w:right w:val="single" w:color="AAAAAA" w:sz="1"/>
             </w:tcBorders>
-            <w:shd w:fill="F2F7FB" w:val="clear"/>
-            <w:tcMar>
-              <w:top w:type="dxa" w:w="60"/>
-              <w:left w:type="dxa" w:w="100"/>
-              <w:bottom w:type="dxa" w:w="60"/>
-              <w:right w:type="dxa" w:w="100"/>
-            </w:tcMar>
-          </w:tcPr>
-          <w:p>
-            <w:r>
-              <w:rPr>
-                <w:rFonts w:ascii="Arial" w:cs="Arial" w:eastAsia="Arial" w:hAnsi="Arial"/>
-                <w:sz w:val="20"/>
-                <w:szCs w:val="20"/>
-              </w:rPr>
-              <w:t xml:space="preserve">Master PRD + Entity Inventory + relevant Entity PRDs + all previously completed service process documents for this service.</w:t>
+            <w:tcMar>
+              <w:top w:type="dxa" w:w="60"/>
+              <w:left w:type="dxa" w:w="100"/>
+              <w:bottom w:type="dxa" w:w="60"/>
+              <w:right w:type="dxa" w:w="100"/>
+            </w:tcMar>
+          </w:tcPr>
+          <w:p>
+            <w:r>
+              <w:rPr>
+                <w:rFonts w:ascii="Arial" w:cs="Arial" w:eastAsia="Arial" w:hAnsi="Arial"/>
+                <w:b w:val="false"/>
+                <w:bCs w:val="false"/>
+                <w:i w:val="false"/>
+                <w:iCs w:val="false"/>
+                <w:sz w:val="20"/>
+                <w:szCs w:val="20"/>
+              </w:rPr>
+              <w:t xml:space="preserve">Domain Overview + relevant Entity PRDs + all process documents for this domain.</w:t>
             </w:r>
           </w:p>
         </w:tc>
@@ -11667,10 +11667,14 @@
             <w:r>
               <w:rPr>
                 <w:rFonts w:ascii="Arial" w:cs="Arial" w:eastAsia="Arial" w:hAnsi="Arial"/>
-                <w:sz w:val="20"/>
-                <w:szCs w:val="20"/>
-              </w:rPr>
-              <w:t xml:space="preserve">Service Reconciliation</w:t>
+                <w:b w:val="false"/>
+                <w:bCs w:val="false"/>
+                <w:i w:val="false"/>
+                <w:iCs w:val="false"/>
+                <w:sz w:val="20"/>
+                <w:szCs w:val="20"/>
+              </w:rPr>
+              <w:t xml:space="preserve">Service Process Definition</w:t>
             </w:r>
           </w:p>
         </w:tc>
@@ -11694,10 +11698,14 @@
             <w:r>
               <w:rPr>
                 <w:rFonts w:ascii="Arial" w:cs="Arial" w:eastAsia="Arial" w:hAnsi="Arial"/>
-                <w:sz w:val="20"/>
-                <w:szCs w:val="20"/>
-              </w:rPr>
-              <w:t xml:space="preserve">Master PRD + Entity Inventory + relevant Entity PRDs + all process documents for this service.</w:t>
+                <w:b w:val="false"/>
+                <w:bCs w:val="false"/>
+                <w:i w:val="false"/>
+                <w:iCs w:val="false"/>
+                <w:sz w:val="20"/>
+                <w:szCs w:val="20"/>
+              </w:rPr>
+              <w:t xml:space="preserve">Master PRD + Entity Inventory + relevant Entity PRDs + all previously completed service process documents for this service.</w:t>
             </w:r>
           </w:p>
         </w:tc>
@@ -11730,7 +11738,7 @@
                 <w:sz w:val="20"/>
                 <w:szCs w:val="20"/>
               </w:rPr>
-              <w:t xml:space="preserve">YAML Generation</w:t>
+              <w:t xml:space="preserve">Service Reconciliation</w:t>
             </w:r>
           </w:p>
         </w:tc>
@@ -11761,7 +11769,7 @@
                 <w:sz w:val="20"/>
                 <w:szCs w:val="20"/>
               </w:rPr>
-              <w:t xml:space="preserve">Domain PRD for current domain + Entity PRDs + all prior YAML files.</w:t>
+              <w:t xml:space="preserve">Master PRD + Entity Inventory + relevant Entity PRDs + all process documents for this service.</w:t>
             </w:r>
           </w:p>
         </w:tc>
@@ -11776,26 +11784,25 @@
               <w:bottom w:val="single" w:color="AAAAAA" w:sz="1"/>
               <w:right w:val="single" w:color="AAAAAA" w:sz="1"/>
             </w:tcBorders>
-            <w:shd w:fill="F2F7FB" w:val="clear"/>
-            <w:tcMar>
-              <w:top w:type="dxa" w:w="60"/>
-              <w:left w:type="dxa" w:w="100"/>
-              <w:bottom w:type="dxa" w:w="60"/>
-              <w:right w:type="dxa" w:w="100"/>
-            </w:tcMar>
-          </w:tcPr>
-          <w:p>
-            <w:r>
-              <w:rPr>
-                <w:rFonts w:ascii="Arial" w:cs="Arial" w:eastAsia="Arial" w:hAnsi="Arial"/>
-                <w:b w:val="false"/>
-                <w:bCs w:val="false"/>
-                <w:i w:val="false"/>
-                <w:iCs w:val="false"/>
-                <w:sz w:val="20"/>
-                <w:szCs w:val="20"/>
-              </w:rPr>
-              <w:t xml:space="preserve">CRM Selection</w:t>
+            <w:tcMar>
+              <w:top w:type="dxa" w:w="60"/>
+              <w:left w:type="dxa" w:w="100"/>
+              <w:bottom w:type="dxa" w:w="60"/>
+              <w:right w:type="dxa" w:w="100"/>
+            </w:tcMar>
+          </w:tcPr>
+          <w:p>
+            <w:r>
+              <w:rPr>
+                <w:rFonts w:ascii="Arial" w:cs="Arial" w:eastAsia="Arial" w:hAnsi="Arial"/>
+                <w:b w:val="false"/>
+                <w:bCs w:val="false"/>
+                <w:i w:val="false"/>
+                <w:iCs w:val="false"/>
+                <w:sz w:val="20"/>
+                <w:szCs w:val="20"/>
+              </w:rPr>
+              <w:t xml:space="preserve">YAML Generation</w:t>
             </w:r>
           </w:p>
         </w:tc>
@@ -11808,26 +11815,25 @@
               <w:bottom w:val="single" w:color="AAAAAA" w:sz="1"/>
               <w:right w:val="single" w:color="AAAAAA" w:sz="1"/>
             </w:tcBorders>
-            <w:shd w:fill="F2F7FB" w:val="clear"/>
-            <w:tcMar>
-              <w:top w:type="dxa" w:w="60"/>
-              <w:left w:type="dxa" w:w="100"/>
-              <w:bottom w:type="dxa" w:w="60"/>
-              <w:right w:type="dxa" w:w="100"/>
-            </w:tcMar>
-          </w:tcPr>
-          <w:p>
-            <w:r>
-              <w:rPr>
-                <w:rFonts w:ascii="Arial" w:cs="Arial" w:eastAsia="Arial" w:hAnsi="Arial"/>
-                <w:b w:val="false"/>
-                <w:bCs w:val="false"/>
-                <w:i w:val="false"/>
-                <w:iCs w:val="false"/>
-                <w:sz w:val="20"/>
-                <w:szCs w:val="20"/>
-              </w:rPr>
-              <w:t xml:space="preserve">Approved Domain PRDs + YAML program files.</w:t>
+            <w:tcMar>
+              <w:top w:type="dxa" w:w="60"/>
+              <w:left w:type="dxa" w:w="100"/>
+              <w:bottom w:type="dxa" w:w="60"/>
+              <w:right w:type="dxa" w:w="100"/>
+            </w:tcMar>
+          </w:tcPr>
+          <w:p>
+            <w:r>
+              <w:rPr>
+                <w:rFonts w:ascii="Arial" w:cs="Arial" w:eastAsia="Arial" w:hAnsi="Arial"/>
+                <w:b w:val="false"/>
+                <w:bCs w:val="false"/>
+                <w:i w:val="false"/>
+                <w:iCs w:val="false"/>
+                <w:sz w:val="20"/>
+                <w:szCs w:val="20"/>
+              </w:rPr>
+              <w:t xml:space="preserve">Domain PRD for current domain + Entity PRDs + all prior YAML files.</w:t>
             </w:r>
           </w:p>
         </w:tc>
@@ -11842,26 +11848,25 @@
               <w:bottom w:val="single" w:color="AAAAAA" w:sz="1"/>
               <w:right w:val="single" w:color="AAAAAA" w:sz="1"/>
             </w:tcBorders>
-            <w:shd w:fill="F2F7FB" w:val="clear"/>
-            <w:tcMar>
-              <w:top w:type="dxa" w:w="60"/>
-              <w:left w:type="dxa" w:w="100"/>
-              <w:bottom w:type="dxa" w:w="60"/>
-              <w:right w:type="dxa" w:w="100"/>
-            </w:tcMar>
-          </w:tcPr>
-          <w:p>
-            <w:r>
-              <w:rPr>
-                <w:rFonts w:ascii="Arial" w:cs="Arial" w:eastAsia="Arial" w:hAnsi="Arial"/>
-                <w:b w:val="false"/>
-                <w:bCs w:val="false"/>
-                <w:i w:val="false"/>
-                <w:iCs w:val="false"/>
-                <w:sz w:val="20"/>
-                <w:szCs w:val="20"/>
-              </w:rPr>
-              <w:t xml:space="preserve">Sub-Domain Overview</w:t>
+            <w:tcMar>
+              <w:top w:type="dxa" w:w="60"/>
+              <w:left w:type="dxa" w:w="100"/>
+              <w:bottom w:type="dxa" w:w="60"/>
+              <w:right w:type="dxa" w:w="100"/>
+            </w:tcMar>
+          </w:tcPr>
+          <w:p>
+            <w:r>
+              <w:rPr>
+                <w:rFonts w:ascii="Arial" w:cs="Arial" w:eastAsia="Arial" w:hAnsi="Arial"/>
+                <w:b w:val="false"/>
+                <w:bCs w:val="false"/>
+                <w:i w:val="false"/>
+                <w:iCs w:val="false"/>
+                <w:sz w:val="20"/>
+                <w:szCs w:val="20"/>
+              </w:rPr>
+              <w:t xml:space="preserve">CRM Selection</w:t>
             </w:r>
           </w:p>
         </w:tc>
@@ -11874,26 +11879,25 @@
               <w:bottom w:val="single" w:color="AAAAAA" w:sz="1"/>
               <w:right w:val="single" w:color="AAAAAA" w:sz="1"/>
             </w:tcBorders>
-            <w:shd w:fill="F2F7FB" w:val="clear"/>
-            <w:tcMar>
-              <w:top w:type="dxa" w:w="60"/>
-              <w:left w:type="dxa" w:w="100"/>
-              <w:bottom w:type="dxa" w:w="60"/>
-              <w:right w:type="dxa" w:w="100"/>
-            </w:tcMar>
-          </w:tcPr>
-          <w:p>
-            <w:r>
-              <w:rPr>
-                <w:rFonts w:ascii="Arial" w:cs="Arial" w:eastAsia="Arial" w:hAnsi="Arial"/>
-                <w:b w:val="false"/>
-                <w:bCs w:val="false"/>
-                <w:i w:val="false"/>
-                <w:iCs w:val="false"/>
-                <w:sz w:val="20"/>
-                <w:szCs w:val="20"/>
-              </w:rPr>
-              <w:t xml:space="preserve">Parent Domain Overview + Master PRD + Entity Inventory + Entity PRDs for entities participating in this sub-domain.</w:t>
+            <w:tcMar>
+              <w:top w:type="dxa" w:w="60"/>
+              <w:left w:type="dxa" w:w="100"/>
+              <w:bottom w:type="dxa" w:w="60"/>
+              <w:right w:type="dxa" w:w="100"/>
+            </w:tcMar>
+          </w:tcPr>
+          <w:p>
+            <w:r>
+              <w:rPr>
+                <w:rFonts w:ascii="Arial" w:cs="Arial" w:eastAsia="Arial" w:hAnsi="Arial"/>
+                <w:b w:val="false"/>
+                <w:bCs w:val="false"/>
+                <w:i w:val="false"/>
+                <w:iCs w:val="false"/>
+                <w:sz w:val="20"/>
+                <w:szCs w:val="20"/>
+              </w:rPr>
+              <w:t xml:space="preserve">Approved Domain PRDs + YAML program files.</w:t>
             </w:r>
           </w:p>
         </w:tc>
@@ -11908,26 +11912,25 @@
               <w:bottom w:val="single" w:color="AAAAAA" w:sz="1"/>
               <w:right w:val="single" w:color="AAAAAA" w:sz="1"/>
             </w:tcBorders>
-            <w:shd w:fill="F2F7FB" w:val="clear"/>
-            <w:tcMar>
-              <w:top w:type="dxa" w:w="60"/>
-              <w:left w:type="dxa" w:w="100"/>
-              <w:bottom w:type="dxa" w:w="60"/>
-              <w:right w:type="dxa" w:w="100"/>
-            </w:tcMar>
-          </w:tcPr>
-          <w:p>
-            <w:r>
-              <w:rPr>
-                <w:rFonts w:ascii="Arial" w:cs="Arial" w:eastAsia="Arial" w:hAnsi="Arial"/>
-                <w:b w:val="false"/>
-                <w:bCs w:val="false"/>
-                <w:i w:val="false"/>
-                <w:iCs w:val="false"/>
-                <w:sz w:val="20"/>
-                <w:szCs w:val="20"/>
-              </w:rPr>
-              <w:t xml:space="preserve">Sub-Domain Reconciliation</w:t>
+            <w:tcMar>
+              <w:top w:type="dxa" w:w="60"/>
+              <w:left w:type="dxa" w:w="100"/>
+              <w:bottom w:type="dxa" w:w="60"/>
+              <w:right w:type="dxa" w:w="100"/>
+            </w:tcMar>
+          </w:tcPr>
+          <w:p>
+            <w:r>
+              <w:rPr>
+                <w:rFonts w:ascii="Arial" w:cs="Arial" w:eastAsia="Arial" w:hAnsi="Arial"/>
+                <w:b w:val="false"/>
+                <w:bCs w:val="false"/>
+                <w:i w:val="false"/>
+                <w:iCs w:val="false"/>
+                <w:sz w:val="20"/>
+                <w:szCs w:val="20"/>
+              </w:rPr>
+              <w:t xml:space="preserve">Sub-Domain Overview</w:t>
             </w:r>
           </w:p>
         </w:tc>
@@ -11940,26 +11943,25 @@
               <w:bottom w:val="single" w:color="AAAAAA" w:sz="1"/>
               <w:right w:val="single" w:color="AAAAAA" w:sz="1"/>
             </w:tcBorders>
-            <w:shd w:fill="F2F7FB" w:val="clear"/>
-            <w:tcMar>
-              <w:top w:type="dxa" w:w="60"/>
-              <w:left w:type="dxa" w:w="100"/>
-              <w:bottom w:type="dxa" w:w="60"/>
-              <w:right w:type="dxa" w:w="100"/>
-            </w:tcMar>
-          </w:tcPr>
-          <w:p>
-            <w:r>
-              <w:rPr>
-                <w:rFonts w:ascii="Arial" w:cs="Arial" w:eastAsia="Arial" w:hAnsi="Arial"/>
-                <w:b w:val="false"/>
-                <w:bCs w:val="false"/>
-                <w:i w:val="false"/>
-                <w:iCs w:val="false"/>
-                <w:sz w:val="20"/>
-                <w:szCs w:val="20"/>
-              </w:rPr>
-              <w:t xml:space="preserve">Sub-Domain Overview + relevant Entity PRDs + all process documents for this sub-domain.</w:t>
+            <w:tcMar>
+              <w:top w:type="dxa" w:w="60"/>
+              <w:left w:type="dxa" w:w="100"/>
+              <w:bottom w:type="dxa" w:w="60"/>
+              <w:right w:type="dxa" w:w="100"/>
+            </w:tcMar>
+          </w:tcPr>
+          <w:p>
+            <w:r>
+              <w:rPr>
+                <w:rFonts w:ascii="Arial" w:cs="Arial" w:eastAsia="Arial" w:hAnsi="Arial"/>
+                <w:b w:val="false"/>
+                <w:bCs w:val="false"/>
+                <w:i w:val="false"/>
+                <w:iCs w:val="false"/>
+                <w:sz w:val="20"/>
+                <w:szCs w:val="20"/>
+              </w:rPr>
+              <w:t xml:space="preserve">Parent Domain Overview + Master PRD + reconciled Entity Inventory + reconciled Persona Inventory.</w:t>
             </w:r>
           </w:p>
         </w:tc>
@@ -11974,26 +11976,25 @@
               <w:bottom w:val="single" w:color="AAAAAA" w:sz="1"/>
               <w:right w:val="single" w:color="AAAAAA" w:sz="1"/>
             </w:tcBorders>
-            <w:shd w:fill="F2F7FB" w:val="clear"/>
-            <w:tcMar>
-              <w:top w:type="dxa" w:w="60"/>
-              <w:left w:type="dxa" w:w="100"/>
-              <w:bottom w:type="dxa" w:w="60"/>
-              <w:right w:type="dxa" w:w="100"/>
-            </w:tcMar>
-          </w:tcPr>
-          <w:p>
-            <w:r>
-              <w:rPr>
-                <w:rFonts w:ascii="Arial" w:cs="Arial" w:eastAsia="Arial" w:hAnsi="Arial"/>
-                <w:b w:val="false"/>
-                <w:bCs w:val="false"/>
-                <w:i w:val="false"/>
-                <w:iCs w:val="false"/>
-                <w:sz w:val="20"/>
-                <w:szCs w:val="20"/>
-              </w:rPr>
-              <w:t xml:space="preserve">Parent Domain Reconciliation (with sub-domains)</w:t>
+            <w:tcMar>
+              <w:top w:type="dxa" w:w="60"/>
+              <w:left w:type="dxa" w:w="100"/>
+              <w:bottom w:type="dxa" w:w="60"/>
+              <w:right w:type="dxa" w:w="100"/>
+            </w:tcMar>
+          </w:tcPr>
+          <w:p>
+            <w:r>
+              <w:rPr>
+                <w:rFonts w:ascii="Arial" w:cs="Arial" w:eastAsia="Arial" w:hAnsi="Arial"/>
+                <w:b w:val="false"/>
+                <w:bCs w:val="false"/>
+                <w:i w:val="false"/>
+                <w:iCs w:val="false"/>
+                <w:sz w:val="20"/>
+                <w:szCs w:val="20"/>
+              </w:rPr>
+              <w:t xml:space="preserve">Sub-Domain Reconciliation</w:t>
             </w:r>
           </w:p>
         </w:tc>
@@ -12006,26 +12007,25 @@
               <w:bottom w:val="single" w:color="AAAAAA" w:sz="1"/>
               <w:right w:val="single" w:color="AAAAAA" w:sz="1"/>
             </w:tcBorders>
-            <w:shd w:fill="F2F7FB" w:val="clear"/>
-            <w:tcMar>
-              <w:top w:type="dxa" w:w="60"/>
-              <w:left w:type="dxa" w:w="100"/>
-              <w:bottom w:type="dxa" w:w="60"/>
-              <w:right w:type="dxa" w:w="100"/>
-            </w:tcMar>
-          </w:tcPr>
-          <w:p>
-            <w:r>
-              <w:rPr>
-                <w:rFonts w:ascii="Arial" w:cs="Arial" w:eastAsia="Arial" w:hAnsi="Arial"/>
-                <w:b w:val="false"/>
-                <w:bCs w:val="false"/>
-                <w:i w:val="false"/>
-                <w:iCs w:val="false"/>
-                <w:sz w:val="20"/>
-                <w:szCs w:val="20"/>
-              </w:rPr>
-              <w:t xml:space="preserve">Parent Domain Overview + all Sub-Domain PRDs for this domain.</w:t>
+            <w:tcMar>
+              <w:top w:type="dxa" w:w="60"/>
+              <w:left w:type="dxa" w:w="100"/>
+              <w:bottom w:type="dxa" w:w="60"/>
+              <w:right w:type="dxa" w:w="100"/>
+            </w:tcMar>
+          </w:tcPr>
+          <w:p>
+            <w:r>
+              <w:rPr>
+                <w:rFonts w:ascii="Arial" w:cs="Arial" w:eastAsia="Arial" w:hAnsi="Arial"/>
+                <w:b w:val="false"/>
+                <w:bCs w:val="false"/>
+                <w:i w:val="false"/>
+                <w:iCs w:val="false"/>
+                <w:sz w:val="20"/>
+                <w:szCs w:val="20"/>
+              </w:rPr>
+              <w:t xml:space="preserve">Sub-Domain Overview + relevant Entity PRDs + all process documents for this sub-domain.</w:t>
             </w:r>
           </w:p>
         </w:tc>
@@ -12040,7 +12040,70 @@
               <w:bottom w:val="single" w:color="AAAAAA" w:sz="1"/>
               <w:right w:val="single" w:color="AAAAAA" w:sz="1"/>
             </w:tcBorders>
-            <w:shd w:fill="F2F7FB" w:val="clear"/>
+            <w:tcMar>
+              <w:top w:type="dxa" w:w="60"/>
+              <w:left w:type="dxa" w:w="100"/>
+              <w:bottom w:type="dxa" w:w="60"/>
+              <w:right w:type="dxa" w:w="100"/>
+            </w:tcMar>
+          </w:tcPr>
+          <w:p>
+            <w:r>
+              <w:rPr>
+                <w:rFonts w:ascii="Arial" w:cs="Arial" w:eastAsia="Arial" w:hAnsi="Arial"/>
+                <w:b w:val="false"/>
+                <w:bCs w:val="false"/>
+                <w:i w:val="false"/>
+                <w:iCs w:val="false"/>
+                <w:sz w:val="20"/>
+                <w:szCs w:val="20"/>
+              </w:rPr>
+              <w:t xml:space="preserve">Parent Domain Reconciliation (with sub-domains)</w:t>
+            </w:r>
+          </w:p>
+        </w:tc>
+        <w:tc>
+          <w:tcPr>
+            <w:tcW w:type="dxa" w:w="6760"/>
+            <w:tcBorders>
+              <w:top w:val="single" w:color="AAAAAA" w:sz="1"/>
+              <w:left w:val="single" w:color="AAAAAA" w:sz="1"/>
+              <w:bottom w:val="single" w:color="AAAAAA" w:sz="1"/>
+              <w:right w:val="single" w:color="AAAAAA" w:sz="1"/>
+            </w:tcBorders>
+            <w:tcMar>
+              <w:top w:type="dxa" w:w="60"/>
+              <w:left w:type="dxa" w:w="100"/>
+              <w:bottom w:type="dxa" w:w="60"/>
+              <w:right w:type="dxa" w:w="100"/>
+            </w:tcMar>
+          </w:tcPr>
+          <w:p>
+            <w:r>
+              <w:rPr>
+                <w:rFonts w:ascii="Arial" w:cs="Arial" w:eastAsia="Arial" w:hAnsi="Arial"/>
+                <w:b w:val="false"/>
+                <w:bCs w:val="false"/>
+                <w:i w:val="false"/>
+                <w:iCs w:val="false"/>
+                <w:sz w:val="20"/>
+                <w:szCs w:val="20"/>
+              </w:rPr>
+              <w:t xml:space="preserve">Parent Domain Overview + all Sub-Domain PRDs for this domain.</w:t>
+            </w:r>
+          </w:p>
+        </w:tc>
+      </w:tr>
+      <w:tr>
+        <w:tc>
+          <w:tcPr>
+            <w:tcW w:type="dxa" w:w="2600"/>
+            <w:tcBorders>
+              <w:top w:val="single" w:color="AAAAAA" w:sz="1"/>
+              <w:left w:val="single" w:color="AAAAAA" w:sz="1"/>
+              <w:bottom w:val="single" w:color="AAAAAA" w:sz="1"/>
+              <w:right w:val="single" w:color="AAAAAA" w:sz="1"/>
+            </w:tcBorders>
             <w:tcMar>
               <w:top w:type="dxa" w:w="60"/>
               <w:left w:type="dxa" w:w="100"/>
@@ -12072,7 +12135,6 @@
               <w:bottom w:val="single" w:color="AAAAAA" w:sz="1"/>
               <w:right w:val="single" w:color="AAAAAA" w:sz="1"/>
             </w:tcBorders>
-            <w:shd w:fill="F2F7FB" w:val="clear"/>
             <w:tcMar>
               <w:top w:type="dxa" w:w="60"/>
               <w:left w:type="dxa" w:w="100"/>

</xml_diff>

<commit_message>
Document Production Process v2.0 - Steps 5-8 (Section 6 repo structure, Section 8 decisions, Section 9 hierarchy, v2.0 header bump)
</commit_message>
<xml_diff>
--- a/PRDs/process/CRM-Builder-Document-Production-Process.docx
+++ b/PRDs/process/CRM-Builder-Document-Production-Process.docx
@@ -251,7 +251,7 @@
                 <w:sz w:val="20"/>
                 <w:szCs w:val="20"/>
               </w:rPr>
-              <w:t xml:space="preserve">04-04-26 21:30</w:t>
+              <w:t xml:space="preserve">04-12-26 14:00</w:t>
             </w:r>
           </w:p>
         </w:tc>
@@ -316,7 +316,7 @@
                 <w:sz w:val="20"/>
                 <w:szCs w:val="20"/>
               </w:rPr>
-              <w:t xml:space="preserve">v1.7</w:t>
+              <w:t xml:space="preserve">v2.0</w:t>
             </w:r>
           </w:p>
         </w:tc>
@@ -10464,7 +10464,7 @@
           <w:sz w:val="22"/>
           <w:szCs w:val="22"/>
         </w:rPr>
-        <w:t xml:space="preserve">All documents are stored in the implementation’s Git repository. The structure is organized by domain, with process documents and the reconciled Domain PRD living in the same folder. Entity PRDs are stored in a dedicated entities folder.</w:t>
+        <w:t xml:space="preserve">All documents are stored in the implementation’s Git repository. The structure is organized by domain, with process documents and the reconciled Domain PRD living in the same folder. Entity PRDs are stored in a dedicated entities folder. Two durable inventories produced in Phase 3 — the Entity Inventory and the Persona Inventory — live at the root of the PRDs directory, alongside the working Domain Discovery Report from Phase 2.</w:t>
       </w:r>
     </w:p>
     <w:p>
@@ -10516,6 +10516,40 @@
           <w:szCs w:val="22"/>
         </w:rPr>
         <w:t xml:space="preserve">    {Implementation}-Entity-Inventory.docx</w:t>
+      </w:r>
+    </w:p>
+    <w:p>
+      <w:pPr>
+        <w:spacing w:after="120"/>
+      </w:pPr>
+      <w:r>
+        <w:rPr>
+          <w:rFonts w:ascii="Arial" w:cs="Arial" w:eastAsia="Arial" w:hAnsi="Arial"/>
+          <w:b w:val="false"/>
+          <w:bCs w:val="false"/>
+          <w:i w:val="false"/>
+          <w:iCs w:val="false"/>
+          <w:sz w:val="22"/>
+          <w:szCs w:val="22"/>
+        </w:rPr>
+        <w:t xml:space="preserve">    {Implementation}-Domain-Discovery-Report.docx</w:t>
+      </w:r>
+    </w:p>
+    <w:p>
+      <w:pPr>
+        <w:spacing w:after="120"/>
+      </w:pPr>
+      <w:r>
+        <w:rPr>
+          <w:rFonts w:ascii="Arial" w:cs="Arial" w:eastAsia="Arial" w:hAnsi="Arial"/>
+          <w:b w:val="false"/>
+          <w:bCs w:val="false"/>
+          <w:i w:val="false"/>
+          <w:iCs w:val="false"/>
+          <w:sz w:val="22"/>
+          <w:szCs w:val="22"/>
+        </w:rPr>
+        <w:t xml:space="preserve">    {Implementation}-Persona-Inventory.docx</w:t>
       </w:r>
     </w:p>
     <w:p>
@@ -10805,7 +10839,7 @@
           <w:sz w:val="22"/>
           <w:szCs w:val="22"/>
         </w:rPr>
-        <w:t xml:space="preserve">When starting a new process conversation, the administrator uploads the Domain Overview plus everything in that domain’s folder. This provides Claude with full context from all prior work.</w:t>
+        <w:t xml:space="preserve">When starting a new process conversation, the administrator uploads the Domain Overview plus everything in that domain’s folder. For Phase 4 process conversations and Phase 5 Entity PRD conversations, the Entity Inventory and Persona Inventory are also uploaded. This provides Claude with full context from all prior work.</w:t>
       </w:r>
     </w:p>
     <w:p>
@@ -12545,7 +12579,7 @@
                 <w:sz w:val="20"/>
                 <w:szCs w:val="20"/>
               </w:rPr>
-              <w:t xml:space="preserve">Entity definition is a separate phase before process definition.</w:t>
+              <w:t xml:space="preserve">Entities are sketched in Phase 2 Domain Discovery, reconciled into the Entity Inventory in Phase 3, and fully defined as Entity PRDs in Phase 5 after processes are drafted.</w:t>
             </w:r>
           </w:p>
         </w:tc>
@@ -12610,7 +12644,7 @@
                 <w:sz w:val="20"/>
                 <w:szCs w:val="20"/>
               </w:rPr>
-              <w:t xml:space="preserve">Entity discovery followed by per-entity interviews.</w:t>
+              <w:t xml:space="preserve">Discovery captures candidate entities and personas together, with per-entity interviews deferred until Phase 5.</w:t>
             </w:r>
           </w:p>
         </w:tc>
@@ -13569,7 +13603,29 @@
           <w:sz w:val="22"/>
           <w:szCs w:val="22"/>
         </w:rPr>
-        <w:t xml:space="preserve">Level 2: Entity Inventory — complete list of entities with domain participation and process references</w:t>
+        <w:t xml:space="preserve">Level 2a: Entity Inventory — complete list of entities with domain participation and process references</w:t>
+      </w:r>
+    </w:p>
+    <w:p>
+      <w:pPr>
+        <w:pStyle w:val="ListParagraph"/>
+        <w:numPr>
+          <w:ilvl w:val="0"/>
+          <w:numId w:val="2"/>
+        </w:numPr>
+        <w:spacing w:after="60"/>
+      </w:pPr>
+      <w:r>
+        <w:rPr>
+          <w:rFonts w:ascii="Arial" w:cs="Arial" w:eastAsia="Arial" w:hAnsi="Arial"/>
+          <w:b w:val="false"/>
+          <w:bCs w:val="false"/>
+          <w:i w:val="false"/>
+          <w:iCs w:val="false"/>
+          <w:sz w:val="22"/>
+          <w:szCs w:val="22"/>
+        </w:rPr>
+        <w:t xml:space="preserve">Level 2b: Persona Inventory — complete list of personas with backing-entity links, source attribution, and domain participation</w:t>
       </w:r>
     </w:p>
     <w:p>

</xml_diff>